<commit_message>
docs: release 1.1.0 pubblicata (PyMuPDF 2.0, tag spostato, link verificati)
- CLAUDE.md: esito della release v1.1.0, account akito996 per il push,
  punto aperto sul passaggio a PyMuPDF 2.0.
- problemi-risolti: pipeline fermata da PyMuPDF 2.0 e come è stata completata.
- Documentazione Word PDFz_20261021.docx: release 1.1.0 con dimensioni e prove.

Co-Authored-By: Claude Opus 5.5 <noreply@anthropic.com>
</commit_message>
<xml_diff>
--- a/docs/PDFz_20261021.docx
+++ b/docs/PDFz_20261021.docx
@@ -16,7 +16,7 @@
           <w:noProof/>
         </w:rPr>
         <w:drawing>
-          <wp:inline distT="0" distB="0" distL="0" distR="0" wp14:anchorId="3D3BF51E" wp14:editId="4037541E">
+          <wp:inline distT="0" distB="0" distL="0" distR="0" wp14:anchorId="075DFA4B" wp14:editId="3B57B709">
             <wp:extent cx="3619500" cy="1285875"/>
             <wp:effectExtent l="0" t="0" r="0" b="0"/>
             <wp:docPr id="1" name="Immagine 1"/>
@@ -136,7 +136,7 @@
     <w:sdt>
       <w:sdtPr>
         <w:alias w:val="Indice"/>
-        <w:id w:val="204299969"/>
+        <w:id w:val="1164896481"/>
       </w:sdtPr>
       <w:sdtEndPr/>
       <w:sdtContent>
@@ -159,7 +159,7 @@
           <w:r>
             <w:fldChar w:fldCharType="separate"/>
           </w:r>
-          <w:hyperlink w:anchor="_Toc243476516" w:history="1">
+          <w:hyperlink w:anchor="_Toc243478094" w:history="1">
             <w:r>
               <w:rPr>
                 <w:rStyle w:val="Collegamentoipertestuale"/>
@@ -183,7 +183,7 @@
               <w:rPr>
                 <w:noProof/>
               </w:rPr>
-              <w:instrText xml:space="preserve"> PAGEREF _Toc243476516 \h </w:instrText>
+              <w:instrText xml:space="preserve"> PAGEREF _Toc243478094 \h </w:instrText>
             </w:r>
             <w:r>
               <w:rPr>
@@ -220,7 +220,7 @@
               <w:noProof/>
             </w:rPr>
           </w:pPr>
-          <w:hyperlink w:anchor="_Toc243476517" w:history="1">
+          <w:hyperlink w:anchor="_Toc243478095" w:history="1">
             <w:r>
               <w:rPr>
                 <w:rStyle w:val="Collegamentoipertestuale"/>
@@ -244,7 +244,7 @@
               <w:rPr>
                 <w:noProof/>
               </w:rPr>
-              <w:instrText xml:space="preserve"> PAGEREF _Toc243476517 \h </w:instrText>
+              <w:instrText xml:space="preserve"> PAGEREF _Toc243478095 \h </w:instrText>
             </w:r>
             <w:r>
               <w:rPr>
@@ -281,7 +281,7 @@
               <w:noProof/>
             </w:rPr>
           </w:pPr>
-          <w:hyperlink w:anchor="_Toc243476518" w:history="1">
+          <w:hyperlink w:anchor="_Toc243478096" w:history="1">
             <w:r>
               <w:rPr>
                 <w:rStyle w:val="Collegamentoipertestuale"/>
@@ -305,7 +305,7 @@
               <w:rPr>
                 <w:noProof/>
               </w:rPr>
-              <w:instrText xml:space="preserve"> PAGEREF _Toc243476518 \h </w:instrText>
+              <w:instrText xml:space="preserve"> PAGEREF _Toc243478096 \h </w:instrText>
             </w:r>
             <w:r>
               <w:rPr>
@@ -342,7 +342,7 @@
               <w:noProof/>
             </w:rPr>
           </w:pPr>
-          <w:hyperlink w:anchor="_Toc243476519" w:history="1">
+          <w:hyperlink w:anchor="_Toc243478097" w:history="1">
             <w:r>
               <w:rPr>
                 <w:rStyle w:val="Collegamentoipertestuale"/>
@@ -366,7 +366,7 @@
               <w:rPr>
                 <w:noProof/>
               </w:rPr>
-              <w:instrText xml:space="preserve"> PAGEREF _Toc243476519 \h </w:instrText>
+              <w:instrText xml:space="preserve"> PAGEREF _Toc243478097 \h </w:instrText>
             </w:r>
             <w:r>
               <w:rPr>
@@ -403,7 +403,7 @@
               <w:noProof/>
             </w:rPr>
           </w:pPr>
-          <w:hyperlink w:anchor="_Toc243476520" w:history="1">
+          <w:hyperlink w:anchor="_Toc243478098" w:history="1">
             <w:r>
               <w:rPr>
                 <w:rStyle w:val="Collegamentoipertestuale"/>
@@ -427,7 +427,7 @@
               <w:rPr>
                 <w:noProof/>
               </w:rPr>
-              <w:instrText xml:space="preserve"> PAGEREF _Toc243476520 \h </w:instrText>
+              <w:instrText xml:space="preserve"> PAGEREF _Toc243478098 \h </w:instrText>
             </w:r>
             <w:r>
               <w:rPr>
@@ -464,7 +464,7 @@
               <w:noProof/>
             </w:rPr>
           </w:pPr>
-          <w:hyperlink w:anchor="_Toc243476521" w:history="1">
+          <w:hyperlink w:anchor="_Toc243478099" w:history="1">
             <w:r>
               <w:rPr>
                 <w:rStyle w:val="Collegamentoipertestuale"/>
@@ -488,7 +488,7 @@
               <w:rPr>
                 <w:noProof/>
               </w:rPr>
-              <w:instrText xml:space="preserve"> PAGEREF _Toc243476521 \h </w:instrText>
+              <w:instrText xml:space="preserve"> PAGEREF _Toc243478099 \h </w:instrText>
             </w:r>
             <w:r>
               <w:rPr>
@@ -525,7 +525,7 @@
               <w:noProof/>
             </w:rPr>
           </w:pPr>
-          <w:hyperlink w:anchor="_Toc243476522" w:history="1">
+          <w:hyperlink w:anchor="_Toc243478100" w:history="1">
             <w:r>
               <w:rPr>
                 <w:rStyle w:val="Collegamentoipertestuale"/>
@@ -549,7 +549,7 @@
               <w:rPr>
                 <w:noProof/>
               </w:rPr>
-              <w:instrText xml:space="preserve"> PAGEREF _Toc243476522 \h </w:instrText>
+              <w:instrText xml:space="preserve"> PAGEREF _Toc243478100 \h </w:instrText>
             </w:r>
             <w:r>
               <w:rPr>
@@ -586,7 +586,7 @@
               <w:noProof/>
             </w:rPr>
           </w:pPr>
-          <w:hyperlink w:anchor="_Toc243476523" w:history="1">
+          <w:hyperlink w:anchor="_Toc243478101" w:history="1">
             <w:r>
               <w:rPr>
                 <w:rStyle w:val="Collegamentoipertestuale"/>
@@ -610,7 +610,7 @@
               <w:rPr>
                 <w:noProof/>
               </w:rPr>
-              <w:instrText xml:space="preserve"> PAGEREF _Toc243476523 \h </w:instrText>
+              <w:instrText xml:space="preserve"> PAGEREF _Toc243478101 \h </w:instrText>
             </w:r>
             <w:r>
               <w:rPr>
@@ -647,7 +647,7 @@
               <w:noProof/>
             </w:rPr>
           </w:pPr>
-          <w:hyperlink w:anchor="_Toc243476524" w:history="1">
+          <w:hyperlink w:anchor="_Toc243478102" w:history="1">
             <w:r>
               <w:rPr>
                 <w:rStyle w:val="Collegamentoipertestuale"/>
@@ -671,7 +671,7 @@
               <w:rPr>
                 <w:noProof/>
               </w:rPr>
-              <w:instrText xml:space="preserve"> PAGEREF _Toc243476524 \h </w:instrText>
+              <w:instrText xml:space="preserve"> PAGEREF _Toc243478102 \h </w:instrText>
             </w:r>
             <w:r>
               <w:rPr>
@@ -708,7 +708,7 @@
               <w:noProof/>
             </w:rPr>
           </w:pPr>
-          <w:hyperlink w:anchor="_Toc243476525" w:history="1">
+          <w:hyperlink w:anchor="_Toc243478103" w:history="1">
             <w:r>
               <w:rPr>
                 <w:rStyle w:val="Collegamentoipertestuale"/>
@@ -732,7 +732,7 @@
               <w:rPr>
                 <w:noProof/>
               </w:rPr>
-              <w:instrText xml:space="preserve"> PAGEREF _Toc243476525 \h </w:instrText>
+              <w:instrText xml:space="preserve"> PAGEREF _Toc243478103 \h </w:instrText>
             </w:r>
             <w:r>
               <w:rPr>
@@ -769,7 +769,7 @@
               <w:noProof/>
             </w:rPr>
           </w:pPr>
-          <w:hyperlink w:anchor="_Toc243476526" w:history="1">
+          <w:hyperlink w:anchor="_Toc243478104" w:history="1">
             <w:r>
               <w:rPr>
                 <w:rStyle w:val="Collegamentoipertestuale"/>
@@ -793,7 +793,7 @@
               <w:rPr>
                 <w:noProof/>
               </w:rPr>
-              <w:instrText xml:space="preserve"> PAGEREF _Toc243476526 \h </w:instrText>
+              <w:instrText xml:space="preserve"> PAGEREF _Toc243478104 \h </w:instrText>
             </w:r>
             <w:r>
               <w:rPr>
@@ -830,7 +830,7 @@
               <w:noProof/>
             </w:rPr>
           </w:pPr>
-          <w:hyperlink w:anchor="_Toc243476527" w:history="1">
+          <w:hyperlink w:anchor="_Toc243478105" w:history="1">
             <w:r>
               <w:rPr>
                 <w:rStyle w:val="Collegamentoipertestuale"/>
@@ -854,7 +854,7 @@
               <w:rPr>
                 <w:noProof/>
               </w:rPr>
-              <w:instrText xml:space="preserve"> PAGEREF _Toc243476527 \h </w:instrText>
+              <w:instrText xml:space="preserve"> PAGEREF _Toc243478105 \h </w:instrText>
             </w:r>
             <w:r>
               <w:rPr>
@@ -891,7 +891,7 @@
               <w:noProof/>
             </w:rPr>
           </w:pPr>
-          <w:hyperlink w:anchor="_Toc243476528" w:history="1">
+          <w:hyperlink w:anchor="_Toc243478106" w:history="1">
             <w:r>
               <w:rPr>
                 <w:rStyle w:val="Collegamentoipertestuale"/>
@@ -915,7 +915,7 @@
               <w:rPr>
                 <w:noProof/>
               </w:rPr>
-              <w:instrText xml:space="preserve"> PAGEREF _Toc243476528 \h </w:instrText>
+              <w:instrText xml:space="preserve"> PAGEREF _Toc243478106 \h </w:instrText>
             </w:r>
             <w:r>
               <w:rPr>
@@ -952,7 +952,7 @@
               <w:noProof/>
             </w:rPr>
           </w:pPr>
-          <w:hyperlink w:anchor="_Toc243476529" w:history="1">
+          <w:hyperlink w:anchor="_Toc243478107" w:history="1">
             <w:r>
               <w:rPr>
                 <w:rStyle w:val="Collegamentoipertestuale"/>
@@ -976,7 +976,7 @@
               <w:rPr>
                 <w:noProof/>
               </w:rPr>
-              <w:instrText xml:space="preserve"> PAGEREF _Toc243476529 \h </w:instrText>
+              <w:instrText xml:space="preserve"> PAGEREF _Toc243478107 \h </w:instrText>
             </w:r>
             <w:r>
               <w:rPr>
@@ -1013,7 +1013,7 @@
               <w:noProof/>
             </w:rPr>
           </w:pPr>
-          <w:hyperlink w:anchor="_Toc243476530" w:history="1">
+          <w:hyperlink w:anchor="_Toc243478108" w:history="1">
             <w:r>
               <w:rPr>
                 <w:rStyle w:val="Collegamentoipertestuale"/>
@@ -1037,7 +1037,7 @@
               <w:rPr>
                 <w:noProof/>
               </w:rPr>
-              <w:instrText xml:space="preserve"> PAGEREF _Toc243476530 \h </w:instrText>
+              <w:instrText xml:space="preserve"> PAGEREF _Toc243478108 \h </w:instrText>
             </w:r>
             <w:r>
               <w:rPr>
@@ -1074,7 +1074,7 @@
               <w:noProof/>
             </w:rPr>
           </w:pPr>
-          <w:hyperlink w:anchor="_Toc243476531" w:history="1">
+          <w:hyperlink w:anchor="_Toc243478109" w:history="1">
             <w:r>
               <w:rPr>
                 <w:rStyle w:val="Collegamentoipertestuale"/>
@@ -1098,7 +1098,7 @@
               <w:rPr>
                 <w:noProof/>
               </w:rPr>
-              <w:instrText xml:space="preserve"> PAGEREF _Toc243476531 \h </w:instrText>
+              <w:instrText xml:space="preserve"> PAGEREF _Toc243478109 \h </w:instrText>
             </w:r>
             <w:r>
               <w:rPr>
@@ -1135,7 +1135,7 @@
               <w:noProof/>
             </w:rPr>
           </w:pPr>
-          <w:hyperlink w:anchor="_Toc243476532" w:history="1">
+          <w:hyperlink w:anchor="_Toc243478110" w:history="1">
             <w:r>
               <w:rPr>
                 <w:rStyle w:val="Collegamentoipertestuale"/>
@@ -1159,7 +1159,7 @@
               <w:rPr>
                 <w:noProof/>
               </w:rPr>
-              <w:instrText xml:space="preserve"> PAGEREF _Toc243476532 \h </w:instrText>
+              <w:instrText xml:space="preserve"> PAGEREF _Toc243478110 \h </w:instrText>
             </w:r>
             <w:r>
               <w:rPr>
@@ -1196,7 +1196,7 @@
               <w:noProof/>
             </w:rPr>
           </w:pPr>
-          <w:hyperlink w:anchor="_Toc243476533" w:history="1">
+          <w:hyperlink w:anchor="_Toc243478111" w:history="1">
             <w:r>
               <w:rPr>
                 <w:rStyle w:val="Collegamentoipertestuale"/>
@@ -1220,7 +1220,7 @@
               <w:rPr>
                 <w:noProof/>
               </w:rPr>
-              <w:instrText xml:space="preserve"> PAGEREF _Toc243476533 \h </w:instrText>
+              <w:instrText xml:space="preserve"> PAGEREF _Toc243478111 \h </w:instrText>
             </w:r>
             <w:r>
               <w:rPr>
@@ -1257,7 +1257,7 @@
               <w:noProof/>
             </w:rPr>
           </w:pPr>
-          <w:hyperlink w:anchor="_Toc243476534" w:history="1">
+          <w:hyperlink w:anchor="_Toc243478112" w:history="1">
             <w:r>
               <w:rPr>
                 <w:rStyle w:val="Collegamentoipertestuale"/>
@@ -1281,7 +1281,7 @@
               <w:rPr>
                 <w:noProof/>
               </w:rPr>
-              <w:instrText xml:space="preserve"> PAGEREF _Toc243476534 \h </w:instrText>
+              <w:instrText xml:space="preserve"> PAGEREF _Toc243478112 \h </w:instrText>
             </w:r>
             <w:r>
               <w:rPr>
@@ -1318,7 +1318,7 @@
               <w:noProof/>
             </w:rPr>
           </w:pPr>
-          <w:hyperlink w:anchor="_Toc243476535" w:history="1">
+          <w:hyperlink w:anchor="_Toc243478113" w:history="1">
             <w:r>
               <w:rPr>
                 <w:rStyle w:val="Collegamentoipertestuale"/>
@@ -1342,7 +1342,7 @@
               <w:rPr>
                 <w:noProof/>
               </w:rPr>
-              <w:instrText xml:space="preserve"> PAGEREF _Toc243476535 \h </w:instrText>
+              <w:instrText xml:space="preserve"> PAGEREF _Toc243478113 \h </w:instrText>
             </w:r>
             <w:r>
               <w:rPr>
@@ -1379,7 +1379,7 @@
               <w:noProof/>
             </w:rPr>
           </w:pPr>
-          <w:hyperlink w:anchor="_Toc243476536" w:history="1">
+          <w:hyperlink w:anchor="_Toc243478114" w:history="1">
             <w:r>
               <w:rPr>
                 <w:rStyle w:val="Collegamentoipertestuale"/>
@@ -1403,7 +1403,7 @@
               <w:rPr>
                 <w:noProof/>
               </w:rPr>
-              <w:instrText xml:space="preserve"> PAGEREF _Toc243476536 \h </w:instrText>
+              <w:instrText xml:space="preserve"> PAGEREF _Toc243478114 \h </w:instrText>
             </w:r>
             <w:r>
               <w:rPr>
@@ -1440,7 +1440,7 @@
               <w:noProof/>
             </w:rPr>
           </w:pPr>
-          <w:hyperlink w:anchor="_Toc243476537" w:history="1">
+          <w:hyperlink w:anchor="_Toc243478115" w:history="1">
             <w:r>
               <w:rPr>
                 <w:rStyle w:val="Collegamentoipertestuale"/>
@@ -1464,7 +1464,7 @@
               <w:rPr>
                 <w:noProof/>
               </w:rPr>
-              <w:instrText xml:space="preserve"> PAGEREF _Toc243476537 \h </w:instrText>
+              <w:instrText xml:space="preserve"> PAGEREF _Toc243478115 \h </w:instrText>
             </w:r>
             <w:r>
               <w:rPr>
@@ -1501,7 +1501,7 @@
               <w:noProof/>
             </w:rPr>
           </w:pPr>
-          <w:hyperlink w:anchor="_Toc243476538" w:history="1">
+          <w:hyperlink w:anchor="_Toc243478116" w:history="1">
             <w:r>
               <w:rPr>
                 <w:rStyle w:val="Collegamentoipertestuale"/>
@@ -1525,7 +1525,7 @@
               <w:rPr>
                 <w:noProof/>
               </w:rPr>
-              <w:instrText xml:space="preserve"> PAGEREF _Toc243476538 \h </w:instrText>
+              <w:instrText xml:space="preserve"> PAGEREF _Toc243478116 \h </w:instrText>
             </w:r>
             <w:r>
               <w:rPr>
@@ -1562,7 +1562,7 @@
               <w:noProof/>
             </w:rPr>
           </w:pPr>
-          <w:hyperlink w:anchor="_Toc243476539" w:history="1">
+          <w:hyperlink w:anchor="_Toc243478117" w:history="1">
             <w:r>
               <w:rPr>
                 <w:rStyle w:val="Collegamentoipertestuale"/>
@@ -1586,7 +1586,7 @@
               <w:rPr>
                 <w:noProof/>
               </w:rPr>
-              <w:instrText xml:space="preserve"> PAGEREF _Toc243476539 \h </w:instrText>
+              <w:instrText xml:space="preserve"> PAGEREF _Toc243478117 \h </w:instrText>
             </w:r>
             <w:r>
               <w:rPr>
@@ -1623,7 +1623,7 @@
               <w:noProof/>
             </w:rPr>
           </w:pPr>
-          <w:hyperlink w:anchor="_Toc243476540" w:history="1">
+          <w:hyperlink w:anchor="_Toc243478118" w:history="1">
             <w:r>
               <w:rPr>
                 <w:rStyle w:val="Collegamentoipertestuale"/>
@@ -1647,7 +1647,7 @@
               <w:rPr>
                 <w:noProof/>
               </w:rPr>
-              <w:instrText xml:space="preserve"> PAGEREF _Toc243476540 \h </w:instrText>
+              <w:instrText xml:space="preserve"> PAGEREF _Toc243478118 \h </w:instrText>
             </w:r>
             <w:r>
               <w:rPr>
@@ -1684,7 +1684,7 @@
               <w:noProof/>
             </w:rPr>
           </w:pPr>
-          <w:hyperlink w:anchor="_Toc243476541" w:history="1">
+          <w:hyperlink w:anchor="_Toc243478119" w:history="1">
             <w:r>
               <w:rPr>
                 <w:rStyle w:val="Collegamentoipertestuale"/>
@@ -1708,7 +1708,7 @@
               <w:rPr>
                 <w:noProof/>
               </w:rPr>
-              <w:instrText xml:space="preserve"> PAGEREF _Toc243476541 \h </w:instrText>
+              <w:instrText xml:space="preserve"> PAGEREF _Toc243478119 \h </w:instrText>
             </w:r>
             <w:r>
               <w:rPr>
@@ -1745,7 +1745,7 @@
               <w:noProof/>
             </w:rPr>
           </w:pPr>
-          <w:hyperlink w:anchor="_Toc243476542" w:history="1">
+          <w:hyperlink w:anchor="_Toc243478120" w:history="1">
             <w:r>
               <w:rPr>
                 <w:rStyle w:val="Collegamentoipertestuale"/>
@@ -1769,7 +1769,7 @@
               <w:rPr>
                 <w:noProof/>
               </w:rPr>
-              <w:instrText xml:space="preserve"> PAGEREF _Toc243476542 \h </w:instrText>
+              <w:instrText xml:space="preserve"> PAGEREF _Toc243478120 \h </w:instrText>
             </w:r>
             <w:r>
               <w:rPr>
@@ -1806,7 +1806,7 @@
               <w:noProof/>
             </w:rPr>
           </w:pPr>
-          <w:hyperlink w:anchor="_Toc243476543" w:history="1">
+          <w:hyperlink w:anchor="_Toc243478121" w:history="1">
             <w:r>
               <w:rPr>
                 <w:rStyle w:val="Collegamentoipertestuale"/>
@@ -1830,7 +1830,7 @@
               <w:rPr>
                 <w:noProof/>
               </w:rPr>
-              <w:instrText xml:space="preserve"> PAGEREF _Toc243476543 \h </w:instrText>
+              <w:instrText xml:space="preserve"> PAGEREF _Toc243478121 \h </w:instrText>
             </w:r>
             <w:r>
               <w:rPr>
@@ -1867,7 +1867,7 @@
               <w:noProof/>
             </w:rPr>
           </w:pPr>
-          <w:hyperlink w:anchor="_Toc243476544" w:history="1">
+          <w:hyperlink w:anchor="_Toc243478122" w:history="1">
             <w:r>
               <w:rPr>
                 <w:rStyle w:val="Collegamentoipertestuale"/>
@@ -1891,7 +1891,7 @@
               <w:rPr>
                 <w:noProof/>
               </w:rPr>
-              <w:instrText xml:space="preserve"> PAGEREF _Toc243476544 \h </w:instrText>
+              <w:instrText xml:space="preserve"> PAGEREF _Toc243478122 \h </w:instrText>
             </w:r>
             <w:r>
               <w:rPr>
@@ -1928,7 +1928,7 @@
               <w:noProof/>
             </w:rPr>
           </w:pPr>
-          <w:hyperlink w:anchor="_Toc243476545" w:history="1">
+          <w:hyperlink w:anchor="_Toc243478123" w:history="1">
             <w:r>
               <w:rPr>
                 <w:rStyle w:val="Collegamentoipertestuale"/>
@@ -1952,7 +1952,7 @@
               <w:rPr>
                 <w:noProof/>
               </w:rPr>
-              <w:instrText xml:space="preserve"> PAGEREF _Toc243476545 \h </w:instrText>
+              <w:instrText xml:space="preserve"> PAGEREF _Toc243478123 \h </w:instrText>
             </w:r>
             <w:r>
               <w:rPr>
@@ -1989,7 +1989,7 @@
               <w:noProof/>
             </w:rPr>
           </w:pPr>
-          <w:hyperlink w:anchor="_Toc243476546" w:history="1">
+          <w:hyperlink w:anchor="_Toc243478124" w:history="1">
             <w:r>
               <w:rPr>
                 <w:rStyle w:val="Collegamentoipertestuale"/>
@@ -2013,7 +2013,7 @@
               <w:rPr>
                 <w:noProof/>
               </w:rPr>
-              <w:instrText xml:space="preserve"> PAGEREF _Toc243476546 \h </w:instrText>
+              <w:instrText xml:space="preserve"> PAGEREF _Toc243478124 \h </w:instrText>
             </w:r>
             <w:r>
               <w:rPr>
@@ -2050,13 +2050,13 @@
               <w:noProof/>
             </w:rPr>
           </w:pPr>
-          <w:hyperlink w:anchor="_Toc243476547" w:history="1">
+          <w:hyperlink w:anchor="_Toc243478125" w:history="1">
             <w:r>
               <w:rPr>
                 <w:rStyle w:val="Collegamentoipertestuale"/>
                 <w:noProof/>
               </w:rPr>
-              <w:t>6.7 Versione 1.1.0</w:t>
+              <w:t>6.7 Release 1.1.0</w:t>
             </w:r>
             <w:r>
               <w:rPr>
@@ -2074,7 +2074,7 @@
               <w:rPr>
                 <w:noProof/>
               </w:rPr>
-              <w:instrText xml:space="preserve"> PAGEREF _Toc243476547 \h </w:instrText>
+              <w:instrText xml:space="preserve"> PAGEREF _Toc243478125 \h </w:instrText>
             </w:r>
             <w:r>
               <w:rPr>
@@ -2111,7 +2111,7 @@
               <w:noProof/>
             </w:rPr>
           </w:pPr>
-          <w:hyperlink w:anchor="_Toc243476548" w:history="1">
+          <w:hyperlink w:anchor="_Toc243478126" w:history="1">
             <w:r>
               <w:rPr>
                 <w:rStyle w:val="Collegamentoipertestuale"/>
@@ -2135,7 +2135,7 @@
               <w:rPr>
                 <w:noProof/>
               </w:rPr>
-              <w:instrText xml:space="preserve"> PAGEREF _Toc243476548 \h </w:instrText>
+              <w:instrText xml:space="preserve"> PAGEREF _Toc243478126 \h </w:instrText>
             </w:r>
             <w:r>
               <w:rPr>
@@ -2152,7 +2152,7 @@
               <w:rPr>
                 <w:noProof/>
               </w:rPr>
-              <w:t>16</w:t>
+              <w:t>17</w:t>
             </w:r>
             <w:r>
               <w:rPr>
@@ -2172,7 +2172,7 @@
               <w:noProof/>
             </w:rPr>
           </w:pPr>
-          <w:hyperlink w:anchor="_Toc243476549" w:history="1">
+          <w:hyperlink w:anchor="_Toc243478127" w:history="1">
             <w:r>
               <w:rPr>
                 <w:rStyle w:val="Collegamentoipertestuale"/>
@@ -2196,7 +2196,7 @@
               <w:rPr>
                 <w:noProof/>
               </w:rPr>
-              <w:instrText xml:space="preserve"> PAGEREF _Toc243476549 \h </w:instrText>
+              <w:instrText xml:space="preserve"> PAGEREF _Toc243478127 \h </w:instrText>
             </w:r>
             <w:r>
               <w:rPr>
@@ -2213,7 +2213,7 @@
               <w:rPr>
                 <w:noProof/>
               </w:rPr>
-              <w:t>16</w:t>
+              <w:t>17</w:t>
             </w:r>
             <w:r>
               <w:rPr>
@@ -2233,7 +2233,7 @@
               <w:noProof/>
             </w:rPr>
           </w:pPr>
-          <w:hyperlink w:anchor="_Toc243476550" w:history="1">
+          <w:hyperlink w:anchor="_Toc243478128" w:history="1">
             <w:r>
               <w:rPr>
                 <w:rStyle w:val="Collegamentoipertestuale"/>
@@ -2257,7 +2257,7 @@
               <w:rPr>
                 <w:noProof/>
               </w:rPr>
-              <w:instrText xml:space="preserve"> PAGEREF _Toc243476550 \h </w:instrText>
+              <w:instrText xml:space="preserve"> PAGEREF _Toc243478128 \h </w:instrText>
             </w:r>
             <w:r>
               <w:rPr>
@@ -2294,7 +2294,7 @@
               <w:noProof/>
             </w:rPr>
           </w:pPr>
-          <w:hyperlink w:anchor="_Toc243476551" w:history="1">
+          <w:hyperlink w:anchor="_Toc243478129" w:history="1">
             <w:r>
               <w:rPr>
                 <w:rStyle w:val="Collegamentoipertestuale"/>
@@ -2318,7 +2318,7 @@
               <w:rPr>
                 <w:noProof/>
               </w:rPr>
-              <w:instrText xml:space="preserve"> PAGEREF _Toc243476551 \h </w:instrText>
+              <w:instrText xml:space="preserve"> PAGEREF _Toc243478129 \h </w:instrText>
             </w:r>
             <w:r>
               <w:rPr>
@@ -2361,7 +2361,7 @@
       <w:pPr>
         <w:pStyle w:val="Titolo1"/>
       </w:pPr>
-      <w:bookmarkStart w:id="0" w:name="_Toc243476516"/>
+      <w:bookmarkStart w:id="0" w:name="_Toc243478094"/>
       <w:r>
         <w:lastRenderedPageBreak/>
         <w:t>1. In breve</w:t>
@@ -2613,7 +2613,7 @@
       <w:pPr>
         <w:pStyle w:val="Titolo1"/>
       </w:pPr>
-      <w:bookmarkStart w:id="1" w:name="_Toc243476517"/>
+      <w:bookmarkStart w:id="1" w:name="_Toc243478095"/>
       <w:r>
         <w:t>2. Nuovo marchio</w:t>
       </w:r>
@@ -2623,7 +2623,7 @@
       <w:pPr>
         <w:pStyle w:val="Titolo2"/>
       </w:pPr>
-      <w:bookmarkStart w:id="2" w:name="_Toc243476518"/>
+      <w:bookmarkStart w:id="2" w:name="_Toc243478096"/>
       <w:r>
         <w:t>2.1 Nomi e identificativi</w:t>
       </w:r>
@@ -3169,7 +3169,7 @@
       <w:pPr>
         <w:pStyle w:val="Titolo2"/>
       </w:pPr>
-      <w:bookmarkStart w:id="3" w:name="_Toc243476519"/>
+      <w:bookmarkStart w:id="3" w:name="_Toc243478097"/>
       <w:r>
         <w:lastRenderedPageBreak/>
         <w:t>2.2 Colori</w:t>
@@ -3565,7 +3565,7 @@
       <w:pPr>
         <w:pStyle w:val="Titolo2"/>
       </w:pPr>
-      <w:bookmarkStart w:id="4" w:name="_Toc243476520"/>
+      <w:bookmarkStart w:id="4" w:name="_Toc243478098"/>
       <w:r>
         <w:t>2.3 Icona in uso: 17 «Foglio oro» (serie 4)</w:t>
       </w:r>
@@ -3599,7 +3599,7 @@
           <w:noProof/>
         </w:rPr>
         <w:drawing>
-          <wp:inline distT="0" distB="0" distL="0" distR="0" wp14:anchorId="25A2E309" wp14:editId="74EC8577">
+          <wp:inline distT="0" distB="0" distL="0" distR="0" wp14:anchorId="2F15990E" wp14:editId="6A9D7E2F">
             <wp:extent cx="5334000" cy="5895975"/>
             <wp:effectExtent l="0" t="0" r="0" b="0"/>
             <wp:docPr id="2" name="Immagine 2"/>
@@ -4020,7 +4020,7 @@
       <w:pPr>
         <w:pStyle w:val="Titolo2"/>
       </w:pPr>
-      <w:bookmarkStart w:id="5" w:name="_Toc243476521"/>
+      <w:bookmarkStart w:id="5" w:name="_Toc243478099"/>
       <w:r>
         <w:t>2.4 Serie 3, non scelta (la 11 è diventata la serie 4)</w:t>
       </w:r>
@@ -4044,7 +4044,7 @@
           <w:noProof/>
         </w:rPr>
         <w:drawing>
-          <wp:inline distT="0" distB="0" distL="0" distR="0" wp14:anchorId="30C92516" wp14:editId="2FA08466">
+          <wp:inline distT="0" distB="0" distL="0" distR="0" wp14:anchorId="36FEB195" wp14:editId="63EF792B">
             <wp:extent cx="5905500" cy="4133850"/>
             <wp:effectExtent l="0" t="0" r="0" b="0"/>
             <wp:docPr id="3" name="Immagine 3"/>
@@ -4731,7 +4731,7 @@
       <w:pPr>
         <w:pStyle w:val="Titolo2"/>
       </w:pPr>
-      <w:bookmarkStart w:id="6" w:name="_Toc243476522"/>
+      <w:bookmarkStart w:id="6" w:name="_Toc243478100"/>
       <w:r>
         <w:t>2.5 Serie 2, non scelta</w:t>
       </w:r>
@@ -4755,7 +4755,7 @@
           <w:noProof/>
         </w:rPr>
         <w:drawing>
-          <wp:inline distT="0" distB="0" distL="0" distR="0" wp14:anchorId="3C041ADE" wp14:editId="04877A03">
+          <wp:inline distT="0" distB="0" distL="0" distR="0" wp14:anchorId="750850DE" wp14:editId="5B134437">
             <wp:extent cx="5905500" cy="4133850"/>
             <wp:effectExtent l="0" t="0" r="0" b="0"/>
             <wp:docPr id="4" name="Immagine 4"/>
@@ -5476,7 +5476,7 @@
       <w:pPr>
         <w:pStyle w:val="Titolo2"/>
       </w:pPr>
-      <w:bookmarkStart w:id="7" w:name="_Toc243476523"/>
+      <w:bookmarkStart w:id="7" w:name="_Toc243478101"/>
       <w:r>
         <w:t>2.6 Serie 1, scartata</w:t>
       </w:r>
@@ -5500,7 +5500,7 @@
           <w:noProof/>
         </w:rPr>
         <w:drawing>
-          <wp:inline distT="0" distB="0" distL="0" distR="0" wp14:anchorId="5C6083E1" wp14:editId="7DB030D1">
+          <wp:inline distT="0" distB="0" distL="0" distR="0" wp14:anchorId="0D2CDDA8" wp14:editId="0D402A2F">
             <wp:extent cx="4000500" cy="2800350"/>
             <wp:effectExtent l="0" t="0" r="0" b="0"/>
             <wp:docPr id="5" name="Immagine 5"/>
@@ -5559,7 +5559,7 @@
       <w:pPr>
         <w:pStyle w:val="Titolo2"/>
       </w:pPr>
-      <w:bookmarkStart w:id="8" w:name="_Toc243476524"/>
+      <w:bookmarkStart w:id="8" w:name="_Toc243478102"/>
       <w:r>
         <w:t>2.7 Verifica dei marchi registrati</w:t>
       </w:r>
@@ -5811,7 +5811,7 @@
       <w:pPr>
         <w:pStyle w:val="Titolo1"/>
       </w:pPr>
-      <w:bookmarkStart w:id="9" w:name="_Toc243476525"/>
+      <w:bookmarkStart w:id="9" w:name="_Toc243478103"/>
       <w:r>
         <w:t>3. Temi colore</w:t>
       </w:r>
@@ -5846,7 +5846,7 @@
         </w:rPr>
         <w:lastRenderedPageBreak/>
         <w:drawing>
-          <wp:inline distT="0" distB="0" distL="0" distR="0" wp14:anchorId="6B4DB936" wp14:editId="1FC72D0D">
+          <wp:inline distT="0" distB="0" distL="0" distR="0" wp14:anchorId="719F10BB" wp14:editId="7E51D6F5">
             <wp:extent cx="4572000" cy="3429000"/>
             <wp:effectExtent l="0" t="0" r="0" b="0"/>
             <wp:docPr id="6" name="Immagine 6"/>
@@ -6556,7 +6556,7 @@
       <w:pPr>
         <w:pStyle w:val="Titolo1"/>
       </w:pPr>
-      <w:bookmarkStart w:id="10" w:name="_Toc243476526"/>
+      <w:bookmarkStart w:id="10" w:name="_Toc243478104"/>
       <w:r>
         <w:t>4. Correzione: avvisi «come JavaScript»</w:t>
       </w:r>
@@ -6566,7 +6566,7 @@
       <w:pPr>
         <w:pStyle w:val="Titolo2"/>
       </w:pPr>
-      <w:bookmarkStart w:id="11" w:name="_Toc243476527"/>
+      <w:bookmarkStart w:id="11" w:name="_Toc243478105"/>
       <w:r>
         <w:t>4.1 Il problema</w:t>
       </w:r>
@@ -6969,7 +6969,7 @@
       <w:pPr>
         <w:pStyle w:val="Titolo2"/>
       </w:pPr>
-      <w:bookmarkStart w:id="12" w:name="_Toc243476528"/>
+      <w:bookmarkStart w:id="12" w:name="_Toc243478106"/>
       <w:r>
         <w:t>4.2 La soluzione</w:t>
       </w:r>
@@ -7102,7 +7102,7 @@
           <w:noProof/>
         </w:rPr>
         <w:drawing>
-          <wp:inline distT="0" distB="0" distL="0" distR="0" wp14:anchorId="37181CDF" wp14:editId="331865FD">
+          <wp:inline distT="0" distB="0" distL="0" distR="0" wp14:anchorId="24B06D1E" wp14:editId="1F56D1F8">
             <wp:extent cx="4572000" cy="3429000"/>
             <wp:effectExtent l="0" t="0" r="0" b="0"/>
             <wp:docPr id="7" name="Immagine 7"/>
@@ -7161,7 +7161,7 @@
       <w:pPr>
         <w:pStyle w:val="Titolo2"/>
       </w:pPr>
-      <w:bookmarkStart w:id="13" w:name="_Toc243476529"/>
+      <w:bookmarkStart w:id="13" w:name="_Toc243478107"/>
       <w:r>
         <w:t>4.3 Verifiche</w:t>
       </w:r>
@@ -7208,7 +7208,7 @@
       <w:pPr>
         <w:pStyle w:val="Titolo2"/>
       </w:pPr>
-      <w:bookmarkStart w:id="14" w:name="_Toc243476530"/>
+      <w:bookmarkStart w:id="14" w:name="_Toc243478108"/>
       <w:r>
         <w:t>4.4 Android: menu Tema e notifiche (versione 1.0.1)</w:t>
       </w:r>
@@ -7544,7 +7544,7 @@
       <w:pPr>
         <w:pStyle w:val="Titolo2"/>
       </w:pPr>
-      <w:bookmarkStart w:id="15" w:name="_Toc243476531"/>
+      <w:bookmarkStart w:id="15" w:name="_Toc243478109"/>
       <w:r>
         <w:t>4.5 App più leggera: traduzione tolta</w:t>
       </w:r>
@@ -7977,7 +7977,7 @@
       <w:pPr>
         <w:pStyle w:val="Titolo2"/>
       </w:pPr>
-      <w:bookmarkStart w:id="16" w:name="_Toc243476532"/>
+      <w:bookmarkStart w:id="16" w:name="_Toc243478110"/>
       <w:r>
         <w:t>4.6 Schede in una nuova finestra</w:t>
       </w:r>
@@ -8095,7 +8095,7 @@
           <w:noProof/>
         </w:rPr>
         <w:drawing>
-          <wp:inline distT="0" distB="0" distL="0" distR="0" wp14:anchorId="4A0D5F9E" wp14:editId="7E1A1FE3">
+          <wp:inline distT="0" distB="0" distL="0" distR="0" wp14:anchorId="60C1E82A" wp14:editId="09F481A1">
             <wp:extent cx="5715000" cy="857250"/>
             <wp:effectExtent l="0" t="0" r="0" b="0"/>
             <wp:docPr id="8" name="Immagine 8"/>
@@ -8385,7 +8385,7 @@
       <w:pPr>
         <w:pStyle w:val="Titolo1"/>
       </w:pPr>
-      <w:bookmarkStart w:id="17" w:name="_Toc243476533"/>
+      <w:bookmarkStart w:id="17" w:name="_Toc243478111"/>
       <w:r>
         <w:t>5. Decisioni</w:t>
       </w:r>
@@ -8403,7 +8403,7 @@
       <w:pPr>
         <w:pStyle w:val="Titolo2"/>
       </w:pPr>
-      <w:bookmarkStart w:id="18" w:name="_Toc243476534"/>
+      <w:bookmarkStart w:id="18" w:name="_Toc243478112"/>
       <w:r>
         <w:t>5.1 Canale degli aggiornamenti</w:t>
       </w:r>
@@ -8910,7 +8910,7 @@
       <w:pPr>
         <w:pStyle w:val="Titolo2"/>
       </w:pPr>
-      <w:bookmarkStart w:id="19" w:name="_Toc243476535"/>
+      <w:bookmarkStart w:id="19" w:name="_Toc243478113"/>
       <w:r>
         <w:t>5.2 Storia del repository</w:t>
       </w:r>
@@ -9418,7 +9418,7 @@
       <w:pPr>
         <w:pStyle w:val="Titolo2"/>
       </w:pPr>
-      <w:bookmarkStart w:id="20" w:name="_Toc243476536"/>
+      <w:bookmarkStart w:id="20" w:name="_Toc243478114"/>
       <w:r>
         <w:t>5.3 Identificativi del prodotto</w:t>
       </w:r>
@@ -9918,7 +9918,7 @@
       <w:pPr>
         <w:pStyle w:val="Titolo2"/>
       </w:pPr>
-      <w:bookmarkStart w:id="21" w:name="_Toc243476537"/>
+      <w:bookmarkStart w:id="21" w:name="_Toc243478115"/>
       <w:r>
         <w:t>5.4 Avvisi e domande</w:t>
       </w:r>
@@ -10425,7 +10425,7 @@
       <w:pPr>
         <w:pStyle w:val="Titolo2"/>
       </w:pPr>
-      <w:bookmarkStart w:id="22" w:name="_Toc243476538"/>
+      <w:bookmarkStart w:id="22" w:name="_Toc243478116"/>
       <w:r>
         <w:t>5.5 Traduzione offline</w:t>
       </w:r>
@@ -10933,7 +10933,7 @@
       <w:pPr>
         <w:pStyle w:val="Titolo2"/>
       </w:pPr>
-      <w:bookmarkStart w:id="23" w:name="_Toc243476539"/>
+      <w:bookmarkStart w:id="23" w:name="_Toc243478117"/>
       <w:r>
         <w:t>5.6 Passaggio della scheda alla nuova finestra</w:t>
       </w:r>
@@ -11455,7 +11455,7 @@
       <w:pPr>
         <w:pStyle w:val="Titolo1"/>
       </w:pPr>
-      <w:bookmarkStart w:id="24" w:name="_Toc243476540"/>
+      <w:bookmarkStart w:id="24" w:name="_Toc243478118"/>
       <w:r>
         <w:t>6. Come si lavora</w:t>
       </w:r>
@@ -11465,7 +11465,7 @@
       <w:pPr>
         <w:pStyle w:val="Titolo2"/>
       </w:pPr>
-      <w:bookmarkStart w:id="25" w:name="_Toc243476541"/>
+      <w:bookmarkStart w:id="25" w:name="_Toc243478119"/>
       <w:r>
         <w:t>6.1 Comandi</w:t>
       </w:r>
@@ -11535,7 +11535,7 @@
       <w:pPr>
         <w:pStyle w:val="Titolo2"/>
       </w:pPr>
-      <w:bookmarkStart w:id="26" w:name="_Toc243476542"/>
+      <w:bookmarkStart w:id="26" w:name="_Toc243478120"/>
       <w:r>
         <w:lastRenderedPageBreak/>
         <w:t>6.2 Pubblicare una versione</w:t>
@@ -11664,7 +11664,7 @@
       <w:pPr>
         <w:pStyle w:val="Titolo2"/>
       </w:pPr>
-      <w:bookmarkStart w:id="27" w:name="_Toc243476543"/>
+      <w:bookmarkStart w:id="27" w:name="_Toc243478121"/>
       <w:r>
         <w:t>6.3 Release 1.0.0 (pubblicata il 16 ottobre 2026)</w:t>
       </w:r>
@@ -12391,7 +12391,7 @@
       <w:pPr>
         <w:pStyle w:val="Titolo2"/>
       </w:pPr>
-      <w:bookmarkStart w:id="28" w:name="_Toc243476544"/>
+      <w:bookmarkStart w:id="28" w:name="_Toc243478122"/>
       <w:r>
         <w:t>6.4 Release 1.0.1</w:t>
       </w:r>
@@ -12689,7 +12689,7 @@
       <w:pPr>
         <w:pStyle w:val="Titolo2"/>
       </w:pPr>
-      <w:bookmarkStart w:id="29" w:name="_Toc243476545"/>
+      <w:bookmarkStart w:id="29" w:name="_Toc243478123"/>
       <w:r>
         <w:t>6.5 Release 1.0.2 e repository pubblico</w:t>
       </w:r>
@@ -13111,7 +13111,7 @@
       <w:pPr>
         <w:pStyle w:val="Titolo2"/>
       </w:pPr>
-      <w:bookmarkStart w:id="30" w:name="_Toc243476546"/>
+      <w:bookmarkStart w:id="30" w:name="_Toc243478124"/>
       <w:r>
         <w:t>6.6 Nuova versione: link diretto per ogni sistema</w:t>
       </w:r>
@@ -13529,7 +13529,7 @@
         </w:rPr>
         <w:lastRenderedPageBreak/>
         <w:drawing>
-          <wp:inline distT="0" distB="0" distL="0" distR="0" wp14:anchorId="4B465275" wp14:editId="63D62A3E">
+          <wp:inline distT="0" distB="0" distL="0" distR="0" wp14:anchorId="041DC653" wp14:editId="054E008C">
             <wp:extent cx="4572000" cy="4429125"/>
             <wp:effectExtent l="0" t="0" r="0" b="0"/>
             <wp:docPr id="9" name="Immagine 9"/>
@@ -13604,9 +13604,9 @@
       <w:pPr>
         <w:pStyle w:val="Titolo2"/>
       </w:pPr>
-      <w:bookmarkStart w:id="31" w:name="_Toc243476547"/>
-      <w:r>
-        <w:t>6.7 Versione 1.1.0</w:t>
+      <w:bookmarkStart w:id="31" w:name="_Toc243478125"/>
+      <w:r>
+        <w:t>6.7 Release 1.1.0</w:t>
       </w:r>
       <w:bookmarkEnd w:id="31"/>
     </w:p>
@@ -13615,7 +13615,534 @@
         <w:spacing w:after="120"/>
       </w:pPr>
       <w:r>
-        <w:t xml:space="preserve">Preparata il 21 ottobre 2026: numeri di versione (installer Windows 101.1.0, Android 1001001000), CHANGELOG e novità della campanella. Pubblicazione con il tag </w:t>
+        <w:t>Pubblicata il 21 ottobre 2026 (release «Latest»): numeri di versione (installer Windows 101.1.0, Android 1001001000), CHANGELOG e novità della campanella.</w:t>
+      </w:r>
+    </w:p>
+    <w:tbl>
+      <w:tblPr>
+        <w:tblW w:w="9638" w:type="dxa"/>
+        <w:tblBorders>
+          <w:top w:val="single" w:sz="4" w:space="0" w:color="auto"/>
+          <w:left w:val="single" w:sz="4" w:space="0" w:color="auto"/>
+          <w:bottom w:val="single" w:sz="4" w:space="0" w:color="auto"/>
+          <w:right w:val="single" w:sz="4" w:space="0" w:color="auto"/>
+          <w:insideH w:val="single" w:sz="4" w:space="0" w:color="auto"/>
+          <w:insideV w:val="single" w:sz="4" w:space="0" w:color="auto"/>
+        </w:tblBorders>
+        <w:tblLook w:val="04A0" w:firstRow="1" w:lastRow="0" w:firstColumn="1" w:lastColumn="0" w:noHBand="0" w:noVBand="1"/>
+      </w:tblPr>
+      <w:tblGrid>
+        <w:gridCol w:w="1928"/>
+        <w:gridCol w:w="4433"/>
+        <w:gridCol w:w="1638"/>
+        <w:gridCol w:w="1639"/>
+      </w:tblGrid>
+      <w:tr>
+        <w:trPr>
+          <w:tblHeader/>
+        </w:trPr>
+        <w:tc>
+          <w:tcPr>
+            <w:tcW w:w="1928" w:type="dxa"/>
+            <w:tcBorders>
+              <w:top w:val="single" w:sz="4" w:space="0" w:color="D4CEC7"/>
+              <w:left w:val="single" w:sz="4" w:space="0" w:color="D4CEC7"/>
+              <w:bottom w:val="single" w:sz="4" w:space="0" w:color="D4CEC7"/>
+              <w:right w:val="single" w:sz="4" w:space="0" w:color="D4CEC7"/>
+            </w:tcBorders>
+            <w:shd w:val="clear" w:color="auto" w:fill="B3122B"/>
+            <w:tcMar>
+              <w:top w:w="60" w:type="dxa"/>
+              <w:left w:w="100" w:type="dxa"/>
+              <w:bottom w:w="60" w:type="dxa"/>
+              <w:right w:w="100" w:type="dxa"/>
+            </w:tcMar>
+          </w:tcPr>
+          <w:p>
+            <w:r>
+              <w:rPr>
+                <w:b/>
+                <w:bCs/>
+                <w:color w:val="FFFFFF"/>
+              </w:rPr>
+              <w:t>Sistema</w:t>
+            </w:r>
+          </w:p>
+        </w:tc>
+        <w:tc>
+          <w:tcPr>
+            <w:tcW w:w="4433" w:type="dxa"/>
+            <w:tcBorders>
+              <w:top w:val="single" w:sz="4" w:space="0" w:color="D4CEC7"/>
+              <w:left w:val="single" w:sz="4" w:space="0" w:color="D4CEC7"/>
+              <w:bottom w:val="single" w:sz="4" w:space="0" w:color="D4CEC7"/>
+              <w:right w:val="single" w:sz="4" w:space="0" w:color="D4CEC7"/>
+            </w:tcBorders>
+            <w:shd w:val="clear" w:color="auto" w:fill="B3122B"/>
+            <w:tcMar>
+              <w:top w:w="60" w:type="dxa"/>
+              <w:left w:w="100" w:type="dxa"/>
+              <w:bottom w:w="60" w:type="dxa"/>
+              <w:right w:w="100" w:type="dxa"/>
+            </w:tcMar>
+          </w:tcPr>
+          <w:p>
+            <w:r>
+              <w:rPr>
+                <w:b/>
+                <w:bCs/>
+                <w:color w:val="FFFFFF"/>
+              </w:rPr>
+              <w:t>Installer</w:t>
+            </w:r>
+          </w:p>
+        </w:tc>
+        <w:tc>
+          <w:tcPr>
+            <w:tcW w:w="1638" w:type="dxa"/>
+            <w:tcBorders>
+              <w:top w:val="single" w:sz="4" w:space="0" w:color="D4CEC7"/>
+              <w:left w:val="single" w:sz="4" w:space="0" w:color="D4CEC7"/>
+              <w:bottom w:val="single" w:sz="4" w:space="0" w:color="D4CEC7"/>
+              <w:right w:val="single" w:sz="4" w:space="0" w:color="D4CEC7"/>
+            </w:tcBorders>
+            <w:shd w:val="clear" w:color="auto" w:fill="B3122B"/>
+            <w:tcMar>
+              <w:top w:w="60" w:type="dxa"/>
+              <w:left w:w="100" w:type="dxa"/>
+              <w:bottom w:w="60" w:type="dxa"/>
+              <w:right w:w="100" w:type="dxa"/>
+            </w:tcMar>
+          </w:tcPr>
+          <w:p>
+            <w:r>
+              <w:rPr>
+                <w:b/>
+                <w:bCs/>
+                <w:color w:val="FFFFFF"/>
+              </w:rPr>
+              <w:t>Dimensione</w:t>
+            </w:r>
+          </w:p>
+        </w:tc>
+        <w:tc>
+          <w:tcPr>
+            <w:tcW w:w="1639" w:type="dxa"/>
+            <w:tcBorders>
+              <w:top w:val="single" w:sz="4" w:space="0" w:color="D4CEC7"/>
+              <w:left w:val="single" w:sz="4" w:space="0" w:color="D4CEC7"/>
+              <w:bottom w:val="single" w:sz="4" w:space="0" w:color="D4CEC7"/>
+              <w:right w:val="single" w:sz="4" w:space="0" w:color="D4CEC7"/>
+            </w:tcBorders>
+            <w:shd w:val="clear" w:color="auto" w:fill="B3122B"/>
+            <w:tcMar>
+              <w:top w:w="60" w:type="dxa"/>
+              <w:left w:w="100" w:type="dxa"/>
+              <w:bottom w:w="60" w:type="dxa"/>
+              <w:right w:w="100" w:type="dxa"/>
+            </w:tcMar>
+          </w:tcPr>
+          <w:p>
+            <w:r>
+              <w:rPr>
+                <w:b/>
+                <w:bCs/>
+                <w:color w:val="FFFFFF"/>
+              </w:rPr>
+              <w:t>1.0.2</w:t>
+            </w:r>
+          </w:p>
+        </w:tc>
+      </w:tr>
+      <w:tr>
+        <w:tc>
+          <w:tcPr>
+            <w:tcW w:w="1928" w:type="dxa"/>
+            <w:tcBorders>
+              <w:top w:val="single" w:sz="4" w:space="0" w:color="D4CEC7"/>
+              <w:left w:val="single" w:sz="4" w:space="0" w:color="D4CEC7"/>
+              <w:bottom w:val="single" w:sz="4" w:space="0" w:color="D4CEC7"/>
+              <w:right w:val="single" w:sz="4" w:space="0" w:color="D4CEC7"/>
+            </w:tcBorders>
+            <w:tcMar>
+              <w:top w:w="60" w:type="dxa"/>
+              <w:left w:w="100" w:type="dxa"/>
+              <w:bottom w:w="60" w:type="dxa"/>
+              <w:right w:w="100" w:type="dxa"/>
+            </w:tcMar>
+          </w:tcPr>
+          <w:p>
+            <w:r>
+              <w:t>Windows</w:t>
+            </w:r>
+          </w:p>
+        </w:tc>
+        <w:tc>
+          <w:tcPr>
+            <w:tcW w:w="4433" w:type="dxa"/>
+            <w:tcBorders>
+              <w:top w:val="single" w:sz="4" w:space="0" w:color="D4CEC7"/>
+              <w:left w:val="single" w:sz="4" w:space="0" w:color="D4CEC7"/>
+              <w:bottom w:val="single" w:sz="4" w:space="0" w:color="D4CEC7"/>
+              <w:right w:val="single" w:sz="4" w:space="0" w:color="D4CEC7"/>
+            </w:tcBorders>
+            <w:tcMar>
+              <w:top w:w="60" w:type="dxa"/>
+              <w:left w:w="100" w:type="dxa"/>
+              <w:bottom w:w="60" w:type="dxa"/>
+              <w:right w:w="100" w:type="dxa"/>
+            </w:tcMar>
+          </w:tcPr>
+          <w:p>
+            <w:r>
+              <w:t>PDFz-1.1.0-x64.msi (un solo MSI, niente pacchetti lingue)</w:t>
+            </w:r>
+          </w:p>
+        </w:tc>
+        <w:tc>
+          <w:tcPr>
+            <w:tcW w:w="1638" w:type="dxa"/>
+            <w:tcBorders>
+              <w:top w:val="single" w:sz="4" w:space="0" w:color="D4CEC7"/>
+              <w:left w:val="single" w:sz="4" w:space="0" w:color="D4CEC7"/>
+              <w:bottom w:val="single" w:sz="4" w:space="0" w:color="D4CEC7"/>
+              <w:right w:val="single" w:sz="4" w:space="0" w:color="D4CEC7"/>
+            </w:tcBorders>
+            <w:tcMar>
+              <w:top w:w="60" w:type="dxa"/>
+              <w:left w:w="100" w:type="dxa"/>
+              <w:bottom w:w="60" w:type="dxa"/>
+              <w:right w:w="100" w:type="dxa"/>
+            </w:tcMar>
+          </w:tcPr>
+          <w:p>
+            <w:r>
+              <w:t>116,6 MB</w:t>
+            </w:r>
+          </w:p>
+        </w:tc>
+        <w:tc>
+          <w:tcPr>
+            <w:tcW w:w="1639" w:type="dxa"/>
+            <w:tcBorders>
+              <w:top w:val="single" w:sz="4" w:space="0" w:color="D4CEC7"/>
+              <w:left w:val="single" w:sz="4" w:space="0" w:color="D4CEC7"/>
+              <w:bottom w:val="single" w:sz="4" w:space="0" w:color="D4CEC7"/>
+              <w:right w:val="single" w:sz="4" w:space="0" w:color="D4CEC7"/>
+            </w:tcBorders>
+            <w:tcMar>
+              <w:top w:w="60" w:type="dxa"/>
+              <w:left w:w="100" w:type="dxa"/>
+              <w:bottom w:w="60" w:type="dxa"/>
+              <w:right w:w="100" w:type="dxa"/>
+            </w:tcMar>
+          </w:tcPr>
+          <w:p>
+            <w:r>
+              <w:t>136,8 MB</w:t>
+            </w:r>
+          </w:p>
+        </w:tc>
+      </w:tr>
+      <w:tr>
+        <w:tc>
+          <w:tcPr>
+            <w:tcW w:w="1928" w:type="dxa"/>
+            <w:tcBorders>
+              <w:top w:val="single" w:sz="4" w:space="0" w:color="D4CEC7"/>
+              <w:left w:val="single" w:sz="4" w:space="0" w:color="D4CEC7"/>
+              <w:bottom w:val="single" w:sz="4" w:space="0" w:color="D4CEC7"/>
+              <w:right w:val="single" w:sz="4" w:space="0" w:color="D4CEC7"/>
+            </w:tcBorders>
+            <w:tcMar>
+              <w:top w:w="60" w:type="dxa"/>
+              <w:left w:w="100" w:type="dxa"/>
+              <w:bottom w:w="60" w:type="dxa"/>
+              <w:right w:w="100" w:type="dxa"/>
+            </w:tcMar>
+          </w:tcPr>
+          <w:p>
+            <w:r>
+              <w:t>macOS (Apple Silicon)</w:t>
+            </w:r>
+          </w:p>
+        </w:tc>
+        <w:tc>
+          <w:tcPr>
+            <w:tcW w:w="4433" w:type="dxa"/>
+            <w:tcBorders>
+              <w:top w:val="single" w:sz="4" w:space="0" w:color="D4CEC7"/>
+              <w:left w:val="single" w:sz="4" w:space="0" w:color="D4CEC7"/>
+              <w:bottom w:val="single" w:sz="4" w:space="0" w:color="D4CEC7"/>
+              <w:right w:val="single" w:sz="4" w:space="0" w:color="D4CEC7"/>
+            </w:tcBorders>
+            <w:tcMar>
+              <w:top w:w="60" w:type="dxa"/>
+              <w:left w:w="100" w:type="dxa"/>
+              <w:bottom w:w="60" w:type="dxa"/>
+              <w:right w:w="100" w:type="dxa"/>
+            </w:tcMar>
+          </w:tcPr>
+          <w:p>
+            <w:r>
+              <w:t>PDFz-1.1.0-macOS-arm64.dmg</w:t>
+            </w:r>
+          </w:p>
+        </w:tc>
+        <w:tc>
+          <w:tcPr>
+            <w:tcW w:w="1638" w:type="dxa"/>
+            <w:tcBorders>
+              <w:top w:val="single" w:sz="4" w:space="0" w:color="D4CEC7"/>
+              <w:left w:val="single" w:sz="4" w:space="0" w:color="D4CEC7"/>
+              <w:bottom w:val="single" w:sz="4" w:space="0" w:color="D4CEC7"/>
+              <w:right w:val="single" w:sz="4" w:space="0" w:color="D4CEC7"/>
+            </w:tcBorders>
+            <w:tcMar>
+              <w:top w:w="60" w:type="dxa"/>
+              <w:left w:w="100" w:type="dxa"/>
+              <w:bottom w:w="60" w:type="dxa"/>
+              <w:right w:w="100" w:type="dxa"/>
+            </w:tcMar>
+          </w:tcPr>
+          <w:p>
+            <w:r>
+              <w:t>137,4 MB</w:t>
+            </w:r>
+          </w:p>
+        </w:tc>
+        <w:tc>
+          <w:tcPr>
+            <w:tcW w:w="1639" w:type="dxa"/>
+            <w:tcBorders>
+              <w:top w:val="single" w:sz="4" w:space="0" w:color="D4CEC7"/>
+              <w:left w:val="single" w:sz="4" w:space="0" w:color="D4CEC7"/>
+              <w:bottom w:val="single" w:sz="4" w:space="0" w:color="D4CEC7"/>
+              <w:right w:val="single" w:sz="4" w:space="0" w:color="D4CEC7"/>
+            </w:tcBorders>
+            <w:tcMar>
+              <w:top w:w="60" w:type="dxa"/>
+              <w:left w:w="100" w:type="dxa"/>
+              <w:bottom w:w="60" w:type="dxa"/>
+              <w:right w:w="100" w:type="dxa"/>
+            </w:tcMar>
+          </w:tcPr>
+          <w:p>
+            <w:r>
+              <w:t>139,3 MB</w:t>
+            </w:r>
+          </w:p>
+        </w:tc>
+      </w:tr>
+      <w:tr>
+        <w:tc>
+          <w:tcPr>
+            <w:tcW w:w="1928" w:type="dxa"/>
+            <w:tcBorders>
+              <w:top w:val="single" w:sz="4" w:space="0" w:color="D4CEC7"/>
+              <w:left w:val="single" w:sz="4" w:space="0" w:color="D4CEC7"/>
+              <w:bottom w:val="single" w:sz="4" w:space="0" w:color="D4CEC7"/>
+              <w:right w:val="single" w:sz="4" w:space="0" w:color="D4CEC7"/>
+            </w:tcBorders>
+            <w:tcMar>
+              <w:top w:w="60" w:type="dxa"/>
+              <w:left w:w="100" w:type="dxa"/>
+              <w:bottom w:w="60" w:type="dxa"/>
+              <w:right w:w="100" w:type="dxa"/>
+            </w:tcMar>
+          </w:tcPr>
+          <w:p>
+            <w:r>
+              <w:t>Linux</w:t>
+            </w:r>
+          </w:p>
+        </w:tc>
+        <w:tc>
+          <w:tcPr>
+            <w:tcW w:w="4433" w:type="dxa"/>
+            <w:tcBorders>
+              <w:top w:val="single" w:sz="4" w:space="0" w:color="D4CEC7"/>
+              <w:left w:val="single" w:sz="4" w:space="0" w:color="D4CEC7"/>
+              <w:bottom w:val="single" w:sz="4" w:space="0" w:color="D4CEC7"/>
+              <w:right w:val="single" w:sz="4" w:space="0" w:color="D4CEC7"/>
+            </w:tcBorders>
+            <w:tcMar>
+              <w:top w:w="60" w:type="dxa"/>
+              <w:left w:w="100" w:type="dxa"/>
+              <w:bottom w:w="60" w:type="dxa"/>
+              <w:right w:w="100" w:type="dxa"/>
+            </w:tcMar>
+          </w:tcPr>
+          <w:p>
+            <w:r>
+              <w:t>PDFz-1.1.0-x86_64.AppImage</w:t>
+            </w:r>
+          </w:p>
+        </w:tc>
+        <w:tc>
+          <w:tcPr>
+            <w:tcW w:w="1638" w:type="dxa"/>
+            <w:tcBorders>
+              <w:top w:val="single" w:sz="4" w:space="0" w:color="D4CEC7"/>
+              <w:left w:val="single" w:sz="4" w:space="0" w:color="D4CEC7"/>
+              <w:bottom w:val="single" w:sz="4" w:space="0" w:color="D4CEC7"/>
+              <w:right w:val="single" w:sz="4" w:space="0" w:color="D4CEC7"/>
+            </w:tcBorders>
+            <w:tcMar>
+              <w:top w:w="60" w:type="dxa"/>
+              <w:left w:w="100" w:type="dxa"/>
+              <w:bottom w:w="60" w:type="dxa"/>
+              <w:right w:w="100" w:type="dxa"/>
+            </w:tcMar>
+          </w:tcPr>
+          <w:p>
+            <w:r>
+              <w:t>162,9 MB</w:t>
+            </w:r>
+          </w:p>
+        </w:tc>
+        <w:tc>
+          <w:tcPr>
+            <w:tcW w:w="1639" w:type="dxa"/>
+            <w:tcBorders>
+              <w:top w:val="single" w:sz="4" w:space="0" w:color="D4CEC7"/>
+              <w:left w:val="single" w:sz="4" w:space="0" w:color="D4CEC7"/>
+              <w:bottom w:val="single" w:sz="4" w:space="0" w:color="D4CEC7"/>
+              <w:right w:val="single" w:sz="4" w:space="0" w:color="D4CEC7"/>
+            </w:tcBorders>
+            <w:tcMar>
+              <w:top w:w="60" w:type="dxa"/>
+              <w:left w:w="100" w:type="dxa"/>
+              <w:bottom w:w="60" w:type="dxa"/>
+              <w:right w:w="100" w:type="dxa"/>
+            </w:tcMar>
+          </w:tcPr>
+          <w:p>
+            <w:r>
+              <w:t>199,7 MB</w:t>
+            </w:r>
+          </w:p>
+        </w:tc>
+      </w:tr>
+      <w:tr>
+        <w:tc>
+          <w:tcPr>
+            <w:tcW w:w="1928" w:type="dxa"/>
+            <w:tcBorders>
+              <w:top w:val="single" w:sz="4" w:space="0" w:color="D4CEC7"/>
+              <w:left w:val="single" w:sz="4" w:space="0" w:color="D4CEC7"/>
+              <w:bottom w:val="single" w:sz="4" w:space="0" w:color="D4CEC7"/>
+              <w:right w:val="single" w:sz="4" w:space="0" w:color="D4CEC7"/>
+            </w:tcBorders>
+            <w:tcMar>
+              <w:top w:w="60" w:type="dxa"/>
+              <w:left w:w="100" w:type="dxa"/>
+              <w:bottom w:w="60" w:type="dxa"/>
+              <w:right w:w="100" w:type="dxa"/>
+            </w:tcMar>
+          </w:tcPr>
+          <w:p>
+            <w:r>
+              <w:t>Android</w:t>
+            </w:r>
+          </w:p>
+        </w:tc>
+        <w:tc>
+          <w:tcPr>
+            <w:tcW w:w="4433" w:type="dxa"/>
+            <w:tcBorders>
+              <w:top w:val="single" w:sz="4" w:space="0" w:color="D4CEC7"/>
+              <w:left w:val="single" w:sz="4" w:space="0" w:color="D4CEC7"/>
+              <w:bottom w:val="single" w:sz="4" w:space="0" w:color="D4CEC7"/>
+              <w:right w:val="single" w:sz="4" w:space="0" w:color="D4CEC7"/>
+            </w:tcBorders>
+            <w:tcMar>
+              <w:top w:w="60" w:type="dxa"/>
+              <w:left w:w="100" w:type="dxa"/>
+              <w:bottom w:w="60" w:type="dxa"/>
+              <w:right w:w="100" w:type="dxa"/>
+            </w:tcMar>
+          </w:tcPr>
+          <w:p>
+            <w:r>
+              <w:t>PDFz-1.1.0-android.apk</w:t>
+            </w:r>
+          </w:p>
+        </w:tc>
+        <w:tc>
+          <w:tcPr>
+            <w:tcW w:w="1638" w:type="dxa"/>
+            <w:tcBorders>
+              <w:top w:val="single" w:sz="4" w:space="0" w:color="D4CEC7"/>
+              <w:left w:val="single" w:sz="4" w:space="0" w:color="D4CEC7"/>
+              <w:bottom w:val="single" w:sz="4" w:space="0" w:color="D4CEC7"/>
+              <w:right w:val="single" w:sz="4" w:space="0" w:color="D4CEC7"/>
+            </w:tcBorders>
+            <w:tcMar>
+              <w:top w:w="60" w:type="dxa"/>
+              <w:left w:w="100" w:type="dxa"/>
+              <w:bottom w:w="60" w:type="dxa"/>
+              <w:right w:w="100" w:type="dxa"/>
+            </w:tcMar>
+          </w:tcPr>
+          <w:p>
+            <w:r>
+              <w:t>64,6 MB</w:t>
+            </w:r>
+          </w:p>
+        </w:tc>
+        <w:tc>
+          <w:tcPr>
+            <w:tcW w:w="1639" w:type="dxa"/>
+            <w:tcBorders>
+              <w:top w:val="single" w:sz="4" w:space="0" w:color="D4CEC7"/>
+              <w:left w:val="single" w:sz="4" w:space="0" w:color="D4CEC7"/>
+              <w:bottom w:val="single" w:sz="4" w:space="0" w:color="D4CEC7"/>
+              <w:right w:val="single" w:sz="4" w:space="0" w:color="D4CEC7"/>
+            </w:tcBorders>
+            <w:tcMar>
+              <w:top w:w="60" w:type="dxa"/>
+              <w:left w:w="100" w:type="dxa"/>
+              <w:bottom w:w="60" w:type="dxa"/>
+              <w:right w:w="100" w:type="dxa"/>
+            </w:tcMar>
+          </w:tcPr>
+          <w:p>
+            <w:r>
+              <w:t>64,6 MB</w:t>
+            </w:r>
+          </w:p>
+        </w:tc>
+      </w:tr>
+    </w:tbl>
+    <w:p>
+      <w:pPr>
+        <w:spacing w:after="120"/>
+      </w:pPr>
+    </w:p>
+    <w:p>
+      <w:pPr>
+        <w:spacing w:after="120"/>
+      </w:pPr>
+      <w:r>
+        <w:rPr>
+          <w:b/>
+          <w:bCs/>
+        </w:rPr>
+        <w:t>Imprevisto:</w:t>
+      </w:r>
+      <w:r>
+        <w:t xml:space="preserve"> la prima pipeline ha installato </w:t>
+      </w:r>
+      <w:r>
+        <w:rPr>
+          <w:b/>
+          <w:bCs/>
+        </w:rPr>
+        <w:t>PyMuPDF 2.0</w:t>
+      </w:r>
+      <w:r>
+        <w:t xml:space="preserve">, uscita da poco, che rompe «Sblocca moduli» (i campi restano in sola lettura): Windows, macOS e Linux si sono fermati nei test e la release è uscita con il solo Android. Correzione: PyMuPDF bloccato sotto la 2.0; il tag </w:t>
       </w:r>
       <w:r>
         <w:rPr>
@@ -13626,15 +14153,24 @@
         <w:t>v1.1.0</w:t>
       </w:r>
       <w:r>
-        <w:t>: la pipeline compila Windows (un solo MSI, senza più i pacchetti lingue), macOS, Linux e Android.</w:t>
+        <w:t xml:space="preserve"> è stato spostato sul commit corretto e la pipeline ha completato la stessa release in 6 minuti.</w:t>
+      </w:r>
+    </w:p>
+    <w:p>
+      <w:pPr>
+        <w:spacing w:after="120"/>
+      </w:pPr>
+      <w:r>
+        <w:t>Prova fatta senza account GitHub: i 4 link diretti rispondono con la dimensione giusta, l'ultima versione è la 1.1.0 e un'app 1.0.2 su ogni sistema riceve l'installer del proprio sistema.</w:t>
       </w:r>
     </w:p>
     <w:p>
       <w:pPr>
         <w:pStyle w:val="Titolo2"/>
       </w:pPr>
-      <w:bookmarkStart w:id="32" w:name="_Toc243476548"/>
-      <w:r>
+      <w:bookmarkStart w:id="32" w:name="_Toc243478126"/>
+      <w:r>
+        <w:lastRenderedPageBreak/>
         <w:t>6.8 Ruoli</w:t>
       </w:r>
       <w:bookmarkEnd w:id="32"/>
@@ -13906,7 +14442,7 @@
       <w:pPr>
         <w:pStyle w:val="Titolo1"/>
       </w:pPr>
-      <w:bookmarkStart w:id="33" w:name="_Toc243476549"/>
+      <w:bookmarkStart w:id="33" w:name="_Toc243478127"/>
       <w:r>
         <w:t>7. Sicurezza</w:t>
       </w:r>
@@ -14017,7 +14553,6 @@
                 <w:bCs/>
                 <w:color w:val="FFFFFF"/>
               </w:rPr>
-              <w:lastRenderedPageBreak/>
               <w:t>Livello</w:t>
             </w:r>
           </w:p>
@@ -14206,7 +14741,7 @@
       <w:pPr>
         <w:pStyle w:val="Titolo1"/>
       </w:pPr>
-      <w:bookmarkStart w:id="34" w:name="_Toc243476550"/>
+      <w:bookmarkStart w:id="34" w:name="_Toc243478128"/>
       <w:r>
         <w:t>8. Punti aperti</w:t>
       </w:r>
@@ -14355,6 +14890,26 @@
         <w:spacing w:after="60"/>
       </w:pPr>
       <w:r>
+        <w:rPr>
+          <w:b/>
+          <w:bCs/>
+        </w:rPr>
+        <w:t>Passaggio a PyMuPDF 2.0</w:t>
+      </w:r>
+      <w:r>
+        <w:t xml:space="preserve"> da fare a parte: correggere «Sblocca moduli» e rilanciare tutti i test.</w:t>
+      </w:r>
+    </w:p>
+    <w:p>
+      <w:pPr>
+        <w:pStyle w:val="Paragrafoelenco"/>
+        <w:numPr>
+          <w:ilvl w:val="0"/>
+          <w:numId w:val="4"/>
+        </w:numPr>
+        <w:spacing w:after="60"/>
+      </w:pPr>
+      <w:r>
         <w:t xml:space="preserve">Sul PC di sviluppo la cartella </w:t>
       </w:r>
       <w:r>
@@ -14373,7 +14928,7 @@
       <w:pPr>
         <w:pStyle w:val="Titolo1"/>
       </w:pPr>
-      <w:bookmarkStart w:id="35" w:name="_Toc243476551"/>
+      <w:bookmarkStart w:id="35" w:name="_Toc243478129"/>
       <w:r>
         <w:t>9. Pensato per i prossimi 10 anni</w:t>
       </w:r>
@@ -14453,6 +15008,7 @@
           <w:b/>
           <w:bCs/>
         </w:rPr>
+        <w:lastRenderedPageBreak/>
         <w:t>Indirizzo degli aggiornamenti configurabile</w:t>
       </w:r>
       <w:r>
@@ -14640,10 +15196,10 @@
 <file path=word/numbering.xml><?xml version="1.0" encoding="utf-8"?>
 <w:numbering xmlns:wpc="http://schemas.microsoft.com/office/word/2010/wordprocessingCanvas" xmlns:cx="http://schemas.microsoft.com/office/drawing/2014/chartex" xmlns:cx1="http://schemas.microsoft.com/office/drawing/2015/9/8/chartex" xmlns:cx2="http://schemas.microsoft.com/office/drawing/2015/10/21/chartex" xmlns:cx3="http://schemas.microsoft.com/office/drawing/2016/5/9/chartex" xmlns:cx4="http://schemas.microsoft.com/office/drawing/2016/5/10/chartex" xmlns:cx5="http://schemas.microsoft.com/office/drawing/2016/5/11/chartex" xmlns:cx6="http://schemas.microsoft.com/office/drawing/2016/5/12/chartex" xmlns:cx7="http://schemas.microsoft.com/office/drawing/2016/5/13/chartex" xmlns:cx8="http://schemas.microsoft.com/office/drawing/2016/5/14/chartex" xmlns:mc="http://schemas.openxmlformats.org/markup-compatibility/2006" xmlns:aink="http://schemas.microsoft.com/office/drawing/2016/ink" xmlns:am3d="http://schemas.microsoft.com/office/drawing/2017/model3d" xmlns:o="urn:schemas-microsoft-com:office:office" xmlns:oel="http://schemas.microsoft.com/office/2019/extlst" xmlns:r="http://schemas.openxmlformats.org/officeDocument/2006/relationships" xmlns:m="http://schemas.openxmlformats.org/officeDocument/2006/math" xmlns:v="urn:schemas-microsoft-com:vml" xmlns:wp14="http://schemas.microsoft.com/office/word/2010/wordprocessingDrawing" xmlns:wp="http://schemas.openxmlformats.org/drawingml/2006/wordprocessingDrawing" xmlns:w10="urn:schemas-microsoft-com:office:word" xmlns:w="http://schemas.openxmlformats.org/wordprocessingml/2006/main" xmlns:w14="http://schemas.microsoft.com/office/word/2010/wordml" xmlns:w15="http://schemas.microsoft.com/office/word/2012/wordml" xmlns:w16cex="http://schemas.microsoft.com/office/word/2018/wordml/cex" xmlns:w16cid="http://schemas.microsoft.com/office/word/2016/wordml/cid" xmlns:w16="http://schemas.microsoft.com/office/word/2018/wordml" xmlns:w16du="http://schemas.microsoft.com/office/word/2023/wordml/word16du" xmlns:w16sdtdh="http://schemas.microsoft.com/office/word/2020/wordml/sdtdatahash" xmlns:w16sdtfl="http://schemas.microsoft.com/office/word/2024/wordml/sdtformatlock" xmlns:w16se="http://schemas.microsoft.com/office/word/2015/wordml/symex" xmlns:wpg="http://schemas.microsoft.com/office/word/2010/wordprocessingGroup" xmlns:wpi="http://schemas.microsoft.com/office/word/2010/wordprocessingInk" xmlns:wne="http://schemas.microsoft.com/office/word/2006/wordml" xmlns:wps="http://schemas.microsoft.com/office/word/2010/wordprocessingShape" mc:Ignorable="w14 w15 w16se w16cid w16 w16cex w16sdtdh w16sdtfl w16du wp14">
   <w:abstractNum w:abstractNumId="0" w15:restartNumberingAfterBreak="0">
-    <w:nsid w:val="00E74A45"/>
+    <w:nsid w:val="37520830"/>
     <w:multiLevelType w:val="hybridMultilevel"/>
-    <w:tmpl w:val="16E493E2"/>
-    <w:lvl w:ilvl="0" w:tplc="CF1AC5C6">
+    <w:tmpl w:val="B852CCAC"/>
+    <w:lvl w:ilvl="0" w:tplc="5DCE3474">
       <w:start w:val="1"/>
       <w:numFmt w:val="bullet"/>
       <w:lvlText w:val="•"/>
@@ -14652,52 +15208,52 @@
         <w:ind w:left="540" w:hanging="270"/>
       </w:pPr>
     </w:lvl>
-    <w:lvl w:ilvl="1" w:tplc="D0643370">
+    <w:lvl w:ilvl="1" w:tplc="8D5C6326">
       <w:numFmt w:val="decimal"/>
       <w:lvlText w:val=""/>
       <w:lvlJc w:val="left"/>
     </w:lvl>
-    <w:lvl w:ilvl="2" w:tplc="CCDE12C4">
+    <w:lvl w:ilvl="2" w:tplc="0EB8F2A4">
       <w:numFmt w:val="decimal"/>
       <w:lvlText w:val=""/>
       <w:lvlJc w:val="left"/>
     </w:lvl>
-    <w:lvl w:ilvl="3" w:tplc="6988257C">
+    <w:lvl w:ilvl="3" w:tplc="232EEE38">
       <w:numFmt w:val="decimal"/>
       <w:lvlText w:val=""/>
       <w:lvlJc w:val="left"/>
     </w:lvl>
-    <w:lvl w:ilvl="4" w:tplc="67DCE9FC">
+    <w:lvl w:ilvl="4" w:tplc="926A6D08">
       <w:numFmt w:val="decimal"/>
       <w:lvlText w:val=""/>
       <w:lvlJc w:val="left"/>
     </w:lvl>
-    <w:lvl w:ilvl="5" w:tplc="1938E84A">
+    <w:lvl w:ilvl="5" w:tplc="47864CD6">
       <w:numFmt w:val="decimal"/>
       <w:lvlText w:val=""/>
       <w:lvlJc w:val="left"/>
     </w:lvl>
-    <w:lvl w:ilvl="6" w:tplc="16EEF93C">
+    <w:lvl w:ilvl="6" w:tplc="11567FEA">
       <w:numFmt w:val="decimal"/>
       <w:lvlText w:val=""/>
       <w:lvlJc w:val="left"/>
     </w:lvl>
-    <w:lvl w:ilvl="7" w:tplc="01C2D0FC">
+    <w:lvl w:ilvl="7" w:tplc="A17E0886">
       <w:numFmt w:val="decimal"/>
       <w:lvlText w:val=""/>
       <w:lvlJc w:val="left"/>
     </w:lvl>
-    <w:lvl w:ilvl="8" w:tplc="ECB22560">
+    <w:lvl w:ilvl="8" w:tplc="370ACC38">
       <w:numFmt w:val="decimal"/>
       <w:lvlText w:val=""/>
       <w:lvlJc w:val="left"/>
     </w:lvl>
   </w:abstractNum>
   <w:abstractNum w:abstractNumId="1" w15:restartNumberingAfterBreak="0">
-    <w:nsid w:val="1BDA22CC"/>
+    <w:nsid w:val="5FE178E6"/>
     <w:multiLevelType w:val="hybridMultilevel"/>
-    <w:tmpl w:val="2FF43050"/>
-    <w:lvl w:ilvl="0" w:tplc="D3889FFC">
+    <w:tmpl w:val="DFB0F910"/>
+    <w:lvl w:ilvl="0" w:tplc="9BDE0580">
       <w:start w:val="1"/>
       <w:numFmt w:val="decimal"/>
       <w:lvlText w:val="%1."/>
@@ -14706,52 +15262,52 @@
         <w:ind w:left="540" w:hanging="300"/>
       </w:pPr>
     </w:lvl>
-    <w:lvl w:ilvl="1" w:tplc="0250F128">
+    <w:lvl w:ilvl="1" w:tplc="6C8EDD50">
       <w:numFmt w:val="decimal"/>
       <w:lvlText w:val=""/>
       <w:lvlJc w:val="left"/>
     </w:lvl>
-    <w:lvl w:ilvl="2" w:tplc="43E05420">
+    <w:lvl w:ilvl="2" w:tplc="DEC4970C">
       <w:numFmt w:val="decimal"/>
       <w:lvlText w:val=""/>
       <w:lvlJc w:val="left"/>
     </w:lvl>
-    <w:lvl w:ilvl="3" w:tplc="D3108CCE">
+    <w:lvl w:ilvl="3" w:tplc="3E4EBEA4">
       <w:numFmt w:val="decimal"/>
       <w:lvlText w:val=""/>
       <w:lvlJc w:val="left"/>
     </w:lvl>
-    <w:lvl w:ilvl="4" w:tplc="6004F49E">
+    <w:lvl w:ilvl="4" w:tplc="0F06AD36">
       <w:numFmt w:val="decimal"/>
       <w:lvlText w:val=""/>
       <w:lvlJc w:val="left"/>
     </w:lvl>
-    <w:lvl w:ilvl="5" w:tplc="0C6E4D44">
+    <w:lvl w:ilvl="5" w:tplc="65969DDA">
       <w:numFmt w:val="decimal"/>
       <w:lvlText w:val=""/>
       <w:lvlJc w:val="left"/>
     </w:lvl>
-    <w:lvl w:ilvl="6" w:tplc="AD006180">
+    <w:lvl w:ilvl="6" w:tplc="4448E32E">
       <w:numFmt w:val="decimal"/>
       <w:lvlText w:val=""/>
       <w:lvlJc w:val="left"/>
     </w:lvl>
-    <w:lvl w:ilvl="7" w:tplc="0736FF6A">
+    <w:lvl w:ilvl="7" w:tplc="F5043E20">
       <w:numFmt w:val="decimal"/>
       <w:lvlText w:val=""/>
       <w:lvlJc w:val="left"/>
     </w:lvl>
-    <w:lvl w:ilvl="8" w:tplc="210C23FC">
+    <w:lvl w:ilvl="8" w:tplc="D15AE2BA">
       <w:numFmt w:val="decimal"/>
       <w:lvlText w:val=""/>
       <w:lvlJc w:val="left"/>
     </w:lvl>
   </w:abstractNum>
   <w:abstractNum w:abstractNumId="2" w15:restartNumberingAfterBreak="0">
-    <w:nsid w:val="546873C8"/>
+    <w:nsid w:val="71B9060A"/>
     <w:multiLevelType w:val="hybridMultilevel"/>
-    <w:tmpl w:val="7C14930A"/>
-    <w:lvl w:ilvl="0" w:tplc="83AA7638" w:tentative="1">
+    <w:tmpl w:val="4AE0C0BE"/>
+    <w:lvl w:ilvl="0" w:tplc="D9CE45EA" w:tentative="1">
       <w:start w:val="1"/>
       <w:numFmt w:val="bullet"/>
       <w:lvlText w:val="●"/>
@@ -14760,7 +15316,7 @@
         <w:ind w:left="720" w:hanging="360"/>
       </w:pPr>
     </w:lvl>
-    <w:lvl w:ilvl="1" w:tplc="A356B340" w:tentative="1">
+    <w:lvl w:ilvl="1" w:tplc="8E04B2DA" w:tentative="1">
       <w:start w:val="1"/>
       <w:numFmt w:val="bullet"/>
       <w:lvlText w:val="○"/>
@@ -14769,7 +15325,7 @@
         <w:ind w:left="1440" w:hanging="360"/>
       </w:pPr>
     </w:lvl>
-    <w:lvl w:ilvl="2" w:tplc="4190886E" w:tentative="1">
+    <w:lvl w:ilvl="2" w:tplc="C5501F14" w:tentative="1">
       <w:start w:val="1"/>
       <w:numFmt w:val="bullet"/>
       <w:lvlText w:val="■"/>
@@ -14778,7 +15334,7 @@
         <w:ind w:left="2160" w:hanging="360"/>
       </w:pPr>
     </w:lvl>
-    <w:lvl w:ilvl="3" w:tplc="4E5A2F90" w:tentative="1">
+    <w:lvl w:ilvl="3" w:tplc="9168DA14" w:tentative="1">
       <w:start w:val="1"/>
       <w:numFmt w:val="bullet"/>
       <w:lvlText w:val="●"/>
@@ -14787,7 +15343,7 @@
         <w:ind w:left="2880" w:hanging="360"/>
       </w:pPr>
     </w:lvl>
-    <w:lvl w:ilvl="4" w:tplc="22C6655C" w:tentative="1">
+    <w:lvl w:ilvl="4" w:tplc="CFCC70A6" w:tentative="1">
       <w:start w:val="1"/>
       <w:numFmt w:val="bullet"/>
       <w:lvlText w:val="○"/>
@@ -14796,7 +15352,7 @@
         <w:ind w:left="3600" w:hanging="360"/>
       </w:pPr>
     </w:lvl>
-    <w:lvl w:ilvl="5" w:tplc="14009F4A" w:tentative="1">
+    <w:lvl w:ilvl="5" w:tplc="1A2C6B92" w:tentative="1">
       <w:start w:val="1"/>
       <w:numFmt w:val="bullet"/>
       <w:lvlText w:val="■"/>
@@ -14805,7 +15361,7 @@
         <w:ind w:left="4320" w:hanging="360"/>
       </w:pPr>
     </w:lvl>
-    <w:lvl w:ilvl="6" w:tplc="7D86F012" w:tentative="1">
+    <w:lvl w:ilvl="6" w:tplc="4D6ED220" w:tentative="1">
       <w:start w:val="1"/>
       <w:numFmt w:val="bullet"/>
       <w:lvlText w:val="●"/>
@@ -14814,7 +15370,7 @@
         <w:ind w:left="5040" w:hanging="360"/>
       </w:pPr>
     </w:lvl>
-    <w:lvl w:ilvl="7" w:tplc="918E9EAC" w:tentative="1">
+    <w:lvl w:ilvl="7" w:tplc="C3A8A878" w:tentative="1">
       <w:start w:val="1"/>
       <w:numFmt w:val="bullet"/>
       <w:lvlText w:val="●"/>
@@ -14823,7 +15379,7 @@
         <w:ind w:left="5760" w:hanging="360"/>
       </w:pPr>
     </w:lvl>
-    <w:lvl w:ilvl="8" w:tplc="B12C8BBE" w:tentative="1">
+    <w:lvl w:ilvl="8" w:tplc="ACE42CAE" w:tentative="1">
       <w:start w:val="1"/>
       <w:numFmt w:val="bullet"/>
       <w:lvlText w:val="●"/>
@@ -14834,10 +15390,10 @@
     </w:lvl>
   </w:abstractNum>
   <w:abstractNum w:abstractNumId="3" w15:restartNumberingAfterBreak="0">
-    <w:nsid w:val="639470A5"/>
+    <w:nsid w:val="7E171B03"/>
     <w:multiLevelType w:val="hybridMultilevel"/>
-    <w:tmpl w:val="4FA01B36"/>
-    <w:lvl w:ilvl="0" w:tplc="49546E86">
+    <w:tmpl w:val="0CC68D9A"/>
+    <w:lvl w:ilvl="0" w:tplc="D2B28794">
       <w:start w:val="1"/>
       <w:numFmt w:val="decimal"/>
       <w:lvlText w:val="%1."/>
@@ -14846,66 +15402,66 @@
         <w:ind w:left="540" w:hanging="300"/>
       </w:pPr>
     </w:lvl>
-    <w:lvl w:ilvl="1" w:tplc="AC827A90">
+    <w:lvl w:ilvl="1" w:tplc="AC0E4922">
       <w:numFmt w:val="decimal"/>
       <w:lvlText w:val=""/>
       <w:lvlJc w:val="left"/>
     </w:lvl>
-    <w:lvl w:ilvl="2" w:tplc="56069D92">
+    <w:lvl w:ilvl="2" w:tplc="35FA2788">
       <w:numFmt w:val="decimal"/>
       <w:lvlText w:val=""/>
       <w:lvlJc w:val="left"/>
     </w:lvl>
-    <w:lvl w:ilvl="3" w:tplc="6BAC4838">
+    <w:lvl w:ilvl="3" w:tplc="124AE69A">
       <w:numFmt w:val="decimal"/>
       <w:lvlText w:val=""/>
       <w:lvlJc w:val="left"/>
     </w:lvl>
-    <w:lvl w:ilvl="4" w:tplc="DEEEE700">
+    <w:lvl w:ilvl="4" w:tplc="433E02BA">
       <w:numFmt w:val="decimal"/>
       <w:lvlText w:val=""/>
       <w:lvlJc w:val="left"/>
     </w:lvl>
-    <w:lvl w:ilvl="5" w:tplc="87DC683A">
+    <w:lvl w:ilvl="5" w:tplc="D0921C3E">
       <w:numFmt w:val="decimal"/>
       <w:lvlText w:val=""/>
       <w:lvlJc w:val="left"/>
     </w:lvl>
-    <w:lvl w:ilvl="6" w:tplc="FE8E2C46">
+    <w:lvl w:ilvl="6" w:tplc="C88E78F6">
       <w:numFmt w:val="decimal"/>
       <w:lvlText w:val=""/>
       <w:lvlJc w:val="left"/>
     </w:lvl>
-    <w:lvl w:ilvl="7" w:tplc="FFD2D08E">
+    <w:lvl w:ilvl="7" w:tplc="E9526EB8">
       <w:numFmt w:val="decimal"/>
       <w:lvlText w:val=""/>
       <w:lvlJc w:val="left"/>
     </w:lvl>
-    <w:lvl w:ilvl="8" w:tplc="56707C1E">
+    <w:lvl w:ilvl="8" w:tplc="E514B11A">
       <w:numFmt w:val="decimal"/>
       <w:lvlText w:val=""/>
       <w:lvlJc w:val="left"/>
     </w:lvl>
   </w:abstractNum>
-  <w:num w:numId="1" w16cid:durableId="1232276081">
+  <w:num w:numId="1" w16cid:durableId="2036927923">
     <w:abstractNumId w:val="2"/>
     <w:lvlOverride w:ilvl="0">
       <w:startOverride w:val="1"/>
     </w:lvlOverride>
   </w:num>
-  <w:num w:numId="2" w16cid:durableId="1387486597">
+  <w:num w:numId="2" w16cid:durableId="1240098785">
     <w:abstractNumId w:val="0"/>
     <w:lvlOverride w:ilvl="0">
       <w:startOverride w:val="1"/>
     </w:lvlOverride>
   </w:num>
-  <w:num w:numId="3" w16cid:durableId="1793745472">
+  <w:num w:numId="3" w16cid:durableId="18043509">
     <w:abstractNumId w:val="1"/>
     <w:lvlOverride w:ilvl="0">
       <w:startOverride w:val="1"/>
     </w:lvlOverride>
   </w:num>
-  <w:num w:numId="4" w16cid:durableId="774444267">
+  <w:num w:numId="4" w16cid:durableId="1362970945">
     <w:abstractNumId w:val="3"/>
     <w:lvlOverride w:ilvl="0">
       <w:startOverride w:val="1"/>
@@ -15547,7 +16103,7 @@
     <w:autoRedefine/>
     <w:uiPriority w:val="39"/>
     <w:unhideWhenUsed/>
-    <w:rsid w:val="00EE3FE1"/>
+    <w:rsid w:val="00954DD7"/>
     <w:pPr>
       <w:spacing w:after="100"/>
     </w:pPr>
@@ -15559,7 +16115,7 @@
     <w:autoRedefine/>
     <w:uiPriority w:val="39"/>
     <w:unhideWhenUsed/>
-    <w:rsid w:val="00EE3FE1"/>
+    <w:rsid w:val="00954DD7"/>
     <w:pPr>
       <w:spacing w:after="100"/>
       <w:ind w:left="210"/>

</xml_diff>

<commit_message>
PDFz 1.2.0: schede fra finestre, Modifica testo, PyMuPDF 2.0
- Versione 1.2.0 (MSI 101.2.0, Android 1001002000), CHANGELOG, novità,
  documenti, CLAUDE.md e documentazione Word PDFz_20261021.docx.

Co-Authored-By: Claude Opus 5.5 <noreply@anthropic.com>
</commit_message>
<xml_diff>
--- a/docs/PDFz_20261021.docx
+++ b/docs/PDFz_20261021.docx
@@ -16,7 +16,7 @@
           <w:noProof/>
         </w:rPr>
         <w:drawing>
-          <wp:inline distT="0" distB="0" distL="0" distR="0" wp14:anchorId="45109FB7" wp14:editId="29CC1BC1">
+          <wp:inline distT="0" distB="0" distL="0" distR="0" wp14:anchorId="432C5EAC" wp14:editId="1838D683">
             <wp:extent cx="3619500" cy="1285875"/>
             <wp:effectExtent l="0" t="0" r="0" b="0"/>
             <wp:docPr id="1" name="Immagine 1"/>
@@ -95,7 +95,7 @@
           <w:sz w:val="22"/>
           <w:szCs w:val="22"/>
         </w:rPr>
-        <w:t>Versione 1.1.0 e modifiche successive  ·  21 ottobre 2026  ·  autore: agjin</w:t>
+        <w:t>Versione 1.2.0  ·  21 ottobre 2026  ·  autore: agjin</w:t>
       </w:r>
     </w:p>
     <w:p>
@@ -129,13 +129,14 @@
           <w:sz w:val="32"/>
           <w:szCs w:val="32"/>
         </w:rPr>
+        <w:lastRenderedPageBreak/>
         <w:t>Indice</w:t>
       </w:r>
     </w:p>
     <w:sdt>
       <w:sdtPr>
         <w:alias w:val="Indice"/>
-        <w:id w:val="1836565562"/>
+        <w:id w:val="-767235062"/>
       </w:sdtPr>
       <w:sdtEndPr/>
       <w:sdtContent>
@@ -158,7 +159,7 @@
           <w:r>
             <w:fldChar w:fldCharType="separate"/>
           </w:r>
-          <w:hyperlink w:anchor="_Toc243487618" w:history="1">
+          <w:hyperlink w:anchor="_Toc243488084" w:history="1">
             <w:r>
               <w:rPr>
                 <w:rStyle w:val="Collegamentoipertestuale"/>
@@ -182,7 +183,7 @@
               <w:rPr>
                 <w:noProof/>
               </w:rPr>
-              <w:instrText xml:space="preserve"> PAGEREF _Toc243487618 \h </w:instrText>
+              <w:instrText xml:space="preserve"> PAGEREF _Toc243488084 \h </w:instrText>
             </w:r>
             <w:r>
               <w:rPr>
@@ -219,7 +220,7 @@
               <w:noProof/>
             </w:rPr>
           </w:pPr>
-          <w:hyperlink w:anchor="_Toc243487619" w:history="1">
+          <w:hyperlink w:anchor="_Toc243488085" w:history="1">
             <w:r>
               <w:rPr>
                 <w:rStyle w:val="Collegamentoipertestuale"/>
@@ -243,7 +244,7 @@
               <w:rPr>
                 <w:noProof/>
               </w:rPr>
-              <w:instrText xml:space="preserve"> PAGEREF _Toc243487619 \h </w:instrText>
+              <w:instrText xml:space="preserve"> PAGEREF _Toc243488085 \h </w:instrText>
             </w:r>
             <w:r>
               <w:rPr>
@@ -280,7 +281,7 @@
               <w:noProof/>
             </w:rPr>
           </w:pPr>
-          <w:hyperlink w:anchor="_Toc243487620" w:history="1">
+          <w:hyperlink w:anchor="_Toc243488086" w:history="1">
             <w:r>
               <w:rPr>
                 <w:rStyle w:val="Collegamentoipertestuale"/>
@@ -304,7 +305,7 @@
               <w:rPr>
                 <w:noProof/>
               </w:rPr>
-              <w:instrText xml:space="preserve"> PAGEREF _Toc243487620 \h </w:instrText>
+              <w:instrText xml:space="preserve"> PAGEREF _Toc243488086 \h </w:instrText>
             </w:r>
             <w:r>
               <w:rPr>
@@ -341,7 +342,7 @@
               <w:noProof/>
             </w:rPr>
           </w:pPr>
-          <w:hyperlink w:anchor="_Toc243487621" w:history="1">
+          <w:hyperlink w:anchor="_Toc243488087" w:history="1">
             <w:r>
               <w:rPr>
                 <w:rStyle w:val="Collegamentoipertestuale"/>
@@ -365,7 +366,7 @@
               <w:rPr>
                 <w:noProof/>
               </w:rPr>
-              <w:instrText xml:space="preserve"> PAGEREF _Toc243487621 \h </w:instrText>
+              <w:instrText xml:space="preserve"> PAGEREF _Toc243488087 \h </w:instrText>
             </w:r>
             <w:r>
               <w:rPr>
@@ -402,7 +403,7 @@
               <w:noProof/>
             </w:rPr>
           </w:pPr>
-          <w:hyperlink w:anchor="_Toc243487622" w:history="1">
+          <w:hyperlink w:anchor="_Toc243488088" w:history="1">
             <w:r>
               <w:rPr>
                 <w:rStyle w:val="Collegamentoipertestuale"/>
@@ -426,7 +427,7 @@
               <w:rPr>
                 <w:noProof/>
               </w:rPr>
-              <w:instrText xml:space="preserve"> PAGEREF _Toc243487622 \h </w:instrText>
+              <w:instrText xml:space="preserve"> PAGEREF _Toc243488088 \h </w:instrText>
             </w:r>
             <w:r>
               <w:rPr>
@@ -463,7 +464,7 @@
               <w:noProof/>
             </w:rPr>
           </w:pPr>
-          <w:hyperlink w:anchor="_Toc243487623" w:history="1">
+          <w:hyperlink w:anchor="_Toc243488089" w:history="1">
             <w:r>
               <w:rPr>
                 <w:rStyle w:val="Collegamentoipertestuale"/>
@@ -487,7 +488,7 @@
               <w:rPr>
                 <w:noProof/>
               </w:rPr>
-              <w:instrText xml:space="preserve"> PAGEREF _Toc243487623 \h </w:instrText>
+              <w:instrText xml:space="preserve"> PAGEREF _Toc243488089 \h </w:instrText>
             </w:r>
             <w:r>
               <w:rPr>
@@ -524,7 +525,7 @@
               <w:noProof/>
             </w:rPr>
           </w:pPr>
-          <w:hyperlink w:anchor="_Toc243487624" w:history="1">
+          <w:hyperlink w:anchor="_Toc243488090" w:history="1">
             <w:r>
               <w:rPr>
                 <w:rStyle w:val="Collegamentoipertestuale"/>
@@ -548,7 +549,7 @@
               <w:rPr>
                 <w:noProof/>
               </w:rPr>
-              <w:instrText xml:space="preserve"> PAGEREF _Toc243487624 \h </w:instrText>
+              <w:instrText xml:space="preserve"> PAGEREF _Toc243488090 \h </w:instrText>
             </w:r>
             <w:r>
               <w:rPr>
@@ -585,7 +586,7 @@
               <w:noProof/>
             </w:rPr>
           </w:pPr>
-          <w:hyperlink w:anchor="_Toc243487625" w:history="1">
+          <w:hyperlink w:anchor="_Toc243488091" w:history="1">
             <w:r>
               <w:rPr>
                 <w:rStyle w:val="Collegamentoipertestuale"/>
@@ -609,7 +610,7 @@
               <w:rPr>
                 <w:noProof/>
               </w:rPr>
-              <w:instrText xml:space="preserve"> PAGEREF _Toc243487625 \h </w:instrText>
+              <w:instrText xml:space="preserve"> PAGEREF _Toc243488091 \h </w:instrText>
             </w:r>
             <w:r>
               <w:rPr>
@@ -646,7 +647,7 @@
               <w:noProof/>
             </w:rPr>
           </w:pPr>
-          <w:hyperlink w:anchor="_Toc243487626" w:history="1">
+          <w:hyperlink w:anchor="_Toc243488092" w:history="1">
             <w:r>
               <w:rPr>
                 <w:rStyle w:val="Collegamentoipertestuale"/>
@@ -670,7 +671,7 @@
               <w:rPr>
                 <w:noProof/>
               </w:rPr>
-              <w:instrText xml:space="preserve"> PAGEREF _Toc243487626 \h </w:instrText>
+              <w:instrText xml:space="preserve"> PAGEREF _Toc243488092 \h </w:instrText>
             </w:r>
             <w:r>
               <w:rPr>
@@ -707,7 +708,7 @@
               <w:noProof/>
             </w:rPr>
           </w:pPr>
-          <w:hyperlink w:anchor="_Toc243487627" w:history="1">
+          <w:hyperlink w:anchor="_Toc243488093" w:history="1">
             <w:r>
               <w:rPr>
                 <w:rStyle w:val="Collegamentoipertestuale"/>
@@ -731,7 +732,7 @@
               <w:rPr>
                 <w:noProof/>
               </w:rPr>
-              <w:instrText xml:space="preserve"> PAGEREF _Toc243487627 \h </w:instrText>
+              <w:instrText xml:space="preserve"> PAGEREF _Toc243488093 \h </w:instrText>
             </w:r>
             <w:r>
               <w:rPr>
@@ -768,7 +769,7 @@
               <w:noProof/>
             </w:rPr>
           </w:pPr>
-          <w:hyperlink w:anchor="_Toc243487628" w:history="1">
+          <w:hyperlink w:anchor="_Toc243488094" w:history="1">
             <w:r>
               <w:rPr>
                 <w:rStyle w:val="Collegamentoipertestuale"/>
@@ -792,7 +793,7 @@
               <w:rPr>
                 <w:noProof/>
               </w:rPr>
-              <w:instrText xml:space="preserve"> PAGEREF _Toc243487628 \h </w:instrText>
+              <w:instrText xml:space="preserve"> PAGEREF _Toc243488094 \h </w:instrText>
             </w:r>
             <w:r>
               <w:rPr>
@@ -829,7 +830,7 @@
               <w:noProof/>
             </w:rPr>
           </w:pPr>
-          <w:hyperlink w:anchor="_Toc243487629" w:history="1">
+          <w:hyperlink w:anchor="_Toc243488095" w:history="1">
             <w:r>
               <w:rPr>
                 <w:rStyle w:val="Collegamentoipertestuale"/>
@@ -853,7 +854,7 @@
               <w:rPr>
                 <w:noProof/>
               </w:rPr>
-              <w:instrText xml:space="preserve"> PAGEREF _Toc243487629 \h </w:instrText>
+              <w:instrText xml:space="preserve"> PAGEREF _Toc243488095 \h </w:instrText>
             </w:r>
             <w:r>
               <w:rPr>
@@ -890,7 +891,7 @@
               <w:noProof/>
             </w:rPr>
           </w:pPr>
-          <w:hyperlink w:anchor="_Toc243487630" w:history="1">
+          <w:hyperlink w:anchor="_Toc243488096" w:history="1">
             <w:r>
               <w:rPr>
                 <w:rStyle w:val="Collegamentoipertestuale"/>
@@ -914,7 +915,7 @@
               <w:rPr>
                 <w:noProof/>
               </w:rPr>
-              <w:instrText xml:space="preserve"> PAGEREF _Toc243487630 \h </w:instrText>
+              <w:instrText xml:space="preserve"> PAGEREF _Toc243488096 \h </w:instrText>
             </w:r>
             <w:r>
               <w:rPr>
@@ -951,7 +952,7 @@
               <w:noProof/>
             </w:rPr>
           </w:pPr>
-          <w:hyperlink w:anchor="_Toc243487631" w:history="1">
+          <w:hyperlink w:anchor="_Toc243488097" w:history="1">
             <w:r>
               <w:rPr>
                 <w:rStyle w:val="Collegamentoipertestuale"/>
@@ -975,7 +976,7 @@
               <w:rPr>
                 <w:noProof/>
               </w:rPr>
-              <w:instrText xml:space="preserve"> PAGEREF _Toc243487631 \h </w:instrText>
+              <w:instrText xml:space="preserve"> PAGEREF _Toc243488097 \h </w:instrText>
             </w:r>
             <w:r>
               <w:rPr>
@@ -1012,7 +1013,7 @@
               <w:noProof/>
             </w:rPr>
           </w:pPr>
-          <w:hyperlink w:anchor="_Toc243487632" w:history="1">
+          <w:hyperlink w:anchor="_Toc243488098" w:history="1">
             <w:r>
               <w:rPr>
                 <w:rStyle w:val="Collegamentoipertestuale"/>
@@ -1036,7 +1037,7 @@
               <w:rPr>
                 <w:noProof/>
               </w:rPr>
-              <w:instrText xml:space="preserve"> PAGEREF _Toc243487632 \h </w:instrText>
+              <w:instrText xml:space="preserve"> PAGEREF _Toc243488098 \h </w:instrText>
             </w:r>
             <w:r>
               <w:rPr>
@@ -1073,7 +1074,7 @@
               <w:noProof/>
             </w:rPr>
           </w:pPr>
-          <w:hyperlink w:anchor="_Toc243487633" w:history="1">
+          <w:hyperlink w:anchor="_Toc243488099" w:history="1">
             <w:r>
               <w:rPr>
                 <w:rStyle w:val="Collegamentoipertestuale"/>
@@ -1097,7 +1098,7 @@
               <w:rPr>
                 <w:noProof/>
               </w:rPr>
-              <w:instrText xml:space="preserve"> PAGEREF _Toc243487633 \h </w:instrText>
+              <w:instrText xml:space="preserve"> PAGEREF _Toc243488099 \h </w:instrText>
             </w:r>
             <w:r>
               <w:rPr>
@@ -1134,7 +1135,7 @@
               <w:noProof/>
             </w:rPr>
           </w:pPr>
-          <w:hyperlink w:anchor="_Toc243487634" w:history="1">
+          <w:hyperlink w:anchor="_Toc243488100" w:history="1">
             <w:r>
               <w:rPr>
                 <w:rStyle w:val="Collegamentoipertestuale"/>
@@ -1158,7 +1159,7 @@
               <w:rPr>
                 <w:noProof/>
               </w:rPr>
-              <w:instrText xml:space="preserve"> PAGEREF _Toc243487634 \h </w:instrText>
+              <w:instrText xml:space="preserve"> PAGEREF _Toc243488100 \h </w:instrText>
             </w:r>
             <w:r>
               <w:rPr>
@@ -1195,7 +1196,7 @@
               <w:noProof/>
             </w:rPr>
           </w:pPr>
-          <w:hyperlink w:anchor="_Toc243487635" w:history="1">
+          <w:hyperlink w:anchor="_Toc243488101" w:history="1">
             <w:r>
               <w:rPr>
                 <w:rStyle w:val="Collegamentoipertestuale"/>
@@ -1219,7 +1220,7 @@
               <w:rPr>
                 <w:noProof/>
               </w:rPr>
-              <w:instrText xml:space="preserve"> PAGEREF _Toc243487635 \h </w:instrText>
+              <w:instrText xml:space="preserve"> PAGEREF _Toc243488101 \h </w:instrText>
             </w:r>
             <w:r>
               <w:rPr>
@@ -1256,7 +1257,7 @@
               <w:noProof/>
             </w:rPr>
           </w:pPr>
-          <w:hyperlink w:anchor="_Toc243487636" w:history="1">
+          <w:hyperlink w:anchor="_Toc243488102" w:history="1">
             <w:r>
               <w:rPr>
                 <w:rStyle w:val="Collegamentoipertestuale"/>
@@ -1280,7 +1281,7 @@
               <w:rPr>
                 <w:noProof/>
               </w:rPr>
-              <w:instrText xml:space="preserve"> PAGEREF _Toc243487636 \h </w:instrText>
+              <w:instrText xml:space="preserve"> PAGEREF _Toc243488102 \h </w:instrText>
             </w:r>
             <w:r>
               <w:rPr>
@@ -1317,7 +1318,7 @@
               <w:noProof/>
             </w:rPr>
           </w:pPr>
-          <w:hyperlink w:anchor="_Toc243487637" w:history="1">
+          <w:hyperlink w:anchor="_Toc243488103" w:history="1">
             <w:r>
               <w:rPr>
                 <w:rStyle w:val="Collegamentoipertestuale"/>
@@ -1341,7 +1342,7 @@
               <w:rPr>
                 <w:noProof/>
               </w:rPr>
-              <w:instrText xml:space="preserve"> PAGEREF _Toc243487637 \h </w:instrText>
+              <w:instrText xml:space="preserve"> PAGEREF _Toc243488103 \h </w:instrText>
             </w:r>
             <w:r>
               <w:rPr>
@@ -1378,7 +1379,7 @@
               <w:noProof/>
             </w:rPr>
           </w:pPr>
-          <w:hyperlink w:anchor="_Toc243487638" w:history="1">
+          <w:hyperlink w:anchor="_Toc243488104" w:history="1">
             <w:r>
               <w:rPr>
                 <w:rStyle w:val="Collegamentoipertestuale"/>
@@ -1402,7 +1403,7 @@
               <w:rPr>
                 <w:noProof/>
               </w:rPr>
-              <w:instrText xml:space="preserve"> PAGEREF _Toc243487638 \h </w:instrText>
+              <w:instrText xml:space="preserve"> PAGEREF _Toc243488104 \h </w:instrText>
             </w:r>
             <w:r>
               <w:rPr>
@@ -1439,7 +1440,7 @@
               <w:noProof/>
             </w:rPr>
           </w:pPr>
-          <w:hyperlink w:anchor="_Toc243487639" w:history="1">
+          <w:hyperlink w:anchor="_Toc243488105" w:history="1">
             <w:r>
               <w:rPr>
                 <w:rStyle w:val="Collegamentoipertestuale"/>
@@ -1463,7 +1464,7 @@
               <w:rPr>
                 <w:noProof/>
               </w:rPr>
-              <w:instrText xml:space="preserve"> PAGEREF _Toc243487639 \h </w:instrText>
+              <w:instrText xml:space="preserve"> PAGEREF _Toc243488105 \h </w:instrText>
             </w:r>
             <w:r>
               <w:rPr>
@@ -1500,7 +1501,7 @@
               <w:noProof/>
             </w:rPr>
           </w:pPr>
-          <w:hyperlink w:anchor="_Toc243487640" w:history="1">
+          <w:hyperlink w:anchor="_Toc243488106" w:history="1">
             <w:r>
               <w:rPr>
                 <w:rStyle w:val="Collegamentoipertestuale"/>
@@ -1524,7 +1525,7 @@
               <w:rPr>
                 <w:noProof/>
               </w:rPr>
-              <w:instrText xml:space="preserve"> PAGEREF _Toc243487640 \h </w:instrText>
+              <w:instrText xml:space="preserve"> PAGEREF _Toc243488106 \h </w:instrText>
             </w:r>
             <w:r>
               <w:rPr>
@@ -1561,7 +1562,7 @@
               <w:noProof/>
             </w:rPr>
           </w:pPr>
-          <w:hyperlink w:anchor="_Toc243487641" w:history="1">
+          <w:hyperlink w:anchor="_Toc243488107" w:history="1">
             <w:r>
               <w:rPr>
                 <w:rStyle w:val="Collegamentoipertestuale"/>
@@ -1585,7 +1586,7 @@
               <w:rPr>
                 <w:noProof/>
               </w:rPr>
-              <w:instrText xml:space="preserve"> PAGEREF _Toc243487641 \h </w:instrText>
+              <w:instrText xml:space="preserve"> PAGEREF _Toc243488107 \h </w:instrText>
             </w:r>
             <w:r>
               <w:rPr>
@@ -1622,7 +1623,7 @@
               <w:noProof/>
             </w:rPr>
           </w:pPr>
-          <w:hyperlink w:anchor="_Toc243487642" w:history="1">
+          <w:hyperlink w:anchor="_Toc243488108" w:history="1">
             <w:r>
               <w:rPr>
                 <w:rStyle w:val="Collegamentoipertestuale"/>
@@ -1646,7 +1647,7 @@
               <w:rPr>
                 <w:noProof/>
               </w:rPr>
-              <w:instrText xml:space="preserve"> PAGEREF _Toc243487642 \h </w:instrText>
+              <w:instrText xml:space="preserve"> PAGEREF _Toc243488108 \h </w:instrText>
             </w:r>
             <w:r>
               <w:rPr>
@@ -1683,7 +1684,7 @@
               <w:noProof/>
             </w:rPr>
           </w:pPr>
-          <w:hyperlink w:anchor="_Toc243487643" w:history="1">
+          <w:hyperlink w:anchor="_Toc243488109" w:history="1">
             <w:r>
               <w:rPr>
                 <w:rStyle w:val="Collegamentoipertestuale"/>
@@ -1707,7 +1708,7 @@
               <w:rPr>
                 <w:noProof/>
               </w:rPr>
-              <w:instrText xml:space="preserve"> PAGEREF _Toc243487643 \h </w:instrText>
+              <w:instrText xml:space="preserve"> PAGEREF _Toc243488109 \h </w:instrText>
             </w:r>
             <w:r>
               <w:rPr>
@@ -1744,7 +1745,7 @@
               <w:noProof/>
             </w:rPr>
           </w:pPr>
-          <w:hyperlink w:anchor="_Toc243487644" w:history="1">
+          <w:hyperlink w:anchor="_Toc243488110" w:history="1">
             <w:r>
               <w:rPr>
                 <w:rStyle w:val="Collegamentoipertestuale"/>
@@ -1768,7 +1769,7 @@
               <w:rPr>
                 <w:noProof/>
               </w:rPr>
-              <w:instrText xml:space="preserve"> PAGEREF _Toc243487644 \h </w:instrText>
+              <w:instrText xml:space="preserve"> PAGEREF _Toc243488110 \h </w:instrText>
             </w:r>
             <w:r>
               <w:rPr>
@@ -1805,7 +1806,7 @@
               <w:noProof/>
             </w:rPr>
           </w:pPr>
-          <w:hyperlink w:anchor="_Toc243487645" w:history="1">
+          <w:hyperlink w:anchor="_Toc243488111" w:history="1">
             <w:r>
               <w:rPr>
                 <w:rStyle w:val="Collegamentoipertestuale"/>
@@ -1829,7 +1830,7 @@
               <w:rPr>
                 <w:noProof/>
               </w:rPr>
-              <w:instrText xml:space="preserve"> PAGEREF _Toc243487645 \h </w:instrText>
+              <w:instrText xml:space="preserve"> PAGEREF _Toc243488111 \h </w:instrText>
             </w:r>
             <w:r>
               <w:rPr>
@@ -1866,7 +1867,7 @@
               <w:noProof/>
             </w:rPr>
           </w:pPr>
-          <w:hyperlink w:anchor="_Toc243487646" w:history="1">
+          <w:hyperlink w:anchor="_Toc243488112" w:history="1">
             <w:r>
               <w:rPr>
                 <w:rStyle w:val="Collegamentoipertestuale"/>
@@ -1890,7 +1891,7 @@
               <w:rPr>
                 <w:noProof/>
               </w:rPr>
-              <w:instrText xml:space="preserve"> PAGEREF _Toc243487646 \h </w:instrText>
+              <w:instrText xml:space="preserve"> PAGEREF _Toc243488112 \h </w:instrText>
             </w:r>
             <w:r>
               <w:rPr>
@@ -1927,7 +1928,7 @@
               <w:noProof/>
             </w:rPr>
           </w:pPr>
-          <w:hyperlink w:anchor="_Toc243487647" w:history="1">
+          <w:hyperlink w:anchor="_Toc243488113" w:history="1">
             <w:r>
               <w:rPr>
                 <w:rStyle w:val="Collegamentoipertestuale"/>
@@ -1951,7 +1952,7 @@
               <w:rPr>
                 <w:noProof/>
               </w:rPr>
-              <w:instrText xml:space="preserve"> PAGEREF _Toc243487647 \h </w:instrText>
+              <w:instrText xml:space="preserve"> PAGEREF _Toc243488113 \h </w:instrText>
             </w:r>
             <w:r>
               <w:rPr>
@@ -1988,7 +1989,7 @@
               <w:noProof/>
             </w:rPr>
           </w:pPr>
-          <w:hyperlink w:anchor="_Toc243487648" w:history="1">
+          <w:hyperlink w:anchor="_Toc243488114" w:history="1">
             <w:r>
               <w:rPr>
                 <w:rStyle w:val="Collegamentoipertestuale"/>
@@ -2012,7 +2013,7 @@
               <w:rPr>
                 <w:noProof/>
               </w:rPr>
-              <w:instrText xml:space="preserve"> PAGEREF _Toc243487648 \h </w:instrText>
+              <w:instrText xml:space="preserve"> PAGEREF _Toc243488114 \h </w:instrText>
             </w:r>
             <w:r>
               <w:rPr>
@@ -2049,7 +2050,7 @@
               <w:noProof/>
             </w:rPr>
           </w:pPr>
-          <w:hyperlink w:anchor="_Toc243487649" w:history="1">
+          <w:hyperlink w:anchor="_Toc243488115" w:history="1">
             <w:r>
               <w:rPr>
                 <w:rStyle w:val="Collegamentoipertestuale"/>
@@ -2073,7 +2074,7 @@
               <w:rPr>
                 <w:noProof/>
               </w:rPr>
-              <w:instrText xml:space="preserve"> PAGEREF _Toc243487649 \h </w:instrText>
+              <w:instrText xml:space="preserve"> PAGEREF _Toc243488115 \h </w:instrText>
             </w:r>
             <w:r>
               <w:rPr>
@@ -2110,7 +2111,7 @@
               <w:noProof/>
             </w:rPr>
           </w:pPr>
-          <w:hyperlink w:anchor="_Toc243487650" w:history="1">
+          <w:hyperlink w:anchor="_Toc243488116" w:history="1">
             <w:r>
               <w:rPr>
                 <w:rStyle w:val="Collegamentoipertestuale"/>
@@ -2134,7 +2135,7 @@
               <w:rPr>
                 <w:noProof/>
               </w:rPr>
-              <w:instrText xml:space="preserve"> PAGEREF _Toc243487650 \h </w:instrText>
+              <w:instrText xml:space="preserve"> PAGEREF _Toc243488116 \h </w:instrText>
             </w:r>
             <w:r>
               <w:rPr>
@@ -2171,7 +2172,7 @@
               <w:noProof/>
             </w:rPr>
           </w:pPr>
-          <w:hyperlink w:anchor="_Toc243487651" w:history="1">
+          <w:hyperlink w:anchor="_Toc243488117" w:history="1">
             <w:r>
               <w:rPr>
                 <w:rStyle w:val="Collegamentoipertestuale"/>
@@ -2195,7 +2196,7 @@
               <w:rPr>
                 <w:noProof/>
               </w:rPr>
-              <w:instrText xml:space="preserve"> PAGEREF _Toc243487651 \h </w:instrText>
+              <w:instrText xml:space="preserve"> PAGEREF _Toc243488117 \h </w:instrText>
             </w:r>
             <w:r>
               <w:rPr>
@@ -2232,7 +2233,7 @@
               <w:noProof/>
             </w:rPr>
           </w:pPr>
-          <w:hyperlink w:anchor="_Toc243487652" w:history="1">
+          <w:hyperlink w:anchor="_Toc243488118" w:history="1">
             <w:r>
               <w:rPr>
                 <w:rStyle w:val="Collegamentoipertestuale"/>
@@ -2256,7 +2257,7 @@
               <w:rPr>
                 <w:noProof/>
               </w:rPr>
-              <w:instrText xml:space="preserve"> PAGEREF _Toc243487652 \h </w:instrText>
+              <w:instrText xml:space="preserve"> PAGEREF _Toc243488118 \h </w:instrText>
             </w:r>
             <w:r>
               <w:rPr>
@@ -2293,13 +2294,13 @@
               <w:noProof/>
             </w:rPr>
           </w:pPr>
-          <w:hyperlink w:anchor="_Toc243487653" w:history="1">
+          <w:hyperlink w:anchor="_Toc243488119" w:history="1">
             <w:r>
               <w:rPr>
                 <w:rStyle w:val="Collegamentoipertestuale"/>
                 <w:noProof/>
               </w:rPr>
-              <w:t>6.8 Ruoli</w:t>
+              <w:t>6.8 Versione 1.2.0</w:t>
             </w:r>
             <w:r>
               <w:rPr>
@@ -2317,7 +2318,68 @@
               <w:rPr>
                 <w:noProof/>
               </w:rPr>
-              <w:instrText xml:space="preserve"> PAGEREF _Toc243487653 \h </w:instrText>
+              <w:instrText xml:space="preserve"> PAGEREF _Toc243488119 \h </w:instrText>
+            </w:r>
+            <w:r>
+              <w:rPr>
+                <w:noProof/>
+              </w:rPr>
+            </w:r>
+            <w:r>
+              <w:rPr>
+                <w:noProof/>
+              </w:rPr>
+              <w:fldChar w:fldCharType="separate"/>
+            </w:r>
+            <w:r>
+              <w:rPr>
+                <w:noProof/>
+              </w:rPr>
+              <w:t>20</w:t>
+            </w:r>
+            <w:r>
+              <w:rPr>
+                <w:noProof/>
+              </w:rPr>
+              <w:fldChar w:fldCharType="end"/>
+            </w:r>
+          </w:hyperlink>
+        </w:p>
+        <w:p>
+          <w:pPr>
+            <w:pStyle w:val="Sommario2"/>
+            <w:tabs>
+              <w:tab w:val="right" w:leader="dot" w:pos="9628"/>
+            </w:tabs>
+            <w:rPr>
+              <w:noProof/>
+            </w:rPr>
+          </w:pPr>
+          <w:hyperlink w:anchor="_Toc243488120" w:history="1">
+            <w:r>
+              <w:rPr>
+                <w:rStyle w:val="Collegamentoipertestuale"/>
+                <w:noProof/>
+              </w:rPr>
+              <w:t>6.9 Ruoli</w:t>
+            </w:r>
+            <w:r>
+              <w:rPr>
+                <w:noProof/>
+              </w:rPr>
+              <w:tab/>
+            </w:r>
+            <w:r>
+              <w:rPr>
+                <w:noProof/>
+              </w:rPr>
+              <w:fldChar w:fldCharType="begin"/>
+            </w:r>
+            <w:r>
+              <w:rPr>
+                <w:noProof/>
+              </w:rPr>
+              <w:instrText xml:space="preserve"> PAGEREF _Toc243488120 \h </w:instrText>
             </w:r>
             <w:r>
               <w:rPr>
@@ -2354,7 +2416,7 @@
               <w:noProof/>
             </w:rPr>
           </w:pPr>
-          <w:hyperlink w:anchor="_Toc243487654" w:history="1">
+          <w:hyperlink w:anchor="_Toc243488121" w:history="1">
             <w:r>
               <w:rPr>
                 <w:rStyle w:val="Collegamentoipertestuale"/>
@@ -2378,7 +2440,7 @@
               <w:rPr>
                 <w:noProof/>
               </w:rPr>
-              <w:instrText xml:space="preserve"> PAGEREF _Toc243487654 \h </w:instrText>
+              <w:instrText xml:space="preserve"> PAGEREF _Toc243488121 \h </w:instrText>
             </w:r>
             <w:r>
               <w:rPr>
@@ -2415,7 +2477,7 @@
               <w:noProof/>
             </w:rPr>
           </w:pPr>
-          <w:hyperlink w:anchor="_Toc243487655" w:history="1">
+          <w:hyperlink w:anchor="_Toc243488122" w:history="1">
             <w:r>
               <w:rPr>
                 <w:rStyle w:val="Collegamentoipertestuale"/>
@@ -2439,7 +2501,7 @@
               <w:rPr>
                 <w:noProof/>
               </w:rPr>
-              <w:instrText xml:space="preserve"> PAGEREF _Toc243487655 \h </w:instrText>
+              <w:instrText xml:space="preserve"> PAGEREF _Toc243488122 \h </w:instrText>
             </w:r>
             <w:r>
               <w:rPr>
@@ -2476,7 +2538,7 @@
               <w:noProof/>
             </w:rPr>
           </w:pPr>
-          <w:hyperlink w:anchor="_Toc243487656" w:history="1">
+          <w:hyperlink w:anchor="_Toc243488123" w:history="1">
             <w:r>
               <w:rPr>
                 <w:rStyle w:val="Collegamentoipertestuale"/>
@@ -2500,7 +2562,7 @@
               <w:rPr>
                 <w:noProof/>
               </w:rPr>
-              <w:instrText xml:space="preserve"> PAGEREF _Toc243487656 \h </w:instrText>
+              <w:instrText xml:space="preserve"> PAGEREF _Toc243488123 \h </w:instrText>
             </w:r>
             <w:r>
               <w:rPr>
@@ -2517,7 +2579,7 @@
               <w:rPr>
                 <w:noProof/>
               </w:rPr>
-              <w:t>20</w:t>
+              <w:t>21</w:t>
             </w:r>
             <w:r>
               <w:rPr>
@@ -2543,8 +2605,9 @@
       <w:pPr>
         <w:pStyle w:val="Titolo1"/>
       </w:pPr>
-      <w:bookmarkStart w:id="0" w:name="_Toc243487618"/>
-      <w:r>
+      <w:bookmarkStart w:id="0" w:name="_Toc243488084"/>
+      <w:r>
+        <w:lastRenderedPageBreak/>
         <w:t>1. In breve</w:t>
       </w:r>
       <w:bookmarkEnd w:id="0"/>
@@ -2788,10 +2851,10 @@
           <w:b/>
           <w:bCs/>
         </w:rPr>
-        <w:t>dopo la 1.1.0</w:t>
-      </w:r>
-      <w:r>
-        <w:t xml:space="preserve"> (non ancora pubblicato): schede </w:t>
+        <w:t>versione 1.2.0</w:t>
+      </w:r>
+      <w:r>
+        <w:t xml:space="preserve"> (21 ottobre): schede </w:t>
       </w:r>
       <w:r>
         <w:rPr>
@@ -2811,7 +2874,7 @@
         <w:t>Modifica testo</w:t>
       </w:r>
       <w:r>
-        <w:t xml:space="preserve"> non fa più sparire le righe attorno e non perde lettere sulle pagine ruotate (vedi 4.8).</w:t>
+        <w:t xml:space="preserve"> non fa più sparire le righe attorno e non perde lettere sulle pagine ruotate (vedi 4.8); «Sblocca moduli» compatibile con PyMuPDF 2.0 (vedi 6.8).</w:t>
       </w:r>
     </w:p>
     <w:p>
@@ -2834,7 +2897,7 @@
       <w:pPr>
         <w:pStyle w:val="Titolo1"/>
       </w:pPr>
-      <w:bookmarkStart w:id="1" w:name="_Toc243487619"/>
+      <w:bookmarkStart w:id="1" w:name="_Toc243488085"/>
       <w:r>
         <w:t>2. Nuovo marchio</w:t>
       </w:r>
@@ -2844,7 +2907,7 @@
       <w:pPr>
         <w:pStyle w:val="Titolo2"/>
       </w:pPr>
-      <w:bookmarkStart w:id="2" w:name="_Toc243487620"/>
+      <w:bookmarkStart w:id="2" w:name="_Toc243488086"/>
       <w:r>
         <w:t>2.1 Nomi e identificativi</w:t>
       </w:r>
@@ -3390,8 +3453,9 @@
       <w:pPr>
         <w:pStyle w:val="Titolo2"/>
       </w:pPr>
-      <w:bookmarkStart w:id="3" w:name="_Toc243487621"/>
-      <w:r>
+      <w:bookmarkStart w:id="3" w:name="_Toc243488087"/>
+      <w:r>
+        <w:lastRenderedPageBreak/>
         <w:t>2.2 Colori</w:t>
       </w:r>
       <w:bookmarkEnd w:id="3"/>
@@ -3785,7 +3849,7 @@
       <w:pPr>
         <w:pStyle w:val="Titolo2"/>
       </w:pPr>
-      <w:bookmarkStart w:id="4" w:name="_Toc243487622"/>
+      <w:bookmarkStart w:id="4" w:name="_Toc243488088"/>
       <w:r>
         <w:t>2.3 Icona in uso: 17 «Foglio oro» (serie 4)</w:t>
       </w:r>
@@ -3819,7 +3883,7 @@
           <w:noProof/>
         </w:rPr>
         <w:drawing>
-          <wp:inline distT="0" distB="0" distL="0" distR="0" wp14:anchorId="165180A6" wp14:editId="4FC1295C">
+          <wp:inline distT="0" distB="0" distL="0" distR="0" wp14:anchorId="578A13E4" wp14:editId="6729E36C">
             <wp:extent cx="5334000" cy="5895975"/>
             <wp:effectExtent l="0" t="0" r="0" b="0"/>
             <wp:docPr id="2" name="Immagine 2"/>
@@ -3871,6 +3935,7 @@
           <w:sz w:val="18"/>
           <w:szCs w:val="18"/>
         </w:rPr>
+        <w:lastRenderedPageBreak/>
         <w:t>Figura 1 – Serie 4: le 3 varianti (in alto) e i favicon abbinati (in basso).</w:t>
       </w:r>
     </w:p>
@@ -4239,7 +4304,7 @@
       <w:pPr>
         <w:pStyle w:val="Titolo2"/>
       </w:pPr>
-      <w:bookmarkStart w:id="5" w:name="_Toc243487623"/>
+      <w:bookmarkStart w:id="5" w:name="_Toc243488089"/>
       <w:r>
         <w:t>2.4 Serie 3, non scelta (la 11 è diventata la serie 4)</w:t>
       </w:r>
@@ -4263,7 +4328,7 @@
           <w:noProof/>
         </w:rPr>
         <w:drawing>
-          <wp:inline distT="0" distB="0" distL="0" distR="0" wp14:anchorId="405C8C15" wp14:editId="3976DD6B">
+          <wp:inline distT="0" distB="0" distL="0" distR="0" wp14:anchorId="4D069F05" wp14:editId="120F552A">
             <wp:extent cx="5905500" cy="4133850"/>
             <wp:effectExtent l="0" t="0" r="0" b="0"/>
             <wp:docPr id="3" name="Immagine 3"/>
@@ -4667,6 +4732,7 @@
           </w:tcPr>
           <w:p>
             <w:r>
+              <w:lastRenderedPageBreak/>
               <w:t>13</w:t>
             </w:r>
           </w:p>
@@ -4949,7 +5015,7 @@
       <w:pPr>
         <w:pStyle w:val="Titolo2"/>
       </w:pPr>
-      <w:bookmarkStart w:id="6" w:name="_Toc243487624"/>
+      <w:bookmarkStart w:id="6" w:name="_Toc243488090"/>
       <w:r>
         <w:t>2.5 Serie 2, non scelta</w:t>
       </w:r>
@@ -4973,7 +5039,7 @@
           <w:noProof/>
         </w:rPr>
         <w:drawing>
-          <wp:inline distT="0" distB="0" distL="0" distR="0" wp14:anchorId="201918E8" wp14:editId="7DDD373F">
+          <wp:inline distT="0" distB="0" distL="0" distR="0" wp14:anchorId="7142F7A2" wp14:editId="3122F7B7">
             <wp:extent cx="5905500" cy="4133850"/>
             <wp:effectExtent l="0" t="0" r="0" b="0"/>
             <wp:docPr id="4" name="Immagine 4"/>
@@ -5571,6 +5637,7 @@
           </w:tcPr>
           <w:p>
             <w:r>
+              <w:lastRenderedPageBreak/>
               <w:t>10</w:t>
             </w:r>
           </w:p>
@@ -5693,7 +5760,7 @@
       <w:pPr>
         <w:pStyle w:val="Titolo2"/>
       </w:pPr>
-      <w:bookmarkStart w:id="7" w:name="_Toc243487625"/>
+      <w:bookmarkStart w:id="7" w:name="_Toc243488091"/>
       <w:r>
         <w:t>2.6 Serie 1, scartata</w:t>
       </w:r>
@@ -5717,7 +5784,7 @@
           <w:noProof/>
         </w:rPr>
         <w:drawing>
-          <wp:inline distT="0" distB="0" distL="0" distR="0" wp14:anchorId="2A9D6A38" wp14:editId="7400A368">
+          <wp:inline distT="0" distB="0" distL="0" distR="0" wp14:anchorId="2585F6AE" wp14:editId="1F554AD4">
             <wp:extent cx="4000500" cy="2800350"/>
             <wp:effectExtent l="0" t="0" r="0" b="0"/>
             <wp:docPr id="5" name="Immagine 5"/>
@@ -5776,7 +5843,7 @@
       <w:pPr>
         <w:pStyle w:val="Titolo2"/>
       </w:pPr>
-      <w:bookmarkStart w:id="8" w:name="_Toc243487626"/>
+      <w:bookmarkStart w:id="8" w:name="_Toc243488092"/>
       <w:r>
         <w:t>2.7 Verifica dei marchi registrati</w:t>
       </w:r>
@@ -6028,7 +6095,7 @@
       <w:pPr>
         <w:pStyle w:val="Titolo1"/>
       </w:pPr>
-      <w:bookmarkStart w:id="9" w:name="_Toc243487627"/>
+      <w:bookmarkStart w:id="9" w:name="_Toc243488093"/>
       <w:r>
         <w:t>3. Temi colore</w:t>
       </w:r>
@@ -6061,8 +6128,9 @@
         <w:rPr>
           <w:noProof/>
         </w:rPr>
+        <w:lastRenderedPageBreak/>
         <w:drawing>
-          <wp:inline distT="0" distB="0" distL="0" distR="0" wp14:anchorId="5789CE68" wp14:editId="5CC04EE9">
+          <wp:inline distT="0" distB="0" distL="0" distR="0" wp14:anchorId="262463C9" wp14:editId="5D14D568">
             <wp:extent cx="4572000" cy="3429000"/>
             <wp:effectExtent l="0" t="0" r="0" b="0"/>
             <wp:docPr id="6" name="Immagine 6"/>
@@ -6772,7 +6840,7 @@
       <w:pPr>
         <w:pStyle w:val="Titolo1"/>
       </w:pPr>
-      <w:bookmarkStart w:id="10" w:name="_Toc243487628"/>
+      <w:bookmarkStart w:id="10" w:name="_Toc243488094"/>
       <w:r>
         <w:t>4. Correzione: avvisi «come JavaScript»</w:t>
       </w:r>
@@ -6782,7 +6850,7 @@
       <w:pPr>
         <w:pStyle w:val="Titolo2"/>
       </w:pPr>
-      <w:bookmarkStart w:id="11" w:name="_Toc243487629"/>
+      <w:bookmarkStart w:id="11" w:name="_Toc243488095"/>
       <w:r>
         <w:t>4.1 Il problema</w:t>
       </w:r>
@@ -7185,7 +7253,7 @@
       <w:pPr>
         <w:pStyle w:val="Titolo2"/>
       </w:pPr>
-      <w:bookmarkStart w:id="12" w:name="_Toc243487630"/>
+      <w:bookmarkStart w:id="12" w:name="_Toc243488096"/>
       <w:r>
         <w:t>4.2 La soluzione</w:t>
       </w:r>
@@ -7318,7 +7386,7 @@
           <w:noProof/>
         </w:rPr>
         <w:drawing>
-          <wp:inline distT="0" distB="0" distL="0" distR="0" wp14:anchorId="58A02665" wp14:editId="12EDE429">
+          <wp:inline distT="0" distB="0" distL="0" distR="0" wp14:anchorId="034BEA40" wp14:editId="12664935">
             <wp:extent cx="4572000" cy="3429000"/>
             <wp:effectExtent l="0" t="0" r="0" b="0"/>
             <wp:docPr id="7" name="Immagine 7"/>
@@ -7377,7 +7445,7 @@
       <w:pPr>
         <w:pStyle w:val="Titolo2"/>
       </w:pPr>
-      <w:bookmarkStart w:id="13" w:name="_Toc243487631"/>
+      <w:bookmarkStart w:id="13" w:name="_Toc243488097"/>
       <w:r>
         <w:t>4.3 Verifiche</w:t>
       </w:r>
@@ -7424,7 +7492,7 @@
       <w:pPr>
         <w:pStyle w:val="Titolo2"/>
       </w:pPr>
-      <w:bookmarkStart w:id="14" w:name="_Toc243487632"/>
+      <w:bookmarkStart w:id="14" w:name="_Toc243488098"/>
       <w:r>
         <w:t>4.4 Android: menu Tema e notifiche (versione 1.0.1)</w:t>
       </w:r>
@@ -7692,6 +7760,7 @@
           </w:tcPr>
           <w:p>
             <w:r>
+              <w:lastRenderedPageBreak/>
               <w:t>Non si leggono tutte le notifiche</w:t>
             </w:r>
           </w:p>
@@ -7759,7 +7828,7 @@
       <w:pPr>
         <w:pStyle w:val="Titolo2"/>
       </w:pPr>
-      <w:bookmarkStart w:id="15" w:name="_Toc243487633"/>
+      <w:bookmarkStart w:id="15" w:name="_Toc243488099"/>
       <w:r>
         <w:t>4.5 App più leggera: traduzione tolta</w:t>
       </w:r>
@@ -8192,7 +8261,7 @@
       <w:pPr>
         <w:pStyle w:val="Titolo2"/>
       </w:pPr>
-      <w:bookmarkStart w:id="16" w:name="_Toc243487634"/>
+      <w:bookmarkStart w:id="16" w:name="_Toc243488100"/>
       <w:r>
         <w:t>4.6 Schede in una nuova finestra</w:t>
       </w:r>
@@ -8310,7 +8379,7 @@
           <w:noProof/>
         </w:rPr>
         <w:drawing>
-          <wp:inline distT="0" distB="0" distL="0" distR="0" wp14:anchorId="4B56A8D9" wp14:editId="56987043">
+          <wp:inline distT="0" distB="0" distL="0" distR="0" wp14:anchorId="79133352" wp14:editId="70A4C30D">
             <wp:extent cx="5715000" cy="857250"/>
             <wp:effectExtent l="0" t="0" r="0" b="0"/>
             <wp:docPr id="8" name="Immagine 8"/>
@@ -8508,6 +8577,7 @@
           </w:tcPr>
           <w:p>
             <w:r>
+              <w:lastRenderedPageBreak/>
               <w:t>Linux</w:t>
             </w:r>
           </w:p>
@@ -8599,7 +8669,7 @@
       <w:pPr>
         <w:pStyle w:val="Titolo2"/>
       </w:pPr>
-      <w:bookmarkStart w:id="17" w:name="_Toc243487635"/>
+      <w:bookmarkStart w:id="17" w:name="_Toc243488101"/>
       <w:r>
         <w:t>4.7 Riunire le finestre</w:t>
       </w:r>
@@ -8686,7 +8756,7 @@
       <w:pPr>
         <w:pStyle w:val="Titolo2"/>
       </w:pPr>
-      <w:bookmarkStart w:id="18" w:name="_Toc243487636"/>
+      <w:bookmarkStart w:id="18" w:name="_Toc243488102"/>
       <w:r>
         <w:t>4.8 Correzioni di «Modifica testo»</w:t>
       </w:r>
@@ -8950,8 +9020,9 @@
         <w:rPr>
           <w:noProof/>
         </w:rPr>
+        <w:lastRenderedPageBreak/>
         <w:drawing>
-          <wp:inline distT="0" distB="0" distL="0" distR="0" wp14:anchorId="3117959B" wp14:editId="70D317EC">
+          <wp:inline distT="0" distB="0" distL="0" distR="0" wp14:anchorId="7BDBCA12" wp14:editId="39E41A96">
             <wp:extent cx="3286125" cy="2286000"/>
             <wp:effectExtent l="0" t="0" r="0" b="0"/>
             <wp:docPr id="9" name="Immagine 9"/>
@@ -9016,7 +9087,7 @@
           <w:noProof/>
         </w:rPr>
         <w:drawing>
-          <wp:inline distT="0" distB="0" distL="0" distR="0" wp14:anchorId="6D49B6E9" wp14:editId="3FFB045A">
+          <wp:inline distT="0" distB="0" distL="0" distR="0" wp14:anchorId="7EDCC4AE" wp14:editId="76723F65">
             <wp:extent cx="3286125" cy="2286000"/>
             <wp:effectExtent l="0" t="0" r="0" b="0"/>
             <wp:docPr id="10" name="Immagine 10"/>
@@ -9083,7 +9154,7 @@
       <w:pPr>
         <w:pStyle w:val="Titolo1"/>
       </w:pPr>
-      <w:bookmarkStart w:id="19" w:name="_Toc243487637"/>
+      <w:bookmarkStart w:id="19" w:name="_Toc243488103"/>
       <w:r>
         <w:t>5. Decisioni</w:t>
       </w:r>
@@ -9101,7 +9172,7 @@
       <w:pPr>
         <w:pStyle w:val="Titolo2"/>
       </w:pPr>
-      <w:bookmarkStart w:id="20" w:name="_Toc243487638"/>
+      <w:bookmarkStart w:id="20" w:name="_Toc243488104"/>
       <w:r>
         <w:t>5.1 Canale degli aggiornamenti</w:t>
       </w:r>
@@ -9552,6 +9623,7 @@
           </w:tcPr>
           <w:p>
             <w:r>
+              <w:lastRenderedPageBreak/>
               <w:t>Compromesso efficace</w:t>
             </w:r>
           </w:p>
@@ -9608,7 +9680,7 @@
       <w:pPr>
         <w:pStyle w:val="Titolo2"/>
       </w:pPr>
-      <w:bookmarkStart w:id="21" w:name="_Toc243487639"/>
+      <w:bookmarkStart w:id="21" w:name="_Toc243488105"/>
       <w:r>
         <w:t>5.2 Storia del repository</w:t>
       </w:r>
@@ -10115,7 +10187,7 @@
       <w:pPr>
         <w:pStyle w:val="Titolo2"/>
       </w:pPr>
-      <w:bookmarkStart w:id="22" w:name="_Toc243487640"/>
+      <w:bookmarkStart w:id="22" w:name="_Toc243488106"/>
       <w:r>
         <w:t>5.3 Identificativi del prodotto</w:t>
       </w:r>
@@ -10615,8 +10687,9 @@
       <w:pPr>
         <w:pStyle w:val="Titolo2"/>
       </w:pPr>
-      <w:bookmarkStart w:id="23" w:name="_Toc243487641"/>
-      <w:r>
+      <w:bookmarkStart w:id="23" w:name="_Toc243488107"/>
+      <w:r>
+        <w:lastRenderedPageBreak/>
         <w:t>5.4 Avvisi e domande</w:t>
       </w:r>
       <w:bookmarkEnd w:id="23"/>
@@ -11122,7 +11195,7 @@
       <w:pPr>
         <w:pStyle w:val="Titolo2"/>
       </w:pPr>
-      <w:bookmarkStart w:id="24" w:name="_Toc243487642"/>
+      <w:bookmarkStart w:id="24" w:name="_Toc243488108"/>
       <w:r>
         <w:t>5.5 Traduzione offline</w:t>
       </w:r>
@@ -11629,7 +11702,7 @@
       <w:pPr>
         <w:pStyle w:val="Titolo2"/>
       </w:pPr>
-      <w:bookmarkStart w:id="25" w:name="_Toc243487643"/>
+      <w:bookmarkStart w:id="25" w:name="_Toc243488109"/>
       <w:r>
         <w:t>5.6 Passaggio della scheda alla nuova finestra</w:t>
       </w:r>
@@ -12151,7 +12224,7 @@
       <w:pPr>
         <w:pStyle w:val="Titolo2"/>
       </w:pPr>
-      <w:bookmarkStart w:id="26" w:name="_Toc243487644"/>
+      <w:bookmarkStart w:id="26" w:name="_Toc243488110"/>
       <w:r>
         <w:t>5.7 Come si cancella la riga in «Modifica testo»</w:t>
       </w:r>
@@ -12658,7 +12731,7 @@
       <w:pPr>
         <w:pStyle w:val="Titolo1"/>
       </w:pPr>
-      <w:bookmarkStart w:id="27" w:name="_Toc243487645"/>
+      <w:bookmarkStart w:id="27" w:name="_Toc243488111"/>
       <w:r>
         <w:t>6. Come si lavora</w:t>
       </w:r>
@@ -12668,7 +12741,7 @@
       <w:pPr>
         <w:pStyle w:val="Titolo2"/>
       </w:pPr>
-      <w:bookmarkStart w:id="28" w:name="_Toc243487646"/>
+      <w:bookmarkStart w:id="28" w:name="_Toc243488112"/>
       <w:r>
         <w:t>6.1 Comandi</w:t>
       </w:r>
@@ -12738,7 +12811,7 @@
       <w:pPr>
         <w:pStyle w:val="Titolo2"/>
       </w:pPr>
-      <w:bookmarkStart w:id="29" w:name="_Toc243487647"/>
+      <w:bookmarkStart w:id="29" w:name="_Toc243488113"/>
       <w:r>
         <w:t>6.2 Pubblicare una versione</w:t>
       </w:r>
@@ -12859,6 +12932,7 @@
         <w:spacing w:after="60"/>
       </w:pPr>
       <w:r>
+        <w:lastRenderedPageBreak/>
         <w:t>La pipeline compila Windows, macOS, Linux e Android e pubblica la GitHub Release con installer e file di versione.</w:t>
       </w:r>
     </w:p>
@@ -12866,7 +12940,7 @@
       <w:pPr>
         <w:pStyle w:val="Titolo2"/>
       </w:pPr>
-      <w:bookmarkStart w:id="30" w:name="_Toc243487648"/>
+      <w:bookmarkStart w:id="30" w:name="_Toc243488114"/>
       <w:r>
         <w:t>6.3 Release 1.0.0 (pubblicata il 16 ottobre 2026)</w:t>
       </w:r>
@@ -13593,7 +13667,7 @@
       <w:pPr>
         <w:pStyle w:val="Titolo2"/>
       </w:pPr>
-      <w:bookmarkStart w:id="31" w:name="_Toc243487649"/>
+      <w:bookmarkStart w:id="31" w:name="_Toc243488115"/>
       <w:r>
         <w:t>6.4 Release 1.0.1</w:t>
       </w:r>
@@ -13890,8 +13964,9 @@
       <w:pPr>
         <w:pStyle w:val="Titolo2"/>
       </w:pPr>
-      <w:bookmarkStart w:id="32" w:name="_Toc243487650"/>
-      <w:r>
+      <w:bookmarkStart w:id="32" w:name="_Toc243488116"/>
+      <w:r>
+        <w:lastRenderedPageBreak/>
         <w:t>6.5 Release 1.0.2 e repository pubblico</w:t>
       </w:r>
       <w:bookmarkEnd w:id="32"/>
@@ -14312,7 +14387,7 @@
       <w:pPr>
         <w:pStyle w:val="Titolo2"/>
       </w:pPr>
-      <w:bookmarkStart w:id="33" w:name="_Toc243487651"/>
+      <w:bookmarkStart w:id="33" w:name="_Toc243488117"/>
       <w:r>
         <w:t>6.6 Nuova versione: link diretto per ogni sistema</w:t>
       </w:r>
@@ -14728,8 +14803,9 @@
         <w:rPr>
           <w:noProof/>
         </w:rPr>
+        <w:lastRenderedPageBreak/>
         <w:drawing>
-          <wp:inline distT="0" distB="0" distL="0" distR="0" wp14:anchorId="1BE2C657" wp14:editId="65DFC2AE">
+          <wp:inline distT="0" distB="0" distL="0" distR="0" wp14:anchorId="17F6ED05" wp14:editId="76EF9EDF">
             <wp:extent cx="4572000" cy="4429125"/>
             <wp:effectExtent l="0" t="0" r="0" b="0"/>
             <wp:docPr id="11" name="Immagine 11"/>
@@ -14804,7 +14880,7 @@
       <w:pPr>
         <w:pStyle w:val="Titolo2"/>
       </w:pPr>
-      <w:bookmarkStart w:id="34" w:name="_Toc243487652"/>
+      <w:bookmarkStart w:id="34" w:name="_Toc243488118"/>
       <w:r>
         <w:t>6.7 Release 1.1.0</w:t>
       </w:r>
@@ -15368,11 +15444,51 @@
       <w:pPr>
         <w:pStyle w:val="Titolo2"/>
       </w:pPr>
-      <w:bookmarkStart w:id="35" w:name="_Toc243487653"/>
-      <w:r>
-        <w:t>6.8 Ruoli</w:t>
+      <w:bookmarkStart w:id="35" w:name="_Toc243488119"/>
+      <w:r>
+        <w:lastRenderedPageBreak/>
+        <w:t>6.8 Versione 1.2.0</w:t>
       </w:r>
       <w:bookmarkEnd w:id="35"/>
+    </w:p>
+    <w:p>
+      <w:pPr>
+        <w:spacing w:after="120"/>
+      </w:pPr>
+      <w:r>
+        <w:t xml:space="preserve">Preparata il 21 ottobre 2026: numeri di versione (installer Windows 101.2.0, Android 1001002000), CHANGELOG e novità della campanella. Contiene le schede fra finestre (4.7), le correzioni di «Modifica testo» (4.8) e il passaggio a </w:t>
+      </w:r>
+      <w:r>
+        <w:rPr>
+          <w:b/>
+          <w:bCs/>
+        </w:rPr>
+        <w:t>PyMuPDF 2.0</w:t>
+      </w:r>
+      <w:r>
+        <w:t xml:space="preserve">, fatto in una sessione separata: «Sblocca moduli» scrive direttamente il flag di sola lettura dei campi (con la 2.0 il vecchio metodo non lo salvava) e il limite diventa </w:t>
+      </w:r>
+      <w:r>
+        <w:rPr>
+          <w:rFonts w:ascii="Consolas" w:eastAsia="Consolas" w:hAnsi="Consolas" w:cs="Consolas"/>
+          <w:sz w:val="19"/>
+          <w:szCs w:val="19"/>
+        </w:rPr>
+        <w:t>pymupdf&lt;3</w:t>
+      </w:r>
+      <w:r>
+        <w:t>. Tutti i test passano con la 1.28.2 e con la 2.0 (77 passati, 2 saltati). L'app Android resta sulla 1.28.2 (per la 2.0 non c'è la versione WebAssembly).</w:t>
+      </w:r>
+    </w:p>
+    <w:p>
+      <w:pPr>
+        <w:pStyle w:val="Titolo2"/>
+      </w:pPr>
+      <w:bookmarkStart w:id="36" w:name="_Toc243488120"/>
+      <w:r>
+        <w:t>6.9 Ruoli</w:t>
+      </w:r>
+      <w:bookmarkEnd w:id="36"/>
     </w:p>
     <w:tbl>
       <w:tblPr>
@@ -15641,11 +15757,11 @@
       <w:pPr>
         <w:pStyle w:val="Titolo1"/>
       </w:pPr>
-      <w:bookmarkStart w:id="36" w:name="_Toc243487654"/>
+      <w:bookmarkStart w:id="37" w:name="_Toc243488121"/>
       <w:r>
         <w:t>7. Sicurezza</w:t>
       </w:r>
-      <w:bookmarkEnd w:id="36"/>
+      <w:bookmarkEnd w:id="37"/>
     </w:p>
     <w:p>
       <w:pPr>
@@ -15940,11 +16056,11 @@
       <w:pPr>
         <w:pStyle w:val="Titolo1"/>
       </w:pPr>
-      <w:bookmarkStart w:id="37" w:name="_Toc243487655"/>
+      <w:bookmarkStart w:id="38" w:name="_Toc243488122"/>
       <w:r>
         <w:t>8. Punti aperti</w:t>
       </w:r>
-      <w:bookmarkEnd w:id="37"/>
+      <w:bookmarkEnd w:id="38"/>
     </w:p>
     <w:p>
       <w:pPr>
@@ -16093,10 +16209,11 @@
           <w:b/>
           <w:bCs/>
         </w:rPr>
-        <w:t>Pubblicare</w:t>
-      </w:r>
-      <w:r>
-        <w:t xml:space="preserve"> le schede fra finestre e le correzioni di «Modifica testo» (proposta: versione 1.2.0).</w:t>
+        <w:lastRenderedPageBreak/>
+        <w:t>PyMuPDF 2.0 su Android</w:t>
+      </w:r>
+      <w:r>
+        <w:t>: l'app Android resta sulla 1.28.2 finché non esiste la versione WebAssembly della 2.0.</w:t>
       </w:r>
     </w:p>
     <w:p>
@@ -16109,26 +16226,6 @@
         <w:spacing w:after="60"/>
       </w:pPr>
       <w:r>
-        <w:rPr>
-          <w:b/>
-          <w:bCs/>
-        </w:rPr>
-        <w:t>Passaggio a PyMuPDF 2.0</w:t>
-      </w:r>
-      <w:r>
-        <w:t xml:space="preserve"> da fare a parte: correggere «Sblocca moduli» e rilanciare tutti i test.</w:t>
-      </w:r>
-    </w:p>
-    <w:p>
-      <w:pPr>
-        <w:pStyle w:val="Paragrafoelenco"/>
-        <w:numPr>
-          <w:ilvl w:val="0"/>
-          <w:numId w:val="4"/>
-        </w:numPr>
-        <w:spacing w:after="60"/>
-      </w:pPr>
-      <w:r>
         <w:t xml:space="preserve">Sul PC di sviluppo la cartella </w:t>
       </w:r>
       <w:r>
@@ -16147,11 +16244,11 @@
       <w:pPr>
         <w:pStyle w:val="Titolo1"/>
       </w:pPr>
-      <w:bookmarkStart w:id="38" w:name="_Toc243487656"/>
+      <w:bookmarkStart w:id="39" w:name="_Toc243488123"/>
       <w:r>
         <w:t>9. Pensato per i prossimi 10 anni</w:t>
       </w:r>
-      <w:bookmarkEnd w:id="38"/>
+      <w:bookmarkEnd w:id="39"/>
     </w:p>
     <w:p>
       <w:pPr>
@@ -16425,118 +16522,150 @@
 <file path=word/numbering.xml><?xml version="1.0" encoding="utf-8"?>
 <w:numbering xmlns:wpc="http://schemas.microsoft.com/office/word/2010/wordprocessingCanvas" xmlns:cx="http://schemas.microsoft.com/office/drawing/2014/chartex" xmlns:cx1="http://schemas.microsoft.com/office/drawing/2015/9/8/chartex" xmlns:cx2="http://schemas.microsoft.com/office/drawing/2015/10/21/chartex" xmlns:cx3="http://schemas.microsoft.com/office/drawing/2016/5/9/chartex" xmlns:cx4="http://schemas.microsoft.com/office/drawing/2016/5/10/chartex" xmlns:cx5="http://schemas.microsoft.com/office/drawing/2016/5/11/chartex" xmlns:cx6="http://schemas.microsoft.com/office/drawing/2016/5/12/chartex" xmlns:cx7="http://schemas.microsoft.com/office/drawing/2016/5/13/chartex" xmlns:cx8="http://schemas.microsoft.com/office/drawing/2016/5/14/chartex" xmlns:mc="http://schemas.openxmlformats.org/markup-compatibility/2006" xmlns:aink="http://schemas.microsoft.com/office/drawing/2016/ink" xmlns:am3d="http://schemas.microsoft.com/office/drawing/2017/model3d" xmlns:o="urn:schemas-microsoft-com:office:office" xmlns:oel="http://schemas.microsoft.com/office/2019/extlst" xmlns:r="http://schemas.openxmlformats.org/officeDocument/2006/relationships" xmlns:m="http://schemas.openxmlformats.org/officeDocument/2006/math" xmlns:v="urn:schemas-microsoft-com:vml" xmlns:wp14="http://schemas.microsoft.com/office/word/2010/wordprocessingDrawing" xmlns:wp="http://schemas.openxmlformats.org/drawingml/2006/wordprocessingDrawing" xmlns:w10="urn:schemas-microsoft-com:office:word" xmlns:w="http://schemas.openxmlformats.org/wordprocessingml/2006/main" xmlns:w14="http://schemas.microsoft.com/office/word/2010/wordml" xmlns:w15="http://schemas.microsoft.com/office/word/2012/wordml" xmlns:w16cex="http://schemas.microsoft.com/office/word/2018/wordml/cex" xmlns:w16cid="http://schemas.microsoft.com/office/word/2016/wordml/cid" xmlns:w16="http://schemas.microsoft.com/office/word/2018/wordml" xmlns:w16du="http://schemas.microsoft.com/office/word/2023/wordml/word16du" xmlns:w16sdtdh="http://schemas.microsoft.com/office/word/2020/wordml/sdtdatahash" xmlns:w16sdtfl="http://schemas.microsoft.com/office/word/2024/wordml/sdtformatlock" xmlns:w16se="http://schemas.microsoft.com/office/word/2015/wordml/symex" xmlns:wpg="http://schemas.microsoft.com/office/word/2010/wordprocessingGroup" xmlns:wpi="http://schemas.microsoft.com/office/word/2010/wordprocessingInk" xmlns:wne="http://schemas.microsoft.com/office/word/2006/wordml" xmlns:wps="http://schemas.microsoft.com/office/word/2010/wordprocessingShape" mc:Ignorable="w14 w15 w16se w16cid w16 w16cex w16sdtdh w16sdtfl w16du wp14">
   <w:abstractNum w:abstractNumId="0" w15:restartNumberingAfterBreak="0">
-    <w:nsid w:val="09762A89"/>
+    <w:nsid w:val="0E61564A"/>
     <w:multiLevelType w:val="hybridMultilevel"/>
-    <w:tmpl w:val="E8CEC668"/>
-    <w:lvl w:ilvl="0" w:tplc="0FCC7442">
+    <w:tmpl w:val="56045EC6"/>
+    <w:lvl w:ilvl="0" w:tplc="64D4850C" w:tentative="1">
       <w:start w:val="1"/>
-      <w:numFmt w:val="decimal"/>
-      <w:lvlText w:val="%1."/>
+      <w:numFmt w:val="bullet"/>
+      <w:lvlText w:val="●"/>
       <w:lvlJc w:val="left"/>
       <w:pPr>
-        <w:ind w:left="540" w:hanging="300"/>
+        <w:ind w:left="720" w:hanging="360"/>
       </w:pPr>
     </w:lvl>
-    <w:lvl w:ilvl="1" w:tplc="8F52A802">
+    <w:lvl w:ilvl="1" w:tplc="8F16C98A" w:tentative="1">
+      <w:start w:val="1"/>
+      <w:numFmt w:val="bullet"/>
+      <w:lvlText w:val="○"/>
+      <w:lvlJc w:val="left"/>
+      <w:pPr>
+        <w:ind w:left="1440" w:hanging="360"/>
+      </w:pPr>
+    </w:lvl>
+    <w:lvl w:ilvl="2" w:tplc="55EE0EFE" w:tentative="1">
+      <w:start w:val="1"/>
+      <w:numFmt w:val="bullet"/>
+      <w:lvlText w:val="■"/>
+      <w:lvlJc w:val="left"/>
+      <w:pPr>
+        <w:ind w:left="2160" w:hanging="360"/>
+      </w:pPr>
+    </w:lvl>
+    <w:lvl w:ilvl="3" w:tplc="7716E714" w:tentative="1">
+      <w:start w:val="1"/>
+      <w:numFmt w:val="bullet"/>
+      <w:lvlText w:val="●"/>
+      <w:lvlJc w:val="left"/>
+      <w:pPr>
+        <w:ind w:left="2880" w:hanging="360"/>
+      </w:pPr>
+    </w:lvl>
+    <w:lvl w:ilvl="4" w:tplc="92B2464C" w:tentative="1">
+      <w:start w:val="1"/>
+      <w:numFmt w:val="bullet"/>
+      <w:lvlText w:val="○"/>
+      <w:lvlJc w:val="left"/>
+      <w:pPr>
+        <w:ind w:left="3600" w:hanging="360"/>
+      </w:pPr>
+    </w:lvl>
+    <w:lvl w:ilvl="5" w:tplc="5EAC6F52" w:tentative="1">
+      <w:start w:val="1"/>
+      <w:numFmt w:val="bullet"/>
+      <w:lvlText w:val="■"/>
+      <w:lvlJc w:val="left"/>
+      <w:pPr>
+        <w:ind w:left="4320" w:hanging="360"/>
+      </w:pPr>
+    </w:lvl>
+    <w:lvl w:ilvl="6" w:tplc="0930DF94" w:tentative="1">
+      <w:start w:val="1"/>
+      <w:numFmt w:val="bullet"/>
+      <w:lvlText w:val="●"/>
+      <w:lvlJc w:val="left"/>
+      <w:pPr>
+        <w:ind w:left="5040" w:hanging="360"/>
+      </w:pPr>
+    </w:lvl>
+    <w:lvl w:ilvl="7" w:tplc="D3F85276" w:tentative="1">
+      <w:start w:val="1"/>
+      <w:numFmt w:val="bullet"/>
+      <w:lvlText w:val="●"/>
+      <w:lvlJc w:val="left"/>
+      <w:pPr>
+        <w:ind w:left="5760" w:hanging="360"/>
+      </w:pPr>
+    </w:lvl>
+    <w:lvl w:ilvl="8" w:tplc="EA0A2E44" w:tentative="1">
+      <w:start w:val="1"/>
+      <w:numFmt w:val="bullet"/>
+      <w:lvlText w:val="●"/>
+      <w:lvlJc w:val="left"/>
+      <w:pPr>
+        <w:ind w:left="6480" w:hanging="360"/>
+      </w:pPr>
+    </w:lvl>
+  </w:abstractNum>
+  <w:abstractNum w:abstractNumId="1" w15:restartNumberingAfterBreak="0">
+    <w:nsid w:val="2E1100AC"/>
+    <w:multiLevelType w:val="hybridMultilevel"/>
+    <w:tmpl w:val="FA42774C"/>
+    <w:lvl w:ilvl="0" w:tplc="3872F446">
+      <w:start w:val="1"/>
+      <w:numFmt w:val="bullet"/>
+      <w:lvlText w:val="•"/>
+      <w:lvlJc w:val="left"/>
+      <w:pPr>
+        <w:ind w:left="540" w:hanging="270"/>
+      </w:pPr>
+    </w:lvl>
+    <w:lvl w:ilvl="1" w:tplc="C9D43DBA">
       <w:numFmt w:val="decimal"/>
       <w:lvlText w:val=""/>
       <w:lvlJc w:val="left"/>
     </w:lvl>
-    <w:lvl w:ilvl="2" w:tplc="DACEC53E">
+    <w:lvl w:ilvl="2" w:tplc="5E9025D6">
       <w:numFmt w:val="decimal"/>
       <w:lvlText w:val=""/>
       <w:lvlJc w:val="left"/>
     </w:lvl>
-    <w:lvl w:ilvl="3" w:tplc="9872D33C">
+    <w:lvl w:ilvl="3" w:tplc="E0FA619E">
       <w:numFmt w:val="decimal"/>
       <w:lvlText w:val=""/>
       <w:lvlJc w:val="left"/>
     </w:lvl>
-    <w:lvl w:ilvl="4" w:tplc="66646A22">
+    <w:lvl w:ilvl="4" w:tplc="51F458FA">
       <w:numFmt w:val="decimal"/>
       <w:lvlText w:val=""/>
       <w:lvlJc w:val="left"/>
     </w:lvl>
-    <w:lvl w:ilvl="5" w:tplc="32846E8A">
+    <w:lvl w:ilvl="5" w:tplc="02E41D40">
       <w:numFmt w:val="decimal"/>
       <w:lvlText w:val=""/>
       <w:lvlJc w:val="left"/>
     </w:lvl>
-    <w:lvl w:ilvl="6" w:tplc="4092A450">
+    <w:lvl w:ilvl="6" w:tplc="A60CC93C">
       <w:numFmt w:val="decimal"/>
       <w:lvlText w:val=""/>
       <w:lvlJc w:val="left"/>
     </w:lvl>
-    <w:lvl w:ilvl="7" w:tplc="05A010A6">
+    <w:lvl w:ilvl="7" w:tplc="B0C62D78">
       <w:numFmt w:val="decimal"/>
       <w:lvlText w:val=""/>
       <w:lvlJc w:val="left"/>
     </w:lvl>
-    <w:lvl w:ilvl="8" w:tplc="07A6E48C">
-      <w:numFmt w:val="decimal"/>
-      <w:lvlText w:val=""/>
-      <w:lvlJc w:val="left"/>
-    </w:lvl>
-  </w:abstractNum>
-  <w:abstractNum w:abstractNumId="1" w15:restartNumberingAfterBreak="0">
-    <w:nsid w:val="192A1155"/>
-    <w:multiLevelType w:val="hybridMultilevel"/>
-    <w:tmpl w:val="58DA3360"/>
-    <w:lvl w:ilvl="0" w:tplc="79F2C464">
-      <w:start w:val="1"/>
-      <w:numFmt w:val="bullet"/>
-      <w:lvlText w:val="•"/>
-      <w:lvlJc w:val="left"/>
-      <w:pPr>
-        <w:ind w:left="540" w:hanging="270"/>
-      </w:pPr>
-    </w:lvl>
-    <w:lvl w:ilvl="1" w:tplc="B38A4766">
-      <w:numFmt w:val="decimal"/>
-      <w:lvlText w:val=""/>
-      <w:lvlJc w:val="left"/>
-    </w:lvl>
-    <w:lvl w:ilvl="2" w:tplc="777AF4FE">
-      <w:numFmt w:val="decimal"/>
-      <w:lvlText w:val=""/>
-      <w:lvlJc w:val="left"/>
-    </w:lvl>
-    <w:lvl w:ilvl="3" w:tplc="428417F4">
-      <w:numFmt w:val="decimal"/>
-      <w:lvlText w:val=""/>
-      <w:lvlJc w:val="left"/>
-    </w:lvl>
-    <w:lvl w:ilvl="4" w:tplc="3BF471E8">
-      <w:numFmt w:val="decimal"/>
-      <w:lvlText w:val=""/>
-      <w:lvlJc w:val="left"/>
-    </w:lvl>
-    <w:lvl w:ilvl="5" w:tplc="612647B4">
-      <w:numFmt w:val="decimal"/>
-      <w:lvlText w:val=""/>
-      <w:lvlJc w:val="left"/>
-    </w:lvl>
-    <w:lvl w:ilvl="6" w:tplc="224C245E">
-      <w:numFmt w:val="decimal"/>
-      <w:lvlText w:val=""/>
-      <w:lvlJc w:val="left"/>
-    </w:lvl>
-    <w:lvl w:ilvl="7" w:tplc="95BA8FBC">
-      <w:numFmt w:val="decimal"/>
-      <w:lvlText w:val=""/>
-      <w:lvlJc w:val="left"/>
-    </w:lvl>
-    <w:lvl w:ilvl="8" w:tplc="A5AA10E8">
+    <w:lvl w:ilvl="8" w:tplc="C4E641E2">
       <w:numFmt w:val="decimal"/>
       <w:lvlText w:val=""/>
       <w:lvlJc w:val="left"/>
     </w:lvl>
   </w:abstractNum>
   <w:abstractNum w:abstractNumId="2" w15:restartNumberingAfterBreak="0">
-    <w:nsid w:val="4BA37FDE"/>
+    <w:nsid w:val="438203BC"/>
     <w:multiLevelType w:val="hybridMultilevel"/>
-    <w:tmpl w:val="546E8F44"/>
-    <w:lvl w:ilvl="0" w:tplc="AB5C60C8">
+    <w:tmpl w:val="E47C0662"/>
+    <w:lvl w:ilvl="0" w:tplc="2A7087BC">
       <w:start w:val="1"/>
       <w:numFmt w:val="decimal"/>
       <w:lvlText w:val="%1."/>
@@ -16545,152 +16674,120 @@
         <w:ind w:left="540" w:hanging="300"/>
       </w:pPr>
     </w:lvl>
-    <w:lvl w:ilvl="1" w:tplc="3B6C0968">
+    <w:lvl w:ilvl="1" w:tplc="D688B180">
       <w:numFmt w:val="decimal"/>
       <w:lvlText w:val=""/>
       <w:lvlJc w:val="left"/>
     </w:lvl>
-    <w:lvl w:ilvl="2" w:tplc="4CA0F8EC">
+    <w:lvl w:ilvl="2" w:tplc="0D9EBEE4">
       <w:numFmt w:val="decimal"/>
       <w:lvlText w:val=""/>
       <w:lvlJc w:val="left"/>
     </w:lvl>
-    <w:lvl w:ilvl="3" w:tplc="2274075C">
+    <w:lvl w:ilvl="3" w:tplc="B8BA65D6">
       <w:numFmt w:val="decimal"/>
       <w:lvlText w:val=""/>
       <w:lvlJc w:val="left"/>
     </w:lvl>
-    <w:lvl w:ilvl="4" w:tplc="C234EDAC">
+    <w:lvl w:ilvl="4" w:tplc="1E562E2C">
       <w:numFmt w:val="decimal"/>
       <w:lvlText w:val=""/>
       <w:lvlJc w:val="left"/>
     </w:lvl>
-    <w:lvl w:ilvl="5" w:tplc="617C6996">
+    <w:lvl w:ilvl="5" w:tplc="D166D63A">
       <w:numFmt w:val="decimal"/>
       <w:lvlText w:val=""/>
       <w:lvlJc w:val="left"/>
     </w:lvl>
-    <w:lvl w:ilvl="6" w:tplc="35987EBC">
+    <w:lvl w:ilvl="6" w:tplc="F3F49DBE">
       <w:numFmt w:val="decimal"/>
       <w:lvlText w:val=""/>
       <w:lvlJc w:val="left"/>
     </w:lvl>
-    <w:lvl w:ilvl="7" w:tplc="62920EF4">
+    <w:lvl w:ilvl="7" w:tplc="265C20F6">
       <w:numFmt w:val="decimal"/>
       <w:lvlText w:val=""/>
       <w:lvlJc w:val="left"/>
     </w:lvl>
-    <w:lvl w:ilvl="8" w:tplc="E5AA39E0">
+    <w:lvl w:ilvl="8" w:tplc="FBB89008">
       <w:numFmt w:val="decimal"/>
       <w:lvlText w:val=""/>
       <w:lvlJc w:val="left"/>
     </w:lvl>
   </w:abstractNum>
   <w:abstractNum w:abstractNumId="3" w15:restartNumberingAfterBreak="0">
-    <w:nsid w:val="502E4C7A"/>
+    <w:nsid w:val="63284E80"/>
     <w:multiLevelType w:val="hybridMultilevel"/>
-    <w:tmpl w:val="41363598"/>
-    <w:lvl w:ilvl="0" w:tplc="5DF4D98C" w:tentative="1">
+    <w:tmpl w:val="B08EE544"/>
+    <w:lvl w:ilvl="0" w:tplc="2918C7C6">
       <w:start w:val="1"/>
-      <w:numFmt w:val="bullet"/>
-      <w:lvlText w:val="●"/>
+      <w:numFmt w:val="decimal"/>
+      <w:lvlText w:val="%1."/>
       <w:lvlJc w:val="left"/>
       <w:pPr>
-        <w:ind w:left="720" w:hanging="360"/>
+        <w:ind w:left="540" w:hanging="300"/>
       </w:pPr>
     </w:lvl>
-    <w:lvl w:ilvl="1" w:tplc="5466591E" w:tentative="1">
-      <w:start w:val="1"/>
-      <w:numFmt w:val="bullet"/>
-      <w:lvlText w:val="○"/>
+    <w:lvl w:ilvl="1" w:tplc="9C9EFBB4">
+      <w:numFmt w:val="decimal"/>
+      <w:lvlText w:val=""/>
       <w:lvlJc w:val="left"/>
-      <w:pPr>
-        <w:ind w:left="1440" w:hanging="360"/>
-      </w:pPr>
     </w:lvl>
-    <w:lvl w:ilvl="2" w:tplc="5B66E6C6" w:tentative="1">
-      <w:start w:val="1"/>
-      <w:numFmt w:val="bullet"/>
-      <w:lvlText w:val="■"/>
+    <w:lvl w:ilvl="2" w:tplc="F1364FE0">
+      <w:numFmt w:val="decimal"/>
+      <w:lvlText w:val=""/>
       <w:lvlJc w:val="left"/>
-      <w:pPr>
-        <w:ind w:left="2160" w:hanging="360"/>
-      </w:pPr>
     </w:lvl>
-    <w:lvl w:ilvl="3" w:tplc="EAB488D2" w:tentative="1">
-      <w:start w:val="1"/>
-      <w:numFmt w:val="bullet"/>
-      <w:lvlText w:val="●"/>
+    <w:lvl w:ilvl="3" w:tplc="AD2049CE">
+      <w:numFmt w:val="decimal"/>
+      <w:lvlText w:val=""/>
       <w:lvlJc w:val="left"/>
-      <w:pPr>
-        <w:ind w:left="2880" w:hanging="360"/>
-      </w:pPr>
     </w:lvl>
-    <w:lvl w:ilvl="4" w:tplc="5EE02B60" w:tentative="1">
-      <w:start w:val="1"/>
-      <w:numFmt w:val="bullet"/>
-      <w:lvlText w:val="○"/>
+    <w:lvl w:ilvl="4" w:tplc="E59A07C4">
+      <w:numFmt w:val="decimal"/>
+      <w:lvlText w:val=""/>
       <w:lvlJc w:val="left"/>
-      <w:pPr>
-        <w:ind w:left="3600" w:hanging="360"/>
-      </w:pPr>
     </w:lvl>
-    <w:lvl w:ilvl="5" w:tplc="7FC409C6" w:tentative="1">
-      <w:start w:val="1"/>
-      <w:numFmt w:val="bullet"/>
-      <w:lvlText w:val="■"/>
+    <w:lvl w:ilvl="5" w:tplc="417E0A4E">
+      <w:numFmt w:val="decimal"/>
+      <w:lvlText w:val=""/>
       <w:lvlJc w:val="left"/>
-      <w:pPr>
-        <w:ind w:left="4320" w:hanging="360"/>
-      </w:pPr>
     </w:lvl>
-    <w:lvl w:ilvl="6" w:tplc="68F05B04" w:tentative="1">
-      <w:start w:val="1"/>
-      <w:numFmt w:val="bullet"/>
-      <w:lvlText w:val="●"/>
+    <w:lvl w:ilvl="6" w:tplc="BB4AA266">
+      <w:numFmt w:val="decimal"/>
+      <w:lvlText w:val=""/>
       <w:lvlJc w:val="left"/>
-      <w:pPr>
-        <w:ind w:left="5040" w:hanging="360"/>
-      </w:pPr>
     </w:lvl>
-    <w:lvl w:ilvl="7" w:tplc="1E12FE80" w:tentative="1">
-      <w:start w:val="1"/>
-      <w:numFmt w:val="bullet"/>
-      <w:lvlText w:val="●"/>
+    <w:lvl w:ilvl="7" w:tplc="D07A6CDC">
+      <w:numFmt w:val="decimal"/>
+      <w:lvlText w:val=""/>
       <w:lvlJc w:val="left"/>
-      <w:pPr>
-        <w:ind w:left="5760" w:hanging="360"/>
-      </w:pPr>
     </w:lvl>
-    <w:lvl w:ilvl="8" w:tplc="3FC039C8" w:tentative="1">
-      <w:start w:val="1"/>
-      <w:numFmt w:val="bullet"/>
-      <w:lvlText w:val="●"/>
+    <w:lvl w:ilvl="8" w:tplc="AC24840A">
+      <w:numFmt w:val="decimal"/>
+      <w:lvlText w:val=""/>
       <w:lvlJc w:val="left"/>
-      <w:pPr>
-        <w:ind w:left="6480" w:hanging="360"/>
-      </w:pPr>
     </w:lvl>
   </w:abstractNum>
-  <w:num w:numId="1" w16cid:durableId="1130172008">
+  <w:num w:numId="1" w16cid:durableId="2050916301">
+    <w:abstractNumId w:val="0"/>
+    <w:lvlOverride w:ilvl="0">
+      <w:startOverride w:val="1"/>
+    </w:lvlOverride>
+  </w:num>
+  <w:num w:numId="2" w16cid:durableId="482897433">
+    <w:abstractNumId w:val="1"/>
+    <w:lvlOverride w:ilvl="0">
+      <w:startOverride w:val="1"/>
+    </w:lvlOverride>
+  </w:num>
+  <w:num w:numId="3" w16cid:durableId="1390493161">
     <w:abstractNumId w:val="3"/>
     <w:lvlOverride w:ilvl="0">
       <w:startOverride w:val="1"/>
     </w:lvlOverride>
   </w:num>
-  <w:num w:numId="2" w16cid:durableId="1700089120">
-    <w:abstractNumId w:val="1"/>
-    <w:lvlOverride w:ilvl="0">
-      <w:startOverride w:val="1"/>
-    </w:lvlOverride>
-  </w:num>
-  <w:num w:numId="3" w16cid:durableId="1108114546">
-    <w:abstractNumId w:val="0"/>
-    <w:lvlOverride w:ilvl="0">
-      <w:startOverride w:val="1"/>
-    </w:lvlOverride>
-  </w:num>
-  <w:num w:numId="4" w16cid:durableId="1529103967">
+  <w:num w:numId="4" w16cid:durableId="120810936">
     <w:abstractNumId w:val="2"/>
     <w:lvlOverride w:ilvl="0">
       <w:startOverride w:val="1"/>
@@ -17332,7 +17429,7 @@
     <w:autoRedefine/>
     <w:uiPriority w:val="39"/>
     <w:unhideWhenUsed/>
-    <w:rsid w:val="00392746"/>
+    <w:rsid w:val="004B4B7D"/>
     <w:pPr>
       <w:spacing w:after="100"/>
     </w:pPr>
@@ -17344,7 +17441,7 @@
     <w:autoRedefine/>
     <w:uiPriority w:val="39"/>
     <w:unhideWhenUsed/>
-    <w:rsid w:val="00392746"/>
+    <w:rsid w:val="004B4B7D"/>
     <w:pPr>
       <w:spacing w:after="100"/>
       <w:ind w:left="210"/>

</xml_diff>

<commit_message>
docs: release 1.2.0 pubblicata (link verificati, dimensioni degli installer)
Co-Authored-By: Claude Opus 5.5 <noreply@anthropic.com>
</commit_message>
<xml_diff>
--- a/docs/PDFz_20261021.docx
+++ b/docs/PDFz_20261021.docx
@@ -16,7 +16,7 @@
           <w:noProof/>
         </w:rPr>
         <w:drawing>
-          <wp:inline distT="0" distB="0" distL="0" distR="0" wp14:anchorId="432C5EAC" wp14:editId="1838D683">
+          <wp:inline distT="0" distB="0" distL="0" distR="0" wp14:anchorId="3AC8D11D" wp14:editId="450B2884">
             <wp:extent cx="3619500" cy="1285875"/>
             <wp:effectExtent l="0" t="0" r="0" b="0"/>
             <wp:docPr id="1" name="Immagine 1"/>
@@ -136,7 +136,7 @@
     <w:sdt>
       <w:sdtPr>
         <w:alias w:val="Indice"/>
-        <w:id w:val="-767235062"/>
+        <w:id w:val="-1398580071"/>
       </w:sdtPr>
       <w:sdtEndPr/>
       <w:sdtContent>
@@ -159,7 +159,7 @@
           <w:r>
             <w:fldChar w:fldCharType="separate"/>
           </w:r>
-          <w:hyperlink w:anchor="_Toc243488084" w:history="1">
+          <w:hyperlink w:anchor="_Toc243488769" w:history="1">
             <w:r>
               <w:rPr>
                 <w:rStyle w:val="Collegamentoipertestuale"/>
@@ -183,7 +183,7 @@
               <w:rPr>
                 <w:noProof/>
               </w:rPr>
-              <w:instrText xml:space="preserve"> PAGEREF _Toc243488084 \h </w:instrText>
+              <w:instrText xml:space="preserve"> PAGEREF _Toc243488769 \h </w:instrText>
             </w:r>
             <w:r>
               <w:rPr>
@@ -220,7 +220,7 @@
               <w:noProof/>
             </w:rPr>
           </w:pPr>
-          <w:hyperlink w:anchor="_Toc243488085" w:history="1">
+          <w:hyperlink w:anchor="_Toc243488770" w:history="1">
             <w:r>
               <w:rPr>
                 <w:rStyle w:val="Collegamentoipertestuale"/>
@@ -244,7 +244,7 @@
               <w:rPr>
                 <w:noProof/>
               </w:rPr>
-              <w:instrText xml:space="preserve"> PAGEREF _Toc243488085 \h </w:instrText>
+              <w:instrText xml:space="preserve"> PAGEREF _Toc243488770 \h </w:instrText>
             </w:r>
             <w:r>
               <w:rPr>
@@ -281,7 +281,7 @@
               <w:noProof/>
             </w:rPr>
           </w:pPr>
-          <w:hyperlink w:anchor="_Toc243488086" w:history="1">
+          <w:hyperlink w:anchor="_Toc243488771" w:history="1">
             <w:r>
               <w:rPr>
                 <w:rStyle w:val="Collegamentoipertestuale"/>
@@ -305,7 +305,7 @@
               <w:rPr>
                 <w:noProof/>
               </w:rPr>
-              <w:instrText xml:space="preserve"> PAGEREF _Toc243488086 \h </w:instrText>
+              <w:instrText xml:space="preserve"> PAGEREF _Toc243488771 \h </w:instrText>
             </w:r>
             <w:r>
               <w:rPr>
@@ -342,7 +342,7 @@
               <w:noProof/>
             </w:rPr>
           </w:pPr>
-          <w:hyperlink w:anchor="_Toc243488087" w:history="1">
+          <w:hyperlink w:anchor="_Toc243488772" w:history="1">
             <w:r>
               <w:rPr>
                 <w:rStyle w:val="Collegamentoipertestuale"/>
@@ -366,7 +366,7 @@
               <w:rPr>
                 <w:noProof/>
               </w:rPr>
-              <w:instrText xml:space="preserve"> PAGEREF _Toc243488087 \h </w:instrText>
+              <w:instrText xml:space="preserve"> PAGEREF _Toc243488772 \h </w:instrText>
             </w:r>
             <w:r>
               <w:rPr>
@@ -403,7 +403,7 @@
               <w:noProof/>
             </w:rPr>
           </w:pPr>
-          <w:hyperlink w:anchor="_Toc243488088" w:history="1">
+          <w:hyperlink w:anchor="_Toc243488773" w:history="1">
             <w:r>
               <w:rPr>
                 <w:rStyle w:val="Collegamentoipertestuale"/>
@@ -427,7 +427,7 @@
               <w:rPr>
                 <w:noProof/>
               </w:rPr>
-              <w:instrText xml:space="preserve"> PAGEREF _Toc243488088 \h </w:instrText>
+              <w:instrText xml:space="preserve"> PAGEREF _Toc243488773 \h </w:instrText>
             </w:r>
             <w:r>
               <w:rPr>
@@ -464,7 +464,7 @@
               <w:noProof/>
             </w:rPr>
           </w:pPr>
-          <w:hyperlink w:anchor="_Toc243488089" w:history="1">
+          <w:hyperlink w:anchor="_Toc243488774" w:history="1">
             <w:r>
               <w:rPr>
                 <w:rStyle w:val="Collegamentoipertestuale"/>
@@ -488,7 +488,7 @@
               <w:rPr>
                 <w:noProof/>
               </w:rPr>
-              <w:instrText xml:space="preserve"> PAGEREF _Toc243488089 \h </w:instrText>
+              <w:instrText xml:space="preserve"> PAGEREF _Toc243488774 \h </w:instrText>
             </w:r>
             <w:r>
               <w:rPr>
@@ -525,7 +525,7 @@
               <w:noProof/>
             </w:rPr>
           </w:pPr>
-          <w:hyperlink w:anchor="_Toc243488090" w:history="1">
+          <w:hyperlink w:anchor="_Toc243488775" w:history="1">
             <w:r>
               <w:rPr>
                 <w:rStyle w:val="Collegamentoipertestuale"/>
@@ -549,7 +549,7 @@
               <w:rPr>
                 <w:noProof/>
               </w:rPr>
-              <w:instrText xml:space="preserve"> PAGEREF _Toc243488090 \h </w:instrText>
+              <w:instrText xml:space="preserve"> PAGEREF _Toc243488775 \h </w:instrText>
             </w:r>
             <w:r>
               <w:rPr>
@@ -586,7 +586,7 @@
               <w:noProof/>
             </w:rPr>
           </w:pPr>
-          <w:hyperlink w:anchor="_Toc243488091" w:history="1">
+          <w:hyperlink w:anchor="_Toc243488776" w:history="1">
             <w:r>
               <w:rPr>
                 <w:rStyle w:val="Collegamentoipertestuale"/>
@@ -610,7 +610,7 @@
               <w:rPr>
                 <w:noProof/>
               </w:rPr>
-              <w:instrText xml:space="preserve"> PAGEREF _Toc243488091 \h </w:instrText>
+              <w:instrText xml:space="preserve"> PAGEREF _Toc243488776 \h </w:instrText>
             </w:r>
             <w:r>
               <w:rPr>
@@ -647,7 +647,7 @@
               <w:noProof/>
             </w:rPr>
           </w:pPr>
-          <w:hyperlink w:anchor="_Toc243488092" w:history="1">
+          <w:hyperlink w:anchor="_Toc243488777" w:history="1">
             <w:r>
               <w:rPr>
                 <w:rStyle w:val="Collegamentoipertestuale"/>
@@ -671,7 +671,7 @@
               <w:rPr>
                 <w:noProof/>
               </w:rPr>
-              <w:instrText xml:space="preserve"> PAGEREF _Toc243488092 \h </w:instrText>
+              <w:instrText xml:space="preserve"> PAGEREF _Toc243488777 \h </w:instrText>
             </w:r>
             <w:r>
               <w:rPr>
@@ -708,7 +708,7 @@
               <w:noProof/>
             </w:rPr>
           </w:pPr>
-          <w:hyperlink w:anchor="_Toc243488093" w:history="1">
+          <w:hyperlink w:anchor="_Toc243488778" w:history="1">
             <w:r>
               <w:rPr>
                 <w:rStyle w:val="Collegamentoipertestuale"/>
@@ -732,7 +732,7 @@
               <w:rPr>
                 <w:noProof/>
               </w:rPr>
-              <w:instrText xml:space="preserve"> PAGEREF _Toc243488093 \h </w:instrText>
+              <w:instrText xml:space="preserve"> PAGEREF _Toc243488778 \h </w:instrText>
             </w:r>
             <w:r>
               <w:rPr>
@@ -769,7 +769,7 @@
               <w:noProof/>
             </w:rPr>
           </w:pPr>
-          <w:hyperlink w:anchor="_Toc243488094" w:history="1">
+          <w:hyperlink w:anchor="_Toc243488779" w:history="1">
             <w:r>
               <w:rPr>
                 <w:rStyle w:val="Collegamentoipertestuale"/>
@@ -793,7 +793,7 @@
               <w:rPr>
                 <w:noProof/>
               </w:rPr>
-              <w:instrText xml:space="preserve"> PAGEREF _Toc243488094 \h </w:instrText>
+              <w:instrText xml:space="preserve"> PAGEREF _Toc243488779 \h </w:instrText>
             </w:r>
             <w:r>
               <w:rPr>
@@ -830,7 +830,7 @@
               <w:noProof/>
             </w:rPr>
           </w:pPr>
-          <w:hyperlink w:anchor="_Toc243488095" w:history="1">
+          <w:hyperlink w:anchor="_Toc243488780" w:history="1">
             <w:r>
               <w:rPr>
                 <w:rStyle w:val="Collegamentoipertestuale"/>
@@ -854,7 +854,7 @@
               <w:rPr>
                 <w:noProof/>
               </w:rPr>
-              <w:instrText xml:space="preserve"> PAGEREF _Toc243488095 \h </w:instrText>
+              <w:instrText xml:space="preserve"> PAGEREF _Toc243488780 \h </w:instrText>
             </w:r>
             <w:r>
               <w:rPr>
@@ -891,7 +891,7 @@
               <w:noProof/>
             </w:rPr>
           </w:pPr>
-          <w:hyperlink w:anchor="_Toc243488096" w:history="1">
+          <w:hyperlink w:anchor="_Toc243488781" w:history="1">
             <w:r>
               <w:rPr>
                 <w:rStyle w:val="Collegamentoipertestuale"/>
@@ -915,7 +915,7 @@
               <w:rPr>
                 <w:noProof/>
               </w:rPr>
-              <w:instrText xml:space="preserve"> PAGEREF _Toc243488096 \h </w:instrText>
+              <w:instrText xml:space="preserve"> PAGEREF _Toc243488781 \h </w:instrText>
             </w:r>
             <w:r>
               <w:rPr>
@@ -952,7 +952,7 @@
               <w:noProof/>
             </w:rPr>
           </w:pPr>
-          <w:hyperlink w:anchor="_Toc243488097" w:history="1">
+          <w:hyperlink w:anchor="_Toc243488782" w:history="1">
             <w:r>
               <w:rPr>
                 <w:rStyle w:val="Collegamentoipertestuale"/>
@@ -976,7 +976,7 @@
               <w:rPr>
                 <w:noProof/>
               </w:rPr>
-              <w:instrText xml:space="preserve"> PAGEREF _Toc243488097 \h </w:instrText>
+              <w:instrText xml:space="preserve"> PAGEREF _Toc243488782 \h </w:instrText>
             </w:r>
             <w:r>
               <w:rPr>
@@ -1013,7 +1013,7 @@
               <w:noProof/>
             </w:rPr>
           </w:pPr>
-          <w:hyperlink w:anchor="_Toc243488098" w:history="1">
+          <w:hyperlink w:anchor="_Toc243488783" w:history="1">
             <w:r>
               <w:rPr>
                 <w:rStyle w:val="Collegamentoipertestuale"/>
@@ -1037,7 +1037,7 @@
               <w:rPr>
                 <w:noProof/>
               </w:rPr>
-              <w:instrText xml:space="preserve"> PAGEREF _Toc243488098 \h </w:instrText>
+              <w:instrText xml:space="preserve"> PAGEREF _Toc243488783 \h </w:instrText>
             </w:r>
             <w:r>
               <w:rPr>
@@ -1074,7 +1074,7 @@
               <w:noProof/>
             </w:rPr>
           </w:pPr>
-          <w:hyperlink w:anchor="_Toc243488099" w:history="1">
+          <w:hyperlink w:anchor="_Toc243488784" w:history="1">
             <w:r>
               <w:rPr>
                 <w:rStyle w:val="Collegamentoipertestuale"/>
@@ -1098,7 +1098,7 @@
               <w:rPr>
                 <w:noProof/>
               </w:rPr>
-              <w:instrText xml:space="preserve"> PAGEREF _Toc243488099 \h </w:instrText>
+              <w:instrText xml:space="preserve"> PAGEREF _Toc243488784 \h </w:instrText>
             </w:r>
             <w:r>
               <w:rPr>
@@ -1135,7 +1135,7 @@
               <w:noProof/>
             </w:rPr>
           </w:pPr>
-          <w:hyperlink w:anchor="_Toc243488100" w:history="1">
+          <w:hyperlink w:anchor="_Toc243488785" w:history="1">
             <w:r>
               <w:rPr>
                 <w:rStyle w:val="Collegamentoipertestuale"/>
@@ -1159,7 +1159,7 @@
               <w:rPr>
                 <w:noProof/>
               </w:rPr>
-              <w:instrText xml:space="preserve"> PAGEREF _Toc243488100 \h </w:instrText>
+              <w:instrText xml:space="preserve"> PAGEREF _Toc243488785 \h </w:instrText>
             </w:r>
             <w:r>
               <w:rPr>
@@ -1196,7 +1196,7 @@
               <w:noProof/>
             </w:rPr>
           </w:pPr>
-          <w:hyperlink w:anchor="_Toc243488101" w:history="1">
+          <w:hyperlink w:anchor="_Toc243488786" w:history="1">
             <w:r>
               <w:rPr>
                 <w:rStyle w:val="Collegamentoipertestuale"/>
@@ -1220,7 +1220,7 @@
               <w:rPr>
                 <w:noProof/>
               </w:rPr>
-              <w:instrText xml:space="preserve"> PAGEREF _Toc243488101 \h </w:instrText>
+              <w:instrText xml:space="preserve"> PAGEREF _Toc243488786 \h </w:instrText>
             </w:r>
             <w:r>
               <w:rPr>
@@ -1257,7 +1257,7 @@
               <w:noProof/>
             </w:rPr>
           </w:pPr>
-          <w:hyperlink w:anchor="_Toc243488102" w:history="1">
+          <w:hyperlink w:anchor="_Toc243488787" w:history="1">
             <w:r>
               <w:rPr>
                 <w:rStyle w:val="Collegamentoipertestuale"/>
@@ -1281,7 +1281,7 @@
               <w:rPr>
                 <w:noProof/>
               </w:rPr>
-              <w:instrText xml:space="preserve"> PAGEREF _Toc243488102 \h </w:instrText>
+              <w:instrText xml:space="preserve"> PAGEREF _Toc243488787 \h </w:instrText>
             </w:r>
             <w:r>
               <w:rPr>
@@ -1318,7 +1318,7 @@
               <w:noProof/>
             </w:rPr>
           </w:pPr>
-          <w:hyperlink w:anchor="_Toc243488103" w:history="1">
+          <w:hyperlink w:anchor="_Toc243488788" w:history="1">
             <w:r>
               <w:rPr>
                 <w:rStyle w:val="Collegamentoipertestuale"/>
@@ -1342,7 +1342,7 @@
               <w:rPr>
                 <w:noProof/>
               </w:rPr>
-              <w:instrText xml:space="preserve"> PAGEREF _Toc243488103 \h </w:instrText>
+              <w:instrText xml:space="preserve"> PAGEREF _Toc243488788 \h </w:instrText>
             </w:r>
             <w:r>
               <w:rPr>
@@ -1379,7 +1379,7 @@
               <w:noProof/>
             </w:rPr>
           </w:pPr>
-          <w:hyperlink w:anchor="_Toc243488104" w:history="1">
+          <w:hyperlink w:anchor="_Toc243488789" w:history="1">
             <w:r>
               <w:rPr>
                 <w:rStyle w:val="Collegamentoipertestuale"/>
@@ -1403,7 +1403,7 @@
               <w:rPr>
                 <w:noProof/>
               </w:rPr>
-              <w:instrText xml:space="preserve"> PAGEREF _Toc243488104 \h </w:instrText>
+              <w:instrText xml:space="preserve"> PAGEREF _Toc243488789 \h </w:instrText>
             </w:r>
             <w:r>
               <w:rPr>
@@ -1440,7 +1440,7 @@
               <w:noProof/>
             </w:rPr>
           </w:pPr>
-          <w:hyperlink w:anchor="_Toc243488105" w:history="1">
+          <w:hyperlink w:anchor="_Toc243488790" w:history="1">
             <w:r>
               <w:rPr>
                 <w:rStyle w:val="Collegamentoipertestuale"/>
@@ -1464,7 +1464,7 @@
               <w:rPr>
                 <w:noProof/>
               </w:rPr>
-              <w:instrText xml:space="preserve"> PAGEREF _Toc243488105 \h </w:instrText>
+              <w:instrText xml:space="preserve"> PAGEREF _Toc243488790 \h </w:instrText>
             </w:r>
             <w:r>
               <w:rPr>
@@ -1501,7 +1501,7 @@
               <w:noProof/>
             </w:rPr>
           </w:pPr>
-          <w:hyperlink w:anchor="_Toc243488106" w:history="1">
+          <w:hyperlink w:anchor="_Toc243488791" w:history="1">
             <w:r>
               <w:rPr>
                 <w:rStyle w:val="Collegamentoipertestuale"/>
@@ -1525,7 +1525,7 @@
               <w:rPr>
                 <w:noProof/>
               </w:rPr>
-              <w:instrText xml:space="preserve"> PAGEREF _Toc243488106 \h </w:instrText>
+              <w:instrText xml:space="preserve"> PAGEREF _Toc243488791 \h </w:instrText>
             </w:r>
             <w:r>
               <w:rPr>
@@ -1562,7 +1562,7 @@
               <w:noProof/>
             </w:rPr>
           </w:pPr>
-          <w:hyperlink w:anchor="_Toc243488107" w:history="1">
+          <w:hyperlink w:anchor="_Toc243488792" w:history="1">
             <w:r>
               <w:rPr>
                 <w:rStyle w:val="Collegamentoipertestuale"/>
@@ -1586,7 +1586,7 @@
               <w:rPr>
                 <w:noProof/>
               </w:rPr>
-              <w:instrText xml:space="preserve"> PAGEREF _Toc243488107 \h </w:instrText>
+              <w:instrText xml:space="preserve"> PAGEREF _Toc243488792 \h </w:instrText>
             </w:r>
             <w:r>
               <w:rPr>
@@ -1623,7 +1623,7 @@
               <w:noProof/>
             </w:rPr>
           </w:pPr>
-          <w:hyperlink w:anchor="_Toc243488108" w:history="1">
+          <w:hyperlink w:anchor="_Toc243488793" w:history="1">
             <w:r>
               <w:rPr>
                 <w:rStyle w:val="Collegamentoipertestuale"/>
@@ -1647,7 +1647,7 @@
               <w:rPr>
                 <w:noProof/>
               </w:rPr>
-              <w:instrText xml:space="preserve"> PAGEREF _Toc243488108 \h </w:instrText>
+              <w:instrText xml:space="preserve"> PAGEREF _Toc243488793 \h </w:instrText>
             </w:r>
             <w:r>
               <w:rPr>
@@ -1684,7 +1684,7 @@
               <w:noProof/>
             </w:rPr>
           </w:pPr>
-          <w:hyperlink w:anchor="_Toc243488109" w:history="1">
+          <w:hyperlink w:anchor="_Toc243488794" w:history="1">
             <w:r>
               <w:rPr>
                 <w:rStyle w:val="Collegamentoipertestuale"/>
@@ -1708,7 +1708,7 @@
               <w:rPr>
                 <w:noProof/>
               </w:rPr>
-              <w:instrText xml:space="preserve"> PAGEREF _Toc243488109 \h </w:instrText>
+              <w:instrText xml:space="preserve"> PAGEREF _Toc243488794 \h </w:instrText>
             </w:r>
             <w:r>
               <w:rPr>
@@ -1745,7 +1745,7 @@
               <w:noProof/>
             </w:rPr>
           </w:pPr>
-          <w:hyperlink w:anchor="_Toc243488110" w:history="1">
+          <w:hyperlink w:anchor="_Toc243488795" w:history="1">
             <w:r>
               <w:rPr>
                 <w:rStyle w:val="Collegamentoipertestuale"/>
@@ -1769,7 +1769,7 @@
               <w:rPr>
                 <w:noProof/>
               </w:rPr>
-              <w:instrText xml:space="preserve"> PAGEREF _Toc243488110 \h </w:instrText>
+              <w:instrText xml:space="preserve"> PAGEREF _Toc243488795 \h </w:instrText>
             </w:r>
             <w:r>
               <w:rPr>
@@ -1806,7 +1806,7 @@
               <w:noProof/>
             </w:rPr>
           </w:pPr>
-          <w:hyperlink w:anchor="_Toc243488111" w:history="1">
+          <w:hyperlink w:anchor="_Toc243488796" w:history="1">
             <w:r>
               <w:rPr>
                 <w:rStyle w:val="Collegamentoipertestuale"/>
@@ -1830,7 +1830,7 @@
               <w:rPr>
                 <w:noProof/>
               </w:rPr>
-              <w:instrText xml:space="preserve"> PAGEREF _Toc243488111 \h </w:instrText>
+              <w:instrText xml:space="preserve"> PAGEREF _Toc243488796 \h </w:instrText>
             </w:r>
             <w:r>
               <w:rPr>
@@ -1867,7 +1867,7 @@
               <w:noProof/>
             </w:rPr>
           </w:pPr>
-          <w:hyperlink w:anchor="_Toc243488112" w:history="1">
+          <w:hyperlink w:anchor="_Toc243488797" w:history="1">
             <w:r>
               <w:rPr>
                 <w:rStyle w:val="Collegamentoipertestuale"/>
@@ -1891,7 +1891,7 @@
               <w:rPr>
                 <w:noProof/>
               </w:rPr>
-              <w:instrText xml:space="preserve"> PAGEREF _Toc243488112 \h </w:instrText>
+              <w:instrText xml:space="preserve"> PAGEREF _Toc243488797 \h </w:instrText>
             </w:r>
             <w:r>
               <w:rPr>
@@ -1928,7 +1928,7 @@
               <w:noProof/>
             </w:rPr>
           </w:pPr>
-          <w:hyperlink w:anchor="_Toc243488113" w:history="1">
+          <w:hyperlink w:anchor="_Toc243488798" w:history="1">
             <w:r>
               <w:rPr>
                 <w:rStyle w:val="Collegamentoipertestuale"/>
@@ -1952,7 +1952,7 @@
               <w:rPr>
                 <w:noProof/>
               </w:rPr>
-              <w:instrText xml:space="preserve"> PAGEREF _Toc243488113 \h </w:instrText>
+              <w:instrText xml:space="preserve"> PAGEREF _Toc243488798 \h </w:instrText>
             </w:r>
             <w:r>
               <w:rPr>
@@ -1989,7 +1989,7 @@
               <w:noProof/>
             </w:rPr>
           </w:pPr>
-          <w:hyperlink w:anchor="_Toc243488114" w:history="1">
+          <w:hyperlink w:anchor="_Toc243488799" w:history="1">
             <w:r>
               <w:rPr>
                 <w:rStyle w:val="Collegamentoipertestuale"/>
@@ -2013,7 +2013,7 @@
               <w:rPr>
                 <w:noProof/>
               </w:rPr>
-              <w:instrText xml:space="preserve"> PAGEREF _Toc243488114 \h </w:instrText>
+              <w:instrText xml:space="preserve"> PAGEREF _Toc243488799 \h </w:instrText>
             </w:r>
             <w:r>
               <w:rPr>
@@ -2050,7 +2050,7 @@
               <w:noProof/>
             </w:rPr>
           </w:pPr>
-          <w:hyperlink w:anchor="_Toc243488115" w:history="1">
+          <w:hyperlink w:anchor="_Toc243488800" w:history="1">
             <w:r>
               <w:rPr>
                 <w:rStyle w:val="Collegamentoipertestuale"/>
@@ -2074,7 +2074,7 @@
               <w:rPr>
                 <w:noProof/>
               </w:rPr>
-              <w:instrText xml:space="preserve"> PAGEREF _Toc243488115 \h </w:instrText>
+              <w:instrText xml:space="preserve"> PAGEREF _Toc243488800 \h </w:instrText>
             </w:r>
             <w:r>
               <w:rPr>
@@ -2111,7 +2111,7 @@
               <w:noProof/>
             </w:rPr>
           </w:pPr>
-          <w:hyperlink w:anchor="_Toc243488116" w:history="1">
+          <w:hyperlink w:anchor="_Toc243488801" w:history="1">
             <w:r>
               <w:rPr>
                 <w:rStyle w:val="Collegamentoipertestuale"/>
@@ -2135,7 +2135,7 @@
               <w:rPr>
                 <w:noProof/>
               </w:rPr>
-              <w:instrText xml:space="preserve"> PAGEREF _Toc243488116 \h </w:instrText>
+              <w:instrText xml:space="preserve"> PAGEREF _Toc243488801 \h </w:instrText>
             </w:r>
             <w:r>
               <w:rPr>
@@ -2172,7 +2172,7 @@
               <w:noProof/>
             </w:rPr>
           </w:pPr>
-          <w:hyperlink w:anchor="_Toc243488117" w:history="1">
+          <w:hyperlink w:anchor="_Toc243488802" w:history="1">
             <w:r>
               <w:rPr>
                 <w:rStyle w:val="Collegamentoipertestuale"/>
@@ -2196,7 +2196,7 @@
               <w:rPr>
                 <w:noProof/>
               </w:rPr>
-              <w:instrText xml:space="preserve"> PAGEREF _Toc243488117 \h </w:instrText>
+              <w:instrText xml:space="preserve"> PAGEREF _Toc243488802 \h </w:instrText>
             </w:r>
             <w:r>
               <w:rPr>
@@ -2233,7 +2233,7 @@
               <w:noProof/>
             </w:rPr>
           </w:pPr>
-          <w:hyperlink w:anchor="_Toc243488118" w:history="1">
+          <w:hyperlink w:anchor="_Toc243488803" w:history="1">
             <w:r>
               <w:rPr>
                 <w:rStyle w:val="Collegamentoipertestuale"/>
@@ -2257,7 +2257,7 @@
               <w:rPr>
                 <w:noProof/>
               </w:rPr>
-              <w:instrText xml:space="preserve"> PAGEREF _Toc243488118 \h </w:instrText>
+              <w:instrText xml:space="preserve"> PAGEREF _Toc243488803 \h </w:instrText>
             </w:r>
             <w:r>
               <w:rPr>
@@ -2294,7 +2294,7 @@
               <w:noProof/>
             </w:rPr>
           </w:pPr>
-          <w:hyperlink w:anchor="_Toc243488119" w:history="1">
+          <w:hyperlink w:anchor="_Toc243488804" w:history="1">
             <w:r>
               <w:rPr>
                 <w:rStyle w:val="Collegamentoipertestuale"/>
@@ -2318,7 +2318,7 @@
               <w:rPr>
                 <w:noProof/>
               </w:rPr>
-              <w:instrText xml:space="preserve"> PAGEREF _Toc243488119 \h </w:instrText>
+              <w:instrText xml:space="preserve"> PAGEREF _Toc243488804 \h </w:instrText>
             </w:r>
             <w:r>
               <w:rPr>
@@ -2355,7 +2355,7 @@
               <w:noProof/>
             </w:rPr>
           </w:pPr>
-          <w:hyperlink w:anchor="_Toc243488120" w:history="1">
+          <w:hyperlink w:anchor="_Toc243488805" w:history="1">
             <w:r>
               <w:rPr>
                 <w:rStyle w:val="Collegamentoipertestuale"/>
@@ -2379,7 +2379,7 @@
               <w:rPr>
                 <w:noProof/>
               </w:rPr>
-              <w:instrText xml:space="preserve"> PAGEREF _Toc243488120 \h </w:instrText>
+              <w:instrText xml:space="preserve"> PAGEREF _Toc243488805 \h </w:instrText>
             </w:r>
             <w:r>
               <w:rPr>
@@ -2416,7 +2416,7 @@
               <w:noProof/>
             </w:rPr>
           </w:pPr>
-          <w:hyperlink w:anchor="_Toc243488121" w:history="1">
+          <w:hyperlink w:anchor="_Toc243488806" w:history="1">
             <w:r>
               <w:rPr>
                 <w:rStyle w:val="Collegamentoipertestuale"/>
@@ -2440,7 +2440,7 @@
               <w:rPr>
                 <w:noProof/>
               </w:rPr>
-              <w:instrText xml:space="preserve"> PAGEREF _Toc243488121 \h </w:instrText>
+              <w:instrText xml:space="preserve"> PAGEREF _Toc243488806 \h </w:instrText>
             </w:r>
             <w:r>
               <w:rPr>
@@ -2477,7 +2477,7 @@
               <w:noProof/>
             </w:rPr>
           </w:pPr>
-          <w:hyperlink w:anchor="_Toc243488122" w:history="1">
+          <w:hyperlink w:anchor="_Toc243488807" w:history="1">
             <w:r>
               <w:rPr>
                 <w:rStyle w:val="Collegamentoipertestuale"/>
@@ -2501,7 +2501,7 @@
               <w:rPr>
                 <w:noProof/>
               </w:rPr>
-              <w:instrText xml:space="preserve"> PAGEREF _Toc243488122 \h </w:instrText>
+              <w:instrText xml:space="preserve"> PAGEREF _Toc243488807 \h </w:instrText>
             </w:r>
             <w:r>
               <w:rPr>
@@ -2518,7 +2518,7 @@
               <w:rPr>
                 <w:noProof/>
               </w:rPr>
-              <w:t>20</w:t>
+              <w:t>21</w:t>
             </w:r>
             <w:r>
               <w:rPr>
@@ -2538,7 +2538,7 @@
               <w:noProof/>
             </w:rPr>
           </w:pPr>
-          <w:hyperlink w:anchor="_Toc243488123" w:history="1">
+          <w:hyperlink w:anchor="_Toc243488808" w:history="1">
             <w:r>
               <w:rPr>
                 <w:rStyle w:val="Collegamentoipertestuale"/>
@@ -2562,7 +2562,7 @@
               <w:rPr>
                 <w:noProof/>
               </w:rPr>
-              <w:instrText xml:space="preserve"> PAGEREF _Toc243488123 \h </w:instrText>
+              <w:instrText xml:space="preserve"> PAGEREF _Toc243488808 \h </w:instrText>
             </w:r>
             <w:r>
               <w:rPr>
@@ -2605,7 +2605,7 @@
       <w:pPr>
         <w:pStyle w:val="Titolo1"/>
       </w:pPr>
-      <w:bookmarkStart w:id="0" w:name="_Toc243488084"/>
+      <w:bookmarkStart w:id="0" w:name="_Toc243488769"/>
       <w:r>
         <w:lastRenderedPageBreak/>
         <w:t>1. In breve</w:t>
@@ -2897,7 +2897,7 @@
       <w:pPr>
         <w:pStyle w:val="Titolo1"/>
       </w:pPr>
-      <w:bookmarkStart w:id="1" w:name="_Toc243488085"/>
+      <w:bookmarkStart w:id="1" w:name="_Toc243488770"/>
       <w:r>
         <w:t>2. Nuovo marchio</w:t>
       </w:r>
@@ -2907,7 +2907,7 @@
       <w:pPr>
         <w:pStyle w:val="Titolo2"/>
       </w:pPr>
-      <w:bookmarkStart w:id="2" w:name="_Toc243488086"/>
+      <w:bookmarkStart w:id="2" w:name="_Toc243488771"/>
       <w:r>
         <w:t>2.1 Nomi e identificativi</w:t>
       </w:r>
@@ -3453,7 +3453,7 @@
       <w:pPr>
         <w:pStyle w:val="Titolo2"/>
       </w:pPr>
-      <w:bookmarkStart w:id="3" w:name="_Toc243488087"/>
+      <w:bookmarkStart w:id="3" w:name="_Toc243488772"/>
       <w:r>
         <w:lastRenderedPageBreak/>
         <w:t>2.2 Colori</w:t>
@@ -3849,7 +3849,7 @@
       <w:pPr>
         <w:pStyle w:val="Titolo2"/>
       </w:pPr>
-      <w:bookmarkStart w:id="4" w:name="_Toc243488088"/>
+      <w:bookmarkStart w:id="4" w:name="_Toc243488773"/>
       <w:r>
         <w:t>2.3 Icona in uso: 17 «Foglio oro» (serie 4)</w:t>
       </w:r>
@@ -3883,7 +3883,7 @@
           <w:noProof/>
         </w:rPr>
         <w:drawing>
-          <wp:inline distT="0" distB="0" distL="0" distR="0" wp14:anchorId="578A13E4" wp14:editId="6729E36C">
+          <wp:inline distT="0" distB="0" distL="0" distR="0" wp14:anchorId="581E27C5" wp14:editId="17E885EA">
             <wp:extent cx="5334000" cy="5895975"/>
             <wp:effectExtent l="0" t="0" r="0" b="0"/>
             <wp:docPr id="2" name="Immagine 2"/>
@@ -4304,7 +4304,7 @@
       <w:pPr>
         <w:pStyle w:val="Titolo2"/>
       </w:pPr>
-      <w:bookmarkStart w:id="5" w:name="_Toc243488089"/>
+      <w:bookmarkStart w:id="5" w:name="_Toc243488774"/>
       <w:r>
         <w:t>2.4 Serie 3, non scelta (la 11 è diventata la serie 4)</w:t>
       </w:r>
@@ -4328,7 +4328,7 @@
           <w:noProof/>
         </w:rPr>
         <w:drawing>
-          <wp:inline distT="0" distB="0" distL="0" distR="0" wp14:anchorId="4D069F05" wp14:editId="120F552A">
+          <wp:inline distT="0" distB="0" distL="0" distR="0" wp14:anchorId="4E661136" wp14:editId="3CAF2F17">
             <wp:extent cx="5905500" cy="4133850"/>
             <wp:effectExtent l="0" t="0" r="0" b="0"/>
             <wp:docPr id="3" name="Immagine 3"/>
@@ -5015,7 +5015,7 @@
       <w:pPr>
         <w:pStyle w:val="Titolo2"/>
       </w:pPr>
-      <w:bookmarkStart w:id="6" w:name="_Toc243488090"/>
+      <w:bookmarkStart w:id="6" w:name="_Toc243488775"/>
       <w:r>
         <w:t>2.5 Serie 2, non scelta</w:t>
       </w:r>
@@ -5039,7 +5039,7 @@
           <w:noProof/>
         </w:rPr>
         <w:drawing>
-          <wp:inline distT="0" distB="0" distL="0" distR="0" wp14:anchorId="7142F7A2" wp14:editId="3122F7B7">
+          <wp:inline distT="0" distB="0" distL="0" distR="0" wp14:anchorId="27AE6378" wp14:editId="682AAB76">
             <wp:extent cx="5905500" cy="4133850"/>
             <wp:effectExtent l="0" t="0" r="0" b="0"/>
             <wp:docPr id="4" name="Immagine 4"/>
@@ -5760,7 +5760,7 @@
       <w:pPr>
         <w:pStyle w:val="Titolo2"/>
       </w:pPr>
-      <w:bookmarkStart w:id="7" w:name="_Toc243488091"/>
+      <w:bookmarkStart w:id="7" w:name="_Toc243488776"/>
       <w:r>
         <w:t>2.6 Serie 1, scartata</w:t>
       </w:r>
@@ -5784,7 +5784,7 @@
           <w:noProof/>
         </w:rPr>
         <w:drawing>
-          <wp:inline distT="0" distB="0" distL="0" distR="0" wp14:anchorId="2585F6AE" wp14:editId="1F554AD4">
+          <wp:inline distT="0" distB="0" distL="0" distR="0" wp14:anchorId="4800C8E6" wp14:editId="61280322">
             <wp:extent cx="4000500" cy="2800350"/>
             <wp:effectExtent l="0" t="0" r="0" b="0"/>
             <wp:docPr id="5" name="Immagine 5"/>
@@ -5843,7 +5843,7 @@
       <w:pPr>
         <w:pStyle w:val="Titolo2"/>
       </w:pPr>
-      <w:bookmarkStart w:id="8" w:name="_Toc243488092"/>
+      <w:bookmarkStart w:id="8" w:name="_Toc243488777"/>
       <w:r>
         <w:t>2.7 Verifica dei marchi registrati</w:t>
       </w:r>
@@ -6095,7 +6095,7 @@
       <w:pPr>
         <w:pStyle w:val="Titolo1"/>
       </w:pPr>
-      <w:bookmarkStart w:id="9" w:name="_Toc243488093"/>
+      <w:bookmarkStart w:id="9" w:name="_Toc243488778"/>
       <w:r>
         <w:t>3. Temi colore</w:t>
       </w:r>
@@ -6130,7 +6130,7 @@
         </w:rPr>
         <w:lastRenderedPageBreak/>
         <w:drawing>
-          <wp:inline distT="0" distB="0" distL="0" distR="0" wp14:anchorId="262463C9" wp14:editId="5D14D568">
+          <wp:inline distT="0" distB="0" distL="0" distR="0" wp14:anchorId="570D188D" wp14:editId="2C73B3F6">
             <wp:extent cx="4572000" cy="3429000"/>
             <wp:effectExtent l="0" t="0" r="0" b="0"/>
             <wp:docPr id="6" name="Immagine 6"/>
@@ -6840,7 +6840,7 @@
       <w:pPr>
         <w:pStyle w:val="Titolo1"/>
       </w:pPr>
-      <w:bookmarkStart w:id="10" w:name="_Toc243488094"/>
+      <w:bookmarkStart w:id="10" w:name="_Toc243488779"/>
       <w:r>
         <w:t>4. Correzione: avvisi «come JavaScript»</w:t>
       </w:r>
@@ -6850,7 +6850,7 @@
       <w:pPr>
         <w:pStyle w:val="Titolo2"/>
       </w:pPr>
-      <w:bookmarkStart w:id="11" w:name="_Toc243488095"/>
+      <w:bookmarkStart w:id="11" w:name="_Toc243488780"/>
       <w:r>
         <w:t>4.1 Il problema</w:t>
       </w:r>
@@ -7253,7 +7253,7 @@
       <w:pPr>
         <w:pStyle w:val="Titolo2"/>
       </w:pPr>
-      <w:bookmarkStart w:id="12" w:name="_Toc243488096"/>
+      <w:bookmarkStart w:id="12" w:name="_Toc243488781"/>
       <w:r>
         <w:t>4.2 La soluzione</w:t>
       </w:r>
@@ -7386,7 +7386,7 @@
           <w:noProof/>
         </w:rPr>
         <w:drawing>
-          <wp:inline distT="0" distB="0" distL="0" distR="0" wp14:anchorId="034BEA40" wp14:editId="12664935">
+          <wp:inline distT="0" distB="0" distL="0" distR="0" wp14:anchorId="6DCBBCEE" wp14:editId="3C1BEB20">
             <wp:extent cx="4572000" cy="3429000"/>
             <wp:effectExtent l="0" t="0" r="0" b="0"/>
             <wp:docPr id="7" name="Immagine 7"/>
@@ -7445,7 +7445,7 @@
       <w:pPr>
         <w:pStyle w:val="Titolo2"/>
       </w:pPr>
-      <w:bookmarkStart w:id="13" w:name="_Toc243488097"/>
+      <w:bookmarkStart w:id="13" w:name="_Toc243488782"/>
       <w:r>
         <w:t>4.3 Verifiche</w:t>
       </w:r>
@@ -7492,7 +7492,7 @@
       <w:pPr>
         <w:pStyle w:val="Titolo2"/>
       </w:pPr>
-      <w:bookmarkStart w:id="14" w:name="_Toc243488098"/>
+      <w:bookmarkStart w:id="14" w:name="_Toc243488783"/>
       <w:r>
         <w:t>4.4 Android: menu Tema e notifiche (versione 1.0.1)</w:t>
       </w:r>
@@ -7828,7 +7828,7 @@
       <w:pPr>
         <w:pStyle w:val="Titolo2"/>
       </w:pPr>
-      <w:bookmarkStart w:id="15" w:name="_Toc243488099"/>
+      <w:bookmarkStart w:id="15" w:name="_Toc243488784"/>
       <w:r>
         <w:t>4.5 App più leggera: traduzione tolta</w:t>
       </w:r>
@@ -8261,7 +8261,7 @@
       <w:pPr>
         <w:pStyle w:val="Titolo2"/>
       </w:pPr>
-      <w:bookmarkStart w:id="16" w:name="_Toc243488100"/>
+      <w:bookmarkStart w:id="16" w:name="_Toc243488785"/>
       <w:r>
         <w:t>4.6 Schede in una nuova finestra</w:t>
       </w:r>
@@ -8379,7 +8379,7 @@
           <w:noProof/>
         </w:rPr>
         <w:drawing>
-          <wp:inline distT="0" distB="0" distL="0" distR="0" wp14:anchorId="79133352" wp14:editId="70A4C30D">
+          <wp:inline distT="0" distB="0" distL="0" distR="0" wp14:anchorId="1617FD6C" wp14:editId="3161E70F">
             <wp:extent cx="5715000" cy="857250"/>
             <wp:effectExtent l="0" t="0" r="0" b="0"/>
             <wp:docPr id="8" name="Immagine 8"/>
@@ -8669,7 +8669,7 @@
       <w:pPr>
         <w:pStyle w:val="Titolo2"/>
       </w:pPr>
-      <w:bookmarkStart w:id="17" w:name="_Toc243488101"/>
+      <w:bookmarkStart w:id="17" w:name="_Toc243488786"/>
       <w:r>
         <w:t>4.7 Riunire le finestre</w:t>
       </w:r>
@@ -8756,7 +8756,7 @@
       <w:pPr>
         <w:pStyle w:val="Titolo2"/>
       </w:pPr>
-      <w:bookmarkStart w:id="18" w:name="_Toc243488102"/>
+      <w:bookmarkStart w:id="18" w:name="_Toc243488787"/>
       <w:r>
         <w:t>4.8 Correzioni di «Modifica testo»</w:t>
       </w:r>
@@ -9022,7 +9022,7 @@
         </w:rPr>
         <w:lastRenderedPageBreak/>
         <w:drawing>
-          <wp:inline distT="0" distB="0" distL="0" distR="0" wp14:anchorId="7BDBCA12" wp14:editId="39E41A96">
+          <wp:inline distT="0" distB="0" distL="0" distR="0" wp14:anchorId="13EA0797" wp14:editId="1431D6DE">
             <wp:extent cx="3286125" cy="2286000"/>
             <wp:effectExtent l="0" t="0" r="0" b="0"/>
             <wp:docPr id="9" name="Immagine 9"/>
@@ -9087,7 +9087,7 @@
           <w:noProof/>
         </w:rPr>
         <w:drawing>
-          <wp:inline distT="0" distB="0" distL="0" distR="0" wp14:anchorId="7EDCC4AE" wp14:editId="76723F65">
+          <wp:inline distT="0" distB="0" distL="0" distR="0" wp14:anchorId="570CC02A" wp14:editId="1F34E9F8">
             <wp:extent cx="3286125" cy="2286000"/>
             <wp:effectExtent l="0" t="0" r="0" b="0"/>
             <wp:docPr id="10" name="Immagine 10"/>
@@ -9154,7 +9154,7 @@
       <w:pPr>
         <w:pStyle w:val="Titolo1"/>
       </w:pPr>
-      <w:bookmarkStart w:id="19" w:name="_Toc243488103"/>
+      <w:bookmarkStart w:id="19" w:name="_Toc243488788"/>
       <w:r>
         <w:t>5. Decisioni</w:t>
       </w:r>
@@ -9172,7 +9172,7 @@
       <w:pPr>
         <w:pStyle w:val="Titolo2"/>
       </w:pPr>
-      <w:bookmarkStart w:id="20" w:name="_Toc243488104"/>
+      <w:bookmarkStart w:id="20" w:name="_Toc243488789"/>
       <w:r>
         <w:t>5.1 Canale degli aggiornamenti</w:t>
       </w:r>
@@ -9680,7 +9680,7 @@
       <w:pPr>
         <w:pStyle w:val="Titolo2"/>
       </w:pPr>
-      <w:bookmarkStart w:id="21" w:name="_Toc243488105"/>
+      <w:bookmarkStart w:id="21" w:name="_Toc243488790"/>
       <w:r>
         <w:t>5.2 Storia del repository</w:t>
       </w:r>
@@ -10187,7 +10187,7 @@
       <w:pPr>
         <w:pStyle w:val="Titolo2"/>
       </w:pPr>
-      <w:bookmarkStart w:id="22" w:name="_Toc243488106"/>
+      <w:bookmarkStart w:id="22" w:name="_Toc243488791"/>
       <w:r>
         <w:t>5.3 Identificativi del prodotto</w:t>
       </w:r>
@@ -10687,7 +10687,7 @@
       <w:pPr>
         <w:pStyle w:val="Titolo2"/>
       </w:pPr>
-      <w:bookmarkStart w:id="23" w:name="_Toc243488107"/>
+      <w:bookmarkStart w:id="23" w:name="_Toc243488792"/>
       <w:r>
         <w:lastRenderedPageBreak/>
         <w:t>5.4 Avvisi e domande</w:t>
@@ -11195,7 +11195,7 @@
       <w:pPr>
         <w:pStyle w:val="Titolo2"/>
       </w:pPr>
-      <w:bookmarkStart w:id="24" w:name="_Toc243488108"/>
+      <w:bookmarkStart w:id="24" w:name="_Toc243488793"/>
       <w:r>
         <w:t>5.5 Traduzione offline</w:t>
       </w:r>
@@ -11702,7 +11702,7 @@
       <w:pPr>
         <w:pStyle w:val="Titolo2"/>
       </w:pPr>
-      <w:bookmarkStart w:id="25" w:name="_Toc243488109"/>
+      <w:bookmarkStart w:id="25" w:name="_Toc243488794"/>
       <w:r>
         <w:t>5.6 Passaggio della scheda alla nuova finestra</w:t>
       </w:r>
@@ -12224,7 +12224,7 @@
       <w:pPr>
         <w:pStyle w:val="Titolo2"/>
       </w:pPr>
-      <w:bookmarkStart w:id="26" w:name="_Toc243488110"/>
+      <w:bookmarkStart w:id="26" w:name="_Toc243488795"/>
       <w:r>
         <w:t>5.7 Come si cancella la riga in «Modifica testo»</w:t>
       </w:r>
@@ -12731,7 +12731,7 @@
       <w:pPr>
         <w:pStyle w:val="Titolo1"/>
       </w:pPr>
-      <w:bookmarkStart w:id="27" w:name="_Toc243488111"/>
+      <w:bookmarkStart w:id="27" w:name="_Toc243488796"/>
       <w:r>
         <w:t>6. Come si lavora</w:t>
       </w:r>
@@ -12741,7 +12741,7 @@
       <w:pPr>
         <w:pStyle w:val="Titolo2"/>
       </w:pPr>
-      <w:bookmarkStart w:id="28" w:name="_Toc243488112"/>
+      <w:bookmarkStart w:id="28" w:name="_Toc243488797"/>
       <w:r>
         <w:t>6.1 Comandi</w:t>
       </w:r>
@@ -12811,7 +12811,7 @@
       <w:pPr>
         <w:pStyle w:val="Titolo2"/>
       </w:pPr>
-      <w:bookmarkStart w:id="29" w:name="_Toc243488113"/>
+      <w:bookmarkStart w:id="29" w:name="_Toc243488798"/>
       <w:r>
         <w:t>6.2 Pubblicare una versione</w:t>
       </w:r>
@@ -12940,7 +12940,7 @@
       <w:pPr>
         <w:pStyle w:val="Titolo2"/>
       </w:pPr>
-      <w:bookmarkStart w:id="30" w:name="_Toc243488114"/>
+      <w:bookmarkStart w:id="30" w:name="_Toc243488799"/>
       <w:r>
         <w:t>6.3 Release 1.0.0 (pubblicata il 16 ottobre 2026)</w:t>
       </w:r>
@@ -13667,7 +13667,7 @@
       <w:pPr>
         <w:pStyle w:val="Titolo2"/>
       </w:pPr>
-      <w:bookmarkStart w:id="31" w:name="_Toc243488115"/>
+      <w:bookmarkStart w:id="31" w:name="_Toc243488800"/>
       <w:r>
         <w:t>6.4 Release 1.0.1</w:t>
       </w:r>
@@ -13964,7 +13964,7 @@
       <w:pPr>
         <w:pStyle w:val="Titolo2"/>
       </w:pPr>
-      <w:bookmarkStart w:id="32" w:name="_Toc243488116"/>
+      <w:bookmarkStart w:id="32" w:name="_Toc243488801"/>
       <w:r>
         <w:lastRenderedPageBreak/>
         <w:t>6.5 Release 1.0.2 e repository pubblico</w:t>
@@ -14387,7 +14387,7 @@
       <w:pPr>
         <w:pStyle w:val="Titolo2"/>
       </w:pPr>
-      <w:bookmarkStart w:id="33" w:name="_Toc243488117"/>
+      <w:bookmarkStart w:id="33" w:name="_Toc243488802"/>
       <w:r>
         <w:t>6.6 Nuova versione: link diretto per ogni sistema</w:t>
       </w:r>
@@ -14805,7 +14805,7 @@
         </w:rPr>
         <w:lastRenderedPageBreak/>
         <w:drawing>
-          <wp:inline distT="0" distB="0" distL="0" distR="0" wp14:anchorId="17F6ED05" wp14:editId="76EF9EDF">
+          <wp:inline distT="0" distB="0" distL="0" distR="0" wp14:anchorId="4C009959" wp14:editId="4E07C565">
             <wp:extent cx="4572000" cy="4429125"/>
             <wp:effectExtent l="0" t="0" r="0" b="0"/>
             <wp:docPr id="11" name="Immagine 11"/>
@@ -14880,7 +14880,7 @@
       <w:pPr>
         <w:pStyle w:val="Titolo2"/>
       </w:pPr>
-      <w:bookmarkStart w:id="34" w:name="_Toc243488118"/>
+      <w:bookmarkStart w:id="34" w:name="_Toc243488803"/>
       <w:r>
         <w:t>6.7 Release 1.1.0</w:t>
       </w:r>
@@ -15444,7 +15444,7 @@
       <w:pPr>
         <w:pStyle w:val="Titolo2"/>
       </w:pPr>
-      <w:bookmarkStart w:id="35" w:name="_Toc243488119"/>
+      <w:bookmarkStart w:id="35" w:name="_Toc243488804"/>
       <w:r>
         <w:lastRenderedPageBreak/>
         <w:t>6.8 Versione 1.2.0</w:t>
@@ -15456,7 +15456,7 @@
         <w:spacing w:after="120"/>
       </w:pPr>
       <w:r>
-        <w:t xml:space="preserve">Preparata il 21 ottobre 2026: numeri di versione (installer Windows 101.2.0, Android 1001002000), CHANGELOG e novità della campanella. Contiene le schede fra finestre (4.7), le correzioni di «Modifica testo» (4.8) e il passaggio a </w:t>
+        <w:t xml:space="preserve">Pubblicata il 21 ottobre 2026 (release «Latest», pipeline riuscita in 9 minuti): numeri di versione (installer Windows 101.2.0, Android 1001002000), CHANGELOG e novità della campanella. Contiene le schede fra finestre (4.7), le correzioni di «Modifica testo» (4.8) e il passaggio a </w:t>
       </w:r>
       <w:r>
         <w:rPr>
@@ -15480,11 +15480,521 @@
         <w:t>. Tutti i test passano con la 1.28.2 e con la 2.0 (77 passati, 2 saltati). L'app Android resta sulla 1.28.2 (per la 2.0 non c'è la versione WebAssembly).</w:t>
       </w:r>
     </w:p>
+    <w:tbl>
+      <w:tblPr>
+        <w:tblW w:w="9638" w:type="dxa"/>
+        <w:tblBorders>
+          <w:top w:val="single" w:sz="4" w:space="0" w:color="auto"/>
+          <w:left w:val="single" w:sz="4" w:space="0" w:color="auto"/>
+          <w:bottom w:val="single" w:sz="4" w:space="0" w:color="auto"/>
+          <w:right w:val="single" w:sz="4" w:space="0" w:color="auto"/>
+          <w:insideH w:val="single" w:sz="4" w:space="0" w:color="auto"/>
+          <w:insideV w:val="single" w:sz="4" w:space="0" w:color="auto"/>
+        </w:tblBorders>
+        <w:tblLook w:val="04A0" w:firstRow="1" w:lastRow="0" w:firstColumn="1" w:lastColumn="0" w:noHBand="0" w:noVBand="1"/>
+      </w:tblPr>
+      <w:tblGrid>
+        <w:gridCol w:w="1928"/>
+        <w:gridCol w:w="4433"/>
+        <w:gridCol w:w="1638"/>
+        <w:gridCol w:w="1639"/>
+      </w:tblGrid>
+      <w:tr>
+        <w:trPr>
+          <w:tblHeader/>
+        </w:trPr>
+        <w:tc>
+          <w:tcPr>
+            <w:tcW w:w="1928" w:type="dxa"/>
+            <w:tcBorders>
+              <w:top w:val="single" w:sz="4" w:space="0" w:color="D4CEC7"/>
+              <w:left w:val="single" w:sz="4" w:space="0" w:color="D4CEC7"/>
+              <w:bottom w:val="single" w:sz="4" w:space="0" w:color="D4CEC7"/>
+              <w:right w:val="single" w:sz="4" w:space="0" w:color="D4CEC7"/>
+            </w:tcBorders>
+            <w:shd w:val="clear" w:color="auto" w:fill="B3122B"/>
+            <w:tcMar>
+              <w:top w:w="60" w:type="dxa"/>
+              <w:left w:w="100" w:type="dxa"/>
+              <w:bottom w:w="60" w:type="dxa"/>
+              <w:right w:w="100" w:type="dxa"/>
+            </w:tcMar>
+          </w:tcPr>
+          <w:p>
+            <w:r>
+              <w:rPr>
+                <w:b/>
+                <w:bCs/>
+                <w:color w:val="FFFFFF"/>
+              </w:rPr>
+              <w:t>Sistema</w:t>
+            </w:r>
+          </w:p>
+        </w:tc>
+        <w:tc>
+          <w:tcPr>
+            <w:tcW w:w="4433" w:type="dxa"/>
+            <w:tcBorders>
+              <w:top w:val="single" w:sz="4" w:space="0" w:color="D4CEC7"/>
+              <w:left w:val="single" w:sz="4" w:space="0" w:color="D4CEC7"/>
+              <w:bottom w:val="single" w:sz="4" w:space="0" w:color="D4CEC7"/>
+              <w:right w:val="single" w:sz="4" w:space="0" w:color="D4CEC7"/>
+            </w:tcBorders>
+            <w:shd w:val="clear" w:color="auto" w:fill="B3122B"/>
+            <w:tcMar>
+              <w:top w:w="60" w:type="dxa"/>
+              <w:left w:w="100" w:type="dxa"/>
+              <w:bottom w:w="60" w:type="dxa"/>
+              <w:right w:w="100" w:type="dxa"/>
+            </w:tcMar>
+          </w:tcPr>
+          <w:p>
+            <w:r>
+              <w:rPr>
+                <w:b/>
+                <w:bCs/>
+                <w:color w:val="FFFFFF"/>
+              </w:rPr>
+              <w:t>Installer</w:t>
+            </w:r>
+          </w:p>
+        </w:tc>
+        <w:tc>
+          <w:tcPr>
+            <w:tcW w:w="1638" w:type="dxa"/>
+            <w:tcBorders>
+              <w:top w:val="single" w:sz="4" w:space="0" w:color="D4CEC7"/>
+              <w:left w:val="single" w:sz="4" w:space="0" w:color="D4CEC7"/>
+              <w:bottom w:val="single" w:sz="4" w:space="0" w:color="D4CEC7"/>
+              <w:right w:val="single" w:sz="4" w:space="0" w:color="D4CEC7"/>
+            </w:tcBorders>
+            <w:shd w:val="clear" w:color="auto" w:fill="B3122B"/>
+            <w:tcMar>
+              <w:top w:w="60" w:type="dxa"/>
+              <w:left w:w="100" w:type="dxa"/>
+              <w:bottom w:w="60" w:type="dxa"/>
+              <w:right w:w="100" w:type="dxa"/>
+            </w:tcMar>
+          </w:tcPr>
+          <w:p>
+            <w:r>
+              <w:rPr>
+                <w:b/>
+                <w:bCs/>
+                <w:color w:val="FFFFFF"/>
+              </w:rPr>
+              <w:t>Dimensione</w:t>
+            </w:r>
+          </w:p>
+        </w:tc>
+        <w:tc>
+          <w:tcPr>
+            <w:tcW w:w="1639" w:type="dxa"/>
+            <w:tcBorders>
+              <w:top w:val="single" w:sz="4" w:space="0" w:color="D4CEC7"/>
+              <w:left w:val="single" w:sz="4" w:space="0" w:color="D4CEC7"/>
+              <w:bottom w:val="single" w:sz="4" w:space="0" w:color="D4CEC7"/>
+              <w:right w:val="single" w:sz="4" w:space="0" w:color="D4CEC7"/>
+            </w:tcBorders>
+            <w:shd w:val="clear" w:color="auto" w:fill="B3122B"/>
+            <w:tcMar>
+              <w:top w:w="60" w:type="dxa"/>
+              <w:left w:w="100" w:type="dxa"/>
+              <w:bottom w:w="60" w:type="dxa"/>
+              <w:right w:w="100" w:type="dxa"/>
+            </w:tcMar>
+          </w:tcPr>
+          <w:p>
+            <w:r>
+              <w:rPr>
+                <w:b/>
+                <w:bCs/>
+                <w:color w:val="FFFFFF"/>
+              </w:rPr>
+              <w:t>1.1.0</w:t>
+            </w:r>
+          </w:p>
+        </w:tc>
+      </w:tr>
+      <w:tr>
+        <w:tc>
+          <w:tcPr>
+            <w:tcW w:w="1928" w:type="dxa"/>
+            <w:tcBorders>
+              <w:top w:val="single" w:sz="4" w:space="0" w:color="D4CEC7"/>
+              <w:left w:val="single" w:sz="4" w:space="0" w:color="D4CEC7"/>
+              <w:bottom w:val="single" w:sz="4" w:space="0" w:color="D4CEC7"/>
+              <w:right w:val="single" w:sz="4" w:space="0" w:color="D4CEC7"/>
+            </w:tcBorders>
+            <w:tcMar>
+              <w:top w:w="60" w:type="dxa"/>
+              <w:left w:w="100" w:type="dxa"/>
+              <w:bottom w:w="60" w:type="dxa"/>
+              <w:right w:w="100" w:type="dxa"/>
+            </w:tcMar>
+          </w:tcPr>
+          <w:p>
+            <w:r>
+              <w:t>Windows</w:t>
+            </w:r>
+          </w:p>
+        </w:tc>
+        <w:tc>
+          <w:tcPr>
+            <w:tcW w:w="4433" w:type="dxa"/>
+            <w:tcBorders>
+              <w:top w:val="single" w:sz="4" w:space="0" w:color="D4CEC7"/>
+              <w:left w:val="single" w:sz="4" w:space="0" w:color="D4CEC7"/>
+              <w:bottom w:val="single" w:sz="4" w:space="0" w:color="D4CEC7"/>
+              <w:right w:val="single" w:sz="4" w:space="0" w:color="D4CEC7"/>
+            </w:tcBorders>
+            <w:tcMar>
+              <w:top w:w="60" w:type="dxa"/>
+              <w:left w:w="100" w:type="dxa"/>
+              <w:bottom w:w="60" w:type="dxa"/>
+              <w:right w:w="100" w:type="dxa"/>
+            </w:tcMar>
+          </w:tcPr>
+          <w:p>
+            <w:r>
+              <w:t>PDFz-1.2.0-x64.msi</w:t>
+            </w:r>
+          </w:p>
+        </w:tc>
+        <w:tc>
+          <w:tcPr>
+            <w:tcW w:w="1638" w:type="dxa"/>
+            <w:tcBorders>
+              <w:top w:val="single" w:sz="4" w:space="0" w:color="D4CEC7"/>
+              <w:left w:val="single" w:sz="4" w:space="0" w:color="D4CEC7"/>
+              <w:bottom w:val="single" w:sz="4" w:space="0" w:color="D4CEC7"/>
+              <w:right w:val="single" w:sz="4" w:space="0" w:color="D4CEC7"/>
+            </w:tcBorders>
+            <w:tcMar>
+              <w:top w:w="60" w:type="dxa"/>
+              <w:left w:w="100" w:type="dxa"/>
+              <w:bottom w:w="60" w:type="dxa"/>
+              <w:right w:w="100" w:type="dxa"/>
+            </w:tcMar>
+          </w:tcPr>
+          <w:p>
+            <w:r>
+              <w:t>131,6 MB</w:t>
+            </w:r>
+          </w:p>
+        </w:tc>
+        <w:tc>
+          <w:tcPr>
+            <w:tcW w:w="1639" w:type="dxa"/>
+            <w:tcBorders>
+              <w:top w:val="single" w:sz="4" w:space="0" w:color="D4CEC7"/>
+              <w:left w:val="single" w:sz="4" w:space="0" w:color="D4CEC7"/>
+              <w:bottom w:val="single" w:sz="4" w:space="0" w:color="D4CEC7"/>
+              <w:right w:val="single" w:sz="4" w:space="0" w:color="D4CEC7"/>
+            </w:tcBorders>
+            <w:tcMar>
+              <w:top w:w="60" w:type="dxa"/>
+              <w:left w:w="100" w:type="dxa"/>
+              <w:bottom w:w="60" w:type="dxa"/>
+              <w:right w:w="100" w:type="dxa"/>
+            </w:tcMar>
+          </w:tcPr>
+          <w:p>
+            <w:r>
+              <w:t>116,6 MB</w:t>
+            </w:r>
+          </w:p>
+        </w:tc>
+      </w:tr>
+      <w:tr>
+        <w:tc>
+          <w:tcPr>
+            <w:tcW w:w="1928" w:type="dxa"/>
+            <w:tcBorders>
+              <w:top w:val="single" w:sz="4" w:space="0" w:color="D4CEC7"/>
+              <w:left w:val="single" w:sz="4" w:space="0" w:color="D4CEC7"/>
+              <w:bottom w:val="single" w:sz="4" w:space="0" w:color="D4CEC7"/>
+              <w:right w:val="single" w:sz="4" w:space="0" w:color="D4CEC7"/>
+            </w:tcBorders>
+            <w:tcMar>
+              <w:top w:w="60" w:type="dxa"/>
+              <w:left w:w="100" w:type="dxa"/>
+              <w:bottom w:w="60" w:type="dxa"/>
+              <w:right w:w="100" w:type="dxa"/>
+            </w:tcMar>
+          </w:tcPr>
+          <w:p>
+            <w:r>
+              <w:t>macOS (Apple Silicon)</w:t>
+            </w:r>
+          </w:p>
+        </w:tc>
+        <w:tc>
+          <w:tcPr>
+            <w:tcW w:w="4433" w:type="dxa"/>
+            <w:tcBorders>
+              <w:top w:val="single" w:sz="4" w:space="0" w:color="D4CEC7"/>
+              <w:left w:val="single" w:sz="4" w:space="0" w:color="D4CEC7"/>
+              <w:bottom w:val="single" w:sz="4" w:space="0" w:color="D4CEC7"/>
+              <w:right w:val="single" w:sz="4" w:space="0" w:color="D4CEC7"/>
+            </w:tcBorders>
+            <w:tcMar>
+              <w:top w:w="60" w:type="dxa"/>
+              <w:left w:w="100" w:type="dxa"/>
+              <w:bottom w:w="60" w:type="dxa"/>
+              <w:right w:w="100" w:type="dxa"/>
+            </w:tcMar>
+          </w:tcPr>
+          <w:p>
+            <w:r>
+              <w:t>PDFz-1.2.0-macOS-arm64.dmg</w:t>
+            </w:r>
+          </w:p>
+        </w:tc>
+        <w:tc>
+          <w:tcPr>
+            <w:tcW w:w="1638" w:type="dxa"/>
+            <w:tcBorders>
+              <w:top w:val="single" w:sz="4" w:space="0" w:color="D4CEC7"/>
+              <w:left w:val="single" w:sz="4" w:space="0" w:color="D4CEC7"/>
+              <w:bottom w:val="single" w:sz="4" w:space="0" w:color="D4CEC7"/>
+              <w:right w:val="single" w:sz="4" w:space="0" w:color="D4CEC7"/>
+            </w:tcBorders>
+            <w:tcMar>
+              <w:top w:w="60" w:type="dxa"/>
+              <w:left w:w="100" w:type="dxa"/>
+              <w:bottom w:w="60" w:type="dxa"/>
+              <w:right w:w="100" w:type="dxa"/>
+            </w:tcMar>
+          </w:tcPr>
+          <w:p>
+            <w:r>
+              <w:t>160,4 MB</w:t>
+            </w:r>
+          </w:p>
+        </w:tc>
+        <w:tc>
+          <w:tcPr>
+            <w:tcW w:w="1639" w:type="dxa"/>
+            <w:tcBorders>
+              <w:top w:val="single" w:sz="4" w:space="0" w:color="D4CEC7"/>
+              <w:left w:val="single" w:sz="4" w:space="0" w:color="D4CEC7"/>
+              <w:bottom w:val="single" w:sz="4" w:space="0" w:color="D4CEC7"/>
+              <w:right w:val="single" w:sz="4" w:space="0" w:color="D4CEC7"/>
+            </w:tcBorders>
+            <w:tcMar>
+              <w:top w:w="60" w:type="dxa"/>
+              <w:left w:w="100" w:type="dxa"/>
+              <w:bottom w:w="60" w:type="dxa"/>
+              <w:right w:w="100" w:type="dxa"/>
+            </w:tcMar>
+          </w:tcPr>
+          <w:p>
+            <w:r>
+              <w:t>137,4 MB</w:t>
+            </w:r>
+          </w:p>
+        </w:tc>
+      </w:tr>
+      <w:tr>
+        <w:tc>
+          <w:tcPr>
+            <w:tcW w:w="1928" w:type="dxa"/>
+            <w:tcBorders>
+              <w:top w:val="single" w:sz="4" w:space="0" w:color="D4CEC7"/>
+              <w:left w:val="single" w:sz="4" w:space="0" w:color="D4CEC7"/>
+              <w:bottom w:val="single" w:sz="4" w:space="0" w:color="D4CEC7"/>
+              <w:right w:val="single" w:sz="4" w:space="0" w:color="D4CEC7"/>
+            </w:tcBorders>
+            <w:tcMar>
+              <w:top w:w="60" w:type="dxa"/>
+              <w:left w:w="100" w:type="dxa"/>
+              <w:bottom w:w="60" w:type="dxa"/>
+              <w:right w:w="100" w:type="dxa"/>
+            </w:tcMar>
+          </w:tcPr>
+          <w:p>
+            <w:r>
+              <w:t>Linux</w:t>
+            </w:r>
+          </w:p>
+        </w:tc>
+        <w:tc>
+          <w:tcPr>
+            <w:tcW w:w="4433" w:type="dxa"/>
+            <w:tcBorders>
+              <w:top w:val="single" w:sz="4" w:space="0" w:color="D4CEC7"/>
+              <w:left w:val="single" w:sz="4" w:space="0" w:color="D4CEC7"/>
+              <w:bottom w:val="single" w:sz="4" w:space="0" w:color="D4CEC7"/>
+              <w:right w:val="single" w:sz="4" w:space="0" w:color="D4CEC7"/>
+            </w:tcBorders>
+            <w:tcMar>
+              <w:top w:w="60" w:type="dxa"/>
+              <w:left w:w="100" w:type="dxa"/>
+              <w:bottom w:w="60" w:type="dxa"/>
+              <w:right w:w="100" w:type="dxa"/>
+            </w:tcMar>
+          </w:tcPr>
+          <w:p>
+            <w:r>
+              <w:t>PDFz-1.2.0-x86_64.AppImage</w:t>
+            </w:r>
+          </w:p>
+        </w:tc>
+        <w:tc>
+          <w:tcPr>
+            <w:tcW w:w="1638" w:type="dxa"/>
+            <w:tcBorders>
+              <w:top w:val="single" w:sz="4" w:space="0" w:color="D4CEC7"/>
+              <w:left w:val="single" w:sz="4" w:space="0" w:color="D4CEC7"/>
+              <w:bottom w:val="single" w:sz="4" w:space="0" w:color="D4CEC7"/>
+              <w:right w:val="single" w:sz="4" w:space="0" w:color="D4CEC7"/>
+            </w:tcBorders>
+            <w:tcMar>
+              <w:top w:w="60" w:type="dxa"/>
+              <w:left w:w="100" w:type="dxa"/>
+              <w:bottom w:w="60" w:type="dxa"/>
+              <w:right w:w="100" w:type="dxa"/>
+            </w:tcMar>
+          </w:tcPr>
+          <w:p>
+            <w:r>
+              <w:t>175,0 MB</w:t>
+            </w:r>
+          </w:p>
+        </w:tc>
+        <w:tc>
+          <w:tcPr>
+            <w:tcW w:w="1639" w:type="dxa"/>
+            <w:tcBorders>
+              <w:top w:val="single" w:sz="4" w:space="0" w:color="D4CEC7"/>
+              <w:left w:val="single" w:sz="4" w:space="0" w:color="D4CEC7"/>
+              <w:bottom w:val="single" w:sz="4" w:space="0" w:color="D4CEC7"/>
+              <w:right w:val="single" w:sz="4" w:space="0" w:color="D4CEC7"/>
+            </w:tcBorders>
+            <w:tcMar>
+              <w:top w:w="60" w:type="dxa"/>
+              <w:left w:w="100" w:type="dxa"/>
+              <w:bottom w:w="60" w:type="dxa"/>
+              <w:right w:w="100" w:type="dxa"/>
+            </w:tcMar>
+          </w:tcPr>
+          <w:p>
+            <w:r>
+              <w:t>162,9 MB</w:t>
+            </w:r>
+          </w:p>
+        </w:tc>
+      </w:tr>
+      <w:tr>
+        <w:tc>
+          <w:tcPr>
+            <w:tcW w:w="1928" w:type="dxa"/>
+            <w:tcBorders>
+              <w:top w:val="single" w:sz="4" w:space="0" w:color="D4CEC7"/>
+              <w:left w:val="single" w:sz="4" w:space="0" w:color="D4CEC7"/>
+              <w:bottom w:val="single" w:sz="4" w:space="0" w:color="D4CEC7"/>
+              <w:right w:val="single" w:sz="4" w:space="0" w:color="D4CEC7"/>
+            </w:tcBorders>
+            <w:tcMar>
+              <w:top w:w="60" w:type="dxa"/>
+              <w:left w:w="100" w:type="dxa"/>
+              <w:bottom w:w="60" w:type="dxa"/>
+              <w:right w:w="100" w:type="dxa"/>
+            </w:tcMar>
+          </w:tcPr>
+          <w:p>
+            <w:r>
+              <w:t>Android</w:t>
+            </w:r>
+          </w:p>
+        </w:tc>
+        <w:tc>
+          <w:tcPr>
+            <w:tcW w:w="4433" w:type="dxa"/>
+            <w:tcBorders>
+              <w:top w:val="single" w:sz="4" w:space="0" w:color="D4CEC7"/>
+              <w:left w:val="single" w:sz="4" w:space="0" w:color="D4CEC7"/>
+              <w:bottom w:val="single" w:sz="4" w:space="0" w:color="D4CEC7"/>
+              <w:right w:val="single" w:sz="4" w:space="0" w:color="D4CEC7"/>
+            </w:tcBorders>
+            <w:tcMar>
+              <w:top w:w="60" w:type="dxa"/>
+              <w:left w:w="100" w:type="dxa"/>
+              <w:bottom w:w="60" w:type="dxa"/>
+              <w:right w:w="100" w:type="dxa"/>
+            </w:tcMar>
+          </w:tcPr>
+          <w:p>
+            <w:r>
+              <w:t>PDFz-1.2.0-android.apk</w:t>
+            </w:r>
+          </w:p>
+        </w:tc>
+        <w:tc>
+          <w:tcPr>
+            <w:tcW w:w="1638" w:type="dxa"/>
+            <w:tcBorders>
+              <w:top w:val="single" w:sz="4" w:space="0" w:color="D4CEC7"/>
+              <w:left w:val="single" w:sz="4" w:space="0" w:color="D4CEC7"/>
+              <w:bottom w:val="single" w:sz="4" w:space="0" w:color="D4CEC7"/>
+              <w:right w:val="single" w:sz="4" w:space="0" w:color="D4CEC7"/>
+            </w:tcBorders>
+            <w:tcMar>
+              <w:top w:w="60" w:type="dxa"/>
+              <w:left w:w="100" w:type="dxa"/>
+              <w:bottom w:w="60" w:type="dxa"/>
+              <w:right w:w="100" w:type="dxa"/>
+            </w:tcMar>
+          </w:tcPr>
+          <w:p>
+            <w:r>
+              <w:t>64,6 MB</w:t>
+            </w:r>
+          </w:p>
+        </w:tc>
+        <w:tc>
+          <w:tcPr>
+            <w:tcW w:w="1639" w:type="dxa"/>
+            <w:tcBorders>
+              <w:top w:val="single" w:sz="4" w:space="0" w:color="D4CEC7"/>
+              <w:left w:val="single" w:sz="4" w:space="0" w:color="D4CEC7"/>
+              <w:bottom w:val="single" w:sz="4" w:space="0" w:color="D4CEC7"/>
+              <w:right w:val="single" w:sz="4" w:space="0" w:color="D4CEC7"/>
+            </w:tcBorders>
+            <w:tcMar>
+              <w:top w:w="60" w:type="dxa"/>
+              <w:left w:w="100" w:type="dxa"/>
+              <w:bottom w:w="60" w:type="dxa"/>
+              <w:right w:w="100" w:type="dxa"/>
+            </w:tcMar>
+          </w:tcPr>
+          <w:p>
+            <w:r>
+              <w:t>64,6 MB</w:t>
+            </w:r>
+          </w:p>
+        </w:tc>
+      </w:tr>
+    </w:tbl>
+    <w:p>
+      <w:pPr>
+        <w:spacing w:after="120"/>
+      </w:pPr>
+    </w:p>
+    <w:p>
+      <w:pPr>
+        <w:spacing w:after="120"/>
+      </w:pPr>
+      <w:r>
+        <w:t>Gli installer per PC sono più grandi della 1.1.0 per la nuova versione di PyMuPDF. Prova fatta senza account GitHub: i 4 link diretti rispondono con la dimensione giusta, l'ultima versione è la 1.2.0 e un'app 1.1.0 riceve l'installer del proprio sistema con le novità (3 sui PC, 2 su Android).</w:t>
+      </w:r>
+    </w:p>
     <w:p>
       <w:pPr>
         <w:pStyle w:val="Titolo2"/>
       </w:pPr>
-      <w:bookmarkStart w:id="36" w:name="_Toc243488120"/>
+      <w:bookmarkStart w:id="36" w:name="_Toc243488805"/>
       <w:r>
         <w:t>6.9 Ruoli</w:t>
       </w:r>
@@ -15757,7 +16267,7 @@
       <w:pPr>
         <w:pStyle w:val="Titolo1"/>
       </w:pPr>
-      <w:bookmarkStart w:id="37" w:name="_Toc243488121"/>
+      <w:bookmarkStart w:id="37" w:name="_Toc243488806"/>
       <w:r>
         <w:t>7. Sicurezza</w:t>
       </w:r>
@@ -16056,8 +16566,9 @@
       <w:pPr>
         <w:pStyle w:val="Titolo1"/>
       </w:pPr>
-      <w:bookmarkStart w:id="38" w:name="_Toc243488122"/>
-      <w:r>
+      <w:bookmarkStart w:id="38" w:name="_Toc243488807"/>
+      <w:r>
+        <w:lastRenderedPageBreak/>
         <w:t>8. Punti aperti</w:t>
       </w:r>
       <w:bookmarkEnd w:id="38"/>
@@ -16209,7 +16720,6 @@
           <w:b/>
           <w:bCs/>
         </w:rPr>
-        <w:lastRenderedPageBreak/>
         <w:t>PyMuPDF 2.0 su Android</w:t>
       </w:r>
       <w:r>
@@ -16244,7 +16754,7 @@
       <w:pPr>
         <w:pStyle w:val="Titolo1"/>
       </w:pPr>
-      <w:bookmarkStart w:id="39" w:name="_Toc243488123"/>
+      <w:bookmarkStart w:id="39" w:name="_Toc243488808"/>
       <w:r>
         <w:t>9. Pensato per i prossimi 10 anni</w:t>
       </w:r>
@@ -16522,96 +17032,10 @@
 <file path=word/numbering.xml><?xml version="1.0" encoding="utf-8"?>
 <w:numbering xmlns:wpc="http://schemas.microsoft.com/office/word/2010/wordprocessingCanvas" xmlns:cx="http://schemas.microsoft.com/office/drawing/2014/chartex" xmlns:cx1="http://schemas.microsoft.com/office/drawing/2015/9/8/chartex" xmlns:cx2="http://schemas.microsoft.com/office/drawing/2015/10/21/chartex" xmlns:cx3="http://schemas.microsoft.com/office/drawing/2016/5/9/chartex" xmlns:cx4="http://schemas.microsoft.com/office/drawing/2016/5/10/chartex" xmlns:cx5="http://schemas.microsoft.com/office/drawing/2016/5/11/chartex" xmlns:cx6="http://schemas.microsoft.com/office/drawing/2016/5/12/chartex" xmlns:cx7="http://schemas.microsoft.com/office/drawing/2016/5/13/chartex" xmlns:cx8="http://schemas.microsoft.com/office/drawing/2016/5/14/chartex" xmlns:mc="http://schemas.openxmlformats.org/markup-compatibility/2006" xmlns:aink="http://schemas.microsoft.com/office/drawing/2016/ink" xmlns:am3d="http://schemas.microsoft.com/office/drawing/2017/model3d" xmlns:o="urn:schemas-microsoft-com:office:office" xmlns:oel="http://schemas.microsoft.com/office/2019/extlst" xmlns:r="http://schemas.openxmlformats.org/officeDocument/2006/relationships" xmlns:m="http://schemas.openxmlformats.org/officeDocument/2006/math" xmlns:v="urn:schemas-microsoft-com:vml" xmlns:wp14="http://schemas.microsoft.com/office/word/2010/wordprocessingDrawing" xmlns:wp="http://schemas.openxmlformats.org/drawingml/2006/wordprocessingDrawing" xmlns:w10="urn:schemas-microsoft-com:office:word" xmlns:w="http://schemas.openxmlformats.org/wordprocessingml/2006/main" xmlns:w14="http://schemas.microsoft.com/office/word/2010/wordml" xmlns:w15="http://schemas.microsoft.com/office/word/2012/wordml" xmlns:w16cex="http://schemas.microsoft.com/office/word/2018/wordml/cex" xmlns:w16cid="http://schemas.microsoft.com/office/word/2016/wordml/cid" xmlns:w16="http://schemas.microsoft.com/office/word/2018/wordml" xmlns:w16du="http://schemas.microsoft.com/office/word/2023/wordml/word16du" xmlns:w16sdtdh="http://schemas.microsoft.com/office/word/2020/wordml/sdtdatahash" xmlns:w16sdtfl="http://schemas.microsoft.com/office/word/2024/wordml/sdtformatlock" xmlns:w16se="http://schemas.microsoft.com/office/word/2015/wordml/symex" xmlns:wpg="http://schemas.microsoft.com/office/word/2010/wordprocessingGroup" xmlns:wpi="http://schemas.microsoft.com/office/word/2010/wordprocessingInk" xmlns:wne="http://schemas.microsoft.com/office/word/2006/wordml" xmlns:wps="http://schemas.microsoft.com/office/word/2010/wordprocessingShape" mc:Ignorable="w14 w15 w16se w16cid w16 w16cex w16sdtdh w16sdtfl w16du wp14">
   <w:abstractNum w:abstractNumId="0" w15:restartNumberingAfterBreak="0">
-    <w:nsid w:val="0E61564A"/>
+    <w:nsid w:val="07905F45"/>
     <w:multiLevelType w:val="hybridMultilevel"/>
-    <w:tmpl w:val="56045EC6"/>
-    <w:lvl w:ilvl="0" w:tplc="64D4850C" w:tentative="1">
-      <w:start w:val="1"/>
-      <w:numFmt w:val="bullet"/>
-      <w:lvlText w:val="●"/>
-      <w:lvlJc w:val="left"/>
-      <w:pPr>
-        <w:ind w:left="720" w:hanging="360"/>
-      </w:pPr>
-    </w:lvl>
-    <w:lvl w:ilvl="1" w:tplc="8F16C98A" w:tentative="1">
-      <w:start w:val="1"/>
-      <w:numFmt w:val="bullet"/>
-      <w:lvlText w:val="○"/>
-      <w:lvlJc w:val="left"/>
-      <w:pPr>
-        <w:ind w:left="1440" w:hanging="360"/>
-      </w:pPr>
-    </w:lvl>
-    <w:lvl w:ilvl="2" w:tplc="55EE0EFE" w:tentative="1">
-      <w:start w:val="1"/>
-      <w:numFmt w:val="bullet"/>
-      <w:lvlText w:val="■"/>
-      <w:lvlJc w:val="left"/>
-      <w:pPr>
-        <w:ind w:left="2160" w:hanging="360"/>
-      </w:pPr>
-    </w:lvl>
-    <w:lvl w:ilvl="3" w:tplc="7716E714" w:tentative="1">
-      <w:start w:val="1"/>
-      <w:numFmt w:val="bullet"/>
-      <w:lvlText w:val="●"/>
-      <w:lvlJc w:val="left"/>
-      <w:pPr>
-        <w:ind w:left="2880" w:hanging="360"/>
-      </w:pPr>
-    </w:lvl>
-    <w:lvl w:ilvl="4" w:tplc="92B2464C" w:tentative="1">
-      <w:start w:val="1"/>
-      <w:numFmt w:val="bullet"/>
-      <w:lvlText w:val="○"/>
-      <w:lvlJc w:val="left"/>
-      <w:pPr>
-        <w:ind w:left="3600" w:hanging="360"/>
-      </w:pPr>
-    </w:lvl>
-    <w:lvl w:ilvl="5" w:tplc="5EAC6F52" w:tentative="1">
-      <w:start w:val="1"/>
-      <w:numFmt w:val="bullet"/>
-      <w:lvlText w:val="■"/>
-      <w:lvlJc w:val="left"/>
-      <w:pPr>
-        <w:ind w:left="4320" w:hanging="360"/>
-      </w:pPr>
-    </w:lvl>
-    <w:lvl w:ilvl="6" w:tplc="0930DF94" w:tentative="1">
-      <w:start w:val="1"/>
-      <w:numFmt w:val="bullet"/>
-      <w:lvlText w:val="●"/>
-      <w:lvlJc w:val="left"/>
-      <w:pPr>
-        <w:ind w:left="5040" w:hanging="360"/>
-      </w:pPr>
-    </w:lvl>
-    <w:lvl w:ilvl="7" w:tplc="D3F85276" w:tentative="1">
-      <w:start w:val="1"/>
-      <w:numFmt w:val="bullet"/>
-      <w:lvlText w:val="●"/>
-      <w:lvlJc w:val="left"/>
-      <w:pPr>
-        <w:ind w:left="5760" w:hanging="360"/>
-      </w:pPr>
-    </w:lvl>
-    <w:lvl w:ilvl="8" w:tplc="EA0A2E44" w:tentative="1">
-      <w:start w:val="1"/>
-      <w:numFmt w:val="bullet"/>
-      <w:lvlText w:val="●"/>
-      <w:lvlJc w:val="left"/>
-      <w:pPr>
-        <w:ind w:left="6480" w:hanging="360"/>
-      </w:pPr>
-    </w:lvl>
-  </w:abstractNum>
-  <w:abstractNum w:abstractNumId="1" w15:restartNumberingAfterBreak="0">
-    <w:nsid w:val="2E1100AC"/>
-    <w:multiLevelType w:val="hybridMultilevel"/>
-    <w:tmpl w:val="FA42774C"/>
-    <w:lvl w:ilvl="0" w:tplc="3872F446">
+    <w:tmpl w:val="2C84108A"/>
+    <w:lvl w:ilvl="0" w:tplc="C8641D2A">
       <w:start w:val="1"/>
       <w:numFmt w:val="bullet"/>
       <w:lvlText w:val="•"/>
@@ -16620,52 +17044,138 @@
         <w:ind w:left="540" w:hanging="270"/>
       </w:pPr>
     </w:lvl>
-    <w:lvl w:ilvl="1" w:tplc="C9D43DBA">
+    <w:lvl w:ilvl="1" w:tplc="20E42982">
       <w:numFmt w:val="decimal"/>
       <w:lvlText w:val=""/>
       <w:lvlJc w:val="left"/>
     </w:lvl>
-    <w:lvl w:ilvl="2" w:tplc="5E9025D6">
+    <w:lvl w:ilvl="2" w:tplc="DDA00468">
       <w:numFmt w:val="decimal"/>
       <w:lvlText w:val=""/>
       <w:lvlJc w:val="left"/>
     </w:lvl>
-    <w:lvl w:ilvl="3" w:tplc="E0FA619E">
+    <w:lvl w:ilvl="3" w:tplc="7D269DDA">
       <w:numFmt w:val="decimal"/>
       <w:lvlText w:val=""/>
       <w:lvlJc w:val="left"/>
     </w:lvl>
-    <w:lvl w:ilvl="4" w:tplc="51F458FA">
+    <w:lvl w:ilvl="4" w:tplc="40BA804A">
       <w:numFmt w:val="decimal"/>
       <w:lvlText w:val=""/>
       <w:lvlJc w:val="left"/>
     </w:lvl>
-    <w:lvl w:ilvl="5" w:tplc="02E41D40">
+    <w:lvl w:ilvl="5" w:tplc="0DA610E6">
       <w:numFmt w:val="decimal"/>
       <w:lvlText w:val=""/>
       <w:lvlJc w:val="left"/>
     </w:lvl>
-    <w:lvl w:ilvl="6" w:tplc="A60CC93C">
+    <w:lvl w:ilvl="6" w:tplc="B374F638">
       <w:numFmt w:val="decimal"/>
       <w:lvlText w:val=""/>
       <w:lvlJc w:val="left"/>
     </w:lvl>
-    <w:lvl w:ilvl="7" w:tplc="B0C62D78">
+    <w:lvl w:ilvl="7" w:tplc="84A2E072">
       <w:numFmt w:val="decimal"/>
       <w:lvlText w:val=""/>
       <w:lvlJc w:val="left"/>
     </w:lvl>
-    <w:lvl w:ilvl="8" w:tplc="C4E641E2">
+    <w:lvl w:ilvl="8" w:tplc="F5F42856">
       <w:numFmt w:val="decimal"/>
       <w:lvlText w:val=""/>
       <w:lvlJc w:val="left"/>
     </w:lvl>
   </w:abstractNum>
+  <w:abstractNum w:abstractNumId="1" w15:restartNumberingAfterBreak="0">
+    <w:nsid w:val="12AD3614"/>
+    <w:multiLevelType w:val="hybridMultilevel"/>
+    <w:tmpl w:val="EAB4B318"/>
+    <w:lvl w:ilvl="0" w:tplc="30D6D214" w:tentative="1">
+      <w:start w:val="1"/>
+      <w:numFmt w:val="bullet"/>
+      <w:lvlText w:val="●"/>
+      <w:lvlJc w:val="left"/>
+      <w:pPr>
+        <w:ind w:left="720" w:hanging="360"/>
+      </w:pPr>
+    </w:lvl>
+    <w:lvl w:ilvl="1" w:tplc="D9AC3666" w:tentative="1">
+      <w:start w:val="1"/>
+      <w:numFmt w:val="bullet"/>
+      <w:lvlText w:val="○"/>
+      <w:lvlJc w:val="left"/>
+      <w:pPr>
+        <w:ind w:left="1440" w:hanging="360"/>
+      </w:pPr>
+    </w:lvl>
+    <w:lvl w:ilvl="2" w:tplc="355469B6" w:tentative="1">
+      <w:start w:val="1"/>
+      <w:numFmt w:val="bullet"/>
+      <w:lvlText w:val="■"/>
+      <w:lvlJc w:val="left"/>
+      <w:pPr>
+        <w:ind w:left="2160" w:hanging="360"/>
+      </w:pPr>
+    </w:lvl>
+    <w:lvl w:ilvl="3" w:tplc="DF7AE57E" w:tentative="1">
+      <w:start w:val="1"/>
+      <w:numFmt w:val="bullet"/>
+      <w:lvlText w:val="●"/>
+      <w:lvlJc w:val="left"/>
+      <w:pPr>
+        <w:ind w:left="2880" w:hanging="360"/>
+      </w:pPr>
+    </w:lvl>
+    <w:lvl w:ilvl="4" w:tplc="A17A5910" w:tentative="1">
+      <w:start w:val="1"/>
+      <w:numFmt w:val="bullet"/>
+      <w:lvlText w:val="○"/>
+      <w:lvlJc w:val="left"/>
+      <w:pPr>
+        <w:ind w:left="3600" w:hanging="360"/>
+      </w:pPr>
+    </w:lvl>
+    <w:lvl w:ilvl="5" w:tplc="3D264052" w:tentative="1">
+      <w:start w:val="1"/>
+      <w:numFmt w:val="bullet"/>
+      <w:lvlText w:val="■"/>
+      <w:lvlJc w:val="left"/>
+      <w:pPr>
+        <w:ind w:left="4320" w:hanging="360"/>
+      </w:pPr>
+    </w:lvl>
+    <w:lvl w:ilvl="6" w:tplc="DF4270D2" w:tentative="1">
+      <w:start w:val="1"/>
+      <w:numFmt w:val="bullet"/>
+      <w:lvlText w:val="●"/>
+      <w:lvlJc w:val="left"/>
+      <w:pPr>
+        <w:ind w:left="5040" w:hanging="360"/>
+      </w:pPr>
+    </w:lvl>
+    <w:lvl w:ilvl="7" w:tplc="969A33D0" w:tentative="1">
+      <w:start w:val="1"/>
+      <w:numFmt w:val="bullet"/>
+      <w:lvlText w:val="●"/>
+      <w:lvlJc w:val="left"/>
+      <w:pPr>
+        <w:ind w:left="5760" w:hanging="360"/>
+      </w:pPr>
+    </w:lvl>
+    <w:lvl w:ilvl="8" w:tplc="4110554A" w:tentative="1">
+      <w:start w:val="1"/>
+      <w:numFmt w:val="bullet"/>
+      <w:lvlText w:val="●"/>
+      <w:lvlJc w:val="left"/>
+      <w:pPr>
+        <w:ind w:left="6480" w:hanging="360"/>
+      </w:pPr>
+    </w:lvl>
+  </w:abstractNum>
   <w:abstractNum w:abstractNumId="2" w15:restartNumberingAfterBreak="0">
-    <w:nsid w:val="438203BC"/>
+    <w:nsid w:val="195D44EB"/>
     <w:multiLevelType w:val="hybridMultilevel"/>
-    <w:tmpl w:val="E47C0662"/>
-    <w:lvl w:ilvl="0" w:tplc="2A7087BC">
+    <w:tmpl w:val="6B08A78C"/>
+    <w:lvl w:ilvl="0" w:tplc="57C816E8">
       <w:start w:val="1"/>
       <w:numFmt w:val="decimal"/>
       <w:lvlText w:val="%1."/>
@@ -16674,52 +17184,52 @@
         <w:ind w:left="540" w:hanging="300"/>
       </w:pPr>
     </w:lvl>
-    <w:lvl w:ilvl="1" w:tplc="D688B180">
+    <w:lvl w:ilvl="1" w:tplc="4B0C7534">
       <w:numFmt w:val="decimal"/>
       <w:lvlText w:val=""/>
       <w:lvlJc w:val="left"/>
     </w:lvl>
-    <w:lvl w:ilvl="2" w:tplc="0D9EBEE4">
+    <w:lvl w:ilvl="2" w:tplc="CA48DC96">
       <w:numFmt w:val="decimal"/>
       <w:lvlText w:val=""/>
       <w:lvlJc w:val="left"/>
     </w:lvl>
-    <w:lvl w:ilvl="3" w:tplc="B8BA65D6">
+    <w:lvl w:ilvl="3" w:tplc="FAAAF3EE">
       <w:numFmt w:val="decimal"/>
       <w:lvlText w:val=""/>
       <w:lvlJc w:val="left"/>
     </w:lvl>
-    <w:lvl w:ilvl="4" w:tplc="1E562E2C">
+    <w:lvl w:ilvl="4" w:tplc="7AFC8390">
       <w:numFmt w:val="decimal"/>
       <w:lvlText w:val=""/>
       <w:lvlJc w:val="left"/>
     </w:lvl>
-    <w:lvl w:ilvl="5" w:tplc="D166D63A">
+    <w:lvl w:ilvl="5" w:tplc="A88C9DC6">
       <w:numFmt w:val="decimal"/>
       <w:lvlText w:val=""/>
       <w:lvlJc w:val="left"/>
     </w:lvl>
-    <w:lvl w:ilvl="6" w:tplc="F3F49DBE">
+    <w:lvl w:ilvl="6" w:tplc="3A400C66">
       <w:numFmt w:val="decimal"/>
       <w:lvlText w:val=""/>
       <w:lvlJc w:val="left"/>
     </w:lvl>
-    <w:lvl w:ilvl="7" w:tplc="265C20F6">
+    <w:lvl w:ilvl="7" w:tplc="0BA4D6BA">
       <w:numFmt w:val="decimal"/>
       <w:lvlText w:val=""/>
       <w:lvlJc w:val="left"/>
     </w:lvl>
-    <w:lvl w:ilvl="8" w:tplc="FBB89008">
+    <w:lvl w:ilvl="8" w:tplc="2B8040C8">
       <w:numFmt w:val="decimal"/>
       <w:lvlText w:val=""/>
       <w:lvlJc w:val="left"/>
     </w:lvl>
   </w:abstractNum>
   <w:abstractNum w:abstractNumId="3" w15:restartNumberingAfterBreak="0">
-    <w:nsid w:val="63284E80"/>
+    <w:nsid w:val="685373F6"/>
     <w:multiLevelType w:val="hybridMultilevel"/>
-    <w:tmpl w:val="B08EE544"/>
-    <w:lvl w:ilvl="0" w:tplc="2918C7C6">
+    <w:tmpl w:val="E062A36C"/>
+    <w:lvl w:ilvl="0" w:tplc="041AC83C">
       <w:start w:val="1"/>
       <w:numFmt w:val="decimal"/>
       <w:lvlText w:val="%1."/>
@@ -16728,66 +17238,66 @@
         <w:ind w:left="540" w:hanging="300"/>
       </w:pPr>
     </w:lvl>
-    <w:lvl w:ilvl="1" w:tplc="9C9EFBB4">
+    <w:lvl w:ilvl="1" w:tplc="5BD8CCD0">
       <w:numFmt w:val="decimal"/>
       <w:lvlText w:val=""/>
       <w:lvlJc w:val="left"/>
     </w:lvl>
-    <w:lvl w:ilvl="2" w:tplc="F1364FE0">
+    <w:lvl w:ilvl="2" w:tplc="C2ACEC0A">
       <w:numFmt w:val="decimal"/>
       <w:lvlText w:val=""/>
       <w:lvlJc w:val="left"/>
     </w:lvl>
-    <w:lvl w:ilvl="3" w:tplc="AD2049CE">
+    <w:lvl w:ilvl="3" w:tplc="01E29810">
       <w:numFmt w:val="decimal"/>
       <w:lvlText w:val=""/>
       <w:lvlJc w:val="left"/>
     </w:lvl>
-    <w:lvl w:ilvl="4" w:tplc="E59A07C4">
+    <w:lvl w:ilvl="4" w:tplc="0F4C4098">
       <w:numFmt w:val="decimal"/>
       <w:lvlText w:val=""/>
       <w:lvlJc w:val="left"/>
     </w:lvl>
-    <w:lvl w:ilvl="5" w:tplc="417E0A4E">
+    <w:lvl w:ilvl="5" w:tplc="564298AA">
       <w:numFmt w:val="decimal"/>
       <w:lvlText w:val=""/>
       <w:lvlJc w:val="left"/>
     </w:lvl>
-    <w:lvl w:ilvl="6" w:tplc="BB4AA266">
+    <w:lvl w:ilvl="6" w:tplc="37180F06">
       <w:numFmt w:val="decimal"/>
       <w:lvlText w:val=""/>
       <w:lvlJc w:val="left"/>
     </w:lvl>
-    <w:lvl w:ilvl="7" w:tplc="D07A6CDC">
+    <w:lvl w:ilvl="7" w:tplc="DCE03032">
       <w:numFmt w:val="decimal"/>
       <w:lvlText w:val=""/>
       <w:lvlJc w:val="left"/>
     </w:lvl>
-    <w:lvl w:ilvl="8" w:tplc="AC24840A">
+    <w:lvl w:ilvl="8" w:tplc="6ED07FAE">
       <w:numFmt w:val="decimal"/>
       <w:lvlText w:val=""/>
       <w:lvlJc w:val="left"/>
     </w:lvl>
   </w:abstractNum>
-  <w:num w:numId="1" w16cid:durableId="2050916301">
+  <w:num w:numId="1" w16cid:durableId="21320407">
+    <w:abstractNumId w:val="1"/>
+    <w:lvlOverride w:ilvl="0">
+      <w:startOverride w:val="1"/>
+    </w:lvlOverride>
+  </w:num>
+  <w:num w:numId="2" w16cid:durableId="1499036269">
     <w:abstractNumId w:val="0"/>
     <w:lvlOverride w:ilvl="0">
       <w:startOverride w:val="1"/>
     </w:lvlOverride>
   </w:num>
-  <w:num w:numId="2" w16cid:durableId="482897433">
-    <w:abstractNumId w:val="1"/>
-    <w:lvlOverride w:ilvl="0">
-      <w:startOverride w:val="1"/>
-    </w:lvlOverride>
-  </w:num>
-  <w:num w:numId="3" w16cid:durableId="1390493161">
+  <w:num w:numId="3" w16cid:durableId="413432706">
     <w:abstractNumId w:val="3"/>
     <w:lvlOverride w:ilvl="0">
       <w:startOverride w:val="1"/>
     </w:lvlOverride>
   </w:num>
-  <w:num w:numId="4" w16cid:durableId="120810936">
+  <w:num w:numId="4" w16cid:durableId="1368943712">
     <w:abstractNumId w:val="2"/>
     <w:lvlOverride w:ilvl="0">
       <w:startOverride w:val="1"/>
@@ -17429,7 +17939,7 @@
     <w:autoRedefine/>
     <w:uiPriority w:val="39"/>
     <w:unhideWhenUsed/>
-    <w:rsid w:val="004B4B7D"/>
+    <w:rsid w:val="00496F62"/>
     <w:pPr>
       <w:spacing w:after="100"/>
     </w:pPr>
@@ -17441,7 +17951,7 @@
     <w:autoRedefine/>
     <w:uiPriority w:val="39"/>
     <w:unhideWhenUsed/>
-    <w:rsid w:val="004B4B7D"/>
+    <w:rsid w:val="00496F62"/>
     <w:pPr>
       <w:spacing w:after="100"/>
       <w:ind w:left="210"/>

</xml_diff>

<commit_message>
PDFz 1.2.1: la finestra rimasta vuota si chiude
- Trascinata in un'altra finestra la sua ultima scheda, la finestra di
  partenza si chiude in ogni ordine degli eventi: il biglietto resta valido
  5 s dopo la fine del trascinamento, la finestra di arrivo accetta il
  rilascio anche dopo "fine-trascina", la chiusura non aspetta dragend.
- Versione 1.2.1 (MSI 101.2.1, Android 1001002001), CHANGELOG, novità,
  documenti, CLAUDE.md e documentazione Word.

Co-Authored-By: Claude Opus 5.5 <noreply@anthropic.com>
</commit_message>
<xml_diff>
--- a/docs/PDFz_20261021.docx
+++ b/docs/PDFz_20261021.docx
@@ -16,7 +16,7 @@
           <w:noProof/>
         </w:rPr>
         <w:drawing>
-          <wp:inline distT="0" distB="0" distL="0" distR="0" wp14:anchorId="3AC8D11D" wp14:editId="450B2884">
+          <wp:inline distT="0" distB="0" distL="0" distR="0" wp14:anchorId="3C586D2C" wp14:editId="2760F6BF">
             <wp:extent cx="3619500" cy="1285875"/>
             <wp:effectExtent l="0" t="0" r="0" b="0"/>
             <wp:docPr id="1" name="Immagine 1"/>
@@ -95,7 +95,7 @@
           <w:sz w:val="22"/>
           <w:szCs w:val="22"/>
         </w:rPr>
-        <w:t>Versione 1.2.0  ·  21 ottobre 2026  ·  autore: agjin</w:t>
+        <w:t>Versione 1.2.1  ·  21 ottobre 2026  ·  autore: agjin</w:t>
       </w:r>
     </w:p>
     <w:p>
@@ -136,7 +136,7 @@
     <w:sdt>
       <w:sdtPr>
         <w:alias w:val="Indice"/>
-        <w:id w:val="-1398580071"/>
+        <w:id w:val="1555899989"/>
       </w:sdtPr>
       <w:sdtEndPr/>
       <w:sdtContent>
@@ -159,7 +159,7 @@
           <w:r>
             <w:fldChar w:fldCharType="separate"/>
           </w:r>
-          <w:hyperlink w:anchor="_Toc243488769" w:history="1">
+          <w:hyperlink w:anchor="_Toc243496254" w:history="1">
             <w:r>
               <w:rPr>
                 <w:rStyle w:val="Collegamentoipertestuale"/>
@@ -183,7 +183,7 @@
               <w:rPr>
                 <w:noProof/>
               </w:rPr>
-              <w:instrText xml:space="preserve"> PAGEREF _Toc243488769 \h </w:instrText>
+              <w:instrText xml:space="preserve"> PAGEREF _Toc243496254 \h </w:instrText>
             </w:r>
             <w:r>
               <w:rPr>
@@ -220,7 +220,7 @@
               <w:noProof/>
             </w:rPr>
           </w:pPr>
-          <w:hyperlink w:anchor="_Toc243488770" w:history="1">
+          <w:hyperlink w:anchor="_Toc243496255" w:history="1">
             <w:r>
               <w:rPr>
                 <w:rStyle w:val="Collegamentoipertestuale"/>
@@ -244,7 +244,7 @@
               <w:rPr>
                 <w:noProof/>
               </w:rPr>
-              <w:instrText xml:space="preserve"> PAGEREF _Toc243488770 \h </w:instrText>
+              <w:instrText xml:space="preserve"> PAGEREF _Toc243496255 \h </w:instrText>
             </w:r>
             <w:r>
               <w:rPr>
@@ -281,7 +281,7 @@
               <w:noProof/>
             </w:rPr>
           </w:pPr>
-          <w:hyperlink w:anchor="_Toc243488771" w:history="1">
+          <w:hyperlink w:anchor="_Toc243496256" w:history="1">
             <w:r>
               <w:rPr>
                 <w:rStyle w:val="Collegamentoipertestuale"/>
@@ -305,7 +305,7 @@
               <w:rPr>
                 <w:noProof/>
               </w:rPr>
-              <w:instrText xml:space="preserve"> PAGEREF _Toc243488771 \h </w:instrText>
+              <w:instrText xml:space="preserve"> PAGEREF _Toc243496256 \h </w:instrText>
             </w:r>
             <w:r>
               <w:rPr>
@@ -342,7 +342,7 @@
               <w:noProof/>
             </w:rPr>
           </w:pPr>
-          <w:hyperlink w:anchor="_Toc243488772" w:history="1">
+          <w:hyperlink w:anchor="_Toc243496257" w:history="1">
             <w:r>
               <w:rPr>
                 <w:rStyle w:val="Collegamentoipertestuale"/>
@@ -366,7 +366,7 @@
               <w:rPr>
                 <w:noProof/>
               </w:rPr>
-              <w:instrText xml:space="preserve"> PAGEREF _Toc243488772 \h </w:instrText>
+              <w:instrText xml:space="preserve"> PAGEREF _Toc243496257 \h </w:instrText>
             </w:r>
             <w:r>
               <w:rPr>
@@ -403,7 +403,7 @@
               <w:noProof/>
             </w:rPr>
           </w:pPr>
-          <w:hyperlink w:anchor="_Toc243488773" w:history="1">
+          <w:hyperlink w:anchor="_Toc243496258" w:history="1">
             <w:r>
               <w:rPr>
                 <w:rStyle w:val="Collegamentoipertestuale"/>
@@ -427,7 +427,7 @@
               <w:rPr>
                 <w:noProof/>
               </w:rPr>
-              <w:instrText xml:space="preserve"> PAGEREF _Toc243488773 \h </w:instrText>
+              <w:instrText xml:space="preserve"> PAGEREF _Toc243496258 \h </w:instrText>
             </w:r>
             <w:r>
               <w:rPr>
@@ -464,7 +464,7 @@
               <w:noProof/>
             </w:rPr>
           </w:pPr>
-          <w:hyperlink w:anchor="_Toc243488774" w:history="1">
+          <w:hyperlink w:anchor="_Toc243496259" w:history="1">
             <w:r>
               <w:rPr>
                 <w:rStyle w:val="Collegamentoipertestuale"/>
@@ -488,7 +488,7 @@
               <w:rPr>
                 <w:noProof/>
               </w:rPr>
-              <w:instrText xml:space="preserve"> PAGEREF _Toc243488774 \h </w:instrText>
+              <w:instrText xml:space="preserve"> PAGEREF _Toc243496259 \h </w:instrText>
             </w:r>
             <w:r>
               <w:rPr>
@@ -525,7 +525,7 @@
               <w:noProof/>
             </w:rPr>
           </w:pPr>
-          <w:hyperlink w:anchor="_Toc243488775" w:history="1">
+          <w:hyperlink w:anchor="_Toc243496260" w:history="1">
             <w:r>
               <w:rPr>
                 <w:rStyle w:val="Collegamentoipertestuale"/>
@@ -549,7 +549,7 @@
               <w:rPr>
                 <w:noProof/>
               </w:rPr>
-              <w:instrText xml:space="preserve"> PAGEREF _Toc243488775 \h </w:instrText>
+              <w:instrText xml:space="preserve"> PAGEREF _Toc243496260 \h </w:instrText>
             </w:r>
             <w:r>
               <w:rPr>
@@ -586,7 +586,7 @@
               <w:noProof/>
             </w:rPr>
           </w:pPr>
-          <w:hyperlink w:anchor="_Toc243488776" w:history="1">
+          <w:hyperlink w:anchor="_Toc243496261" w:history="1">
             <w:r>
               <w:rPr>
                 <w:rStyle w:val="Collegamentoipertestuale"/>
@@ -610,7 +610,7 @@
               <w:rPr>
                 <w:noProof/>
               </w:rPr>
-              <w:instrText xml:space="preserve"> PAGEREF _Toc243488776 \h </w:instrText>
+              <w:instrText xml:space="preserve"> PAGEREF _Toc243496261 \h </w:instrText>
             </w:r>
             <w:r>
               <w:rPr>
@@ -647,7 +647,7 @@
               <w:noProof/>
             </w:rPr>
           </w:pPr>
-          <w:hyperlink w:anchor="_Toc243488777" w:history="1">
+          <w:hyperlink w:anchor="_Toc243496262" w:history="1">
             <w:r>
               <w:rPr>
                 <w:rStyle w:val="Collegamentoipertestuale"/>
@@ -671,7 +671,7 @@
               <w:rPr>
                 <w:noProof/>
               </w:rPr>
-              <w:instrText xml:space="preserve"> PAGEREF _Toc243488777 \h </w:instrText>
+              <w:instrText xml:space="preserve"> PAGEREF _Toc243496262 \h </w:instrText>
             </w:r>
             <w:r>
               <w:rPr>
@@ -708,7 +708,7 @@
               <w:noProof/>
             </w:rPr>
           </w:pPr>
-          <w:hyperlink w:anchor="_Toc243488778" w:history="1">
+          <w:hyperlink w:anchor="_Toc243496263" w:history="1">
             <w:r>
               <w:rPr>
                 <w:rStyle w:val="Collegamentoipertestuale"/>
@@ -732,7 +732,7 @@
               <w:rPr>
                 <w:noProof/>
               </w:rPr>
-              <w:instrText xml:space="preserve"> PAGEREF _Toc243488778 \h </w:instrText>
+              <w:instrText xml:space="preserve"> PAGEREF _Toc243496263 \h </w:instrText>
             </w:r>
             <w:r>
               <w:rPr>
@@ -769,7 +769,7 @@
               <w:noProof/>
             </w:rPr>
           </w:pPr>
-          <w:hyperlink w:anchor="_Toc243488779" w:history="1">
+          <w:hyperlink w:anchor="_Toc243496264" w:history="1">
             <w:r>
               <w:rPr>
                 <w:rStyle w:val="Collegamentoipertestuale"/>
@@ -793,7 +793,7 @@
               <w:rPr>
                 <w:noProof/>
               </w:rPr>
-              <w:instrText xml:space="preserve"> PAGEREF _Toc243488779 \h </w:instrText>
+              <w:instrText xml:space="preserve"> PAGEREF _Toc243496264 \h </w:instrText>
             </w:r>
             <w:r>
               <w:rPr>
@@ -830,7 +830,7 @@
               <w:noProof/>
             </w:rPr>
           </w:pPr>
-          <w:hyperlink w:anchor="_Toc243488780" w:history="1">
+          <w:hyperlink w:anchor="_Toc243496265" w:history="1">
             <w:r>
               <w:rPr>
                 <w:rStyle w:val="Collegamentoipertestuale"/>
@@ -854,7 +854,7 @@
               <w:rPr>
                 <w:noProof/>
               </w:rPr>
-              <w:instrText xml:space="preserve"> PAGEREF _Toc243488780 \h </w:instrText>
+              <w:instrText xml:space="preserve"> PAGEREF _Toc243496265 \h </w:instrText>
             </w:r>
             <w:r>
               <w:rPr>
@@ -891,7 +891,7 @@
               <w:noProof/>
             </w:rPr>
           </w:pPr>
-          <w:hyperlink w:anchor="_Toc243488781" w:history="1">
+          <w:hyperlink w:anchor="_Toc243496266" w:history="1">
             <w:r>
               <w:rPr>
                 <w:rStyle w:val="Collegamentoipertestuale"/>
@@ -915,7 +915,7 @@
               <w:rPr>
                 <w:noProof/>
               </w:rPr>
-              <w:instrText xml:space="preserve"> PAGEREF _Toc243488781 \h </w:instrText>
+              <w:instrText xml:space="preserve"> PAGEREF _Toc243496266 \h </w:instrText>
             </w:r>
             <w:r>
               <w:rPr>
@@ -952,7 +952,7 @@
               <w:noProof/>
             </w:rPr>
           </w:pPr>
-          <w:hyperlink w:anchor="_Toc243488782" w:history="1">
+          <w:hyperlink w:anchor="_Toc243496267" w:history="1">
             <w:r>
               <w:rPr>
                 <w:rStyle w:val="Collegamentoipertestuale"/>
@@ -976,7 +976,7 @@
               <w:rPr>
                 <w:noProof/>
               </w:rPr>
-              <w:instrText xml:space="preserve"> PAGEREF _Toc243488782 \h </w:instrText>
+              <w:instrText xml:space="preserve"> PAGEREF _Toc243496267 \h </w:instrText>
             </w:r>
             <w:r>
               <w:rPr>
@@ -1013,7 +1013,7 @@
               <w:noProof/>
             </w:rPr>
           </w:pPr>
-          <w:hyperlink w:anchor="_Toc243488783" w:history="1">
+          <w:hyperlink w:anchor="_Toc243496268" w:history="1">
             <w:r>
               <w:rPr>
                 <w:rStyle w:val="Collegamentoipertestuale"/>
@@ -1037,7 +1037,7 @@
               <w:rPr>
                 <w:noProof/>
               </w:rPr>
-              <w:instrText xml:space="preserve"> PAGEREF _Toc243488783 \h </w:instrText>
+              <w:instrText xml:space="preserve"> PAGEREF _Toc243496268 \h </w:instrText>
             </w:r>
             <w:r>
               <w:rPr>
@@ -1074,7 +1074,7 @@
               <w:noProof/>
             </w:rPr>
           </w:pPr>
-          <w:hyperlink w:anchor="_Toc243488784" w:history="1">
+          <w:hyperlink w:anchor="_Toc243496269" w:history="1">
             <w:r>
               <w:rPr>
                 <w:rStyle w:val="Collegamentoipertestuale"/>
@@ -1098,7 +1098,7 @@
               <w:rPr>
                 <w:noProof/>
               </w:rPr>
-              <w:instrText xml:space="preserve"> PAGEREF _Toc243488784 \h </w:instrText>
+              <w:instrText xml:space="preserve"> PAGEREF _Toc243496269 \h </w:instrText>
             </w:r>
             <w:r>
               <w:rPr>
@@ -1135,7 +1135,7 @@
               <w:noProof/>
             </w:rPr>
           </w:pPr>
-          <w:hyperlink w:anchor="_Toc243488785" w:history="1">
+          <w:hyperlink w:anchor="_Toc243496270" w:history="1">
             <w:r>
               <w:rPr>
                 <w:rStyle w:val="Collegamentoipertestuale"/>
@@ -1159,7 +1159,7 @@
               <w:rPr>
                 <w:noProof/>
               </w:rPr>
-              <w:instrText xml:space="preserve"> PAGEREF _Toc243488785 \h </w:instrText>
+              <w:instrText xml:space="preserve"> PAGEREF _Toc243496270 \h </w:instrText>
             </w:r>
             <w:r>
               <w:rPr>
@@ -1196,7 +1196,7 @@
               <w:noProof/>
             </w:rPr>
           </w:pPr>
-          <w:hyperlink w:anchor="_Toc243488786" w:history="1">
+          <w:hyperlink w:anchor="_Toc243496271" w:history="1">
             <w:r>
               <w:rPr>
                 <w:rStyle w:val="Collegamentoipertestuale"/>
@@ -1220,7 +1220,7 @@
               <w:rPr>
                 <w:noProof/>
               </w:rPr>
-              <w:instrText xml:space="preserve"> PAGEREF _Toc243488786 \h </w:instrText>
+              <w:instrText xml:space="preserve"> PAGEREF _Toc243496271 \h </w:instrText>
             </w:r>
             <w:r>
               <w:rPr>
@@ -1257,7 +1257,7 @@
               <w:noProof/>
             </w:rPr>
           </w:pPr>
-          <w:hyperlink w:anchor="_Toc243488787" w:history="1">
+          <w:hyperlink w:anchor="_Toc243496272" w:history="1">
             <w:r>
               <w:rPr>
                 <w:rStyle w:val="Collegamentoipertestuale"/>
@@ -1281,7 +1281,7 @@
               <w:rPr>
                 <w:noProof/>
               </w:rPr>
-              <w:instrText xml:space="preserve"> PAGEREF _Toc243488787 \h </w:instrText>
+              <w:instrText xml:space="preserve"> PAGEREF _Toc243496272 \h </w:instrText>
             </w:r>
             <w:r>
               <w:rPr>
@@ -1318,7 +1318,7 @@
               <w:noProof/>
             </w:rPr>
           </w:pPr>
-          <w:hyperlink w:anchor="_Toc243488788" w:history="1">
+          <w:hyperlink w:anchor="_Toc243496273" w:history="1">
             <w:r>
               <w:rPr>
                 <w:rStyle w:val="Collegamentoipertestuale"/>
@@ -1342,7 +1342,7 @@
               <w:rPr>
                 <w:noProof/>
               </w:rPr>
-              <w:instrText xml:space="preserve"> PAGEREF _Toc243488788 \h </w:instrText>
+              <w:instrText xml:space="preserve"> PAGEREF _Toc243496273 \h </w:instrText>
             </w:r>
             <w:r>
               <w:rPr>
@@ -1379,7 +1379,7 @@
               <w:noProof/>
             </w:rPr>
           </w:pPr>
-          <w:hyperlink w:anchor="_Toc243488789" w:history="1">
+          <w:hyperlink w:anchor="_Toc243496274" w:history="1">
             <w:r>
               <w:rPr>
                 <w:rStyle w:val="Collegamentoipertestuale"/>
@@ -1403,7 +1403,7 @@
               <w:rPr>
                 <w:noProof/>
               </w:rPr>
-              <w:instrText xml:space="preserve"> PAGEREF _Toc243488789 \h </w:instrText>
+              <w:instrText xml:space="preserve"> PAGEREF _Toc243496274 \h </w:instrText>
             </w:r>
             <w:r>
               <w:rPr>
@@ -1440,7 +1440,7 @@
               <w:noProof/>
             </w:rPr>
           </w:pPr>
-          <w:hyperlink w:anchor="_Toc243488790" w:history="1">
+          <w:hyperlink w:anchor="_Toc243496275" w:history="1">
             <w:r>
               <w:rPr>
                 <w:rStyle w:val="Collegamentoipertestuale"/>
@@ -1464,7 +1464,7 @@
               <w:rPr>
                 <w:noProof/>
               </w:rPr>
-              <w:instrText xml:space="preserve"> PAGEREF _Toc243488790 \h </w:instrText>
+              <w:instrText xml:space="preserve"> PAGEREF _Toc243496275 \h </w:instrText>
             </w:r>
             <w:r>
               <w:rPr>
@@ -1501,7 +1501,7 @@
               <w:noProof/>
             </w:rPr>
           </w:pPr>
-          <w:hyperlink w:anchor="_Toc243488791" w:history="1">
+          <w:hyperlink w:anchor="_Toc243496276" w:history="1">
             <w:r>
               <w:rPr>
                 <w:rStyle w:val="Collegamentoipertestuale"/>
@@ -1525,7 +1525,7 @@
               <w:rPr>
                 <w:noProof/>
               </w:rPr>
-              <w:instrText xml:space="preserve"> PAGEREF _Toc243488791 \h </w:instrText>
+              <w:instrText xml:space="preserve"> PAGEREF _Toc243496276 \h </w:instrText>
             </w:r>
             <w:r>
               <w:rPr>
@@ -1562,7 +1562,7 @@
               <w:noProof/>
             </w:rPr>
           </w:pPr>
-          <w:hyperlink w:anchor="_Toc243488792" w:history="1">
+          <w:hyperlink w:anchor="_Toc243496277" w:history="1">
             <w:r>
               <w:rPr>
                 <w:rStyle w:val="Collegamentoipertestuale"/>
@@ -1586,7 +1586,7 @@
               <w:rPr>
                 <w:noProof/>
               </w:rPr>
-              <w:instrText xml:space="preserve"> PAGEREF _Toc243488792 \h </w:instrText>
+              <w:instrText xml:space="preserve"> PAGEREF _Toc243496277 \h </w:instrText>
             </w:r>
             <w:r>
               <w:rPr>
@@ -1623,7 +1623,7 @@
               <w:noProof/>
             </w:rPr>
           </w:pPr>
-          <w:hyperlink w:anchor="_Toc243488793" w:history="1">
+          <w:hyperlink w:anchor="_Toc243496278" w:history="1">
             <w:r>
               <w:rPr>
                 <w:rStyle w:val="Collegamentoipertestuale"/>
@@ -1647,7 +1647,7 @@
               <w:rPr>
                 <w:noProof/>
               </w:rPr>
-              <w:instrText xml:space="preserve"> PAGEREF _Toc243488793 \h </w:instrText>
+              <w:instrText xml:space="preserve"> PAGEREF _Toc243496278 \h </w:instrText>
             </w:r>
             <w:r>
               <w:rPr>
@@ -1684,7 +1684,7 @@
               <w:noProof/>
             </w:rPr>
           </w:pPr>
-          <w:hyperlink w:anchor="_Toc243488794" w:history="1">
+          <w:hyperlink w:anchor="_Toc243496279" w:history="1">
             <w:r>
               <w:rPr>
                 <w:rStyle w:val="Collegamentoipertestuale"/>
@@ -1708,7 +1708,7 @@
               <w:rPr>
                 <w:noProof/>
               </w:rPr>
-              <w:instrText xml:space="preserve"> PAGEREF _Toc243488794 \h </w:instrText>
+              <w:instrText xml:space="preserve"> PAGEREF _Toc243496279 \h </w:instrText>
             </w:r>
             <w:r>
               <w:rPr>
@@ -1745,7 +1745,7 @@
               <w:noProof/>
             </w:rPr>
           </w:pPr>
-          <w:hyperlink w:anchor="_Toc243488795" w:history="1">
+          <w:hyperlink w:anchor="_Toc243496280" w:history="1">
             <w:r>
               <w:rPr>
                 <w:rStyle w:val="Collegamentoipertestuale"/>
@@ -1769,7 +1769,7 @@
               <w:rPr>
                 <w:noProof/>
               </w:rPr>
-              <w:instrText xml:space="preserve"> PAGEREF _Toc243488795 \h </w:instrText>
+              <w:instrText xml:space="preserve"> PAGEREF _Toc243496280 \h </w:instrText>
             </w:r>
             <w:r>
               <w:rPr>
@@ -1806,7 +1806,7 @@
               <w:noProof/>
             </w:rPr>
           </w:pPr>
-          <w:hyperlink w:anchor="_Toc243488796" w:history="1">
+          <w:hyperlink w:anchor="_Toc243496281" w:history="1">
             <w:r>
               <w:rPr>
                 <w:rStyle w:val="Collegamentoipertestuale"/>
@@ -1830,7 +1830,7 @@
               <w:rPr>
                 <w:noProof/>
               </w:rPr>
-              <w:instrText xml:space="preserve"> PAGEREF _Toc243488796 \h </w:instrText>
+              <w:instrText xml:space="preserve"> PAGEREF _Toc243496281 \h </w:instrText>
             </w:r>
             <w:r>
               <w:rPr>
@@ -1867,7 +1867,7 @@
               <w:noProof/>
             </w:rPr>
           </w:pPr>
-          <w:hyperlink w:anchor="_Toc243488797" w:history="1">
+          <w:hyperlink w:anchor="_Toc243496282" w:history="1">
             <w:r>
               <w:rPr>
                 <w:rStyle w:val="Collegamentoipertestuale"/>
@@ -1891,7 +1891,7 @@
               <w:rPr>
                 <w:noProof/>
               </w:rPr>
-              <w:instrText xml:space="preserve"> PAGEREF _Toc243488797 \h </w:instrText>
+              <w:instrText xml:space="preserve"> PAGEREF _Toc243496282 \h </w:instrText>
             </w:r>
             <w:r>
               <w:rPr>
@@ -1928,7 +1928,7 @@
               <w:noProof/>
             </w:rPr>
           </w:pPr>
-          <w:hyperlink w:anchor="_Toc243488798" w:history="1">
+          <w:hyperlink w:anchor="_Toc243496283" w:history="1">
             <w:r>
               <w:rPr>
                 <w:rStyle w:val="Collegamentoipertestuale"/>
@@ -1952,7 +1952,7 @@
               <w:rPr>
                 <w:noProof/>
               </w:rPr>
-              <w:instrText xml:space="preserve"> PAGEREF _Toc243488798 \h </w:instrText>
+              <w:instrText xml:space="preserve"> PAGEREF _Toc243496283 \h </w:instrText>
             </w:r>
             <w:r>
               <w:rPr>
@@ -1989,7 +1989,7 @@
               <w:noProof/>
             </w:rPr>
           </w:pPr>
-          <w:hyperlink w:anchor="_Toc243488799" w:history="1">
+          <w:hyperlink w:anchor="_Toc243496284" w:history="1">
             <w:r>
               <w:rPr>
                 <w:rStyle w:val="Collegamentoipertestuale"/>
@@ -2013,7 +2013,7 @@
               <w:rPr>
                 <w:noProof/>
               </w:rPr>
-              <w:instrText xml:space="preserve"> PAGEREF _Toc243488799 \h </w:instrText>
+              <w:instrText xml:space="preserve"> PAGEREF _Toc243496284 \h </w:instrText>
             </w:r>
             <w:r>
               <w:rPr>
@@ -2050,7 +2050,7 @@
               <w:noProof/>
             </w:rPr>
           </w:pPr>
-          <w:hyperlink w:anchor="_Toc243488800" w:history="1">
+          <w:hyperlink w:anchor="_Toc243496285" w:history="1">
             <w:r>
               <w:rPr>
                 <w:rStyle w:val="Collegamentoipertestuale"/>
@@ -2074,7 +2074,7 @@
               <w:rPr>
                 <w:noProof/>
               </w:rPr>
-              <w:instrText xml:space="preserve"> PAGEREF _Toc243488800 \h </w:instrText>
+              <w:instrText xml:space="preserve"> PAGEREF _Toc243496285 \h </w:instrText>
             </w:r>
             <w:r>
               <w:rPr>
@@ -2111,7 +2111,7 @@
               <w:noProof/>
             </w:rPr>
           </w:pPr>
-          <w:hyperlink w:anchor="_Toc243488801" w:history="1">
+          <w:hyperlink w:anchor="_Toc243496286" w:history="1">
             <w:r>
               <w:rPr>
                 <w:rStyle w:val="Collegamentoipertestuale"/>
@@ -2135,7 +2135,7 @@
               <w:rPr>
                 <w:noProof/>
               </w:rPr>
-              <w:instrText xml:space="preserve"> PAGEREF _Toc243488801 \h </w:instrText>
+              <w:instrText xml:space="preserve"> PAGEREF _Toc243496286 \h </w:instrText>
             </w:r>
             <w:r>
               <w:rPr>
@@ -2172,7 +2172,7 @@
               <w:noProof/>
             </w:rPr>
           </w:pPr>
-          <w:hyperlink w:anchor="_Toc243488802" w:history="1">
+          <w:hyperlink w:anchor="_Toc243496287" w:history="1">
             <w:r>
               <w:rPr>
                 <w:rStyle w:val="Collegamentoipertestuale"/>
@@ -2196,7 +2196,7 @@
               <w:rPr>
                 <w:noProof/>
               </w:rPr>
-              <w:instrText xml:space="preserve"> PAGEREF _Toc243488802 \h </w:instrText>
+              <w:instrText xml:space="preserve"> PAGEREF _Toc243496287 \h </w:instrText>
             </w:r>
             <w:r>
               <w:rPr>
@@ -2233,7 +2233,7 @@
               <w:noProof/>
             </w:rPr>
           </w:pPr>
-          <w:hyperlink w:anchor="_Toc243488803" w:history="1">
+          <w:hyperlink w:anchor="_Toc243496288" w:history="1">
             <w:r>
               <w:rPr>
                 <w:rStyle w:val="Collegamentoipertestuale"/>
@@ -2257,7 +2257,7 @@
               <w:rPr>
                 <w:noProof/>
               </w:rPr>
-              <w:instrText xml:space="preserve"> PAGEREF _Toc243488803 \h </w:instrText>
+              <w:instrText xml:space="preserve"> PAGEREF _Toc243496288 \h </w:instrText>
             </w:r>
             <w:r>
               <w:rPr>
@@ -2294,7 +2294,7 @@
               <w:noProof/>
             </w:rPr>
           </w:pPr>
-          <w:hyperlink w:anchor="_Toc243488804" w:history="1">
+          <w:hyperlink w:anchor="_Toc243496289" w:history="1">
             <w:r>
               <w:rPr>
                 <w:rStyle w:val="Collegamentoipertestuale"/>
@@ -2318,7 +2318,7 @@
               <w:rPr>
                 <w:noProof/>
               </w:rPr>
-              <w:instrText xml:space="preserve"> PAGEREF _Toc243488804 \h </w:instrText>
+              <w:instrText xml:space="preserve"> PAGEREF _Toc243496289 \h </w:instrText>
             </w:r>
             <w:r>
               <w:rPr>
@@ -2355,13 +2355,13 @@
               <w:noProof/>
             </w:rPr>
           </w:pPr>
-          <w:hyperlink w:anchor="_Toc243488805" w:history="1">
+          <w:hyperlink w:anchor="_Toc243496290" w:history="1">
             <w:r>
               <w:rPr>
                 <w:rStyle w:val="Collegamentoipertestuale"/>
                 <w:noProof/>
               </w:rPr>
-              <w:t>6.9 Ruoli</w:t>
+              <w:t>6.9 Versione 1.2.1</w:t>
             </w:r>
             <w:r>
               <w:rPr>
@@ -2379,7 +2379,68 @@
               <w:rPr>
                 <w:noProof/>
               </w:rPr>
-              <w:instrText xml:space="preserve"> PAGEREF _Toc243488805 \h </w:instrText>
+              <w:instrText xml:space="preserve"> PAGEREF _Toc243496290 \h </w:instrText>
+            </w:r>
+            <w:r>
+              <w:rPr>
+                <w:noProof/>
+              </w:rPr>
+            </w:r>
+            <w:r>
+              <w:rPr>
+                <w:noProof/>
+              </w:rPr>
+              <w:fldChar w:fldCharType="separate"/>
+            </w:r>
+            <w:r>
+              <w:rPr>
+                <w:noProof/>
+              </w:rPr>
+              <w:t>20</w:t>
+            </w:r>
+            <w:r>
+              <w:rPr>
+                <w:noProof/>
+              </w:rPr>
+              <w:fldChar w:fldCharType="end"/>
+            </w:r>
+          </w:hyperlink>
+        </w:p>
+        <w:p>
+          <w:pPr>
+            <w:pStyle w:val="Sommario2"/>
+            <w:tabs>
+              <w:tab w:val="right" w:leader="dot" w:pos="9628"/>
+            </w:tabs>
+            <w:rPr>
+              <w:noProof/>
+            </w:rPr>
+          </w:pPr>
+          <w:hyperlink w:anchor="_Toc243496291" w:history="1">
+            <w:r>
+              <w:rPr>
+                <w:rStyle w:val="Collegamentoipertestuale"/>
+                <w:noProof/>
+              </w:rPr>
+              <w:t>6.10 Ruoli</w:t>
+            </w:r>
+            <w:r>
+              <w:rPr>
+                <w:noProof/>
+              </w:rPr>
+              <w:tab/>
+            </w:r>
+            <w:r>
+              <w:rPr>
+                <w:noProof/>
+              </w:rPr>
+              <w:fldChar w:fldCharType="begin"/>
+            </w:r>
+            <w:r>
+              <w:rPr>
+                <w:noProof/>
+              </w:rPr>
+              <w:instrText xml:space="preserve"> PAGEREF _Toc243496291 \h </w:instrText>
             </w:r>
             <w:r>
               <w:rPr>
@@ -2416,7 +2477,7 @@
               <w:noProof/>
             </w:rPr>
           </w:pPr>
-          <w:hyperlink w:anchor="_Toc243488806" w:history="1">
+          <w:hyperlink w:anchor="_Toc243496292" w:history="1">
             <w:r>
               <w:rPr>
                 <w:rStyle w:val="Collegamentoipertestuale"/>
@@ -2440,7 +2501,7 @@
               <w:rPr>
                 <w:noProof/>
               </w:rPr>
-              <w:instrText xml:space="preserve"> PAGEREF _Toc243488806 \h </w:instrText>
+              <w:instrText xml:space="preserve"> PAGEREF _Toc243496292 \h </w:instrText>
             </w:r>
             <w:r>
               <w:rPr>
@@ -2477,7 +2538,7 @@
               <w:noProof/>
             </w:rPr>
           </w:pPr>
-          <w:hyperlink w:anchor="_Toc243488807" w:history="1">
+          <w:hyperlink w:anchor="_Toc243496293" w:history="1">
             <w:r>
               <w:rPr>
                 <w:rStyle w:val="Collegamentoipertestuale"/>
@@ -2501,7 +2562,7 @@
               <w:rPr>
                 <w:noProof/>
               </w:rPr>
-              <w:instrText xml:space="preserve"> PAGEREF _Toc243488807 \h </w:instrText>
+              <w:instrText xml:space="preserve"> PAGEREF _Toc243496293 \h </w:instrText>
             </w:r>
             <w:r>
               <w:rPr>
@@ -2538,7 +2599,7 @@
               <w:noProof/>
             </w:rPr>
           </w:pPr>
-          <w:hyperlink w:anchor="_Toc243488808" w:history="1">
+          <w:hyperlink w:anchor="_Toc243496294" w:history="1">
             <w:r>
               <w:rPr>
                 <w:rStyle w:val="Collegamentoipertestuale"/>
@@ -2562,7 +2623,7 @@
               <w:rPr>
                 <w:noProof/>
               </w:rPr>
-              <w:instrText xml:space="preserve"> PAGEREF _Toc243488808 \h </w:instrText>
+              <w:instrText xml:space="preserve"> PAGEREF _Toc243496294 \h </w:instrText>
             </w:r>
             <w:r>
               <w:rPr>
@@ -2605,7 +2666,7 @@
       <w:pPr>
         <w:pStyle w:val="Titolo1"/>
       </w:pPr>
-      <w:bookmarkStart w:id="0" w:name="_Toc243488769"/>
+      <w:bookmarkStart w:id="0" w:name="_Toc243496254"/>
       <w:r>
         <w:lastRenderedPageBreak/>
         <w:t>1. In breve</w:t>
@@ -2897,7 +2958,7 @@
       <w:pPr>
         <w:pStyle w:val="Titolo1"/>
       </w:pPr>
-      <w:bookmarkStart w:id="1" w:name="_Toc243488770"/>
+      <w:bookmarkStart w:id="1" w:name="_Toc243496255"/>
       <w:r>
         <w:t>2. Nuovo marchio</w:t>
       </w:r>
@@ -2907,7 +2968,7 @@
       <w:pPr>
         <w:pStyle w:val="Titolo2"/>
       </w:pPr>
-      <w:bookmarkStart w:id="2" w:name="_Toc243488771"/>
+      <w:bookmarkStart w:id="2" w:name="_Toc243496256"/>
       <w:r>
         <w:t>2.1 Nomi e identificativi</w:t>
       </w:r>
@@ -3453,7 +3514,7 @@
       <w:pPr>
         <w:pStyle w:val="Titolo2"/>
       </w:pPr>
-      <w:bookmarkStart w:id="3" w:name="_Toc243488772"/>
+      <w:bookmarkStart w:id="3" w:name="_Toc243496257"/>
       <w:r>
         <w:lastRenderedPageBreak/>
         <w:t>2.2 Colori</w:t>
@@ -3849,7 +3910,7 @@
       <w:pPr>
         <w:pStyle w:val="Titolo2"/>
       </w:pPr>
-      <w:bookmarkStart w:id="4" w:name="_Toc243488773"/>
+      <w:bookmarkStart w:id="4" w:name="_Toc243496258"/>
       <w:r>
         <w:t>2.3 Icona in uso: 17 «Foglio oro» (serie 4)</w:t>
       </w:r>
@@ -3883,7 +3944,7 @@
           <w:noProof/>
         </w:rPr>
         <w:drawing>
-          <wp:inline distT="0" distB="0" distL="0" distR="0" wp14:anchorId="581E27C5" wp14:editId="17E885EA">
+          <wp:inline distT="0" distB="0" distL="0" distR="0" wp14:anchorId="4DE6B4FC" wp14:editId="26B9F8D9">
             <wp:extent cx="5334000" cy="5895975"/>
             <wp:effectExtent l="0" t="0" r="0" b="0"/>
             <wp:docPr id="2" name="Immagine 2"/>
@@ -4304,7 +4365,7 @@
       <w:pPr>
         <w:pStyle w:val="Titolo2"/>
       </w:pPr>
-      <w:bookmarkStart w:id="5" w:name="_Toc243488774"/>
+      <w:bookmarkStart w:id="5" w:name="_Toc243496259"/>
       <w:r>
         <w:t>2.4 Serie 3, non scelta (la 11 è diventata la serie 4)</w:t>
       </w:r>
@@ -4328,7 +4389,7 @@
           <w:noProof/>
         </w:rPr>
         <w:drawing>
-          <wp:inline distT="0" distB="0" distL="0" distR="0" wp14:anchorId="4E661136" wp14:editId="3CAF2F17">
+          <wp:inline distT="0" distB="0" distL="0" distR="0" wp14:anchorId="478C5361" wp14:editId="6D679311">
             <wp:extent cx="5905500" cy="4133850"/>
             <wp:effectExtent l="0" t="0" r="0" b="0"/>
             <wp:docPr id="3" name="Immagine 3"/>
@@ -5015,7 +5076,7 @@
       <w:pPr>
         <w:pStyle w:val="Titolo2"/>
       </w:pPr>
-      <w:bookmarkStart w:id="6" w:name="_Toc243488775"/>
+      <w:bookmarkStart w:id="6" w:name="_Toc243496260"/>
       <w:r>
         <w:t>2.5 Serie 2, non scelta</w:t>
       </w:r>
@@ -5039,7 +5100,7 @@
           <w:noProof/>
         </w:rPr>
         <w:drawing>
-          <wp:inline distT="0" distB="0" distL="0" distR="0" wp14:anchorId="27AE6378" wp14:editId="682AAB76">
+          <wp:inline distT="0" distB="0" distL="0" distR="0" wp14:anchorId="3981E36B" wp14:editId="46FE5D9B">
             <wp:extent cx="5905500" cy="4133850"/>
             <wp:effectExtent l="0" t="0" r="0" b="0"/>
             <wp:docPr id="4" name="Immagine 4"/>
@@ -5760,7 +5821,7 @@
       <w:pPr>
         <w:pStyle w:val="Titolo2"/>
       </w:pPr>
-      <w:bookmarkStart w:id="7" w:name="_Toc243488776"/>
+      <w:bookmarkStart w:id="7" w:name="_Toc243496261"/>
       <w:r>
         <w:t>2.6 Serie 1, scartata</w:t>
       </w:r>
@@ -5784,7 +5845,7 @@
           <w:noProof/>
         </w:rPr>
         <w:drawing>
-          <wp:inline distT="0" distB="0" distL="0" distR="0" wp14:anchorId="4800C8E6" wp14:editId="61280322">
+          <wp:inline distT="0" distB="0" distL="0" distR="0" wp14:anchorId="2759E611" wp14:editId="3EDBDD16">
             <wp:extent cx="4000500" cy="2800350"/>
             <wp:effectExtent l="0" t="0" r="0" b="0"/>
             <wp:docPr id="5" name="Immagine 5"/>
@@ -5843,7 +5904,7 @@
       <w:pPr>
         <w:pStyle w:val="Titolo2"/>
       </w:pPr>
-      <w:bookmarkStart w:id="8" w:name="_Toc243488777"/>
+      <w:bookmarkStart w:id="8" w:name="_Toc243496262"/>
       <w:r>
         <w:t>2.7 Verifica dei marchi registrati</w:t>
       </w:r>
@@ -6095,7 +6156,7 @@
       <w:pPr>
         <w:pStyle w:val="Titolo1"/>
       </w:pPr>
-      <w:bookmarkStart w:id="9" w:name="_Toc243488778"/>
+      <w:bookmarkStart w:id="9" w:name="_Toc243496263"/>
       <w:r>
         <w:t>3. Temi colore</w:t>
       </w:r>
@@ -6130,7 +6191,7 @@
         </w:rPr>
         <w:lastRenderedPageBreak/>
         <w:drawing>
-          <wp:inline distT="0" distB="0" distL="0" distR="0" wp14:anchorId="570D188D" wp14:editId="2C73B3F6">
+          <wp:inline distT="0" distB="0" distL="0" distR="0" wp14:anchorId="13BD76B4" wp14:editId="667F8578">
             <wp:extent cx="4572000" cy="3429000"/>
             <wp:effectExtent l="0" t="0" r="0" b="0"/>
             <wp:docPr id="6" name="Immagine 6"/>
@@ -6840,7 +6901,7 @@
       <w:pPr>
         <w:pStyle w:val="Titolo1"/>
       </w:pPr>
-      <w:bookmarkStart w:id="10" w:name="_Toc243488779"/>
+      <w:bookmarkStart w:id="10" w:name="_Toc243496264"/>
       <w:r>
         <w:t>4. Correzione: avvisi «come JavaScript»</w:t>
       </w:r>
@@ -6850,7 +6911,7 @@
       <w:pPr>
         <w:pStyle w:val="Titolo2"/>
       </w:pPr>
-      <w:bookmarkStart w:id="11" w:name="_Toc243488780"/>
+      <w:bookmarkStart w:id="11" w:name="_Toc243496265"/>
       <w:r>
         <w:t>4.1 Il problema</w:t>
       </w:r>
@@ -7253,7 +7314,7 @@
       <w:pPr>
         <w:pStyle w:val="Titolo2"/>
       </w:pPr>
-      <w:bookmarkStart w:id="12" w:name="_Toc243488781"/>
+      <w:bookmarkStart w:id="12" w:name="_Toc243496266"/>
       <w:r>
         <w:t>4.2 La soluzione</w:t>
       </w:r>
@@ -7386,7 +7447,7 @@
           <w:noProof/>
         </w:rPr>
         <w:drawing>
-          <wp:inline distT="0" distB="0" distL="0" distR="0" wp14:anchorId="6DCBBCEE" wp14:editId="3C1BEB20">
+          <wp:inline distT="0" distB="0" distL="0" distR="0" wp14:anchorId="453041A2" wp14:editId="6752B30C">
             <wp:extent cx="4572000" cy="3429000"/>
             <wp:effectExtent l="0" t="0" r="0" b="0"/>
             <wp:docPr id="7" name="Immagine 7"/>
@@ -7445,7 +7506,7 @@
       <w:pPr>
         <w:pStyle w:val="Titolo2"/>
       </w:pPr>
-      <w:bookmarkStart w:id="13" w:name="_Toc243488782"/>
+      <w:bookmarkStart w:id="13" w:name="_Toc243496267"/>
       <w:r>
         <w:t>4.3 Verifiche</w:t>
       </w:r>
@@ -7492,7 +7553,7 @@
       <w:pPr>
         <w:pStyle w:val="Titolo2"/>
       </w:pPr>
-      <w:bookmarkStart w:id="14" w:name="_Toc243488783"/>
+      <w:bookmarkStart w:id="14" w:name="_Toc243496268"/>
       <w:r>
         <w:t>4.4 Android: menu Tema e notifiche (versione 1.0.1)</w:t>
       </w:r>
@@ -7828,7 +7889,7 @@
       <w:pPr>
         <w:pStyle w:val="Titolo2"/>
       </w:pPr>
-      <w:bookmarkStart w:id="15" w:name="_Toc243488784"/>
+      <w:bookmarkStart w:id="15" w:name="_Toc243496269"/>
       <w:r>
         <w:t>4.5 App più leggera: traduzione tolta</w:t>
       </w:r>
@@ -8261,7 +8322,7 @@
       <w:pPr>
         <w:pStyle w:val="Titolo2"/>
       </w:pPr>
-      <w:bookmarkStart w:id="16" w:name="_Toc243488785"/>
+      <w:bookmarkStart w:id="16" w:name="_Toc243496270"/>
       <w:r>
         <w:t>4.6 Schede in una nuova finestra</w:t>
       </w:r>
@@ -8379,7 +8440,7 @@
           <w:noProof/>
         </w:rPr>
         <w:drawing>
-          <wp:inline distT="0" distB="0" distL="0" distR="0" wp14:anchorId="1617FD6C" wp14:editId="3161E70F">
+          <wp:inline distT="0" distB="0" distL="0" distR="0" wp14:anchorId="6AABD356" wp14:editId="5CD76D5F">
             <wp:extent cx="5715000" cy="857250"/>
             <wp:effectExtent l="0" t="0" r="0" b="0"/>
             <wp:docPr id="8" name="Immagine 8"/>
@@ -8669,7 +8730,7 @@
       <w:pPr>
         <w:pStyle w:val="Titolo2"/>
       </w:pPr>
-      <w:bookmarkStart w:id="17" w:name="_Toc243488786"/>
+      <w:bookmarkStart w:id="17" w:name="_Toc243496271"/>
       <w:r>
         <w:t>4.7 Riunire le finestre</w:t>
       </w:r>
@@ -8754,9 +8815,24 @@
     </w:p>
     <w:p>
       <w:pPr>
+        <w:spacing w:after="120"/>
+      </w:pPr>
+      <w:r>
+        <w:rPr>
+          <w:b/>
+          <w:bCs/>
+        </w:rPr>
+        <w:t>Correzione nella 1.2.1</w:t>
+      </w:r>
+      <w:r>
+        <w:t>: trascinata in un'altra finestra la sua ultima scheda, a volte la finestra di partenza restava aperta. Con il mouse gli avvisi fra le due finestre (rilascio, fine del trascinamento) possono arrivare in ordine diverso: ora il biglietto resta valido qualche secondo, la finestra di arrivo accetta la scheda anche se il trascinamento risulta già finito e la finestra di partenza si chiude appena cede l'ultima scheda. Provato con l'app desktop vera in tre ordini di eventi.</w:t>
+      </w:r>
+    </w:p>
+    <w:p>
+      <w:pPr>
         <w:pStyle w:val="Titolo2"/>
       </w:pPr>
-      <w:bookmarkStart w:id="18" w:name="_Toc243488787"/>
+      <w:bookmarkStart w:id="18" w:name="_Toc243496272"/>
       <w:r>
         <w:t>4.8 Correzioni di «Modifica testo»</w:t>
       </w:r>
@@ -9022,7 +9098,7 @@
         </w:rPr>
         <w:lastRenderedPageBreak/>
         <w:drawing>
-          <wp:inline distT="0" distB="0" distL="0" distR="0" wp14:anchorId="13EA0797" wp14:editId="1431D6DE">
+          <wp:inline distT="0" distB="0" distL="0" distR="0" wp14:anchorId="4F8BBB44" wp14:editId="3E9BECCE">
             <wp:extent cx="3286125" cy="2286000"/>
             <wp:effectExtent l="0" t="0" r="0" b="0"/>
             <wp:docPr id="9" name="Immagine 9"/>
@@ -9087,7 +9163,7 @@
           <w:noProof/>
         </w:rPr>
         <w:drawing>
-          <wp:inline distT="0" distB="0" distL="0" distR="0" wp14:anchorId="570CC02A" wp14:editId="1F34E9F8">
+          <wp:inline distT="0" distB="0" distL="0" distR="0" wp14:anchorId="7ED87126" wp14:editId="5079C899">
             <wp:extent cx="3286125" cy="2286000"/>
             <wp:effectExtent l="0" t="0" r="0" b="0"/>
             <wp:docPr id="10" name="Immagine 10"/>
@@ -9154,7 +9230,7 @@
       <w:pPr>
         <w:pStyle w:val="Titolo1"/>
       </w:pPr>
-      <w:bookmarkStart w:id="19" w:name="_Toc243488788"/>
+      <w:bookmarkStart w:id="19" w:name="_Toc243496273"/>
       <w:r>
         <w:t>5. Decisioni</w:t>
       </w:r>
@@ -9172,7 +9248,7 @@
       <w:pPr>
         <w:pStyle w:val="Titolo2"/>
       </w:pPr>
-      <w:bookmarkStart w:id="20" w:name="_Toc243488789"/>
+      <w:bookmarkStart w:id="20" w:name="_Toc243496274"/>
       <w:r>
         <w:t>5.1 Canale degli aggiornamenti</w:t>
       </w:r>
@@ -9680,7 +9756,7 @@
       <w:pPr>
         <w:pStyle w:val="Titolo2"/>
       </w:pPr>
-      <w:bookmarkStart w:id="21" w:name="_Toc243488790"/>
+      <w:bookmarkStart w:id="21" w:name="_Toc243496275"/>
       <w:r>
         <w:t>5.2 Storia del repository</w:t>
       </w:r>
@@ -10187,7 +10263,7 @@
       <w:pPr>
         <w:pStyle w:val="Titolo2"/>
       </w:pPr>
-      <w:bookmarkStart w:id="22" w:name="_Toc243488791"/>
+      <w:bookmarkStart w:id="22" w:name="_Toc243496276"/>
       <w:r>
         <w:t>5.3 Identificativi del prodotto</w:t>
       </w:r>
@@ -10687,7 +10763,7 @@
       <w:pPr>
         <w:pStyle w:val="Titolo2"/>
       </w:pPr>
-      <w:bookmarkStart w:id="23" w:name="_Toc243488792"/>
+      <w:bookmarkStart w:id="23" w:name="_Toc243496277"/>
       <w:r>
         <w:lastRenderedPageBreak/>
         <w:t>5.4 Avvisi e domande</w:t>
@@ -11195,7 +11271,7 @@
       <w:pPr>
         <w:pStyle w:val="Titolo2"/>
       </w:pPr>
-      <w:bookmarkStart w:id="24" w:name="_Toc243488793"/>
+      <w:bookmarkStart w:id="24" w:name="_Toc243496278"/>
       <w:r>
         <w:t>5.5 Traduzione offline</w:t>
       </w:r>
@@ -11702,7 +11778,7 @@
       <w:pPr>
         <w:pStyle w:val="Titolo2"/>
       </w:pPr>
-      <w:bookmarkStart w:id="25" w:name="_Toc243488794"/>
+      <w:bookmarkStart w:id="25" w:name="_Toc243496279"/>
       <w:r>
         <w:t>5.6 Passaggio della scheda alla nuova finestra</w:t>
       </w:r>
@@ -12224,7 +12300,7 @@
       <w:pPr>
         <w:pStyle w:val="Titolo2"/>
       </w:pPr>
-      <w:bookmarkStart w:id="26" w:name="_Toc243488795"/>
+      <w:bookmarkStart w:id="26" w:name="_Toc243496280"/>
       <w:r>
         <w:t>5.7 Come si cancella la riga in «Modifica testo»</w:t>
       </w:r>
@@ -12731,7 +12807,7 @@
       <w:pPr>
         <w:pStyle w:val="Titolo1"/>
       </w:pPr>
-      <w:bookmarkStart w:id="27" w:name="_Toc243488796"/>
+      <w:bookmarkStart w:id="27" w:name="_Toc243496281"/>
       <w:r>
         <w:t>6. Come si lavora</w:t>
       </w:r>
@@ -12741,7 +12817,7 @@
       <w:pPr>
         <w:pStyle w:val="Titolo2"/>
       </w:pPr>
-      <w:bookmarkStart w:id="28" w:name="_Toc243488797"/>
+      <w:bookmarkStart w:id="28" w:name="_Toc243496282"/>
       <w:r>
         <w:t>6.1 Comandi</w:t>
       </w:r>
@@ -12811,7 +12887,7 @@
       <w:pPr>
         <w:pStyle w:val="Titolo2"/>
       </w:pPr>
-      <w:bookmarkStart w:id="29" w:name="_Toc243488798"/>
+      <w:bookmarkStart w:id="29" w:name="_Toc243496283"/>
       <w:r>
         <w:t>6.2 Pubblicare una versione</w:t>
       </w:r>
@@ -12940,7 +13016,7 @@
       <w:pPr>
         <w:pStyle w:val="Titolo2"/>
       </w:pPr>
-      <w:bookmarkStart w:id="30" w:name="_Toc243488799"/>
+      <w:bookmarkStart w:id="30" w:name="_Toc243496284"/>
       <w:r>
         <w:t>6.3 Release 1.0.0 (pubblicata il 16 ottobre 2026)</w:t>
       </w:r>
@@ -13667,7 +13743,7 @@
       <w:pPr>
         <w:pStyle w:val="Titolo2"/>
       </w:pPr>
-      <w:bookmarkStart w:id="31" w:name="_Toc243488800"/>
+      <w:bookmarkStart w:id="31" w:name="_Toc243496285"/>
       <w:r>
         <w:t>6.4 Release 1.0.1</w:t>
       </w:r>
@@ -13964,7 +14040,7 @@
       <w:pPr>
         <w:pStyle w:val="Titolo2"/>
       </w:pPr>
-      <w:bookmarkStart w:id="32" w:name="_Toc243488801"/>
+      <w:bookmarkStart w:id="32" w:name="_Toc243496286"/>
       <w:r>
         <w:lastRenderedPageBreak/>
         <w:t>6.5 Release 1.0.2 e repository pubblico</w:t>
@@ -14387,7 +14463,7 @@
       <w:pPr>
         <w:pStyle w:val="Titolo2"/>
       </w:pPr>
-      <w:bookmarkStart w:id="33" w:name="_Toc243488802"/>
+      <w:bookmarkStart w:id="33" w:name="_Toc243496287"/>
       <w:r>
         <w:t>6.6 Nuova versione: link diretto per ogni sistema</w:t>
       </w:r>
@@ -14805,7 +14881,7 @@
         </w:rPr>
         <w:lastRenderedPageBreak/>
         <w:drawing>
-          <wp:inline distT="0" distB="0" distL="0" distR="0" wp14:anchorId="4C009959" wp14:editId="4E07C565">
+          <wp:inline distT="0" distB="0" distL="0" distR="0" wp14:anchorId="6B1170EB" wp14:editId="1725D153">
             <wp:extent cx="4572000" cy="4429125"/>
             <wp:effectExtent l="0" t="0" r="0" b="0"/>
             <wp:docPr id="11" name="Immagine 11"/>
@@ -14880,7 +14956,7 @@
       <w:pPr>
         <w:pStyle w:val="Titolo2"/>
       </w:pPr>
-      <w:bookmarkStart w:id="34" w:name="_Toc243488803"/>
+      <w:bookmarkStart w:id="34" w:name="_Toc243496288"/>
       <w:r>
         <w:t>6.7 Release 1.1.0</w:t>
       </w:r>
@@ -15444,7 +15520,7 @@
       <w:pPr>
         <w:pStyle w:val="Titolo2"/>
       </w:pPr>
-      <w:bookmarkStart w:id="35" w:name="_Toc243488804"/>
+      <w:bookmarkStart w:id="35" w:name="_Toc243496289"/>
       <w:r>
         <w:lastRenderedPageBreak/>
         <w:t>6.8 Versione 1.2.0</w:t>
@@ -15994,11 +16070,40 @@
       <w:pPr>
         <w:pStyle w:val="Titolo2"/>
       </w:pPr>
-      <w:bookmarkStart w:id="36" w:name="_Toc243488805"/>
-      <w:r>
-        <w:t>6.9 Ruoli</w:t>
+      <w:bookmarkStart w:id="36" w:name="_Toc243496290"/>
+      <w:r>
+        <w:t>6.9 Versione 1.2.1</w:t>
       </w:r>
       <w:bookmarkEnd w:id="36"/>
+    </w:p>
+    <w:p>
+      <w:pPr>
+        <w:spacing w:after="120"/>
+      </w:pPr>
+      <w:r>
+        <w:t xml:space="preserve">Preparata il 21 ottobre 2026 con la sola correzione della chiusura della finestra rimasta vuota (vedi 4.7): installer Windows 101.2.1, Android 1001002001. Pubblicazione con il tag </w:t>
+      </w:r>
+      <w:r>
+        <w:rPr>
+          <w:rFonts w:ascii="Consolas" w:eastAsia="Consolas" w:hAnsi="Consolas" w:cs="Consolas"/>
+          <w:sz w:val="19"/>
+          <w:szCs w:val="19"/>
+        </w:rPr>
+        <w:t>v1.2.1</w:t>
+      </w:r>
+      <w:r>
+        <w:t>.</w:t>
+      </w:r>
+    </w:p>
+    <w:p>
+      <w:pPr>
+        <w:pStyle w:val="Titolo2"/>
+      </w:pPr>
+      <w:bookmarkStart w:id="37" w:name="_Toc243496291"/>
+      <w:r>
+        <w:t>6.10 Ruoli</w:t>
+      </w:r>
+      <w:bookmarkEnd w:id="37"/>
     </w:p>
     <w:tbl>
       <w:tblPr>
@@ -16267,11 +16372,11 @@
       <w:pPr>
         <w:pStyle w:val="Titolo1"/>
       </w:pPr>
-      <w:bookmarkStart w:id="37" w:name="_Toc243488806"/>
+      <w:bookmarkStart w:id="38" w:name="_Toc243496292"/>
       <w:r>
         <w:t>7. Sicurezza</w:t>
       </w:r>
-      <w:bookmarkEnd w:id="37"/>
+      <w:bookmarkEnd w:id="38"/>
     </w:p>
     <w:p>
       <w:pPr>
@@ -16566,12 +16671,12 @@
       <w:pPr>
         <w:pStyle w:val="Titolo1"/>
       </w:pPr>
-      <w:bookmarkStart w:id="38" w:name="_Toc243488807"/>
+      <w:bookmarkStart w:id="39" w:name="_Toc243496293"/>
       <w:r>
         <w:lastRenderedPageBreak/>
         <w:t>8. Punti aperti</w:t>
       </w:r>
-      <w:bookmarkEnd w:id="38"/>
+      <w:bookmarkEnd w:id="39"/>
     </w:p>
     <w:p>
       <w:pPr>
@@ -16754,11 +16859,11 @@
       <w:pPr>
         <w:pStyle w:val="Titolo1"/>
       </w:pPr>
-      <w:bookmarkStart w:id="39" w:name="_Toc243488808"/>
+      <w:bookmarkStart w:id="40" w:name="_Toc243496294"/>
       <w:r>
         <w:t>9. Pensato per i prossimi 10 anni</w:t>
       </w:r>
-      <w:bookmarkEnd w:id="39"/>
+      <w:bookmarkEnd w:id="40"/>
     </w:p>
     <w:p>
       <w:pPr>
@@ -17032,10 +17137,10 @@
 <file path=word/numbering.xml><?xml version="1.0" encoding="utf-8"?>
 <w:numbering xmlns:wpc="http://schemas.microsoft.com/office/word/2010/wordprocessingCanvas" xmlns:cx="http://schemas.microsoft.com/office/drawing/2014/chartex" xmlns:cx1="http://schemas.microsoft.com/office/drawing/2015/9/8/chartex" xmlns:cx2="http://schemas.microsoft.com/office/drawing/2015/10/21/chartex" xmlns:cx3="http://schemas.microsoft.com/office/drawing/2016/5/9/chartex" xmlns:cx4="http://schemas.microsoft.com/office/drawing/2016/5/10/chartex" xmlns:cx5="http://schemas.microsoft.com/office/drawing/2016/5/11/chartex" xmlns:cx6="http://schemas.microsoft.com/office/drawing/2016/5/12/chartex" xmlns:cx7="http://schemas.microsoft.com/office/drawing/2016/5/13/chartex" xmlns:cx8="http://schemas.microsoft.com/office/drawing/2016/5/14/chartex" xmlns:mc="http://schemas.openxmlformats.org/markup-compatibility/2006" xmlns:aink="http://schemas.microsoft.com/office/drawing/2016/ink" xmlns:am3d="http://schemas.microsoft.com/office/drawing/2017/model3d" xmlns:o="urn:schemas-microsoft-com:office:office" xmlns:oel="http://schemas.microsoft.com/office/2019/extlst" xmlns:r="http://schemas.openxmlformats.org/officeDocument/2006/relationships" xmlns:m="http://schemas.openxmlformats.org/officeDocument/2006/math" xmlns:v="urn:schemas-microsoft-com:vml" xmlns:wp14="http://schemas.microsoft.com/office/word/2010/wordprocessingDrawing" xmlns:wp="http://schemas.openxmlformats.org/drawingml/2006/wordprocessingDrawing" xmlns:w10="urn:schemas-microsoft-com:office:word" xmlns:w="http://schemas.openxmlformats.org/wordprocessingml/2006/main" xmlns:w14="http://schemas.microsoft.com/office/word/2010/wordml" xmlns:w15="http://schemas.microsoft.com/office/word/2012/wordml" xmlns:w16cex="http://schemas.microsoft.com/office/word/2018/wordml/cex" xmlns:w16cid="http://schemas.microsoft.com/office/word/2016/wordml/cid" xmlns:w16="http://schemas.microsoft.com/office/word/2018/wordml" xmlns:w16du="http://schemas.microsoft.com/office/word/2023/wordml/word16du" xmlns:w16sdtdh="http://schemas.microsoft.com/office/word/2020/wordml/sdtdatahash" xmlns:w16sdtfl="http://schemas.microsoft.com/office/word/2024/wordml/sdtformatlock" xmlns:w16se="http://schemas.microsoft.com/office/word/2015/wordml/symex" xmlns:wpg="http://schemas.microsoft.com/office/word/2010/wordprocessingGroup" xmlns:wpi="http://schemas.microsoft.com/office/word/2010/wordprocessingInk" xmlns:wne="http://schemas.microsoft.com/office/word/2006/wordml" xmlns:wps="http://schemas.microsoft.com/office/word/2010/wordprocessingShape" mc:Ignorable="w14 w15 w16se w16cid w16 w16cex w16sdtdh w16sdtfl w16du wp14">
   <w:abstractNum w:abstractNumId="0" w15:restartNumberingAfterBreak="0">
-    <w:nsid w:val="07905F45"/>
+    <w:nsid w:val="19BD2FBC"/>
     <w:multiLevelType w:val="hybridMultilevel"/>
-    <w:tmpl w:val="2C84108A"/>
-    <w:lvl w:ilvl="0" w:tplc="C8641D2A">
+    <w:tmpl w:val="0C08CAD8"/>
+    <w:lvl w:ilvl="0" w:tplc="662E64EC">
       <w:start w:val="1"/>
       <w:numFmt w:val="bullet"/>
       <w:lvlText w:val="•"/>
@@ -17044,138 +17149,52 @@
         <w:ind w:left="540" w:hanging="270"/>
       </w:pPr>
     </w:lvl>
-    <w:lvl w:ilvl="1" w:tplc="20E42982">
+    <w:lvl w:ilvl="1" w:tplc="4CD4F988">
       <w:numFmt w:val="decimal"/>
       <w:lvlText w:val=""/>
       <w:lvlJc w:val="left"/>
     </w:lvl>
-    <w:lvl w:ilvl="2" w:tplc="DDA00468">
+    <w:lvl w:ilvl="2" w:tplc="99144428">
       <w:numFmt w:val="decimal"/>
       <w:lvlText w:val=""/>
       <w:lvlJc w:val="left"/>
     </w:lvl>
-    <w:lvl w:ilvl="3" w:tplc="7D269DDA">
+    <w:lvl w:ilvl="3" w:tplc="42008188">
       <w:numFmt w:val="decimal"/>
       <w:lvlText w:val=""/>
       <w:lvlJc w:val="left"/>
     </w:lvl>
-    <w:lvl w:ilvl="4" w:tplc="40BA804A">
+    <w:lvl w:ilvl="4" w:tplc="ADB45746">
       <w:numFmt w:val="decimal"/>
       <w:lvlText w:val=""/>
       <w:lvlJc w:val="left"/>
     </w:lvl>
-    <w:lvl w:ilvl="5" w:tplc="0DA610E6">
+    <w:lvl w:ilvl="5" w:tplc="AAE22A7A">
       <w:numFmt w:val="decimal"/>
       <w:lvlText w:val=""/>
       <w:lvlJc w:val="left"/>
     </w:lvl>
-    <w:lvl w:ilvl="6" w:tplc="B374F638">
+    <w:lvl w:ilvl="6" w:tplc="01BE126A">
       <w:numFmt w:val="decimal"/>
       <w:lvlText w:val=""/>
       <w:lvlJc w:val="left"/>
     </w:lvl>
-    <w:lvl w:ilvl="7" w:tplc="84A2E072">
+    <w:lvl w:ilvl="7" w:tplc="B99418F8">
       <w:numFmt w:val="decimal"/>
       <w:lvlText w:val=""/>
       <w:lvlJc w:val="left"/>
     </w:lvl>
-    <w:lvl w:ilvl="8" w:tplc="F5F42856">
+    <w:lvl w:ilvl="8" w:tplc="62FA87FA">
       <w:numFmt w:val="decimal"/>
       <w:lvlText w:val=""/>
       <w:lvlJc w:val="left"/>
     </w:lvl>
   </w:abstractNum>
   <w:abstractNum w:abstractNumId="1" w15:restartNumberingAfterBreak="0">
-    <w:nsid w:val="12AD3614"/>
+    <w:nsid w:val="45A467AE"/>
     <w:multiLevelType w:val="hybridMultilevel"/>
-    <w:tmpl w:val="EAB4B318"/>
-    <w:lvl w:ilvl="0" w:tplc="30D6D214" w:tentative="1">
-      <w:start w:val="1"/>
-      <w:numFmt w:val="bullet"/>
-      <w:lvlText w:val="●"/>
-      <w:lvlJc w:val="left"/>
-      <w:pPr>
-        <w:ind w:left="720" w:hanging="360"/>
-      </w:pPr>
-    </w:lvl>
-    <w:lvl w:ilvl="1" w:tplc="D9AC3666" w:tentative="1">
-      <w:start w:val="1"/>
-      <w:numFmt w:val="bullet"/>
-      <w:lvlText w:val="○"/>
-      <w:lvlJc w:val="left"/>
-      <w:pPr>
-        <w:ind w:left="1440" w:hanging="360"/>
-      </w:pPr>
-    </w:lvl>
-    <w:lvl w:ilvl="2" w:tplc="355469B6" w:tentative="1">
-      <w:start w:val="1"/>
-      <w:numFmt w:val="bullet"/>
-      <w:lvlText w:val="■"/>
-      <w:lvlJc w:val="left"/>
-      <w:pPr>
-        <w:ind w:left="2160" w:hanging="360"/>
-      </w:pPr>
-    </w:lvl>
-    <w:lvl w:ilvl="3" w:tplc="DF7AE57E" w:tentative="1">
-      <w:start w:val="1"/>
-      <w:numFmt w:val="bullet"/>
-      <w:lvlText w:val="●"/>
-      <w:lvlJc w:val="left"/>
-      <w:pPr>
-        <w:ind w:left="2880" w:hanging="360"/>
-      </w:pPr>
-    </w:lvl>
-    <w:lvl w:ilvl="4" w:tplc="A17A5910" w:tentative="1">
-      <w:start w:val="1"/>
-      <w:numFmt w:val="bullet"/>
-      <w:lvlText w:val="○"/>
-      <w:lvlJc w:val="left"/>
-      <w:pPr>
-        <w:ind w:left="3600" w:hanging="360"/>
-      </w:pPr>
-    </w:lvl>
-    <w:lvl w:ilvl="5" w:tplc="3D264052" w:tentative="1">
-      <w:start w:val="1"/>
-      <w:numFmt w:val="bullet"/>
-      <w:lvlText w:val="■"/>
-      <w:lvlJc w:val="left"/>
-      <w:pPr>
-        <w:ind w:left="4320" w:hanging="360"/>
-      </w:pPr>
-    </w:lvl>
-    <w:lvl w:ilvl="6" w:tplc="DF4270D2" w:tentative="1">
-      <w:start w:val="1"/>
-      <w:numFmt w:val="bullet"/>
-      <w:lvlText w:val="●"/>
-      <w:lvlJc w:val="left"/>
-      <w:pPr>
-        <w:ind w:left="5040" w:hanging="360"/>
-      </w:pPr>
-    </w:lvl>
-    <w:lvl w:ilvl="7" w:tplc="969A33D0" w:tentative="1">
-      <w:start w:val="1"/>
-      <w:numFmt w:val="bullet"/>
-      <w:lvlText w:val="●"/>
-      <w:lvlJc w:val="left"/>
-      <w:pPr>
-        <w:ind w:left="5760" w:hanging="360"/>
-      </w:pPr>
-    </w:lvl>
-    <w:lvl w:ilvl="8" w:tplc="4110554A" w:tentative="1">
-      <w:start w:val="1"/>
-      <w:numFmt w:val="bullet"/>
-      <w:lvlText w:val="●"/>
-      <w:lvlJc w:val="left"/>
-      <w:pPr>
-        <w:ind w:left="6480" w:hanging="360"/>
-      </w:pPr>
-    </w:lvl>
-  </w:abstractNum>
-  <w:abstractNum w:abstractNumId="2" w15:restartNumberingAfterBreak="0">
-    <w:nsid w:val="195D44EB"/>
-    <w:multiLevelType w:val="hybridMultilevel"/>
-    <w:tmpl w:val="6B08A78C"/>
-    <w:lvl w:ilvl="0" w:tplc="57C816E8">
+    <w:tmpl w:val="B4F4719C"/>
+    <w:lvl w:ilvl="0" w:tplc="CC30C2D6">
       <w:start w:val="1"/>
       <w:numFmt w:val="decimal"/>
       <w:lvlText w:val="%1."/>
@@ -17184,120 +17203,206 @@
         <w:ind w:left="540" w:hanging="300"/>
       </w:pPr>
     </w:lvl>
-    <w:lvl w:ilvl="1" w:tplc="4B0C7534">
+    <w:lvl w:ilvl="1" w:tplc="2A92888A">
       <w:numFmt w:val="decimal"/>
       <w:lvlText w:val=""/>
       <w:lvlJc w:val="left"/>
     </w:lvl>
-    <w:lvl w:ilvl="2" w:tplc="CA48DC96">
+    <w:lvl w:ilvl="2" w:tplc="9F088CCC">
       <w:numFmt w:val="decimal"/>
       <w:lvlText w:val=""/>
       <w:lvlJc w:val="left"/>
     </w:lvl>
-    <w:lvl w:ilvl="3" w:tplc="FAAAF3EE">
+    <w:lvl w:ilvl="3" w:tplc="D140102C">
       <w:numFmt w:val="decimal"/>
       <w:lvlText w:val=""/>
       <w:lvlJc w:val="left"/>
     </w:lvl>
-    <w:lvl w:ilvl="4" w:tplc="7AFC8390">
+    <w:lvl w:ilvl="4" w:tplc="B692B210">
       <w:numFmt w:val="decimal"/>
       <w:lvlText w:val=""/>
       <w:lvlJc w:val="left"/>
     </w:lvl>
-    <w:lvl w:ilvl="5" w:tplc="A88C9DC6">
+    <w:lvl w:ilvl="5" w:tplc="A85C5C88">
       <w:numFmt w:val="decimal"/>
       <w:lvlText w:val=""/>
       <w:lvlJc w:val="left"/>
     </w:lvl>
-    <w:lvl w:ilvl="6" w:tplc="3A400C66">
+    <w:lvl w:ilvl="6" w:tplc="4B206C96">
       <w:numFmt w:val="decimal"/>
       <w:lvlText w:val=""/>
       <w:lvlJc w:val="left"/>
     </w:lvl>
-    <w:lvl w:ilvl="7" w:tplc="0BA4D6BA">
+    <w:lvl w:ilvl="7" w:tplc="208AB0D8">
       <w:numFmt w:val="decimal"/>
       <w:lvlText w:val=""/>
       <w:lvlJc w:val="left"/>
     </w:lvl>
-    <w:lvl w:ilvl="8" w:tplc="2B8040C8">
+    <w:lvl w:ilvl="8" w:tplc="F510FEA4">
+      <w:numFmt w:val="decimal"/>
+      <w:lvlText w:val=""/>
+      <w:lvlJc w:val="left"/>
+    </w:lvl>
+  </w:abstractNum>
+  <w:abstractNum w:abstractNumId="2" w15:restartNumberingAfterBreak="0">
+    <w:nsid w:val="502E4DC0"/>
+    <w:multiLevelType w:val="hybridMultilevel"/>
+    <w:tmpl w:val="2C74D37E"/>
+    <w:lvl w:ilvl="0" w:tplc="16982042">
+      <w:start w:val="1"/>
+      <w:numFmt w:val="decimal"/>
+      <w:lvlText w:val="%1."/>
+      <w:lvlJc w:val="left"/>
+      <w:pPr>
+        <w:ind w:left="540" w:hanging="300"/>
+      </w:pPr>
+    </w:lvl>
+    <w:lvl w:ilvl="1" w:tplc="DB2CD8C8">
+      <w:numFmt w:val="decimal"/>
+      <w:lvlText w:val=""/>
+      <w:lvlJc w:val="left"/>
+    </w:lvl>
+    <w:lvl w:ilvl="2" w:tplc="1152D5B4">
+      <w:numFmt w:val="decimal"/>
+      <w:lvlText w:val=""/>
+      <w:lvlJc w:val="left"/>
+    </w:lvl>
+    <w:lvl w:ilvl="3" w:tplc="0CB002E0">
+      <w:numFmt w:val="decimal"/>
+      <w:lvlText w:val=""/>
+      <w:lvlJc w:val="left"/>
+    </w:lvl>
+    <w:lvl w:ilvl="4" w:tplc="B81A5C30">
+      <w:numFmt w:val="decimal"/>
+      <w:lvlText w:val=""/>
+      <w:lvlJc w:val="left"/>
+    </w:lvl>
+    <w:lvl w:ilvl="5" w:tplc="317CD684">
+      <w:numFmt w:val="decimal"/>
+      <w:lvlText w:val=""/>
+      <w:lvlJc w:val="left"/>
+    </w:lvl>
+    <w:lvl w:ilvl="6" w:tplc="FE7EED88">
+      <w:numFmt w:val="decimal"/>
+      <w:lvlText w:val=""/>
+      <w:lvlJc w:val="left"/>
+    </w:lvl>
+    <w:lvl w:ilvl="7" w:tplc="FE8CD74A">
+      <w:numFmt w:val="decimal"/>
+      <w:lvlText w:val=""/>
+      <w:lvlJc w:val="left"/>
+    </w:lvl>
+    <w:lvl w:ilvl="8" w:tplc="B314A7E2">
       <w:numFmt w:val="decimal"/>
       <w:lvlText w:val=""/>
       <w:lvlJc w:val="left"/>
     </w:lvl>
   </w:abstractNum>
   <w:abstractNum w:abstractNumId="3" w15:restartNumberingAfterBreak="0">
-    <w:nsid w:val="685373F6"/>
+    <w:nsid w:val="58800124"/>
     <w:multiLevelType w:val="hybridMultilevel"/>
-    <w:tmpl w:val="E062A36C"/>
-    <w:lvl w:ilvl="0" w:tplc="041AC83C">
+    <w:tmpl w:val="014E5246"/>
+    <w:lvl w:ilvl="0" w:tplc="E05E13C4" w:tentative="1">
       <w:start w:val="1"/>
-      <w:numFmt w:val="decimal"/>
-      <w:lvlText w:val="%1."/>
+      <w:numFmt w:val="bullet"/>
+      <w:lvlText w:val="●"/>
       <w:lvlJc w:val="left"/>
       <w:pPr>
-        <w:ind w:left="540" w:hanging="300"/>
+        <w:ind w:left="720" w:hanging="360"/>
       </w:pPr>
     </w:lvl>
-    <w:lvl w:ilvl="1" w:tplc="5BD8CCD0">
-      <w:numFmt w:val="decimal"/>
-      <w:lvlText w:val=""/>
+    <w:lvl w:ilvl="1" w:tplc="A39C18D4" w:tentative="1">
+      <w:start w:val="1"/>
+      <w:numFmt w:val="bullet"/>
+      <w:lvlText w:val="○"/>
       <w:lvlJc w:val="left"/>
+      <w:pPr>
+        <w:ind w:left="1440" w:hanging="360"/>
+      </w:pPr>
     </w:lvl>
-    <w:lvl w:ilvl="2" w:tplc="C2ACEC0A">
-      <w:numFmt w:val="decimal"/>
-      <w:lvlText w:val=""/>
+    <w:lvl w:ilvl="2" w:tplc="D506BD92" w:tentative="1">
+      <w:start w:val="1"/>
+      <w:numFmt w:val="bullet"/>
+      <w:lvlText w:val="■"/>
       <w:lvlJc w:val="left"/>
+      <w:pPr>
+        <w:ind w:left="2160" w:hanging="360"/>
+      </w:pPr>
     </w:lvl>
-    <w:lvl w:ilvl="3" w:tplc="01E29810">
-      <w:numFmt w:val="decimal"/>
-      <w:lvlText w:val=""/>
+    <w:lvl w:ilvl="3" w:tplc="144AD472" w:tentative="1">
+      <w:start w:val="1"/>
+      <w:numFmt w:val="bullet"/>
+      <w:lvlText w:val="●"/>
       <w:lvlJc w:val="left"/>
+      <w:pPr>
+        <w:ind w:left="2880" w:hanging="360"/>
+      </w:pPr>
     </w:lvl>
-    <w:lvl w:ilvl="4" w:tplc="0F4C4098">
-      <w:numFmt w:val="decimal"/>
-      <w:lvlText w:val=""/>
+    <w:lvl w:ilvl="4" w:tplc="9488B8C4" w:tentative="1">
+      <w:start w:val="1"/>
+      <w:numFmt w:val="bullet"/>
+      <w:lvlText w:val="○"/>
       <w:lvlJc w:val="left"/>
+      <w:pPr>
+        <w:ind w:left="3600" w:hanging="360"/>
+      </w:pPr>
     </w:lvl>
-    <w:lvl w:ilvl="5" w:tplc="564298AA">
-      <w:numFmt w:val="decimal"/>
-      <w:lvlText w:val=""/>
+    <w:lvl w:ilvl="5" w:tplc="D2BE45D4" w:tentative="1">
+      <w:start w:val="1"/>
+      <w:numFmt w:val="bullet"/>
+      <w:lvlText w:val="■"/>
       <w:lvlJc w:val="left"/>
+      <w:pPr>
+        <w:ind w:left="4320" w:hanging="360"/>
+      </w:pPr>
     </w:lvl>
-    <w:lvl w:ilvl="6" w:tplc="37180F06">
-      <w:numFmt w:val="decimal"/>
-      <w:lvlText w:val=""/>
+    <w:lvl w:ilvl="6" w:tplc="37669C12" w:tentative="1">
+      <w:start w:val="1"/>
+      <w:numFmt w:val="bullet"/>
+      <w:lvlText w:val="●"/>
       <w:lvlJc w:val="left"/>
+      <w:pPr>
+        <w:ind w:left="5040" w:hanging="360"/>
+      </w:pPr>
     </w:lvl>
-    <w:lvl w:ilvl="7" w:tplc="DCE03032">
-      <w:numFmt w:val="decimal"/>
-      <w:lvlText w:val=""/>
+    <w:lvl w:ilvl="7" w:tplc="0E4CE5D2" w:tentative="1">
+      <w:start w:val="1"/>
+      <w:numFmt w:val="bullet"/>
+      <w:lvlText w:val="●"/>
       <w:lvlJc w:val="left"/>
+      <w:pPr>
+        <w:ind w:left="5760" w:hanging="360"/>
+      </w:pPr>
     </w:lvl>
-    <w:lvl w:ilvl="8" w:tplc="6ED07FAE">
-      <w:numFmt w:val="decimal"/>
-      <w:lvlText w:val=""/>
+    <w:lvl w:ilvl="8" w:tplc="618A4CB2" w:tentative="1">
+      <w:start w:val="1"/>
+      <w:numFmt w:val="bullet"/>
+      <w:lvlText w:val="●"/>
       <w:lvlJc w:val="left"/>
+      <w:pPr>
+        <w:ind w:left="6480" w:hanging="360"/>
+      </w:pPr>
     </w:lvl>
   </w:abstractNum>
-  <w:num w:numId="1" w16cid:durableId="21320407">
+  <w:num w:numId="1" w16cid:durableId="1813599299">
+    <w:abstractNumId w:val="3"/>
+    <w:lvlOverride w:ilvl="0">
+      <w:startOverride w:val="1"/>
+    </w:lvlOverride>
+  </w:num>
+  <w:num w:numId="2" w16cid:durableId="1457220164">
+    <w:abstractNumId w:val="0"/>
+    <w:lvlOverride w:ilvl="0">
+      <w:startOverride w:val="1"/>
+    </w:lvlOverride>
+  </w:num>
+  <w:num w:numId="3" w16cid:durableId="1982883879">
     <w:abstractNumId w:val="1"/>
     <w:lvlOverride w:ilvl="0">
       <w:startOverride w:val="1"/>
     </w:lvlOverride>
   </w:num>
-  <w:num w:numId="2" w16cid:durableId="1499036269">
-    <w:abstractNumId w:val="0"/>
-    <w:lvlOverride w:ilvl="0">
-      <w:startOverride w:val="1"/>
-    </w:lvlOverride>
-  </w:num>
-  <w:num w:numId="3" w16cid:durableId="413432706">
-    <w:abstractNumId w:val="3"/>
-    <w:lvlOverride w:ilvl="0">
-      <w:startOverride w:val="1"/>
-    </w:lvlOverride>
-  </w:num>
-  <w:num w:numId="4" w16cid:durableId="1368943712">
+  <w:num w:numId="4" w16cid:durableId="236404527">
     <w:abstractNumId w:val="2"/>
     <w:lvlOverride w:ilvl="0">
       <w:startOverride w:val="1"/>
@@ -17939,7 +18044,7 @@
     <w:autoRedefine/>
     <w:uiPriority w:val="39"/>
     <w:unhideWhenUsed/>
-    <w:rsid w:val="00496F62"/>
+    <w:rsid w:val="004B228A"/>
     <w:pPr>
       <w:spacing w:after="100"/>
     </w:pPr>
@@ -17951,7 +18056,7 @@
     <w:autoRedefine/>
     <w:uiPriority w:val="39"/>
     <w:unhideWhenUsed/>
-    <w:rsid w:val="00496F62"/>
+    <w:rsid w:val="004B228A"/>
     <w:pPr>
       <w:spacing w:after="100"/>
       <w:ind w:left="210"/>

</xml_diff>

<commit_message>
docs: release 1.2.1 pubblicata (link verificati)
Co-Authored-By: Claude Opus 5.5 <noreply@anthropic.com>
</commit_message>
<xml_diff>
--- a/docs/PDFz_20261021.docx
+++ b/docs/PDFz_20261021.docx
@@ -16,7 +16,7 @@
           <w:noProof/>
         </w:rPr>
         <w:drawing>
-          <wp:inline distT="0" distB="0" distL="0" distR="0" wp14:anchorId="3C586D2C" wp14:editId="2760F6BF">
+          <wp:inline distT="0" distB="0" distL="0" distR="0" wp14:anchorId="75B3FF86" wp14:editId="155EC0CD">
             <wp:extent cx="3619500" cy="1285875"/>
             <wp:effectExtent l="0" t="0" r="0" b="0"/>
             <wp:docPr id="1" name="Immagine 1"/>
@@ -129,14 +129,13 @@
           <w:sz w:val="32"/>
           <w:szCs w:val="32"/>
         </w:rPr>
-        <w:lastRenderedPageBreak/>
         <w:t>Indice</w:t>
       </w:r>
     </w:p>
     <w:sdt>
       <w:sdtPr>
         <w:alias w:val="Indice"/>
-        <w:id w:val="1555899989"/>
+        <w:id w:val="-391122534"/>
       </w:sdtPr>
       <w:sdtEndPr/>
       <w:sdtContent>
@@ -159,7 +158,7 @@
           <w:r>
             <w:fldChar w:fldCharType="separate"/>
           </w:r>
-          <w:hyperlink w:anchor="_Toc243496254" w:history="1">
+          <w:hyperlink w:anchor="_Toc243497037" w:history="1">
             <w:r>
               <w:rPr>
                 <w:rStyle w:val="Collegamentoipertestuale"/>
@@ -183,7 +182,7 @@
               <w:rPr>
                 <w:noProof/>
               </w:rPr>
-              <w:instrText xml:space="preserve"> PAGEREF _Toc243496254 \h </w:instrText>
+              <w:instrText xml:space="preserve"> PAGEREF _Toc243497037 \h </w:instrText>
             </w:r>
             <w:r>
               <w:rPr>
@@ -220,7 +219,7 @@
               <w:noProof/>
             </w:rPr>
           </w:pPr>
-          <w:hyperlink w:anchor="_Toc243496255" w:history="1">
+          <w:hyperlink w:anchor="_Toc243497038" w:history="1">
             <w:r>
               <w:rPr>
                 <w:rStyle w:val="Collegamentoipertestuale"/>
@@ -244,7 +243,7 @@
               <w:rPr>
                 <w:noProof/>
               </w:rPr>
-              <w:instrText xml:space="preserve"> PAGEREF _Toc243496255 \h </w:instrText>
+              <w:instrText xml:space="preserve"> PAGEREF _Toc243497038 \h </w:instrText>
             </w:r>
             <w:r>
               <w:rPr>
@@ -281,7 +280,7 @@
               <w:noProof/>
             </w:rPr>
           </w:pPr>
-          <w:hyperlink w:anchor="_Toc243496256" w:history="1">
+          <w:hyperlink w:anchor="_Toc243497039" w:history="1">
             <w:r>
               <w:rPr>
                 <w:rStyle w:val="Collegamentoipertestuale"/>
@@ -305,7 +304,7 @@
               <w:rPr>
                 <w:noProof/>
               </w:rPr>
-              <w:instrText xml:space="preserve"> PAGEREF _Toc243496256 \h </w:instrText>
+              <w:instrText xml:space="preserve"> PAGEREF _Toc243497039 \h </w:instrText>
             </w:r>
             <w:r>
               <w:rPr>
@@ -342,7 +341,7 @@
               <w:noProof/>
             </w:rPr>
           </w:pPr>
-          <w:hyperlink w:anchor="_Toc243496257" w:history="1">
+          <w:hyperlink w:anchor="_Toc243497040" w:history="1">
             <w:r>
               <w:rPr>
                 <w:rStyle w:val="Collegamentoipertestuale"/>
@@ -366,7 +365,7 @@
               <w:rPr>
                 <w:noProof/>
               </w:rPr>
-              <w:instrText xml:space="preserve"> PAGEREF _Toc243496257 \h </w:instrText>
+              <w:instrText xml:space="preserve"> PAGEREF _Toc243497040 \h </w:instrText>
             </w:r>
             <w:r>
               <w:rPr>
@@ -403,7 +402,7 @@
               <w:noProof/>
             </w:rPr>
           </w:pPr>
-          <w:hyperlink w:anchor="_Toc243496258" w:history="1">
+          <w:hyperlink w:anchor="_Toc243497041" w:history="1">
             <w:r>
               <w:rPr>
                 <w:rStyle w:val="Collegamentoipertestuale"/>
@@ -427,7 +426,7 @@
               <w:rPr>
                 <w:noProof/>
               </w:rPr>
-              <w:instrText xml:space="preserve"> PAGEREF _Toc243496258 \h </w:instrText>
+              <w:instrText xml:space="preserve"> PAGEREF _Toc243497041 \h </w:instrText>
             </w:r>
             <w:r>
               <w:rPr>
@@ -464,7 +463,7 @@
               <w:noProof/>
             </w:rPr>
           </w:pPr>
-          <w:hyperlink w:anchor="_Toc243496259" w:history="1">
+          <w:hyperlink w:anchor="_Toc243497042" w:history="1">
             <w:r>
               <w:rPr>
                 <w:rStyle w:val="Collegamentoipertestuale"/>
@@ -488,7 +487,7 @@
               <w:rPr>
                 <w:noProof/>
               </w:rPr>
-              <w:instrText xml:space="preserve"> PAGEREF _Toc243496259 \h </w:instrText>
+              <w:instrText xml:space="preserve"> PAGEREF _Toc243497042 \h </w:instrText>
             </w:r>
             <w:r>
               <w:rPr>
@@ -525,7 +524,7 @@
               <w:noProof/>
             </w:rPr>
           </w:pPr>
-          <w:hyperlink w:anchor="_Toc243496260" w:history="1">
+          <w:hyperlink w:anchor="_Toc243497043" w:history="1">
             <w:r>
               <w:rPr>
                 <w:rStyle w:val="Collegamentoipertestuale"/>
@@ -549,7 +548,7 @@
               <w:rPr>
                 <w:noProof/>
               </w:rPr>
-              <w:instrText xml:space="preserve"> PAGEREF _Toc243496260 \h </w:instrText>
+              <w:instrText xml:space="preserve"> PAGEREF _Toc243497043 \h </w:instrText>
             </w:r>
             <w:r>
               <w:rPr>
@@ -586,7 +585,7 @@
               <w:noProof/>
             </w:rPr>
           </w:pPr>
-          <w:hyperlink w:anchor="_Toc243496261" w:history="1">
+          <w:hyperlink w:anchor="_Toc243497044" w:history="1">
             <w:r>
               <w:rPr>
                 <w:rStyle w:val="Collegamentoipertestuale"/>
@@ -610,7 +609,7 @@
               <w:rPr>
                 <w:noProof/>
               </w:rPr>
-              <w:instrText xml:space="preserve"> PAGEREF _Toc243496261 \h </w:instrText>
+              <w:instrText xml:space="preserve"> PAGEREF _Toc243497044 \h </w:instrText>
             </w:r>
             <w:r>
               <w:rPr>
@@ -647,7 +646,7 @@
               <w:noProof/>
             </w:rPr>
           </w:pPr>
-          <w:hyperlink w:anchor="_Toc243496262" w:history="1">
+          <w:hyperlink w:anchor="_Toc243497045" w:history="1">
             <w:r>
               <w:rPr>
                 <w:rStyle w:val="Collegamentoipertestuale"/>
@@ -671,7 +670,7 @@
               <w:rPr>
                 <w:noProof/>
               </w:rPr>
-              <w:instrText xml:space="preserve"> PAGEREF _Toc243496262 \h </w:instrText>
+              <w:instrText xml:space="preserve"> PAGEREF _Toc243497045 \h </w:instrText>
             </w:r>
             <w:r>
               <w:rPr>
@@ -708,7 +707,7 @@
               <w:noProof/>
             </w:rPr>
           </w:pPr>
-          <w:hyperlink w:anchor="_Toc243496263" w:history="1">
+          <w:hyperlink w:anchor="_Toc243497046" w:history="1">
             <w:r>
               <w:rPr>
                 <w:rStyle w:val="Collegamentoipertestuale"/>
@@ -732,7 +731,7 @@
               <w:rPr>
                 <w:noProof/>
               </w:rPr>
-              <w:instrText xml:space="preserve"> PAGEREF _Toc243496263 \h </w:instrText>
+              <w:instrText xml:space="preserve"> PAGEREF _Toc243497046 \h </w:instrText>
             </w:r>
             <w:r>
               <w:rPr>
@@ -769,7 +768,7 @@
               <w:noProof/>
             </w:rPr>
           </w:pPr>
-          <w:hyperlink w:anchor="_Toc243496264" w:history="1">
+          <w:hyperlink w:anchor="_Toc243497047" w:history="1">
             <w:r>
               <w:rPr>
                 <w:rStyle w:val="Collegamentoipertestuale"/>
@@ -793,7 +792,7 @@
               <w:rPr>
                 <w:noProof/>
               </w:rPr>
-              <w:instrText xml:space="preserve"> PAGEREF _Toc243496264 \h </w:instrText>
+              <w:instrText xml:space="preserve"> PAGEREF _Toc243497047 \h </w:instrText>
             </w:r>
             <w:r>
               <w:rPr>
@@ -830,7 +829,7 @@
               <w:noProof/>
             </w:rPr>
           </w:pPr>
-          <w:hyperlink w:anchor="_Toc243496265" w:history="1">
+          <w:hyperlink w:anchor="_Toc243497048" w:history="1">
             <w:r>
               <w:rPr>
                 <w:rStyle w:val="Collegamentoipertestuale"/>
@@ -854,7 +853,7 @@
               <w:rPr>
                 <w:noProof/>
               </w:rPr>
-              <w:instrText xml:space="preserve"> PAGEREF _Toc243496265 \h </w:instrText>
+              <w:instrText xml:space="preserve"> PAGEREF _Toc243497048 \h </w:instrText>
             </w:r>
             <w:r>
               <w:rPr>
@@ -891,7 +890,7 @@
               <w:noProof/>
             </w:rPr>
           </w:pPr>
-          <w:hyperlink w:anchor="_Toc243496266" w:history="1">
+          <w:hyperlink w:anchor="_Toc243497049" w:history="1">
             <w:r>
               <w:rPr>
                 <w:rStyle w:val="Collegamentoipertestuale"/>
@@ -915,7 +914,7 @@
               <w:rPr>
                 <w:noProof/>
               </w:rPr>
-              <w:instrText xml:space="preserve"> PAGEREF _Toc243496266 \h </w:instrText>
+              <w:instrText xml:space="preserve"> PAGEREF _Toc243497049 \h </w:instrText>
             </w:r>
             <w:r>
               <w:rPr>
@@ -952,7 +951,7 @@
               <w:noProof/>
             </w:rPr>
           </w:pPr>
-          <w:hyperlink w:anchor="_Toc243496267" w:history="1">
+          <w:hyperlink w:anchor="_Toc243497050" w:history="1">
             <w:r>
               <w:rPr>
                 <w:rStyle w:val="Collegamentoipertestuale"/>
@@ -976,7 +975,7 @@
               <w:rPr>
                 <w:noProof/>
               </w:rPr>
-              <w:instrText xml:space="preserve"> PAGEREF _Toc243496267 \h </w:instrText>
+              <w:instrText xml:space="preserve"> PAGEREF _Toc243497050 \h </w:instrText>
             </w:r>
             <w:r>
               <w:rPr>
@@ -1013,7 +1012,7 @@
               <w:noProof/>
             </w:rPr>
           </w:pPr>
-          <w:hyperlink w:anchor="_Toc243496268" w:history="1">
+          <w:hyperlink w:anchor="_Toc243497051" w:history="1">
             <w:r>
               <w:rPr>
                 <w:rStyle w:val="Collegamentoipertestuale"/>
@@ -1037,7 +1036,7 @@
               <w:rPr>
                 <w:noProof/>
               </w:rPr>
-              <w:instrText xml:space="preserve"> PAGEREF _Toc243496268 \h </w:instrText>
+              <w:instrText xml:space="preserve"> PAGEREF _Toc243497051 \h </w:instrText>
             </w:r>
             <w:r>
               <w:rPr>
@@ -1074,7 +1073,7 @@
               <w:noProof/>
             </w:rPr>
           </w:pPr>
-          <w:hyperlink w:anchor="_Toc243496269" w:history="1">
+          <w:hyperlink w:anchor="_Toc243497052" w:history="1">
             <w:r>
               <w:rPr>
                 <w:rStyle w:val="Collegamentoipertestuale"/>
@@ -1098,7 +1097,7 @@
               <w:rPr>
                 <w:noProof/>
               </w:rPr>
-              <w:instrText xml:space="preserve"> PAGEREF _Toc243496269 \h </w:instrText>
+              <w:instrText xml:space="preserve"> PAGEREF _Toc243497052 \h </w:instrText>
             </w:r>
             <w:r>
               <w:rPr>
@@ -1135,7 +1134,7 @@
               <w:noProof/>
             </w:rPr>
           </w:pPr>
-          <w:hyperlink w:anchor="_Toc243496270" w:history="1">
+          <w:hyperlink w:anchor="_Toc243497053" w:history="1">
             <w:r>
               <w:rPr>
                 <w:rStyle w:val="Collegamentoipertestuale"/>
@@ -1159,7 +1158,7 @@
               <w:rPr>
                 <w:noProof/>
               </w:rPr>
-              <w:instrText xml:space="preserve"> PAGEREF _Toc243496270 \h </w:instrText>
+              <w:instrText xml:space="preserve"> PAGEREF _Toc243497053 \h </w:instrText>
             </w:r>
             <w:r>
               <w:rPr>
@@ -1196,7 +1195,7 @@
               <w:noProof/>
             </w:rPr>
           </w:pPr>
-          <w:hyperlink w:anchor="_Toc243496271" w:history="1">
+          <w:hyperlink w:anchor="_Toc243497054" w:history="1">
             <w:r>
               <w:rPr>
                 <w:rStyle w:val="Collegamentoipertestuale"/>
@@ -1220,7 +1219,7 @@
               <w:rPr>
                 <w:noProof/>
               </w:rPr>
-              <w:instrText xml:space="preserve"> PAGEREF _Toc243496271 \h </w:instrText>
+              <w:instrText xml:space="preserve"> PAGEREF _Toc243497054 \h </w:instrText>
             </w:r>
             <w:r>
               <w:rPr>
@@ -1257,7 +1256,7 @@
               <w:noProof/>
             </w:rPr>
           </w:pPr>
-          <w:hyperlink w:anchor="_Toc243496272" w:history="1">
+          <w:hyperlink w:anchor="_Toc243497055" w:history="1">
             <w:r>
               <w:rPr>
                 <w:rStyle w:val="Collegamentoipertestuale"/>
@@ -1281,7 +1280,7 @@
               <w:rPr>
                 <w:noProof/>
               </w:rPr>
-              <w:instrText xml:space="preserve"> PAGEREF _Toc243496272 \h </w:instrText>
+              <w:instrText xml:space="preserve"> PAGEREF _Toc243497055 \h </w:instrText>
             </w:r>
             <w:r>
               <w:rPr>
@@ -1318,7 +1317,7 @@
               <w:noProof/>
             </w:rPr>
           </w:pPr>
-          <w:hyperlink w:anchor="_Toc243496273" w:history="1">
+          <w:hyperlink w:anchor="_Toc243497056" w:history="1">
             <w:r>
               <w:rPr>
                 <w:rStyle w:val="Collegamentoipertestuale"/>
@@ -1342,7 +1341,7 @@
               <w:rPr>
                 <w:noProof/>
               </w:rPr>
-              <w:instrText xml:space="preserve"> PAGEREF _Toc243496273 \h </w:instrText>
+              <w:instrText xml:space="preserve"> PAGEREF _Toc243497056 \h </w:instrText>
             </w:r>
             <w:r>
               <w:rPr>
@@ -1379,7 +1378,7 @@
               <w:noProof/>
             </w:rPr>
           </w:pPr>
-          <w:hyperlink w:anchor="_Toc243496274" w:history="1">
+          <w:hyperlink w:anchor="_Toc243497057" w:history="1">
             <w:r>
               <w:rPr>
                 <w:rStyle w:val="Collegamentoipertestuale"/>
@@ -1403,7 +1402,7 @@
               <w:rPr>
                 <w:noProof/>
               </w:rPr>
-              <w:instrText xml:space="preserve"> PAGEREF _Toc243496274 \h </w:instrText>
+              <w:instrText xml:space="preserve"> PAGEREF _Toc243497057 \h </w:instrText>
             </w:r>
             <w:r>
               <w:rPr>
@@ -1440,7 +1439,7 @@
               <w:noProof/>
             </w:rPr>
           </w:pPr>
-          <w:hyperlink w:anchor="_Toc243496275" w:history="1">
+          <w:hyperlink w:anchor="_Toc243497058" w:history="1">
             <w:r>
               <w:rPr>
                 <w:rStyle w:val="Collegamentoipertestuale"/>
@@ -1464,7 +1463,7 @@
               <w:rPr>
                 <w:noProof/>
               </w:rPr>
-              <w:instrText xml:space="preserve"> PAGEREF _Toc243496275 \h </w:instrText>
+              <w:instrText xml:space="preserve"> PAGEREF _Toc243497058 \h </w:instrText>
             </w:r>
             <w:r>
               <w:rPr>
@@ -1501,7 +1500,7 @@
               <w:noProof/>
             </w:rPr>
           </w:pPr>
-          <w:hyperlink w:anchor="_Toc243496276" w:history="1">
+          <w:hyperlink w:anchor="_Toc243497059" w:history="1">
             <w:r>
               <w:rPr>
                 <w:rStyle w:val="Collegamentoipertestuale"/>
@@ -1525,7 +1524,7 @@
               <w:rPr>
                 <w:noProof/>
               </w:rPr>
-              <w:instrText xml:space="preserve"> PAGEREF _Toc243496276 \h </w:instrText>
+              <w:instrText xml:space="preserve"> PAGEREF _Toc243497059 \h </w:instrText>
             </w:r>
             <w:r>
               <w:rPr>
@@ -1562,7 +1561,7 @@
               <w:noProof/>
             </w:rPr>
           </w:pPr>
-          <w:hyperlink w:anchor="_Toc243496277" w:history="1">
+          <w:hyperlink w:anchor="_Toc243497060" w:history="1">
             <w:r>
               <w:rPr>
                 <w:rStyle w:val="Collegamentoipertestuale"/>
@@ -1586,7 +1585,7 @@
               <w:rPr>
                 <w:noProof/>
               </w:rPr>
-              <w:instrText xml:space="preserve"> PAGEREF _Toc243496277 \h </w:instrText>
+              <w:instrText xml:space="preserve"> PAGEREF _Toc243497060 \h </w:instrText>
             </w:r>
             <w:r>
               <w:rPr>
@@ -1623,7 +1622,7 @@
               <w:noProof/>
             </w:rPr>
           </w:pPr>
-          <w:hyperlink w:anchor="_Toc243496278" w:history="1">
+          <w:hyperlink w:anchor="_Toc243497061" w:history="1">
             <w:r>
               <w:rPr>
                 <w:rStyle w:val="Collegamentoipertestuale"/>
@@ -1647,7 +1646,7 @@
               <w:rPr>
                 <w:noProof/>
               </w:rPr>
-              <w:instrText xml:space="preserve"> PAGEREF _Toc243496278 \h </w:instrText>
+              <w:instrText xml:space="preserve"> PAGEREF _Toc243497061 \h </w:instrText>
             </w:r>
             <w:r>
               <w:rPr>
@@ -1684,7 +1683,7 @@
               <w:noProof/>
             </w:rPr>
           </w:pPr>
-          <w:hyperlink w:anchor="_Toc243496279" w:history="1">
+          <w:hyperlink w:anchor="_Toc243497062" w:history="1">
             <w:r>
               <w:rPr>
                 <w:rStyle w:val="Collegamentoipertestuale"/>
@@ -1708,7 +1707,7 @@
               <w:rPr>
                 <w:noProof/>
               </w:rPr>
-              <w:instrText xml:space="preserve"> PAGEREF _Toc243496279 \h </w:instrText>
+              <w:instrText xml:space="preserve"> PAGEREF _Toc243497062 \h </w:instrText>
             </w:r>
             <w:r>
               <w:rPr>
@@ -1745,7 +1744,7 @@
               <w:noProof/>
             </w:rPr>
           </w:pPr>
-          <w:hyperlink w:anchor="_Toc243496280" w:history="1">
+          <w:hyperlink w:anchor="_Toc243497063" w:history="1">
             <w:r>
               <w:rPr>
                 <w:rStyle w:val="Collegamentoipertestuale"/>
@@ -1769,7 +1768,7 @@
               <w:rPr>
                 <w:noProof/>
               </w:rPr>
-              <w:instrText xml:space="preserve"> PAGEREF _Toc243496280 \h </w:instrText>
+              <w:instrText xml:space="preserve"> PAGEREF _Toc243497063 \h </w:instrText>
             </w:r>
             <w:r>
               <w:rPr>
@@ -1806,7 +1805,7 @@
               <w:noProof/>
             </w:rPr>
           </w:pPr>
-          <w:hyperlink w:anchor="_Toc243496281" w:history="1">
+          <w:hyperlink w:anchor="_Toc243497064" w:history="1">
             <w:r>
               <w:rPr>
                 <w:rStyle w:val="Collegamentoipertestuale"/>
@@ -1830,7 +1829,7 @@
               <w:rPr>
                 <w:noProof/>
               </w:rPr>
-              <w:instrText xml:space="preserve"> PAGEREF _Toc243496281 \h </w:instrText>
+              <w:instrText xml:space="preserve"> PAGEREF _Toc243497064 \h </w:instrText>
             </w:r>
             <w:r>
               <w:rPr>
@@ -1867,7 +1866,7 @@
               <w:noProof/>
             </w:rPr>
           </w:pPr>
-          <w:hyperlink w:anchor="_Toc243496282" w:history="1">
+          <w:hyperlink w:anchor="_Toc243497065" w:history="1">
             <w:r>
               <w:rPr>
                 <w:rStyle w:val="Collegamentoipertestuale"/>
@@ -1891,7 +1890,7 @@
               <w:rPr>
                 <w:noProof/>
               </w:rPr>
-              <w:instrText xml:space="preserve"> PAGEREF _Toc243496282 \h </w:instrText>
+              <w:instrText xml:space="preserve"> PAGEREF _Toc243497065 \h </w:instrText>
             </w:r>
             <w:r>
               <w:rPr>
@@ -1928,7 +1927,7 @@
               <w:noProof/>
             </w:rPr>
           </w:pPr>
-          <w:hyperlink w:anchor="_Toc243496283" w:history="1">
+          <w:hyperlink w:anchor="_Toc243497066" w:history="1">
             <w:r>
               <w:rPr>
                 <w:rStyle w:val="Collegamentoipertestuale"/>
@@ -1952,7 +1951,7 @@
               <w:rPr>
                 <w:noProof/>
               </w:rPr>
-              <w:instrText xml:space="preserve"> PAGEREF _Toc243496283 \h </w:instrText>
+              <w:instrText xml:space="preserve"> PAGEREF _Toc243497066 \h </w:instrText>
             </w:r>
             <w:r>
               <w:rPr>
@@ -1989,7 +1988,7 @@
               <w:noProof/>
             </w:rPr>
           </w:pPr>
-          <w:hyperlink w:anchor="_Toc243496284" w:history="1">
+          <w:hyperlink w:anchor="_Toc243497067" w:history="1">
             <w:r>
               <w:rPr>
                 <w:rStyle w:val="Collegamentoipertestuale"/>
@@ -2013,7 +2012,7 @@
               <w:rPr>
                 <w:noProof/>
               </w:rPr>
-              <w:instrText xml:space="preserve"> PAGEREF _Toc243496284 \h </w:instrText>
+              <w:instrText xml:space="preserve"> PAGEREF _Toc243497067 \h </w:instrText>
             </w:r>
             <w:r>
               <w:rPr>
@@ -2050,7 +2049,7 @@
               <w:noProof/>
             </w:rPr>
           </w:pPr>
-          <w:hyperlink w:anchor="_Toc243496285" w:history="1">
+          <w:hyperlink w:anchor="_Toc243497068" w:history="1">
             <w:r>
               <w:rPr>
                 <w:rStyle w:val="Collegamentoipertestuale"/>
@@ -2074,7 +2073,7 @@
               <w:rPr>
                 <w:noProof/>
               </w:rPr>
-              <w:instrText xml:space="preserve"> PAGEREF _Toc243496285 \h </w:instrText>
+              <w:instrText xml:space="preserve"> PAGEREF _Toc243497068 \h </w:instrText>
             </w:r>
             <w:r>
               <w:rPr>
@@ -2111,7 +2110,7 @@
               <w:noProof/>
             </w:rPr>
           </w:pPr>
-          <w:hyperlink w:anchor="_Toc243496286" w:history="1">
+          <w:hyperlink w:anchor="_Toc243497069" w:history="1">
             <w:r>
               <w:rPr>
                 <w:rStyle w:val="Collegamentoipertestuale"/>
@@ -2135,7 +2134,7 @@
               <w:rPr>
                 <w:noProof/>
               </w:rPr>
-              <w:instrText xml:space="preserve"> PAGEREF _Toc243496286 \h </w:instrText>
+              <w:instrText xml:space="preserve"> PAGEREF _Toc243497069 \h </w:instrText>
             </w:r>
             <w:r>
               <w:rPr>
@@ -2172,7 +2171,7 @@
               <w:noProof/>
             </w:rPr>
           </w:pPr>
-          <w:hyperlink w:anchor="_Toc243496287" w:history="1">
+          <w:hyperlink w:anchor="_Toc243497070" w:history="1">
             <w:r>
               <w:rPr>
                 <w:rStyle w:val="Collegamentoipertestuale"/>
@@ -2196,7 +2195,7 @@
               <w:rPr>
                 <w:noProof/>
               </w:rPr>
-              <w:instrText xml:space="preserve"> PAGEREF _Toc243496287 \h </w:instrText>
+              <w:instrText xml:space="preserve"> PAGEREF _Toc243497070 \h </w:instrText>
             </w:r>
             <w:r>
               <w:rPr>
@@ -2233,7 +2232,7 @@
               <w:noProof/>
             </w:rPr>
           </w:pPr>
-          <w:hyperlink w:anchor="_Toc243496288" w:history="1">
+          <w:hyperlink w:anchor="_Toc243497071" w:history="1">
             <w:r>
               <w:rPr>
                 <w:rStyle w:val="Collegamentoipertestuale"/>
@@ -2257,7 +2256,7 @@
               <w:rPr>
                 <w:noProof/>
               </w:rPr>
-              <w:instrText xml:space="preserve"> PAGEREF _Toc243496288 \h </w:instrText>
+              <w:instrText xml:space="preserve"> PAGEREF _Toc243497071 \h </w:instrText>
             </w:r>
             <w:r>
               <w:rPr>
@@ -2294,7 +2293,7 @@
               <w:noProof/>
             </w:rPr>
           </w:pPr>
-          <w:hyperlink w:anchor="_Toc243496289" w:history="1">
+          <w:hyperlink w:anchor="_Toc243497072" w:history="1">
             <w:r>
               <w:rPr>
                 <w:rStyle w:val="Collegamentoipertestuale"/>
@@ -2318,7 +2317,7 @@
               <w:rPr>
                 <w:noProof/>
               </w:rPr>
-              <w:instrText xml:space="preserve"> PAGEREF _Toc243496289 \h </w:instrText>
+              <w:instrText xml:space="preserve"> PAGEREF _Toc243497072 \h </w:instrText>
             </w:r>
             <w:r>
               <w:rPr>
@@ -2355,7 +2354,7 @@
               <w:noProof/>
             </w:rPr>
           </w:pPr>
-          <w:hyperlink w:anchor="_Toc243496290" w:history="1">
+          <w:hyperlink w:anchor="_Toc243497073" w:history="1">
             <w:r>
               <w:rPr>
                 <w:rStyle w:val="Collegamentoipertestuale"/>
@@ -2379,7 +2378,7 @@
               <w:rPr>
                 <w:noProof/>
               </w:rPr>
-              <w:instrText xml:space="preserve"> PAGEREF _Toc243496290 \h </w:instrText>
+              <w:instrText xml:space="preserve"> PAGEREF _Toc243497073 \h </w:instrText>
             </w:r>
             <w:r>
               <w:rPr>
@@ -2416,7 +2415,7 @@
               <w:noProof/>
             </w:rPr>
           </w:pPr>
-          <w:hyperlink w:anchor="_Toc243496291" w:history="1">
+          <w:hyperlink w:anchor="_Toc243497074" w:history="1">
             <w:r>
               <w:rPr>
                 <w:rStyle w:val="Collegamentoipertestuale"/>
@@ -2440,7 +2439,7 @@
               <w:rPr>
                 <w:noProof/>
               </w:rPr>
-              <w:instrText xml:space="preserve"> PAGEREF _Toc243496291 \h </w:instrText>
+              <w:instrText xml:space="preserve"> PAGEREF _Toc243497074 \h </w:instrText>
             </w:r>
             <w:r>
               <w:rPr>
@@ -2477,7 +2476,7 @@
               <w:noProof/>
             </w:rPr>
           </w:pPr>
-          <w:hyperlink w:anchor="_Toc243496292" w:history="1">
+          <w:hyperlink w:anchor="_Toc243497075" w:history="1">
             <w:r>
               <w:rPr>
                 <w:rStyle w:val="Collegamentoipertestuale"/>
@@ -2501,7 +2500,7 @@
               <w:rPr>
                 <w:noProof/>
               </w:rPr>
-              <w:instrText xml:space="preserve"> PAGEREF _Toc243496292 \h </w:instrText>
+              <w:instrText xml:space="preserve"> PAGEREF _Toc243497075 \h </w:instrText>
             </w:r>
             <w:r>
               <w:rPr>
@@ -2538,7 +2537,7 @@
               <w:noProof/>
             </w:rPr>
           </w:pPr>
-          <w:hyperlink w:anchor="_Toc243496293" w:history="1">
+          <w:hyperlink w:anchor="_Toc243497076" w:history="1">
             <w:r>
               <w:rPr>
                 <w:rStyle w:val="Collegamentoipertestuale"/>
@@ -2562,7 +2561,7 @@
               <w:rPr>
                 <w:noProof/>
               </w:rPr>
-              <w:instrText xml:space="preserve"> PAGEREF _Toc243496293 \h </w:instrText>
+              <w:instrText xml:space="preserve"> PAGEREF _Toc243497076 \h </w:instrText>
             </w:r>
             <w:r>
               <w:rPr>
@@ -2599,7 +2598,7 @@
               <w:noProof/>
             </w:rPr>
           </w:pPr>
-          <w:hyperlink w:anchor="_Toc243496294" w:history="1">
+          <w:hyperlink w:anchor="_Toc243497077" w:history="1">
             <w:r>
               <w:rPr>
                 <w:rStyle w:val="Collegamentoipertestuale"/>
@@ -2623,7 +2622,7 @@
               <w:rPr>
                 <w:noProof/>
               </w:rPr>
-              <w:instrText xml:space="preserve"> PAGEREF _Toc243496294 \h </w:instrText>
+              <w:instrText xml:space="preserve"> PAGEREF _Toc243497077 \h </w:instrText>
             </w:r>
             <w:r>
               <w:rPr>
@@ -2666,9 +2665,8 @@
       <w:pPr>
         <w:pStyle w:val="Titolo1"/>
       </w:pPr>
-      <w:bookmarkStart w:id="0" w:name="_Toc243496254"/>
-      <w:r>
-        <w:lastRenderedPageBreak/>
+      <w:bookmarkStart w:id="0" w:name="_Toc243497037"/>
+      <w:r>
         <w:t>1. In breve</w:t>
       </w:r>
       <w:bookmarkEnd w:id="0"/>
@@ -2958,7 +2956,7 @@
       <w:pPr>
         <w:pStyle w:val="Titolo1"/>
       </w:pPr>
-      <w:bookmarkStart w:id="1" w:name="_Toc243496255"/>
+      <w:bookmarkStart w:id="1" w:name="_Toc243497038"/>
       <w:r>
         <w:t>2. Nuovo marchio</w:t>
       </w:r>
@@ -2968,7 +2966,7 @@
       <w:pPr>
         <w:pStyle w:val="Titolo2"/>
       </w:pPr>
-      <w:bookmarkStart w:id="2" w:name="_Toc243496256"/>
+      <w:bookmarkStart w:id="2" w:name="_Toc243497039"/>
       <w:r>
         <w:t>2.1 Nomi e identificativi</w:t>
       </w:r>
@@ -3514,9 +3512,8 @@
       <w:pPr>
         <w:pStyle w:val="Titolo2"/>
       </w:pPr>
-      <w:bookmarkStart w:id="3" w:name="_Toc243496257"/>
-      <w:r>
-        <w:lastRenderedPageBreak/>
+      <w:bookmarkStart w:id="3" w:name="_Toc243497040"/>
+      <w:r>
         <w:t>2.2 Colori</w:t>
       </w:r>
       <w:bookmarkEnd w:id="3"/>
@@ -3910,7 +3907,7 @@
       <w:pPr>
         <w:pStyle w:val="Titolo2"/>
       </w:pPr>
-      <w:bookmarkStart w:id="4" w:name="_Toc243496258"/>
+      <w:bookmarkStart w:id="4" w:name="_Toc243497041"/>
       <w:r>
         <w:t>2.3 Icona in uso: 17 «Foglio oro» (serie 4)</w:t>
       </w:r>
@@ -3944,7 +3941,7 @@
           <w:noProof/>
         </w:rPr>
         <w:drawing>
-          <wp:inline distT="0" distB="0" distL="0" distR="0" wp14:anchorId="4DE6B4FC" wp14:editId="26B9F8D9">
+          <wp:inline distT="0" distB="0" distL="0" distR="0" wp14:anchorId="6F173B88" wp14:editId="6953C00C">
             <wp:extent cx="5334000" cy="5895975"/>
             <wp:effectExtent l="0" t="0" r="0" b="0"/>
             <wp:docPr id="2" name="Immagine 2"/>
@@ -3996,7 +3993,6 @@
           <w:sz w:val="18"/>
           <w:szCs w:val="18"/>
         </w:rPr>
-        <w:lastRenderedPageBreak/>
         <w:t>Figura 1 – Serie 4: le 3 varianti (in alto) e i favicon abbinati (in basso).</w:t>
       </w:r>
     </w:p>
@@ -4365,7 +4361,7 @@
       <w:pPr>
         <w:pStyle w:val="Titolo2"/>
       </w:pPr>
-      <w:bookmarkStart w:id="5" w:name="_Toc243496259"/>
+      <w:bookmarkStart w:id="5" w:name="_Toc243497042"/>
       <w:r>
         <w:t>2.4 Serie 3, non scelta (la 11 è diventata la serie 4)</w:t>
       </w:r>
@@ -4389,7 +4385,7 @@
           <w:noProof/>
         </w:rPr>
         <w:drawing>
-          <wp:inline distT="0" distB="0" distL="0" distR="0" wp14:anchorId="478C5361" wp14:editId="6D679311">
+          <wp:inline distT="0" distB="0" distL="0" distR="0" wp14:anchorId="4CFB7F13" wp14:editId="6746D943">
             <wp:extent cx="5905500" cy="4133850"/>
             <wp:effectExtent l="0" t="0" r="0" b="0"/>
             <wp:docPr id="3" name="Immagine 3"/>
@@ -4793,7 +4789,6 @@
           </w:tcPr>
           <w:p>
             <w:r>
-              <w:lastRenderedPageBreak/>
               <w:t>13</w:t>
             </w:r>
           </w:p>
@@ -5076,7 +5071,7 @@
       <w:pPr>
         <w:pStyle w:val="Titolo2"/>
       </w:pPr>
-      <w:bookmarkStart w:id="6" w:name="_Toc243496260"/>
+      <w:bookmarkStart w:id="6" w:name="_Toc243497043"/>
       <w:r>
         <w:t>2.5 Serie 2, non scelta</w:t>
       </w:r>
@@ -5100,7 +5095,7 @@
           <w:noProof/>
         </w:rPr>
         <w:drawing>
-          <wp:inline distT="0" distB="0" distL="0" distR="0" wp14:anchorId="3981E36B" wp14:editId="46FE5D9B">
+          <wp:inline distT="0" distB="0" distL="0" distR="0" wp14:anchorId="2409C59E" wp14:editId="25EF15EB">
             <wp:extent cx="5905500" cy="4133850"/>
             <wp:effectExtent l="0" t="0" r="0" b="0"/>
             <wp:docPr id="4" name="Immagine 4"/>
@@ -5698,7 +5693,6 @@
           </w:tcPr>
           <w:p>
             <w:r>
-              <w:lastRenderedPageBreak/>
               <w:t>10</w:t>
             </w:r>
           </w:p>
@@ -5821,7 +5815,7 @@
       <w:pPr>
         <w:pStyle w:val="Titolo2"/>
       </w:pPr>
-      <w:bookmarkStart w:id="7" w:name="_Toc243496261"/>
+      <w:bookmarkStart w:id="7" w:name="_Toc243497044"/>
       <w:r>
         <w:t>2.6 Serie 1, scartata</w:t>
       </w:r>
@@ -5845,7 +5839,7 @@
           <w:noProof/>
         </w:rPr>
         <w:drawing>
-          <wp:inline distT="0" distB="0" distL="0" distR="0" wp14:anchorId="2759E611" wp14:editId="3EDBDD16">
+          <wp:inline distT="0" distB="0" distL="0" distR="0" wp14:anchorId="602891D7" wp14:editId="0F6FCB29">
             <wp:extent cx="4000500" cy="2800350"/>
             <wp:effectExtent l="0" t="0" r="0" b="0"/>
             <wp:docPr id="5" name="Immagine 5"/>
@@ -5904,7 +5898,7 @@
       <w:pPr>
         <w:pStyle w:val="Titolo2"/>
       </w:pPr>
-      <w:bookmarkStart w:id="8" w:name="_Toc243496262"/>
+      <w:bookmarkStart w:id="8" w:name="_Toc243497045"/>
       <w:r>
         <w:t>2.7 Verifica dei marchi registrati</w:t>
       </w:r>
@@ -6156,7 +6150,7 @@
       <w:pPr>
         <w:pStyle w:val="Titolo1"/>
       </w:pPr>
-      <w:bookmarkStart w:id="9" w:name="_Toc243496263"/>
+      <w:bookmarkStart w:id="9" w:name="_Toc243497046"/>
       <w:r>
         <w:t>3. Temi colore</w:t>
       </w:r>
@@ -6189,9 +6183,8 @@
         <w:rPr>
           <w:noProof/>
         </w:rPr>
-        <w:lastRenderedPageBreak/>
         <w:drawing>
-          <wp:inline distT="0" distB="0" distL="0" distR="0" wp14:anchorId="13BD76B4" wp14:editId="667F8578">
+          <wp:inline distT="0" distB="0" distL="0" distR="0" wp14:anchorId="4ED1A681" wp14:editId="5BED8F0F">
             <wp:extent cx="4572000" cy="3429000"/>
             <wp:effectExtent l="0" t="0" r="0" b="0"/>
             <wp:docPr id="6" name="Immagine 6"/>
@@ -6901,7 +6894,7 @@
       <w:pPr>
         <w:pStyle w:val="Titolo1"/>
       </w:pPr>
-      <w:bookmarkStart w:id="10" w:name="_Toc243496264"/>
+      <w:bookmarkStart w:id="10" w:name="_Toc243497047"/>
       <w:r>
         <w:t>4. Correzione: avvisi «come JavaScript»</w:t>
       </w:r>
@@ -6911,7 +6904,7 @@
       <w:pPr>
         <w:pStyle w:val="Titolo2"/>
       </w:pPr>
-      <w:bookmarkStart w:id="11" w:name="_Toc243496265"/>
+      <w:bookmarkStart w:id="11" w:name="_Toc243497048"/>
       <w:r>
         <w:t>4.1 Il problema</w:t>
       </w:r>
@@ -7314,7 +7307,7 @@
       <w:pPr>
         <w:pStyle w:val="Titolo2"/>
       </w:pPr>
-      <w:bookmarkStart w:id="12" w:name="_Toc243496266"/>
+      <w:bookmarkStart w:id="12" w:name="_Toc243497049"/>
       <w:r>
         <w:t>4.2 La soluzione</w:t>
       </w:r>
@@ -7447,7 +7440,7 @@
           <w:noProof/>
         </w:rPr>
         <w:drawing>
-          <wp:inline distT="0" distB="0" distL="0" distR="0" wp14:anchorId="453041A2" wp14:editId="6752B30C">
+          <wp:inline distT="0" distB="0" distL="0" distR="0" wp14:anchorId="43961761" wp14:editId="700BB169">
             <wp:extent cx="4572000" cy="3429000"/>
             <wp:effectExtent l="0" t="0" r="0" b="0"/>
             <wp:docPr id="7" name="Immagine 7"/>
@@ -7506,7 +7499,7 @@
       <w:pPr>
         <w:pStyle w:val="Titolo2"/>
       </w:pPr>
-      <w:bookmarkStart w:id="13" w:name="_Toc243496267"/>
+      <w:bookmarkStart w:id="13" w:name="_Toc243497050"/>
       <w:r>
         <w:t>4.3 Verifiche</w:t>
       </w:r>
@@ -7553,7 +7546,7 @@
       <w:pPr>
         <w:pStyle w:val="Titolo2"/>
       </w:pPr>
-      <w:bookmarkStart w:id="14" w:name="_Toc243496268"/>
+      <w:bookmarkStart w:id="14" w:name="_Toc243497051"/>
       <w:r>
         <w:t>4.4 Android: menu Tema e notifiche (versione 1.0.1)</w:t>
       </w:r>
@@ -7821,7 +7814,6 @@
           </w:tcPr>
           <w:p>
             <w:r>
-              <w:lastRenderedPageBreak/>
               <w:t>Non si leggono tutte le notifiche</w:t>
             </w:r>
           </w:p>
@@ -7889,7 +7881,7 @@
       <w:pPr>
         <w:pStyle w:val="Titolo2"/>
       </w:pPr>
-      <w:bookmarkStart w:id="15" w:name="_Toc243496269"/>
+      <w:bookmarkStart w:id="15" w:name="_Toc243497052"/>
       <w:r>
         <w:t>4.5 App più leggera: traduzione tolta</w:t>
       </w:r>
@@ -8322,7 +8314,7 @@
       <w:pPr>
         <w:pStyle w:val="Titolo2"/>
       </w:pPr>
-      <w:bookmarkStart w:id="16" w:name="_Toc243496270"/>
+      <w:bookmarkStart w:id="16" w:name="_Toc243497053"/>
       <w:r>
         <w:t>4.6 Schede in una nuova finestra</w:t>
       </w:r>
@@ -8440,7 +8432,7 @@
           <w:noProof/>
         </w:rPr>
         <w:drawing>
-          <wp:inline distT="0" distB="0" distL="0" distR="0" wp14:anchorId="6AABD356" wp14:editId="5CD76D5F">
+          <wp:inline distT="0" distB="0" distL="0" distR="0" wp14:anchorId="0BA20CCC" wp14:editId="62D1A721">
             <wp:extent cx="5715000" cy="857250"/>
             <wp:effectExtent l="0" t="0" r="0" b="0"/>
             <wp:docPr id="8" name="Immagine 8"/>
@@ -8638,7 +8630,6 @@
           </w:tcPr>
           <w:p>
             <w:r>
-              <w:lastRenderedPageBreak/>
               <w:t>Linux</w:t>
             </w:r>
           </w:p>
@@ -8730,7 +8721,7 @@
       <w:pPr>
         <w:pStyle w:val="Titolo2"/>
       </w:pPr>
-      <w:bookmarkStart w:id="17" w:name="_Toc243496271"/>
+      <w:bookmarkStart w:id="17" w:name="_Toc243497054"/>
       <w:r>
         <w:t>4.7 Riunire le finestre</w:t>
       </w:r>
@@ -8832,7 +8823,7 @@
       <w:pPr>
         <w:pStyle w:val="Titolo2"/>
       </w:pPr>
-      <w:bookmarkStart w:id="18" w:name="_Toc243496272"/>
+      <w:bookmarkStart w:id="18" w:name="_Toc243497055"/>
       <w:r>
         <w:t>4.8 Correzioni di «Modifica testo»</w:t>
       </w:r>
@@ -9096,9 +9087,8 @@
         <w:rPr>
           <w:noProof/>
         </w:rPr>
-        <w:lastRenderedPageBreak/>
         <w:drawing>
-          <wp:inline distT="0" distB="0" distL="0" distR="0" wp14:anchorId="4F8BBB44" wp14:editId="3E9BECCE">
+          <wp:inline distT="0" distB="0" distL="0" distR="0" wp14:anchorId="20057F99" wp14:editId="0DFCC58F">
             <wp:extent cx="3286125" cy="2286000"/>
             <wp:effectExtent l="0" t="0" r="0" b="0"/>
             <wp:docPr id="9" name="Immagine 9"/>
@@ -9163,7 +9153,7 @@
           <w:noProof/>
         </w:rPr>
         <w:drawing>
-          <wp:inline distT="0" distB="0" distL="0" distR="0" wp14:anchorId="7ED87126" wp14:editId="5079C899">
+          <wp:inline distT="0" distB="0" distL="0" distR="0" wp14:anchorId="3533C289" wp14:editId="1DBAD578">
             <wp:extent cx="3286125" cy="2286000"/>
             <wp:effectExtent l="0" t="0" r="0" b="0"/>
             <wp:docPr id="10" name="Immagine 10"/>
@@ -9230,7 +9220,7 @@
       <w:pPr>
         <w:pStyle w:val="Titolo1"/>
       </w:pPr>
-      <w:bookmarkStart w:id="19" w:name="_Toc243496273"/>
+      <w:bookmarkStart w:id="19" w:name="_Toc243497056"/>
       <w:r>
         <w:t>5. Decisioni</w:t>
       </w:r>
@@ -9248,7 +9238,7 @@
       <w:pPr>
         <w:pStyle w:val="Titolo2"/>
       </w:pPr>
-      <w:bookmarkStart w:id="20" w:name="_Toc243496274"/>
+      <w:bookmarkStart w:id="20" w:name="_Toc243497057"/>
       <w:r>
         <w:t>5.1 Canale degli aggiornamenti</w:t>
       </w:r>
@@ -9699,7 +9689,6 @@
           </w:tcPr>
           <w:p>
             <w:r>
-              <w:lastRenderedPageBreak/>
               <w:t>Compromesso efficace</w:t>
             </w:r>
           </w:p>
@@ -9756,7 +9745,7 @@
       <w:pPr>
         <w:pStyle w:val="Titolo2"/>
       </w:pPr>
-      <w:bookmarkStart w:id="21" w:name="_Toc243496275"/>
+      <w:bookmarkStart w:id="21" w:name="_Toc243497058"/>
       <w:r>
         <w:t>5.2 Storia del repository</w:t>
       </w:r>
@@ -10263,7 +10252,7 @@
       <w:pPr>
         <w:pStyle w:val="Titolo2"/>
       </w:pPr>
-      <w:bookmarkStart w:id="22" w:name="_Toc243496276"/>
+      <w:bookmarkStart w:id="22" w:name="_Toc243497059"/>
       <w:r>
         <w:t>5.3 Identificativi del prodotto</w:t>
       </w:r>
@@ -10763,9 +10752,8 @@
       <w:pPr>
         <w:pStyle w:val="Titolo2"/>
       </w:pPr>
-      <w:bookmarkStart w:id="23" w:name="_Toc243496277"/>
-      <w:r>
-        <w:lastRenderedPageBreak/>
+      <w:bookmarkStart w:id="23" w:name="_Toc243497060"/>
+      <w:r>
         <w:t>5.4 Avvisi e domande</w:t>
       </w:r>
       <w:bookmarkEnd w:id="23"/>
@@ -11271,7 +11259,7 @@
       <w:pPr>
         <w:pStyle w:val="Titolo2"/>
       </w:pPr>
-      <w:bookmarkStart w:id="24" w:name="_Toc243496278"/>
+      <w:bookmarkStart w:id="24" w:name="_Toc243497061"/>
       <w:r>
         <w:t>5.5 Traduzione offline</w:t>
       </w:r>
@@ -11778,7 +11766,7 @@
       <w:pPr>
         <w:pStyle w:val="Titolo2"/>
       </w:pPr>
-      <w:bookmarkStart w:id="25" w:name="_Toc243496279"/>
+      <w:bookmarkStart w:id="25" w:name="_Toc243497062"/>
       <w:r>
         <w:t>5.6 Passaggio della scheda alla nuova finestra</w:t>
       </w:r>
@@ -12300,7 +12288,7 @@
       <w:pPr>
         <w:pStyle w:val="Titolo2"/>
       </w:pPr>
-      <w:bookmarkStart w:id="26" w:name="_Toc243496280"/>
+      <w:bookmarkStart w:id="26" w:name="_Toc243497063"/>
       <w:r>
         <w:t>5.7 Come si cancella la riga in «Modifica testo»</w:t>
       </w:r>
@@ -12807,7 +12795,7 @@
       <w:pPr>
         <w:pStyle w:val="Titolo1"/>
       </w:pPr>
-      <w:bookmarkStart w:id="27" w:name="_Toc243496281"/>
+      <w:bookmarkStart w:id="27" w:name="_Toc243497064"/>
       <w:r>
         <w:t>6. Come si lavora</w:t>
       </w:r>
@@ -12817,7 +12805,7 @@
       <w:pPr>
         <w:pStyle w:val="Titolo2"/>
       </w:pPr>
-      <w:bookmarkStart w:id="28" w:name="_Toc243496282"/>
+      <w:bookmarkStart w:id="28" w:name="_Toc243497065"/>
       <w:r>
         <w:t>6.1 Comandi</w:t>
       </w:r>
@@ -12887,7 +12875,7 @@
       <w:pPr>
         <w:pStyle w:val="Titolo2"/>
       </w:pPr>
-      <w:bookmarkStart w:id="29" w:name="_Toc243496283"/>
+      <w:bookmarkStart w:id="29" w:name="_Toc243497066"/>
       <w:r>
         <w:t>6.2 Pubblicare una versione</w:t>
       </w:r>
@@ -13008,7 +12996,6 @@
         <w:spacing w:after="60"/>
       </w:pPr>
       <w:r>
-        <w:lastRenderedPageBreak/>
         <w:t>La pipeline compila Windows, macOS, Linux e Android e pubblica la GitHub Release con installer e file di versione.</w:t>
       </w:r>
     </w:p>
@@ -13016,7 +13003,7 @@
       <w:pPr>
         <w:pStyle w:val="Titolo2"/>
       </w:pPr>
-      <w:bookmarkStart w:id="30" w:name="_Toc243496284"/>
+      <w:bookmarkStart w:id="30" w:name="_Toc243497067"/>
       <w:r>
         <w:t>6.3 Release 1.0.0 (pubblicata il 16 ottobre 2026)</w:t>
       </w:r>
@@ -13743,7 +13730,7 @@
       <w:pPr>
         <w:pStyle w:val="Titolo2"/>
       </w:pPr>
-      <w:bookmarkStart w:id="31" w:name="_Toc243496285"/>
+      <w:bookmarkStart w:id="31" w:name="_Toc243497068"/>
       <w:r>
         <w:t>6.4 Release 1.0.1</w:t>
       </w:r>
@@ -14040,9 +14027,8 @@
       <w:pPr>
         <w:pStyle w:val="Titolo2"/>
       </w:pPr>
-      <w:bookmarkStart w:id="32" w:name="_Toc243496286"/>
-      <w:r>
-        <w:lastRenderedPageBreak/>
+      <w:bookmarkStart w:id="32" w:name="_Toc243497069"/>
+      <w:r>
         <w:t>6.5 Release 1.0.2 e repository pubblico</w:t>
       </w:r>
       <w:bookmarkEnd w:id="32"/>
@@ -14463,7 +14449,7 @@
       <w:pPr>
         <w:pStyle w:val="Titolo2"/>
       </w:pPr>
-      <w:bookmarkStart w:id="33" w:name="_Toc243496287"/>
+      <w:bookmarkStart w:id="33" w:name="_Toc243497070"/>
       <w:r>
         <w:t>6.6 Nuova versione: link diretto per ogni sistema</w:t>
       </w:r>
@@ -14879,9 +14865,8 @@
         <w:rPr>
           <w:noProof/>
         </w:rPr>
-        <w:lastRenderedPageBreak/>
         <w:drawing>
-          <wp:inline distT="0" distB="0" distL="0" distR="0" wp14:anchorId="6B1170EB" wp14:editId="1725D153">
+          <wp:inline distT="0" distB="0" distL="0" distR="0" wp14:anchorId="239C0BF3" wp14:editId="34833B53">
             <wp:extent cx="4572000" cy="4429125"/>
             <wp:effectExtent l="0" t="0" r="0" b="0"/>
             <wp:docPr id="11" name="Immagine 11"/>
@@ -14956,7 +14941,7 @@
       <w:pPr>
         <w:pStyle w:val="Titolo2"/>
       </w:pPr>
-      <w:bookmarkStart w:id="34" w:name="_Toc243496288"/>
+      <w:bookmarkStart w:id="34" w:name="_Toc243497071"/>
       <w:r>
         <w:t>6.7 Release 1.1.0</w:t>
       </w:r>
@@ -15520,9 +15505,8 @@
       <w:pPr>
         <w:pStyle w:val="Titolo2"/>
       </w:pPr>
-      <w:bookmarkStart w:id="35" w:name="_Toc243496289"/>
-      <w:r>
-        <w:lastRenderedPageBreak/>
+      <w:bookmarkStart w:id="35" w:name="_Toc243497072"/>
+      <w:r>
         <w:t>6.8 Versione 1.2.0</w:t>
       </w:r>
       <w:bookmarkEnd w:id="35"/>
@@ -16070,7 +16054,7 @@
       <w:pPr>
         <w:pStyle w:val="Titolo2"/>
       </w:pPr>
-      <w:bookmarkStart w:id="36" w:name="_Toc243496290"/>
+      <w:bookmarkStart w:id="36" w:name="_Toc243497073"/>
       <w:r>
         <w:t>6.9 Versione 1.2.1</w:t>
       </w:r>
@@ -16081,25 +16065,14 @@
         <w:spacing w:after="120"/>
       </w:pPr>
       <w:r>
-        <w:t xml:space="preserve">Preparata il 21 ottobre 2026 con la sola correzione della chiusura della finestra rimasta vuota (vedi 4.7): installer Windows 101.2.1, Android 1001002001. Pubblicazione con il tag </w:t>
-      </w:r>
-      <w:r>
-        <w:rPr>
-          <w:rFonts w:ascii="Consolas" w:eastAsia="Consolas" w:hAnsi="Consolas" w:cs="Consolas"/>
-          <w:sz w:val="19"/>
-          <w:szCs w:val="19"/>
-        </w:rPr>
-        <w:t>v1.2.1</w:t>
-      </w:r>
-      <w:r>
-        <w:t>.</w:t>
+        <w:t>Pubblicata il 21 ottobre 2026 (release «Latest», pipeline riuscita in 6 minuti) con la sola correzione della chiusura della finestra rimasta vuota (vedi 4.7): installer Windows 101.2.1, Android 1001002001; dimensioni come la 1.2.0 (MSI 131,6 MB, DMG 160,4 MB, AppImage 175,0 MB, APK 64,6 MB). Prova senza account GitHub: i 4 link diretti rispondono, l'ultima versione è la 1.2.1 e un'app 1.2.0 riceve l'installer del proprio sistema.</w:t>
       </w:r>
     </w:p>
     <w:p>
       <w:pPr>
         <w:pStyle w:val="Titolo2"/>
       </w:pPr>
-      <w:bookmarkStart w:id="37" w:name="_Toc243496291"/>
+      <w:bookmarkStart w:id="37" w:name="_Toc243497074"/>
       <w:r>
         <w:t>6.10 Ruoli</w:t>
       </w:r>
@@ -16372,7 +16345,7 @@
       <w:pPr>
         <w:pStyle w:val="Titolo1"/>
       </w:pPr>
-      <w:bookmarkStart w:id="38" w:name="_Toc243496292"/>
+      <w:bookmarkStart w:id="38" w:name="_Toc243497075"/>
       <w:r>
         <w:t>7. Sicurezza</w:t>
       </w:r>
@@ -16671,9 +16644,8 @@
       <w:pPr>
         <w:pStyle w:val="Titolo1"/>
       </w:pPr>
-      <w:bookmarkStart w:id="39" w:name="_Toc243496293"/>
-      <w:r>
-        <w:lastRenderedPageBreak/>
+      <w:bookmarkStart w:id="39" w:name="_Toc243497076"/>
+      <w:r>
         <w:t>8. Punti aperti</w:t>
       </w:r>
       <w:bookmarkEnd w:id="39"/>
@@ -16859,7 +16831,7 @@
       <w:pPr>
         <w:pStyle w:val="Titolo1"/>
       </w:pPr>
-      <w:bookmarkStart w:id="40" w:name="_Toc243496294"/>
+      <w:bookmarkStart w:id="40" w:name="_Toc243497077"/>
       <w:r>
         <w:t>9. Pensato per i prossimi 10 anni</w:t>
       </w:r>
@@ -17137,118 +17109,150 @@
 <file path=word/numbering.xml><?xml version="1.0" encoding="utf-8"?>
 <w:numbering xmlns:wpc="http://schemas.microsoft.com/office/word/2010/wordprocessingCanvas" xmlns:cx="http://schemas.microsoft.com/office/drawing/2014/chartex" xmlns:cx1="http://schemas.microsoft.com/office/drawing/2015/9/8/chartex" xmlns:cx2="http://schemas.microsoft.com/office/drawing/2015/10/21/chartex" xmlns:cx3="http://schemas.microsoft.com/office/drawing/2016/5/9/chartex" xmlns:cx4="http://schemas.microsoft.com/office/drawing/2016/5/10/chartex" xmlns:cx5="http://schemas.microsoft.com/office/drawing/2016/5/11/chartex" xmlns:cx6="http://schemas.microsoft.com/office/drawing/2016/5/12/chartex" xmlns:cx7="http://schemas.microsoft.com/office/drawing/2016/5/13/chartex" xmlns:cx8="http://schemas.microsoft.com/office/drawing/2016/5/14/chartex" xmlns:mc="http://schemas.openxmlformats.org/markup-compatibility/2006" xmlns:aink="http://schemas.microsoft.com/office/drawing/2016/ink" xmlns:am3d="http://schemas.microsoft.com/office/drawing/2017/model3d" xmlns:o="urn:schemas-microsoft-com:office:office" xmlns:oel="http://schemas.microsoft.com/office/2019/extlst" xmlns:r="http://schemas.openxmlformats.org/officeDocument/2006/relationships" xmlns:m="http://schemas.openxmlformats.org/officeDocument/2006/math" xmlns:v="urn:schemas-microsoft-com:vml" xmlns:wp14="http://schemas.microsoft.com/office/word/2010/wordprocessingDrawing" xmlns:wp="http://schemas.openxmlformats.org/drawingml/2006/wordprocessingDrawing" xmlns:w10="urn:schemas-microsoft-com:office:word" xmlns:w="http://schemas.openxmlformats.org/wordprocessingml/2006/main" xmlns:w14="http://schemas.microsoft.com/office/word/2010/wordml" xmlns:w15="http://schemas.microsoft.com/office/word/2012/wordml" xmlns:w16cex="http://schemas.microsoft.com/office/word/2018/wordml/cex" xmlns:w16cid="http://schemas.microsoft.com/office/word/2016/wordml/cid" xmlns:w16="http://schemas.microsoft.com/office/word/2018/wordml" xmlns:w16du="http://schemas.microsoft.com/office/word/2023/wordml/word16du" xmlns:w16sdtdh="http://schemas.microsoft.com/office/word/2020/wordml/sdtdatahash" xmlns:w16sdtfl="http://schemas.microsoft.com/office/word/2024/wordml/sdtformatlock" xmlns:w16se="http://schemas.microsoft.com/office/word/2015/wordml/symex" xmlns:wpg="http://schemas.microsoft.com/office/word/2010/wordprocessingGroup" xmlns:wpi="http://schemas.microsoft.com/office/word/2010/wordprocessingInk" xmlns:wne="http://schemas.microsoft.com/office/word/2006/wordml" xmlns:wps="http://schemas.microsoft.com/office/word/2010/wordprocessingShape" mc:Ignorable="w14 w15 w16se w16cid w16 w16cex w16sdtdh w16sdtfl w16du wp14">
   <w:abstractNum w:abstractNumId="0" w15:restartNumberingAfterBreak="0">
-    <w:nsid w:val="19BD2FBC"/>
+    <w:nsid w:val="58B977D2"/>
     <w:multiLevelType w:val="hybridMultilevel"/>
-    <w:tmpl w:val="0C08CAD8"/>
-    <w:lvl w:ilvl="0" w:tplc="662E64EC">
+    <w:tmpl w:val="419C85F4"/>
+    <w:lvl w:ilvl="0" w:tplc="58787940" w:tentative="1">
       <w:start w:val="1"/>
       <w:numFmt w:val="bullet"/>
-      <w:lvlText w:val="•"/>
+      <w:lvlText w:val="●"/>
       <w:lvlJc w:val="left"/>
       <w:pPr>
-        <w:ind w:left="540" w:hanging="270"/>
+        <w:ind w:left="720" w:hanging="360"/>
       </w:pPr>
     </w:lvl>
-    <w:lvl w:ilvl="1" w:tplc="4CD4F988">
+    <w:lvl w:ilvl="1" w:tplc="F832631A" w:tentative="1">
+      <w:start w:val="1"/>
+      <w:numFmt w:val="bullet"/>
+      <w:lvlText w:val="○"/>
+      <w:lvlJc w:val="left"/>
+      <w:pPr>
+        <w:ind w:left="1440" w:hanging="360"/>
+      </w:pPr>
+    </w:lvl>
+    <w:lvl w:ilvl="2" w:tplc="6B88BF02" w:tentative="1">
+      <w:start w:val="1"/>
+      <w:numFmt w:val="bullet"/>
+      <w:lvlText w:val="■"/>
+      <w:lvlJc w:val="left"/>
+      <w:pPr>
+        <w:ind w:left="2160" w:hanging="360"/>
+      </w:pPr>
+    </w:lvl>
+    <w:lvl w:ilvl="3" w:tplc="2A821656" w:tentative="1">
+      <w:start w:val="1"/>
+      <w:numFmt w:val="bullet"/>
+      <w:lvlText w:val="●"/>
+      <w:lvlJc w:val="left"/>
+      <w:pPr>
+        <w:ind w:left="2880" w:hanging="360"/>
+      </w:pPr>
+    </w:lvl>
+    <w:lvl w:ilvl="4" w:tplc="323C6D14" w:tentative="1">
+      <w:start w:val="1"/>
+      <w:numFmt w:val="bullet"/>
+      <w:lvlText w:val="○"/>
+      <w:lvlJc w:val="left"/>
+      <w:pPr>
+        <w:ind w:left="3600" w:hanging="360"/>
+      </w:pPr>
+    </w:lvl>
+    <w:lvl w:ilvl="5" w:tplc="1310AFAE" w:tentative="1">
+      <w:start w:val="1"/>
+      <w:numFmt w:val="bullet"/>
+      <w:lvlText w:val="■"/>
+      <w:lvlJc w:val="left"/>
+      <w:pPr>
+        <w:ind w:left="4320" w:hanging="360"/>
+      </w:pPr>
+    </w:lvl>
+    <w:lvl w:ilvl="6" w:tplc="36C20CF0" w:tentative="1">
+      <w:start w:val="1"/>
+      <w:numFmt w:val="bullet"/>
+      <w:lvlText w:val="●"/>
+      <w:lvlJc w:val="left"/>
+      <w:pPr>
+        <w:ind w:left="5040" w:hanging="360"/>
+      </w:pPr>
+    </w:lvl>
+    <w:lvl w:ilvl="7" w:tplc="CE7E3DF8" w:tentative="1">
+      <w:start w:val="1"/>
+      <w:numFmt w:val="bullet"/>
+      <w:lvlText w:val="●"/>
+      <w:lvlJc w:val="left"/>
+      <w:pPr>
+        <w:ind w:left="5760" w:hanging="360"/>
+      </w:pPr>
+    </w:lvl>
+    <w:lvl w:ilvl="8" w:tplc="BE7AC854" w:tentative="1">
+      <w:start w:val="1"/>
+      <w:numFmt w:val="bullet"/>
+      <w:lvlText w:val="●"/>
+      <w:lvlJc w:val="left"/>
+      <w:pPr>
+        <w:ind w:left="6480" w:hanging="360"/>
+      </w:pPr>
+    </w:lvl>
+  </w:abstractNum>
+  <w:abstractNum w:abstractNumId="1" w15:restartNumberingAfterBreak="0">
+    <w:nsid w:val="5CF31064"/>
+    <w:multiLevelType w:val="hybridMultilevel"/>
+    <w:tmpl w:val="EA80B33C"/>
+    <w:lvl w:ilvl="0" w:tplc="918C3DE6">
+      <w:start w:val="1"/>
+      <w:numFmt w:val="decimal"/>
+      <w:lvlText w:val="%1."/>
+      <w:lvlJc w:val="left"/>
+      <w:pPr>
+        <w:ind w:left="540" w:hanging="300"/>
+      </w:pPr>
+    </w:lvl>
+    <w:lvl w:ilvl="1" w:tplc="F8741086">
       <w:numFmt w:val="decimal"/>
       <w:lvlText w:val=""/>
       <w:lvlJc w:val="left"/>
     </w:lvl>
-    <w:lvl w:ilvl="2" w:tplc="99144428">
+    <w:lvl w:ilvl="2" w:tplc="444C91CE">
       <w:numFmt w:val="decimal"/>
       <w:lvlText w:val=""/>
       <w:lvlJc w:val="left"/>
     </w:lvl>
-    <w:lvl w:ilvl="3" w:tplc="42008188">
+    <w:lvl w:ilvl="3" w:tplc="F32CA364">
       <w:numFmt w:val="decimal"/>
       <w:lvlText w:val=""/>
       <w:lvlJc w:val="left"/>
     </w:lvl>
-    <w:lvl w:ilvl="4" w:tplc="ADB45746">
+    <w:lvl w:ilvl="4" w:tplc="D7D462CE">
       <w:numFmt w:val="decimal"/>
       <w:lvlText w:val=""/>
       <w:lvlJc w:val="left"/>
     </w:lvl>
-    <w:lvl w:ilvl="5" w:tplc="AAE22A7A">
+    <w:lvl w:ilvl="5" w:tplc="EFFAEBB8">
       <w:numFmt w:val="decimal"/>
       <w:lvlText w:val=""/>
       <w:lvlJc w:val="left"/>
     </w:lvl>
-    <w:lvl w:ilvl="6" w:tplc="01BE126A">
+    <w:lvl w:ilvl="6" w:tplc="B04027E4">
       <w:numFmt w:val="decimal"/>
       <w:lvlText w:val=""/>
       <w:lvlJc w:val="left"/>
     </w:lvl>
-    <w:lvl w:ilvl="7" w:tplc="B99418F8">
+    <w:lvl w:ilvl="7" w:tplc="C778E632">
       <w:numFmt w:val="decimal"/>
       <w:lvlText w:val=""/>
       <w:lvlJc w:val="left"/>
     </w:lvl>
-    <w:lvl w:ilvl="8" w:tplc="62FA87FA">
-      <w:numFmt w:val="decimal"/>
-      <w:lvlText w:val=""/>
-      <w:lvlJc w:val="left"/>
-    </w:lvl>
-  </w:abstractNum>
-  <w:abstractNum w:abstractNumId="1" w15:restartNumberingAfterBreak="0">
-    <w:nsid w:val="45A467AE"/>
-    <w:multiLevelType w:val="hybridMultilevel"/>
-    <w:tmpl w:val="B4F4719C"/>
-    <w:lvl w:ilvl="0" w:tplc="CC30C2D6">
-      <w:start w:val="1"/>
-      <w:numFmt w:val="decimal"/>
-      <w:lvlText w:val="%1."/>
-      <w:lvlJc w:val="left"/>
-      <w:pPr>
-        <w:ind w:left="540" w:hanging="300"/>
-      </w:pPr>
-    </w:lvl>
-    <w:lvl w:ilvl="1" w:tplc="2A92888A">
-      <w:numFmt w:val="decimal"/>
-      <w:lvlText w:val=""/>
-      <w:lvlJc w:val="left"/>
-    </w:lvl>
-    <w:lvl w:ilvl="2" w:tplc="9F088CCC">
-      <w:numFmt w:val="decimal"/>
-      <w:lvlText w:val=""/>
-      <w:lvlJc w:val="left"/>
-    </w:lvl>
-    <w:lvl w:ilvl="3" w:tplc="D140102C">
-      <w:numFmt w:val="decimal"/>
-      <w:lvlText w:val=""/>
-      <w:lvlJc w:val="left"/>
-    </w:lvl>
-    <w:lvl w:ilvl="4" w:tplc="B692B210">
-      <w:numFmt w:val="decimal"/>
-      <w:lvlText w:val=""/>
-      <w:lvlJc w:val="left"/>
-    </w:lvl>
-    <w:lvl w:ilvl="5" w:tplc="A85C5C88">
-      <w:numFmt w:val="decimal"/>
-      <w:lvlText w:val=""/>
-      <w:lvlJc w:val="left"/>
-    </w:lvl>
-    <w:lvl w:ilvl="6" w:tplc="4B206C96">
-      <w:numFmt w:val="decimal"/>
-      <w:lvlText w:val=""/>
-      <w:lvlJc w:val="left"/>
-    </w:lvl>
-    <w:lvl w:ilvl="7" w:tplc="208AB0D8">
-      <w:numFmt w:val="decimal"/>
-      <w:lvlText w:val=""/>
-      <w:lvlJc w:val="left"/>
-    </w:lvl>
-    <w:lvl w:ilvl="8" w:tplc="F510FEA4">
+    <w:lvl w:ilvl="8" w:tplc="B97EB3AC">
       <w:numFmt w:val="decimal"/>
       <w:lvlText w:val=""/>
       <w:lvlJc w:val="left"/>
     </w:lvl>
   </w:abstractNum>
   <w:abstractNum w:abstractNumId="2" w15:restartNumberingAfterBreak="0">
-    <w:nsid w:val="502E4DC0"/>
+    <w:nsid w:val="69DF5D36"/>
     <w:multiLevelType w:val="hybridMultilevel"/>
-    <w:tmpl w:val="2C74D37E"/>
-    <w:lvl w:ilvl="0" w:tplc="16982042">
+    <w:tmpl w:val="4E8A7964"/>
+    <w:lvl w:ilvl="0" w:tplc="61880348">
       <w:start w:val="1"/>
       <w:numFmt w:val="decimal"/>
       <w:lvlText w:val="%1."/>
@@ -17257,152 +17261,120 @@
         <w:ind w:left="540" w:hanging="300"/>
       </w:pPr>
     </w:lvl>
-    <w:lvl w:ilvl="1" w:tplc="DB2CD8C8">
+    <w:lvl w:ilvl="1" w:tplc="27402F84">
       <w:numFmt w:val="decimal"/>
       <w:lvlText w:val=""/>
       <w:lvlJc w:val="left"/>
     </w:lvl>
-    <w:lvl w:ilvl="2" w:tplc="1152D5B4">
+    <w:lvl w:ilvl="2" w:tplc="54E8AE98">
       <w:numFmt w:val="decimal"/>
       <w:lvlText w:val=""/>
       <w:lvlJc w:val="left"/>
     </w:lvl>
-    <w:lvl w:ilvl="3" w:tplc="0CB002E0">
+    <w:lvl w:ilvl="3" w:tplc="7BECB026">
       <w:numFmt w:val="decimal"/>
       <w:lvlText w:val=""/>
       <w:lvlJc w:val="left"/>
     </w:lvl>
-    <w:lvl w:ilvl="4" w:tplc="B81A5C30">
+    <w:lvl w:ilvl="4" w:tplc="4496848C">
       <w:numFmt w:val="decimal"/>
       <w:lvlText w:val=""/>
       <w:lvlJc w:val="left"/>
     </w:lvl>
-    <w:lvl w:ilvl="5" w:tplc="317CD684">
+    <w:lvl w:ilvl="5" w:tplc="774AB352">
       <w:numFmt w:val="decimal"/>
       <w:lvlText w:val=""/>
       <w:lvlJc w:val="left"/>
     </w:lvl>
-    <w:lvl w:ilvl="6" w:tplc="FE7EED88">
+    <w:lvl w:ilvl="6" w:tplc="EE6646BA">
       <w:numFmt w:val="decimal"/>
       <w:lvlText w:val=""/>
       <w:lvlJc w:val="left"/>
     </w:lvl>
-    <w:lvl w:ilvl="7" w:tplc="FE8CD74A">
+    <w:lvl w:ilvl="7" w:tplc="D570C220">
       <w:numFmt w:val="decimal"/>
       <w:lvlText w:val=""/>
       <w:lvlJc w:val="left"/>
     </w:lvl>
-    <w:lvl w:ilvl="8" w:tplc="B314A7E2">
+    <w:lvl w:ilvl="8" w:tplc="F90C02C0">
       <w:numFmt w:val="decimal"/>
       <w:lvlText w:val=""/>
       <w:lvlJc w:val="left"/>
     </w:lvl>
   </w:abstractNum>
   <w:abstractNum w:abstractNumId="3" w15:restartNumberingAfterBreak="0">
-    <w:nsid w:val="58800124"/>
+    <w:nsid w:val="7C540395"/>
     <w:multiLevelType w:val="hybridMultilevel"/>
-    <w:tmpl w:val="014E5246"/>
-    <w:lvl w:ilvl="0" w:tplc="E05E13C4" w:tentative="1">
+    <w:tmpl w:val="54DE4148"/>
+    <w:lvl w:ilvl="0" w:tplc="CF660176">
       <w:start w:val="1"/>
       <w:numFmt w:val="bullet"/>
-      <w:lvlText w:val="●"/>
+      <w:lvlText w:val="•"/>
       <w:lvlJc w:val="left"/>
       <w:pPr>
-        <w:ind w:left="720" w:hanging="360"/>
+        <w:ind w:left="540" w:hanging="270"/>
       </w:pPr>
     </w:lvl>
-    <w:lvl w:ilvl="1" w:tplc="A39C18D4" w:tentative="1">
-      <w:start w:val="1"/>
-      <w:numFmt w:val="bullet"/>
-      <w:lvlText w:val="○"/>
+    <w:lvl w:ilvl="1" w:tplc="73225316">
+      <w:numFmt w:val="decimal"/>
+      <w:lvlText w:val=""/>
       <w:lvlJc w:val="left"/>
-      <w:pPr>
-        <w:ind w:left="1440" w:hanging="360"/>
-      </w:pPr>
     </w:lvl>
-    <w:lvl w:ilvl="2" w:tplc="D506BD92" w:tentative="1">
-      <w:start w:val="1"/>
-      <w:numFmt w:val="bullet"/>
-      <w:lvlText w:val="■"/>
+    <w:lvl w:ilvl="2" w:tplc="D25A47C8">
+      <w:numFmt w:val="decimal"/>
+      <w:lvlText w:val=""/>
       <w:lvlJc w:val="left"/>
-      <w:pPr>
-        <w:ind w:left="2160" w:hanging="360"/>
-      </w:pPr>
     </w:lvl>
-    <w:lvl w:ilvl="3" w:tplc="144AD472" w:tentative="1">
-      <w:start w:val="1"/>
-      <w:numFmt w:val="bullet"/>
-      <w:lvlText w:val="●"/>
+    <w:lvl w:ilvl="3" w:tplc="2578B7E6">
+      <w:numFmt w:val="decimal"/>
+      <w:lvlText w:val=""/>
       <w:lvlJc w:val="left"/>
-      <w:pPr>
-        <w:ind w:left="2880" w:hanging="360"/>
-      </w:pPr>
     </w:lvl>
-    <w:lvl w:ilvl="4" w:tplc="9488B8C4" w:tentative="1">
-      <w:start w:val="1"/>
-      <w:numFmt w:val="bullet"/>
-      <w:lvlText w:val="○"/>
+    <w:lvl w:ilvl="4" w:tplc="A0DEEBDC">
+      <w:numFmt w:val="decimal"/>
+      <w:lvlText w:val=""/>
       <w:lvlJc w:val="left"/>
-      <w:pPr>
-        <w:ind w:left="3600" w:hanging="360"/>
-      </w:pPr>
     </w:lvl>
-    <w:lvl w:ilvl="5" w:tplc="D2BE45D4" w:tentative="1">
-      <w:start w:val="1"/>
-      <w:numFmt w:val="bullet"/>
-      <w:lvlText w:val="■"/>
+    <w:lvl w:ilvl="5" w:tplc="DB841832">
+      <w:numFmt w:val="decimal"/>
+      <w:lvlText w:val=""/>
       <w:lvlJc w:val="left"/>
-      <w:pPr>
-        <w:ind w:left="4320" w:hanging="360"/>
-      </w:pPr>
     </w:lvl>
-    <w:lvl w:ilvl="6" w:tplc="37669C12" w:tentative="1">
-      <w:start w:val="1"/>
-      <w:numFmt w:val="bullet"/>
-      <w:lvlText w:val="●"/>
+    <w:lvl w:ilvl="6" w:tplc="81F64892">
+      <w:numFmt w:val="decimal"/>
+      <w:lvlText w:val=""/>
       <w:lvlJc w:val="left"/>
-      <w:pPr>
-        <w:ind w:left="5040" w:hanging="360"/>
-      </w:pPr>
     </w:lvl>
-    <w:lvl w:ilvl="7" w:tplc="0E4CE5D2" w:tentative="1">
-      <w:start w:val="1"/>
-      <w:numFmt w:val="bullet"/>
-      <w:lvlText w:val="●"/>
+    <w:lvl w:ilvl="7" w:tplc="8F121FF6">
+      <w:numFmt w:val="decimal"/>
+      <w:lvlText w:val=""/>
       <w:lvlJc w:val="left"/>
-      <w:pPr>
-        <w:ind w:left="5760" w:hanging="360"/>
-      </w:pPr>
     </w:lvl>
-    <w:lvl w:ilvl="8" w:tplc="618A4CB2" w:tentative="1">
-      <w:start w:val="1"/>
-      <w:numFmt w:val="bullet"/>
-      <w:lvlText w:val="●"/>
+    <w:lvl w:ilvl="8" w:tplc="89B21B54">
+      <w:numFmt w:val="decimal"/>
+      <w:lvlText w:val=""/>
       <w:lvlJc w:val="left"/>
-      <w:pPr>
-        <w:ind w:left="6480" w:hanging="360"/>
-      </w:pPr>
     </w:lvl>
   </w:abstractNum>
-  <w:num w:numId="1" w16cid:durableId="1813599299">
+  <w:num w:numId="1" w16cid:durableId="1421759760">
+    <w:abstractNumId w:val="0"/>
+    <w:lvlOverride w:ilvl="0">
+      <w:startOverride w:val="1"/>
+    </w:lvlOverride>
+  </w:num>
+  <w:num w:numId="2" w16cid:durableId="441921221">
     <w:abstractNumId w:val="3"/>
     <w:lvlOverride w:ilvl="0">
       <w:startOverride w:val="1"/>
     </w:lvlOverride>
   </w:num>
-  <w:num w:numId="2" w16cid:durableId="1457220164">
-    <w:abstractNumId w:val="0"/>
-    <w:lvlOverride w:ilvl="0">
-      <w:startOverride w:val="1"/>
-    </w:lvlOverride>
-  </w:num>
-  <w:num w:numId="3" w16cid:durableId="1982883879">
+  <w:num w:numId="3" w16cid:durableId="739913192">
     <w:abstractNumId w:val="1"/>
     <w:lvlOverride w:ilvl="0">
       <w:startOverride w:val="1"/>
     </w:lvlOverride>
   </w:num>
-  <w:num w:numId="4" w16cid:durableId="236404527">
+  <w:num w:numId="4" w16cid:durableId="329715769">
     <w:abstractNumId w:val="2"/>
     <w:lvlOverride w:ilvl="0">
       <w:startOverride w:val="1"/>
@@ -18044,7 +18016,7 @@
     <w:autoRedefine/>
     <w:uiPriority w:val="39"/>
     <w:unhideWhenUsed/>
-    <w:rsid w:val="004B228A"/>
+    <w:rsid w:val="009029F3"/>
     <w:pPr>
       <w:spacing w:after="100"/>
     </w:pPr>
@@ -18056,7 +18028,7 @@
     <w:autoRedefine/>
     <w:uiPriority w:val="39"/>
     <w:unhideWhenUsed/>
-    <w:rsid w:val="004B228A"/>
+    <w:rsid w:val="009029F3"/>
     <w:pPr>
       <w:spacing w:after="100"/>
       <w:ind w:left="210"/>

</xml_diff>